<commit_message>
Paper 02 (JPopE): disclose SSRN 6563021 preprint; number docx captions (Table 1-8) and equation; ESM cross-references to Tables 3 and 4; typo fixes, no negative zeros; employed share to three decimals; one title everywhere; abstract says 79.5; consent statement; DOIs (Crossref-verified); refresh author PDF; counts
</commit_message>
<xml_diff>
--- a/submission/02_grandparent_care/package/manuscript_anonymised.docx
+++ b/submission/02_grandparent_care/package/manuscript_anonymised.docx
@@ -29,7 +29,7 @@
         <w:pStyle w:val="Abstract"/>
       </w:pPr>
       <w:r>
-        <w:t xml:space="preserve">Do coresident grandmothers relieve mothers of childcare, and what do they give up? Same-day time diaries from India’s Time Use Survey 2024 cover both generations in each household. I compare 49,992 married mothers of children under six, 36% of whom live with a grandmother, and 26,062 women and 19,382 men aged 45 to 80 in the generation above them. The innovation is to measure grandmothers’ own time and to assign grandmothers and young children correctly in rosters without parent identifiers. Grandmothers living with a young grandchild report 79 minutes more childcare a day and less domestic work, free time and sleep. Mothers’ childcare and paid work differ little between households with and without a grandmother, the confidence intervals include zero, and the estimates are fragile. The contribution is to show that grandmother care is a costly transfer of older women’s time, while its benefit for mothers’ work is not established.</w:t>
+        <w:t xml:space="preserve">Do coresident grandmothers relieve mothers of childcare, and what do they give up? Same-day time diaries from India’s Time Use Survey 2024 cover both generations in each household. I compare 49,992 married mothers of children under six, 36% of whom live with a grandmother, and 26,062 women and 19,382 men aged 45 to 80 in the generation above them. The innovation is to measure grandmothers’ own time and to assign grandmothers and young children correctly in rosters without parent identifiers. Grandmothers living with a young grandchild report 79.5 minutes more childcare a day and less domestic work, free time and sleep. Mothers’ childcare and paid work differ little between households with and without a grandmother, the confidence intervals include zero, and the estimates are fragile. The contribution is to show that grandmother care is a costly transfer of older women’s time, while its benefit for mothers’ work is not established.</w:t>
       </w:r>
     </w:p>
     <w:p>
@@ -1572,7 +1572,7 @@
         <w:t xml:space="preserve"> </w:t>
       </w:r>
       <w:r>
-        <w:t xml:space="preserve">persons recorded as third gender from the analyzes because the sample is</w:t>
+        <w:t xml:space="preserve">persons recorded as third gender from the analyses because the sample is</w:t>
       </w:r>
       <w:r>
         <w:t xml:space="preserve"> </w:t>
@@ -1968,7 +1968,7 @@
         <w:pStyle w:val="TableCaption"/>
       </w:pPr>
       <w:r>
-        <w:t xml:space="preserve">Mothers of children under six: minutes per day by grandmother coresidence</w:t>
+        <w:t>Table 1: Mothers of children under six: minutes per day by grandmother coresidence</w:t>
       </w:r>
     </w:p>
     <w:tbl>
@@ -2566,23 +2566,23 @@
               <w:rPr>
                 <w:sz w:val="18"/>
               </w:rPr>
-              <w:t xml:space="preserve">0.2 (0.0)</w:t>
-            </w:r>
-          </w:p>
-        </w:tc>
-        <w:tc>
-          <w:tcPr/>
-          <w:p>
-            <w:pPr>
-              <w:pStyle w:val="Compact"/>
-              <w:spacing w:line="240" w:lineRule="auto" w:after="0" w:before="0"/>
-              <w:jc w:val="right"/>
-            </w:pPr>
-            <w:r>
-              <w:rPr>
-                <w:sz w:val="18"/>
-              </w:rPr>
-              <w:t xml:space="preserve">0.2 (0.0)</w:t>
+              <w:t xml:space="preserve">0.176 (0.004)</w:t>
+            </w:r>
+          </w:p>
+        </w:tc>
+        <w:tc>
+          <w:tcPr/>
+          <w:p>
+            <w:pPr>
+              <w:pStyle w:val="Compact"/>
+              <w:spacing w:line="240" w:lineRule="auto" w:after="0" w:before="0"/>
+              <w:jc w:val="right"/>
+            </w:pPr>
+            <w:r>
+              <w:rPr>
+                <w:sz w:val="18"/>
+              </w:rPr>
+              <w:t xml:space="preserve">0.165 (0.004)</w:t>
             </w:r>
           </w:p>
         </w:tc>
@@ -2604,7 +2604,7 @@
         <w:t xml:space="preserve"> </w:t>
       </w:r>
       <w:r>
-        <w:t xml:space="preserve">Married women aged 18–49 at head or junior level in households with a child under six, excluding head-level women who live with a junior married woman of childbearing age. Survey-weighted means; FSU-clustered standard errors in parentheses. Employed is a share.</w:t>
+        <w:t xml:space="preserve">Married women aged 18–49 at head or junior level in households with a child under six, excluding head-level women who live with a junior married woman of childbearing age. Survey-weighted means; FSU-clustered standard errors in parentheses. Employed is a share (three decimals).</w:t>
       </w:r>
     </w:p>
     <w:bookmarkEnd w:id="19"/>
@@ -2684,151 +2684,157 @@
     <w:p>
       <w:pPr>
         <w:pStyle w:val="BodyText"/>
-      </w:pPr>
-      <m:oMathPara>
-        <m:oMathParaPr>
-          <m:jc m:val="center"/>
-        </m:oMathParaPr>
-        <m:oMath>
-          <m:sSub>
-            <m:e>
-              <m:r>
-                <m:t>y</m:t>
-              </m:r>
-            </m:e>
-            <m:sub>
-              <m:r>
-                <m:t>i</m:t>
-              </m:r>
-              <m:r>
-                <m:t>h</m:t>
-              </m:r>
-            </m:sub>
-          </m:sSub>
-          <m:r>
-            <m:rPr>
-              <m:sty m:val="p"/>
-            </m:rPr>
-            <m:t>=</m:t>
-          </m:r>
-          <m:r>
-            <m:t>β</m:t>
-          </m:r>
-          <m:r>
-            <m:t> </m:t>
-          </m:r>
-          <m:r>
-            <m:t>G</m:t>
-          </m:r>
-          <m:sSub>
-            <m:e>
-              <m:r>
-                <m:t>M</m:t>
-              </m:r>
-            </m:e>
-            <m:sub>
-              <m:r>
-                <m:t>h</m:t>
-              </m:r>
-            </m:sub>
-          </m:sSub>
-          <m:r>
-            <m:rPr>
-              <m:sty m:val="p"/>
-            </m:rPr>
-            <m:t>+</m:t>
-          </m:r>
-          <m:sSubSup>
-            <m:e>
-              <m:r>
-                <m:t>X</m:t>
-              </m:r>
-            </m:e>
-            <m:sub>
-              <m:r>
-                <m:t>i</m:t>
-              </m:r>
-              <m:r>
-                <m:t>h</m:t>
-              </m:r>
-            </m:sub>
-            <m:sup>
-              <m:r>
-                <m:rPr>
-                  <m:sty m:val="p"/>
-                </m:rPr>
-                <m:t>′</m:t>
-              </m:r>
-            </m:sup>
-          </m:sSubSup>
-          <m:r>
-            <m:t>γ</m:t>
-          </m:r>
-          <m:r>
-            <m:rPr>
-              <m:sty m:val="p"/>
-            </m:rPr>
-            <m:t>+</m:t>
-          </m:r>
-          <m:sSub>
-            <m:e>
-              <m:r>
-                <m:t>μ</m:t>
-              </m:r>
-            </m:e>
-            <m:sub>
-              <m:r>
-                <m:t>s</m:t>
-              </m:r>
-            </m:sub>
-          </m:sSub>
-          <m:r>
-            <m:rPr>
-              <m:sty m:val="p"/>
-            </m:rPr>
-            <m:t>+</m:t>
-          </m:r>
-          <m:sSub>
-            <m:e>
-              <m:r>
-                <m:t>τ</m:t>
-              </m:r>
-            </m:e>
-            <m:sub>
-              <m:r>
-                <m:t>d</m:t>
-              </m:r>
-            </m:sub>
-          </m:sSub>
-          <m:r>
-            <m:rPr>
-              <m:sty m:val="p"/>
-            </m:rPr>
-            <m:t>+</m:t>
-          </m:r>
-          <m:sSub>
-            <m:e>
-              <m:r>
-                <m:t>ε</m:t>
-              </m:r>
-            </m:e>
-            <m:sub>
-              <m:r>
-                <m:t>i</m:t>
-              </m:r>
-              <m:r>
-                <m:t>h</m:t>
-              </m:r>
-            </m:sub>
-          </m:sSub>
-          <m:r>
-            <m:rPr>
-              <m:sty m:val="p"/>
-            </m:rPr>
-            <m:t>,</m:t>
-          </m:r>
-        </m:oMath>
-      </m:oMathPara>
+        <w:tabs>
+          <w:tab w:pos="4680" w:val="center"/>
+          <w:tab w:pos="9360" w:val="right"/>
+        </w:tabs>
+      </w:pPr>
+      <w:r>
+        <w:tab/>
+      </w:r>
+      <m:oMath>
+        <m:sSub>
+          <m:e>
+            <m:r>
+              <m:t>y</m:t>
+            </m:r>
+          </m:e>
+          <m:sub>
+            <m:r>
+              <m:t>i</m:t>
+            </m:r>
+            <m:r>
+              <m:t>h</m:t>
+            </m:r>
+          </m:sub>
+        </m:sSub>
+        <m:r>
+          <m:rPr>
+            <m:sty m:val="p"/>
+          </m:rPr>
+          <m:t>=</m:t>
+        </m:r>
+        <m:r>
+          <m:t>β</m:t>
+        </m:r>
+        <m:r>
+          <m:t> </m:t>
+        </m:r>
+        <m:r>
+          <m:t>G</m:t>
+        </m:r>
+        <m:sSub>
+          <m:e>
+            <m:r>
+              <m:t>M</m:t>
+            </m:r>
+          </m:e>
+          <m:sub>
+            <m:r>
+              <m:t>h</m:t>
+            </m:r>
+          </m:sub>
+        </m:sSub>
+        <m:r>
+          <m:rPr>
+            <m:sty m:val="p"/>
+          </m:rPr>
+          <m:t>+</m:t>
+        </m:r>
+        <m:sSubSup>
+          <m:e>
+            <m:r>
+              <m:t>X</m:t>
+            </m:r>
+          </m:e>
+          <m:sub>
+            <m:r>
+              <m:t>i</m:t>
+            </m:r>
+            <m:r>
+              <m:t>h</m:t>
+            </m:r>
+          </m:sub>
+          <m:sup>
+            <m:r>
+              <m:rPr>
+                <m:sty m:val="p"/>
+              </m:rPr>
+              <m:t>′</m:t>
+            </m:r>
+          </m:sup>
+        </m:sSubSup>
+        <m:r>
+          <m:t>γ</m:t>
+        </m:r>
+        <m:r>
+          <m:rPr>
+            <m:sty m:val="p"/>
+          </m:rPr>
+          <m:t>+</m:t>
+        </m:r>
+        <m:sSub>
+          <m:e>
+            <m:r>
+              <m:t>μ</m:t>
+            </m:r>
+          </m:e>
+          <m:sub>
+            <m:r>
+              <m:t>s</m:t>
+            </m:r>
+          </m:sub>
+        </m:sSub>
+        <m:r>
+          <m:rPr>
+            <m:sty m:val="p"/>
+          </m:rPr>
+          <m:t>+</m:t>
+        </m:r>
+        <m:sSub>
+          <m:e>
+            <m:r>
+              <m:t>τ</m:t>
+            </m:r>
+          </m:e>
+          <m:sub>
+            <m:r>
+              <m:t>d</m:t>
+            </m:r>
+          </m:sub>
+        </m:sSub>
+        <m:r>
+          <m:rPr>
+            <m:sty m:val="p"/>
+          </m:rPr>
+          <m:t>+</m:t>
+        </m:r>
+        <m:sSub>
+          <m:e>
+            <m:r>
+              <m:t>ε</m:t>
+            </m:r>
+          </m:e>
+          <m:sub>
+            <m:r>
+              <m:t>i</m:t>
+            </m:r>
+            <m:r>
+              <m:t>h</m:t>
+            </m:r>
+          </m:sub>
+        </m:sSub>
+        <m:r>
+          <m:rPr>
+            <m:sty m:val="p"/>
+          </m:rPr>
+          <m:t>,</m:t>
+        </m:r>
+      </m:oMath>
+      <w:r>
+        <w:tab/>
+        <w:t>(1)</w:t>
+      </w:r>
     </w:p>
     <w:p>
       <w:pPr>
@@ -3354,7 +3360,7 @@
         <w:t xml:space="preserve"> </w:t>
       </w:r>
       <w:r>
-        <w:t xml:space="preserve">shows -2.2 minutes (CI -4.6 to 0.3) for active care and -0.0 minutes (CI</w:t>
+        <w:t xml:space="preserve">shows -2.2 minutes (CI -4.6 to 0.3) for active care and 0.0 minutes (CI</w:t>
       </w:r>
       <w:r>
         <w:t xml:space="preserve"> </w:t>
@@ -3387,7 +3393,7 @@
         <w:pStyle w:val="TableCaption"/>
       </w:pPr>
       <w:r>
-        <w:t xml:space="preserve">Coresident grandmother and mothers’ time use</w:t>
+        <w:t>Table 2: Coresident grandmother and mothers’ time use</w:t>
       </w:r>
     </w:p>
     <w:tbl>
@@ -4339,39 +4345,39 @@
               <w:rPr>
                 <w:sz w:val="18"/>
               </w:rPr>
-              <w:t xml:space="preserve">0.18</w:t>
-            </w:r>
-          </w:p>
-        </w:tc>
-        <w:tc>
-          <w:tcPr/>
-          <w:p>
-            <w:pPr>
-              <w:pStyle w:val="Compact"/>
-              <w:spacing w:line="240" w:lineRule="auto" w:after="0" w:before="0"/>
-              <w:jc w:val="right"/>
-            </w:pPr>
-            <w:r>
-              <w:rPr>
-                <w:sz w:val="18"/>
-              </w:rPr>
-              <w:t xml:space="preserve">-0.01</w:t>
-            </w:r>
-          </w:p>
-        </w:tc>
-        <w:tc>
-          <w:tcPr/>
-          <w:p>
-            <w:pPr>
-              <w:pStyle w:val="Compact"/>
-              <w:spacing w:line="240" w:lineRule="auto" w:after="0" w:before="0"/>
-              <w:jc w:val="right"/>
-            </w:pPr>
-            <w:r>
-              <w:rPr>
-                <w:sz w:val="18"/>
-              </w:rPr>
-              <w:t xml:space="preserve">[-0.02, -0.00]</w:t>
+              <w:t xml:space="preserve">0.176</w:t>
+            </w:r>
+          </w:p>
+        </w:tc>
+        <w:tc>
+          <w:tcPr/>
+          <w:p>
+            <w:pPr>
+              <w:pStyle w:val="Compact"/>
+              <w:spacing w:line="240" w:lineRule="auto" w:after="0" w:before="0"/>
+              <w:jc w:val="right"/>
+            </w:pPr>
+            <w:r>
+              <w:rPr>
+                <w:sz w:val="18"/>
+              </w:rPr>
+              <w:t xml:space="preserve">-0.014</w:t>
+            </w:r>
+          </w:p>
+        </w:tc>
+        <w:tc>
+          <w:tcPr/>
+          <w:p>
+            <w:pPr>
+              <w:pStyle w:val="Compact"/>
+              <w:spacing w:line="240" w:lineRule="auto" w:after="0" w:before="0"/>
+              <w:jc w:val="right"/>
+            </w:pPr>
+            <w:r>
+              <w:rPr>
+                <w:sz w:val="18"/>
+              </w:rPr>
+              <w:t xml:space="preserve">[-0.023, -0.004]</w:t>
             </w:r>
           </w:p>
         </w:tc>
@@ -4489,7 +4495,7 @@
         <w:t xml:space="preserve"> </w:t>
       </w:r>
       <w:r>
-        <w:t xml:space="preserve">7.3) and sleep 3.1 minutes lower (CI -5.3 to -0.9), Both intervals</w:t>
+        <w:t xml:space="preserve">7.3) and sleep 3.1 minutes lower (CI -5.3 to -0.9). Both intervals</w:t>
       </w:r>
       <w:r>
         <w:t xml:space="preserve"> </w:t>
@@ -4691,7 +4697,7 @@
         <w:pStyle w:val="TableCaption"/>
       </w:pPr>
       <w:r>
-        <w:t xml:space="preserve">Childcare minutes per day by provider, households with a child under six</w:t>
+        <w:t>Table 3: Childcare minutes per day by provider, households with a child under six</w:t>
       </w:r>
     </w:p>
     <w:tbl>
@@ -5223,7 +5229,7 @@
         <w:pStyle w:val="TableCaption"/>
       </w:pPr>
       <w:r>
-        <w:t xml:space="preserve">The older generation: time use and a child under six in the household</w:t>
+        <w:t>Table 4: The older generation: time use and a child under six in the household</w:t>
       </w:r>
     </w:p>
     <w:tbl>
@@ -5765,55 +5771,55 @@
               <w:rPr>
                 <w:sz w:val="18"/>
               </w:rPr>
-              <w:t xml:space="preserve">0.22</w:t>
-            </w:r>
-          </w:p>
-        </w:tc>
-        <w:tc>
-          <w:tcPr/>
-          <w:p>
-            <w:pPr>
-              <w:pStyle w:val="Compact"/>
-              <w:spacing w:line="240" w:lineRule="auto" w:after="0" w:before="0"/>
-              <w:jc w:val="right"/>
-            </w:pPr>
-            <w:r>
-              <w:rPr>
-                <w:sz w:val="18"/>
-              </w:rPr>
-              <w:t xml:space="preserve">0.02 [0.00, 0.03]</w:t>
-            </w:r>
-          </w:p>
-        </w:tc>
-        <w:tc>
-          <w:tcPr/>
-          <w:p>
-            <w:pPr>
-              <w:pStyle w:val="Compact"/>
-              <w:spacing w:line="240" w:lineRule="auto" w:after="0" w:before="0"/>
-              <w:jc w:val="right"/>
-            </w:pPr>
-            <w:r>
-              <w:rPr>
-                <w:sz w:val="18"/>
-              </w:rPr>
-              <w:t xml:space="preserve">0.03 [0.01, 0.04]</w:t>
-            </w:r>
-          </w:p>
-        </w:tc>
-        <w:tc>
-          <w:tcPr/>
-          <w:p>
-            <w:pPr>
-              <w:pStyle w:val="Compact"/>
-              <w:spacing w:line="240" w:lineRule="auto" w:after="0" w:before="0"/>
-              <w:jc w:val="right"/>
-            </w:pPr>
-            <w:r>
-              <w:rPr>
-                <w:sz w:val="18"/>
-              </w:rPr>
-              <w:t xml:space="preserve">-0.01 [-0.03, 0.01]</w:t>
+              <w:t xml:space="preserve">0.219</w:t>
+            </w:r>
+          </w:p>
+        </w:tc>
+        <w:tc>
+          <w:tcPr/>
+          <w:p>
+            <w:pPr>
+              <w:pStyle w:val="Compact"/>
+              <w:spacing w:line="240" w:lineRule="auto" w:after="0" w:before="0"/>
+              <w:jc w:val="right"/>
+            </w:pPr>
+            <w:r>
+              <w:rPr>
+                <w:sz w:val="18"/>
+              </w:rPr>
+              <w:t xml:space="preserve">0.016 [0.004, 0.028]</w:t>
+            </w:r>
+          </w:p>
+        </w:tc>
+        <w:tc>
+          <w:tcPr/>
+          <w:p>
+            <w:pPr>
+              <w:pStyle w:val="Compact"/>
+              <w:spacing w:line="240" w:lineRule="auto" w:after="0" w:before="0"/>
+              <w:jc w:val="right"/>
+            </w:pPr>
+            <w:r>
+              <w:rPr>
+                <w:sz w:val="18"/>
+              </w:rPr>
+              <w:t xml:space="preserve">0.026 [0.012, 0.040]</w:t>
+            </w:r>
+          </w:p>
+        </w:tc>
+        <w:tc>
+          <w:tcPr/>
+          <w:p>
+            <w:pPr>
+              <w:pStyle w:val="Compact"/>
+              <w:spacing w:line="240" w:lineRule="auto" w:after="0" w:before="0"/>
+              <w:jc w:val="right"/>
+            </w:pPr>
+            <w:r>
+              <w:rPr>
+                <w:sz w:val="18"/>
+              </w:rPr>
+              <w:t xml:space="preserve">-0.010 [-0.029, 0.008]</w:t>
             </w:r>
           </w:p>
         </w:tc>
@@ -6153,7 +6159,7 @@
         <w:pStyle w:val="TableCaption"/>
       </w:pPr>
       <w:r>
-        <w:t xml:space="preserve">Mothers’ childcare and employment minutes by type of coresident grandparent</w:t>
+        <w:t>Table 5: Mothers’ childcare and employment minutes by type of coresident grandparent</w:t>
       </w:r>
     </w:p>
     <w:tbl>
@@ -6845,7 +6851,7 @@
         <w:t xml:space="preserve"> </w:t>
       </w:r>
       <w:r>
-        <w:t xml:space="preserve">(CI -11.9 to -4.3) with both grandparents, , so the pooled employment</w:t>
+        <w:t xml:space="preserve">(CI -11.9 to -4.3) with both grandparents, so the pooled employment</w:t>
       </w:r>
       <w:r>
         <w:t xml:space="preserve"> </w:t>
@@ -7003,7 +7009,7 @@
         <w:pStyle w:val="TableCaption"/>
       </w:pPr>
       <w:r>
-        <w:t xml:space="preserve">Heterogeneity: grandmother coresidence and mothers’ childcare and employment minutes</w:t>
+        <w:t>Table 6: Heterogeneity: grandmother coresidence and mothers’ childcare and employment minutes</w:t>
       </w:r>
     </w:p>
     <w:tbl>
@@ -7448,7 +7454,7 @@
               <w:rPr>
                 <w:sz w:val="18"/>
               </w:rPr>
-              <w:t xml:space="preserve">-3.52 [-7.03, -0.00]</w:t>
+              <w:t xml:space="preserve">-3.52 [-7.03, 0.00]</w:t>
             </w:r>
           </w:p>
         </w:tc>
@@ -7660,7 +7666,7 @@
         <w:t xml:space="preserve"> </w:t>
       </w:r>
       <w:r>
-        <w:t xml:space="preserve">secondary and -3.5 minutes (CI -7.0 to -0.0) at secondary or above. More</w:t>
+        <w:t xml:space="preserve">secondary and -3.5 minutes (CI -7.0 to 0.0) at secondary or above. More</w:t>
       </w:r>
       <w:r>
         <w:t xml:space="preserve"> </w:t>
@@ -7884,7 +7890,7 @@
         <w:pStyle w:val="TableCaption"/>
       </w:pPr>
       <w:r>
-        <w:t xml:space="preserve">Placebo: grandmother coresidence for mothers whose youngest child is aged 6 to 14</w:t>
+        <w:t>Table 7: Placebo: grandmother coresidence for mothers whose youngest child is aged 6 to 14</w:t>
       </w:r>
     </w:p>
     <w:tbl>
@@ -8504,7 +8510,7 @@
         <w:pStyle w:val="TableCaption"/>
       </w:pPr>
       <w:r>
-        <w:t xml:space="preserve">Robustness: mothers’ primary childcare minutes</w:t>
+        <w:t>Table 8: Robustness: mothers’ primary childcare minutes</w:t>
       </w:r>
     </w:p>
     <w:tbl>
@@ -10012,31 +10018,43 @@
           <w:b/>
           <w:bCs/>
         </w:rPr>
-        <w:t xml:space="preserve">Ethics approval.</w:t>
-      </w:r>
-      <w:r>
-        <w:t xml:space="preserve"> </w:t>
-      </w:r>
-      <w:r>
-        <w:t xml:space="preserve">The study is a secondary analysis of</w:t>
-      </w:r>
-      <w:r>
-        <w:t xml:space="preserve"> </w:t>
-      </w:r>
-      <w:r>
-        <w:t xml:space="preserve">anonymized unit-level data released by the National Statistics Office.</w:t>
-      </w:r>
-      <w:r>
-        <w:t xml:space="preserve"> </w:t>
-      </w:r>
-      <w:r>
-        <w:t xml:space="preserve">It involved no contact with respondents, and no ethics approval was</w:t>
-      </w:r>
-      <w:r>
-        <w:t xml:space="preserve"> </w:t>
-      </w:r>
-      <w:r>
-        <w:t xml:space="preserve">required.</w:t>
+        <w:t xml:space="preserve">Ethics approval and consent to participate.</w:t>
+      </w:r>
+      <w:r>
+        <w:t xml:space="preserve"> </w:t>
+      </w:r>
+      <w:r>
+        <w:t xml:space="preserve">The study is a</w:t>
+      </w:r>
+      <w:r>
+        <w:t xml:space="preserve"> </w:t>
+      </w:r>
+      <w:r>
+        <w:t xml:space="preserve">secondary analysis of anonymized, publicly released unit-level microdata</w:t>
+      </w:r>
+      <w:r>
+        <w:t xml:space="preserve"> </w:t>
+      </w:r>
+      <w:r>
+        <w:t xml:space="preserve">from the Time Use Survey 2024 of the Government of India’s National</w:t>
+      </w:r>
+      <w:r>
+        <w:t xml:space="preserve"> </w:t>
+      </w:r>
+      <w:r>
+        <w:t xml:space="preserve">Statistics Office. It involved no contact with respondents, so ethics</w:t>
+      </w:r>
+      <w:r>
+        <w:t xml:space="preserve"> </w:t>
+      </w:r>
+      <w:r>
+        <w:t xml:space="preserve">approval and consent to participate were not required. The survey agency</w:t>
+      </w:r>
+      <w:r>
+        <w:t xml:space="preserve"> </w:t>
+      </w:r>
+      <w:r>
+        <w:t xml:space="preserve">obtained informed consent from respondents when it collected the data.</w:t>
       </w:r>
     </w:p>
     <w:p>
@@ -10076,7 +10094,7 @@
       </w:r>
     </w:p>
     <w:bookmarkEnd w:id="43"/>
-    <w:bookmarkStart w:id="79" w:name="references"/>
+    <w:bookmarkStart w:id="86" w:name="references"/>
     <w:p>
       <w:pPr>
         <w:pStyle w:val="Heading1"/>
@@ -10115,8 +10133,19 @@
         <w:t xml:space="preserve"> </w:t>
       </w:r>
       <w:r>
-        <w:t xml:space="preserve">138:1–35</w:t>
-      </w:r>
+        <w:t xml:space="preserve">138:1–35.</w:t>
+      </w:r>
+      <w:r>
+        <w:t xml:space="preserve"> </w:t>
+      </w:r>
+      <w:hyperlink r:id="rId45">
+        <w:r>
+          <w:rPr>
+            <w:rStyle w:val="Hyperlink"/>
+          </w:rPr>
+          <w:t xml:space="preserve">https://doi.org/10.1093/qje/qjac038</w:t>
+        </w:r>
+      </w:hyperlink>
     </w:p>
     <w:p>
       <w:pPr>
@@ -10152,7 +10181,7 @@
       <w:r>
         <w:t xml:space="preserve"> </w:t>
       </w:r>
-      <w:hyperlink r:id="rId45">
+      <w:hyperlink r:id="rId46">
         <w:r>
           <w:rPr>
             <w:rStyle w:val="Hyperlink"/>
@@ -10195,7 +10224,7 @@
       <w:r>
         <w:t xml:space="preserve"> </w:t>
       </w:r>
-      <w:hyperlink r:id="rId46">
+      <w:hyperlink r:id="rId47">
         <w:r>
           <w:rPr>
             <w:rStyle w:val="Hyperlink"/>
@@ -10226,7 +10255,7 @@
       <w:r>
         <w:t xml:space="preserve"> </w:t>
       </w:r>
-      <w:hyperlink r:id="rId47">
+      <w:hyperlink r:id="rId48">
         <w:r>
           <w:rPr>
             <w:rStyle w:val="Hyperlink"/>
@@ -10261,8 +10290,19 @@
         <w:t xml:space="preserve"> </w:t>
       </w:r>
       <w:r>
-        <w:t xml:space="preserve">Journal of Agricultural Economics 102:1328–1351</w:t>
-      </w:r>
+        <w:t xml:space="preserve">Journal of Agricultural Economics 102:1328–1351.</w:t>
+      </w:r>
+      <w:r>
+        <w:t xml:space="preserve"> </w:t>
+      </w:r>
+      <w:hyperlink r:id="rId49">
+        <w:r>
+          <w:rPr>
+            <w:rStyle w:val="Hyperlink"/>
+          </w:rPr>
+          <w:t xml:space="preserve">https://doi.org/10.1111/ajae.12114</w:t>
+        </w:r>
+      </w:hyperlink>
     </w:p>
     <w:p>
       <w:pPr>
@@ -10286,7 +10326,7 @@
       <w:r>
         <w:t xml:space="preserve"> </w:t>
       </w:r>
-      <w:hyperlink r:id="rId48">
+      <w:hyperlink r:id="rId50">
         <w:r>
           <w:rPr>
             <w:rStyle w:val="Hyperlink"/>
@@ -10338,7 +10378,7 @@
       <w:r>
         <w:t xml:space="preserve"> </w:t>
       </w:r>
-      <w:hyperlink r:id="rId49">
+      <w:hyperlink r:id="rId51">
         <w:r>
           <w:rPr>
             <w:rStyle w:val="Hyperlink"/>
@@ -10398,7 +10438,7 @@
       <w:r>
         <w:t xml:space="preserve"> </w:t>
       </w:r>
-      <w:hyperlink r:id="rId50">
+      <w:hyperlink r:id="rId52">
         <w:r>
           <w:rPr>
             <w:rStyle w:val="Hyperlink"/>
@@ -10423,7 +10463,7 @@
       <w:r>
         <w:t xml:space="preserve"> </w:t>
       </w:r>
-      <w:hyperlink r:id="rId51">
+      <w:hyperlink r:id="rId53">
         <w:r>
           <w:rPr>
             <w:rStyle w:val="Hyperlink"/>
@@ -10454,7 +10494,7 @@
       <w:r>
         <w:t xml:space="preserve"> </w:t>
       </w:r>
-      <w:hyperlink r:id="rId52">
+      <w:hyperlink r:id="rId54">
         <w:r>
           <w:rPr>
             <w:rStyle w:val="Hyperlink"/>
@@ -10479,7 +10519,7 @@
       <w:r>
         <w:t xml:space="preserve"> </w:t>
       </w:r>
-      <w:hyperlink r:id="rId53">
+      <w:hyperlink r:id="rId55">
         <w:r>
           <w:rPr>
             <w:rStyle w:val="Hyperlink"/>
@@ -10504,7 +10544,7 @@
       <w:r>
         <w:t xml:space="preserve"> </w:t>
       </w:r>
-      <w:hyperlink r:id="rId54">
+      <w:hyperlink r:id="rId56">
         <w:r>
           <w:rPr>
             <w:rStyle w:val="Hyperlink"/>
@@ -10544,8 +10584,19 @@
         <w:t xml:space="preserve"> </w:t>
       </w:r>
       <w:r>
-        <w:t xml:space="preserve">76:834–861</w:t>
-      </w:r>
+        <w:t xml:space="preserve">76:834–861.</w:t>
+      </w:r>
+      <w:r>
+        <w:t xml:space="preserve"> </w:t>
+      </w:r>
+      <w:hyperlink r:id="rId57">
+        <w:r>
+          <w:rPr>
+            <w:rStyle w:val="Hyperlink"/>
+          </w:rPr>
+          <w:t xml:space="preserve">https://doi.org/10.1177/0003122411427673</w:t>
+        </w:r>
+      </w:hyperlink>
     </w:p>
     <w:p>
       <w:pPr>
@@ -10572,7 +10623,7 @@
       <w:r>
         <w:t xml:space="preserve"> </w:t>
       </w:r>
-      <w:hyperlink r:id="rId55">
+      <w:hyperlink r:id="rId58">
         <w:r>
           <w:rPr>
             <w:rStyle w:val="Hyperlink"/>
@@ -10612,7 +10663,7 @@
       <w:r>
         <w:t xml:space="preserve"> </w:t>
       </w:r>
-      <w:hyperlink r:id="rId56">
+      <w:hyperlink r:id="rId59">
         <w:r>
           <w:rPr>
             <w:rStyle w:val="Hyperlink"/>
@@ -10652,7 +10703,7 @@
       <w:r>
         <w:t xml:space="preserve"> </w:t>
       </w:r>
-      <w:hyperlink r:id="rId57">
+      <w:hyperlink r:id="rId60">
         <w:r>
           <w:rPr>
             <w:rStyle w:val="Hyperlink"/>
@@ -10692,7 +10743,7 @@
       <w:r>
         <w:t xml:space="preserve"> </w:t>
       </w:r>
-      <w:hyperlink r:id="rId58">
+      <w:hyperlink r:id="rId61">
         <w:r>
           <w:rPr>
             <w:rStyle w:val="Hyperlink"/>
@@ -10723,7 +10774,7 @@
       <w:r>
         <w:t xml:space="preserve"> </w:t>
       </w:r>
-      <w:hyperlink r:id="rId59">
+      <w:hyperlink r:id="rId62">
         <w:r>
           <w:rPr>
             <w:rStyle w:val="Hyperlink"/>
@@ -10758,8 +10809,19 @@
         <w:t xml:space="preserve"> </w:t>
       </w:r>
       <w:r>
-        <w:t xml:space="preserve">School</w:t>
-      </w:r>
+        <w:t xml:space="preserve">School.</w:t>
+      </w:r>
+      <w:r>
+        <w:t xml:space="preserve"> </w:t>
+      </w:r>
+      <w:hyperlink r:id="rId63">
+        <w:r>
+          <w:rPr>
+            <w:rStyle w:val="Hyperlink"/>
+          </w:rPr>
+          <w:t xml:space="preserve">https://doi.org/10.2139/ssrn.3116310</w:t>
+        </w:r>
+      </w:hyperlink>
     </w:p>
     <w:p>
       <w:pPr>
@@ -10777,7 +10839,7 @@
       <w:r>
         <w:t xml:space="preserve"> </w:t>
       </w:r>
-      <w:hyperlink r:id="rId60">
+      <w:hyperlink r:id="rId64">
         <w:r>
           <w:rPr>
             <w:rStyle w:val="Hyperlink"/>
@@ -10811,7 +10873,7 @@
       <w:r>
         <w:t xml:space="preserve"> </w:t>
       </w:r>
-      <w:hyperlink r:id="rId61">
+      <w:hyperlink r:id="rId65">
         <w:r>
           <w:rPr>
             <w:rStyle w:val="Hyperlink"/>
@@ -10842,7 +10904,7 @@
       <w:r>
         <w:t xml:space="preserve"> </w:t>
       </w:r>
-      <w:hyperlink r:id="rId62">
+      <w:hyperlink r:id="rId66">
         <w:r>
           <w:rPr>
             <w:rStyle w:val="Hyperlink"/>
@@ -10876,7 +10938,7 @@
       <w:r>
         <w:t xml:space="preserve"> </w:t>
       </w:r>
-      <w:hyperlink r:id="rId63">
+      <w:hyperlink r:id="rId67">
         <w:r>
           <w:rPr>
             <w:rStyle w:val="Hyperlink"/>
@@ -10907,7 +10969,7 @@
       <w:r>
         <w:t xml:space="preserve"> </w:t>
       </w:r>
-      <w:hyperlink r:id="rId64">
+      <w:hyperlink r:id="rId68">
         <w:r>
           <w:rPr>
             <w:rStyle w:val="Hyperlink"/>
@@ -10932,7 +10994,7 @@
       <w:r>
         <w:t xml:space="preserve"> </w:t>
       </w:r>
-      <w:hyperlink r:id="rId65">
+      <w:hyperlink r:id="rId69">
         <w:r>
           <w:rPr>
             <w:rStyle w:val="Hyperlink"/>
@@ -10966,7 +11028,7 @@
       <w:r>
         <w:t xml:space="preserve"> </w:t>
       </w:r>
-      <w:hyperlink r:id="rId66">
+      <w:hyperlink r:id="rId70">
         <w:r>
           <w:rPr>
             <w:rStyle w:val="Hyperlink"/>
@@ -11023,7 +11085,7 @@
       <w:r>
         <w:t xml:space="preserve"> </w:t>
       </w:r>
-      <w:hyperlink r:id="rId67">
+      <w:hyperlink r:id="rId71">
         <w:r>
           <w:rPr>
             <w:rStyle w:val="Hyperlink"/>
@@ -11048,7 +11110,7 @@
       <w:r>
         <w:t xml:space="preserve"> </w:t>
       </w:r>
-      <w:hyperlink r:id="rId68">
+      <w:hyperlink r:id="rId72">
         <w:r>
           <w:rPr>
             <w:rStyle w:val="Hyperlink"/>
@@ -11091,7 +11153,7 @@
       <w:r>
         <w:t xml:space="preserve"> </w:t>
       </w:r>
-      <w:hyperlink r:id="rId69">
+      <w:hyperlink r:id="rId73">
         <w:r>
           <w:rPr>
             <w:rStyle w:val="Hyperlink"/>
@@ -11116,7 +11178,7 @@
       <w:r>
         <w:t xml:space="preserve"> </w:t>
       </w:r>
-      <w:hyperlink r:id="rId70">
+      <w:hyperlink r:id="rId74">
         <w:r>
           <w:rPr>
             <w:rStyle w:val="Hyperlink"/>
@@ -11151,8 +11213,19 @@
         <w:t xml:space="preserve"> </w:t>
       </w:r>
       <w:r>
-        <w:t xml:space="preserve">29:449–478</w:t>
-      </w:r>
+        <w:t xml:space="preserve">29:449–478.</w:t>
+      </w:r>
+      <w:r>
+        <w:t xml:space="preserve"> </w:t>
+      </w:r>
+      <w:hyperlink r:id="rId75">
+        <w:r>
+          <w:rPr>
+            <w:rStyle w:val="Hyperlink"/>
+          </w:rPr>
+          <w:t xml:space="preserve">https://doi.org/10.1093/wber/lhv003</w:t>
+        </w:r>
+      </w:hyperlink>
     </w:p>
     <w:p>
       <w:pPr>
@@ -11165,8 +11238,19 @@
         <w:t xml:space="preserve"> </w:t>
       </w:r>
       <w:r>
-        <w:t xml:space="preserve">of care responsibilities for grandchildren. Demography 52:433–454</w:t>
-      </w:r>
+        <w:t xml:space="preserve">of care responsibilities for grandchildren. Demography 52:433–454.</w:t>
+      </w:r>
+      <w:r>
+        <w:t xml:space="preserve"> </w:t>
+      </w:r>
+      <w:hyperlink r:id="rId76">
+        <w:r>
+          <w:rPr>
+            <w:rStyle w:val="Hyperlink"/>
+          </w:rPr>
+          <w:t xml:space="preserve">https://doi.org/10.1007/s13524-015-0382-5</w:t>
+        </w:r>
+      </w:hyperlink>
     </w:p>
     <w:p>
       <w:pPr>
@@ -11199,7 +11283,7 @@
       <w:r>
         <w:t xml:space="preserve"> </w:t>
       </w:r>
-      <w:hyperlink r:id="rId71">
+      <w:hyperlink r:id="rId77">
         <w:r>
           <w:rPr>
             <w:rStyle w:val="Hyperlink"/>
@@ -11274,7 +11358,7 @@
       <w:r>
         <w:t xml:space="preserve"> </w:t>
       </w:r>
-      <w:hyperlink r:id="rId72">
+      <w:hyperlink r:id="rId78">
         <w:r>
           <w:rPr>
             <w:rStyle w:val="Hyperlink"/>
@@ -11299,7 +11383,7 @@
       <w:r>
         <w:t xml:space="preserve"> </w:t>
       </w:r>
-      <w:hyperlink r:id="rId73">
+      <w:hyperlink r:id="rId79">
         <w:r>
           <w:rPr>
             <w:rStyle w:val="Hyperlink"/>
@@ -11324,7 +11408,7 @@
       <w:r>
         <w:t xml:space="preserve"> </w:t>
       </w:r>
-      <w:hyperlink r:id="rId74">
+      <w:hyperlink r:id="rId80">
         <w:r>
           <w:rPr>
             <w:rStyle w:val="Hyperlink"/>
@@ -11344,8 +11428,19 @@
         <w:t xml:space="preserve"> </w:t>
       </w:r>
       <w:r>
-        <w:t xml:space="preserve">supply. Journal of Public Economics 159:89–103</w:t>
-      </w:r>
+        <w:t xml:space="preserve">supply. Journal of Public Economics 159:89–103.</w:t>
+      </w:r>
+      <w:r>
+        <w:t xml:space="preserve"> </w:t>
+      </w:r>
+      <w:hyperlink r:id="rId81">
+        <w:r>
+          <w:rPr>
+            <w:rStyle w:val="Hyperlink"/>
+          </w:rPr>
+          <w:t xml:space="preserve">https://doi.org/10.1016/j.jpubeco.2017.12.013</w:t>
+        </w:r>
+      </w:hyperlink>
     </w:p>
     <w:p>
       <w:pPr>
@@ -11381,7 +11476,7 @@
       <w:r>
         <w:t xml:space="preserve"> </w:t>
       </w:r>
-      <w:hyperlink r:id="rId75">
+      <w:hyperlink r:id="rId82">
         <w:r>
           <w:rPr>
             <w:rStyle w:val="Hyperlink"/>
@@ -11412,7 +11507,7 @@
       <w:r>
         <w:t xml:space="preserve"> </w:t>
       </w:r>
-      <w:hyperlink r:id="rId76">
+      <w:hyperlink r:id="rId83">
         <w:r>
           <w:rPr>
             <w:rStyle w:val="Hyperlink"/>
@@ -11449,7 +11544,7 @@
       <w:r>
         <w:t xml:space="preserve"> </w:t>
       </w:r>
-      <w:hyperlink r:id="rId77">
+      <w:hyperlink r:id="rId84">
         <w:r>
           <w:rPr>
             <w:rStyle w:val="Hyperlink"/>
@@ -11474,7 +11569,7 @@
       <w:r>
         <w:t xml:space="preserve"> </w:t>
       </w:r>
-      <w:hyperlink r:id="rId78">
+      <w:hyperlink r:id="rId85">
         <w:r>
           <w:rPr>
             <w:rStyle w:val="Hyperlink"/>
@@ -11532,7 +11627,7 @@
         <w:t xml:space="preserve">Nations, New York</w:t>
       </w:r>
     </w:p>
-    <w:bookmarkEnd w:id="79"/>
+    <w:bookmarkEnd w:id="86"/>
     <w:sectPr>
       <w:footerReference w:type="default" r:id="rId9"/>
       <w:footnotePr>

</xml_diff>

<commit_message>
Paper 02 (JPopE): real-data rebuild after Roo fixes (PDF 21 pp, docx 23 pp, ESM 2 pp, author PDF 23 pp); counts refreshed
</commit_message>
<xml_diff>
--- a/submission/02_grandparent_care/package/manuscript_anonymised.docx
+++ b/submission/02_grandparent_care/package/manuscript_anonymised.docx
@@ -193,6 +193,15 @@
         <w:pStyle w:val="Heading1"/>
       </w:pPr>
       <w:r>
+        <w:rPr>
+          <w:rStyle w:val="SectionNumber"/>
+        </w:rPr>
+        <w:t xml:space="preserve">1</w:t>
+      </w:r>
+      <w:r>
+        <w:tab/>
+      </w:r>
+      <w:r>
         <w:t xml:space="preserve">Introduction</w:t>
       </w:r>
     </w:p>
@@ -333,103 +342,109 @@
         <w:pStyle w:val="BodyText"/>
       </w:pPr>
       <w:r>
-        <w:t xml:space="preserve">The same arrangement has a second side that matters for social</w:t>
-      </w:r>
-      <w:r>
-        <w:t xml:space="preserve"> </w:t>
-      </w:r>
-      <w:r>
-        <w:t xml:space="preserve">gerontology. The time that grandmothers give to grandchildren is a</w:t>
-      </w:r>
-      <w:r>
-        <w:t xml:space="preserve"> </w:t>
-      </w:r>
-      <w:r>
-        <w:t xml:space="preserve">transfer from a generation whose own work, rest and health also matter,</w:t>
-      </w:r>
-      <w:r>
-        <w:t xml:space="preserve"> </w:t>
-      </w:r>
-      <w:r>
-        <w:t xml:space="preserve">in a country whose older population is growing (International Institute</w:t>
-      </w:r>
-      <w:r>
-        <w:t xml:space="preserve"> </w:t>
-      </w:r>
-      <w:r>
-        <w:t xml:space="preserve">for Population Sciences et al. 2020; UNFPA and International Institute</w:t>
-      </w:r>
-      <w:r>
-        <w:t xml:space="preserve"> </w:t>
-      </w:r>
-      <w:r>
-        <w:t xml:space="preserve">for Population Sciences 2023). There are also reasons to doubt that the</w:t>
-      </w:r>
-      <w:r>
-        <w:t xml:space="preserve"> </w:t>
-      </w:r>
-      <w:r>
-        <w:t xml:space="preserve">evidence from other settings carries over. Residence after marriage is</w:t>
-      </w:r>
-      <w:r>
-        <w:t xml:space="preserve"> </w:t>
-      </w:r>
-      <w:r>
-        <w:t xml:space="preserve">predominantly patrilocal, so the coresident grandmother is typically the</w:t>
-      </w:r>
-      <w:r>
-        <w:t xml:space="preserve"> </w:t>
-      </w:r>
-      <w:r>
-        <w:t xml:space="preserve">mother-in-law, and the literature describes the young daughter-in-law as</w:t>
-      </w:r>
-      <w:r>
-        <w:t xml:space="preserve"> </w:t>
-      </w:r>
-      <w:r>
-        <w:t xml:space="preserve">the junior member of a hierarchy in which her mobility and work outside</w:t>
-      </w:r>
-      <w:r>
-        <w:t xml:space="preserve"> </w:t>
-      </w:r>
-      <w:r>
-        <w:t xml:space="preserve">the home are shaped by her husband’s parents (Dyson and Moore 1983;</w:t>
-      </w:r>
-      <w:r>
-        <w:t xml:space="preserve"> </w:t>
-      </w:r>
-      <w:r>
-        <w:t xml:space="preserve">Kandiyoti 1988; Jayachandran 2015; Anukriti et al. 2020). Women in joint</w:t>
-      </w:r>
-      <w:r>
-        <w:t xml:space="preserve"> </w:t>
-      </w:r>
-      <w:r>
-        <w:t xml:space="preserve">households in rural India are less likely to be employed than women in</w:t>
-      </w:r>
-      <w:r>
-        <w:t xml:space="preserve"> </w:t>
-      </w:r>
-      <w:r>
-        <w:t xml:space="preserve">nuclear households (Dhanaraj and Mahambare 2019). A three-generation</w:t>
-      </w:r>
-      <w:r>
-        <w:t xml:space="preserve"> </w:t>
-      </w:r>
-      <w:r>
-        <w:t xml:space="preserve">household is also a larger household, with more meals to cook.</w:t>
-      </w:r>
-      <w:r>
-        <w:t xml:space="preserve"> </w:t>
-      </w:r>
-      <w:r>
-        <w:t xml:space="preserve">Coresidence can therefore add to a mother’s work as well as bring a</w:t>
-      </w:r>
-      <w:r>
-        <w:t xml:space="preserve"> </w:t>
-      </w:r>
-      <w:r>
-        <w:t xml:space="preserve">potential substitute for her childcare. I call these the</w:t>
+        <w:t xml:space="preserve">The same arrangement has a second side that matters for the economics of</w:t>
+      </w:r>
+      <w:r>
+        <w:t xml:space="preserve"> </w:t>
+      </w:r>
+      <w:r>
+        <w:t xml:space="preserve">aging and of the family. The time that grandmothers give to</w:t>
+      </w:r>
+      <w:r>
+        <w:t xml:space="preserve"> </w:t>
+      </w:r>
+      <w:r>
+        <w:t xml:space="preserve">grandchildren is a transfer from a generation whose own work, rest and</w:t>
+      </w:r>
+      <w:r>
+        <w:t xml:space="preserve"> </w:t>
+      </w:r>
+      <w:r>
+        <w:t xml:space="preserve">health also matter, in a country whose older population is growing</w:t>
+      </w:r>
+      <w:r>
+        <w:t xml:space="preserve"> </w:t>
+      </w:r>
+      <w:r>
+        <w:t xml:space="preserve">(International Institute for Population Sciences et al. 2020; UNFPA and</w:t>
+      </w:r>
+      <w:r>
+        <w:t xml:space="preserve"> </w:t>
+      </w:r>
+      <w:r>
+        <w:t xml:space="preserve">International Institute for Population Sciences 2023). There are also</w:t>
+      </w:r>
+      <w:r>
+        <w:t xml:space="preserve"> </w:t>
+      </w:r>
+      <w:r>
+        <w:t xml:space="preserve">reasons to doubt that the evidence from other settings carries over.</w:t>
+      </w:r>
+      <w:r>
+        <w:t xml:space="preserve"> </w:t>
+      </w:r>
+      <w:r>
+        <w:t xml:space="preserve">Residence after marriage is predominantly patrilocal, so the coresident</w:t>
+      </w:r>
+      <w:r>
+        <w:t xml:space="preserve"> </w:t>
+      </w:r>
+      <w:r>
+        <w:t xml:space="preserve">grandmother is typically the mother-in-law, and the literature describes</w:t>
+      </w:r>
+      <w:r>
+        <w:t xml:space="preserve"> </w:t>
+      </w:r>
+      <w:r>
+        <w:t xml:space="preserve">the young daughter-in-law as the junior member of a hierarchy in which</w:t>
+      </w:r>
+      <w:r>
+        <w:t xml:space="preserve"> </w:t>
+      </w:r>
+      <w:r>
+        <w:t xml:space="preserve">her mobility and work outside the home are shaped by her husband’s</w:t>
+      </w:r>
+      <w:r>
+        <w:t xml:space="preserve"> </w:t>
+      </w:r>
+      <w:r>
+        <w:t xml:space="preserve">parents (Dyson and Moore 1983; Kandiyoti 1988; Jayachandran 2015;</w:t>
+      </w:r>
+      <w:r>
+        <w:t xml:space="preserve"> </w:t>
+      </w:r>
+      <w:r>
+        <w:t xml:space="preserve">Anukriti et al. 2020). Women in joint households in rural India are less</w:t>
+      </w:r>
+      <w:r>
+        <w:t xml:space="preserve"> </w:t>
+      </w:r>
+      <w:r>
+        <w:t xml:space="preserve">likely to be employed than women in nuclear households (Dhanaraj and</w:t>
+      </w:r>
+      <w:r>
+        <w:t xml:space="preserve"> </w:t>
+      </w:r>
+      <w:r>
+        <w:t xml:space="preserve">Mahambare 2019). A three-generation household is also a larger</w:t>
+      </w:r>
+      <w:r>
+        <w:t xml:space="preserve"> </w:t>
+      </w:r>
+      <w:r>
+        <w:t xml:space="preserve">household, with more meals to cook. Coresidence can therefore add to a</w:t>
+      </w:r>
+      <w:r>
+        <w:t xml:space="preserve"> </w:t>
+      </w:r>
+      <w:r>
+        <w:t xml:space="preserve">mother’s work as well as bring a potential substitute for her childcare.</w:t>
+      </w:r>
+      <w:r>
+        <w:t xml:space="preserve"> </w:t>
+      </w:r>
+      <w:r>
+        <w:t xml:space="preserve">I call these the</w:t>
       </w:r>
       <w:r>
         <w:t xml:space="preserve"> </w:t>
@@ -841,6 +856,15 @@
         <w:pStyle w:val="Heading1"/>
       </w:pPr>
       <w:r>
+        <w:rPr>
+          <w:rStyle w:val="SectionNumber"/>
+        </w:rPr>
+        <w:t xml:space="preserve">2</w:t>
+      </w:r>
+      <w:r>
+        <w:tab/>
+      </w:r>
+      <w:r>
         <w:t xml:space="preserve">Background and conceptual</w:t>
       </w:r>
       <w:r>
@@ -855,6 +879,15 @@
       <w:pPr>
         <w:pStyle w:val="Heading2"/>
       </w:pPr>
+      <w:r>
+        <w:rPr>
+          <w:rStyle w:val="SectionNumber"/>
+        </w:rPr>
+        <w:t xml:space="preserve">2.1</w:t>
+      </w:r>
+      <w:r>
+        <w:tab/>
+      </w:r>
       <w:r>
         <w:t xml:space="preserve">Grandparental care and maternal</w:t>
       </w:r>
@@ -1038,6 +1071,15 @@
         <w:pStyle w:val="Heading2"/>
       </w:pPr>
       <w:r>
+        <w:rPr>
+          <w:rStyle w:val="SectionNumber"/>
+        </w:rPr>
+        <w:t xml:space="preserve">2.2</w:t>
+      </w:r>
+      <w:r>
+        <w:tab/>
+      </w:r>
+      <w:r>
         <w:t xml:space="preserve">Older women’s time, aging and intergenerational</w:t>
       </w:r>
       <w:r>
@@ -1158,6 +1200,15 @@
         <w:pStyle w:val="Heading2"/>
       </w:pPr>
       <w:r>
+        <w:rPr>
+          <w:rStyle w:val="SectionNumber"/>
+        </w:rPr>
+        <w:t xml:space="preserve">2.3</w:t>
+      </w:r>
+      <w:r>
+        <w:tab/>
+      </w:r>
+      <w:r>
         <w:t xml:space="preserve">Patrilocality and women’s work in</w:t>
       </w:r>
       <w:r>
@@ -1266,6 +1317,15 @@
         <w:pStyle w:val="Heading2"/>
       </w:pPr>
       <w:r>
+        <w:rPr>
+          <w:rStyle w:val="SectionNumber"/>
+        </w:rPr>
+        <w:t xml:space="preserve">2.4</w:t>
+      </w:r>
+      <w:r>
+        <w:tab/>
+      </w:r>
+      <w:r>
         <w:t xml:space="preserve">Measuring childcare in time</w:t>
       </w:r>
       <w:r>
@@ -1343,6 +1403,15 @@
       <w:pPr>
         <w:pStyle w:val="Heading2"/>
       </w:pPr>
+      <w:r>
+        <w:rPr>
+          <w:rStyle w:val="SectionNumber"/>
+        </w:rPr>
+        <w:t xml:space="preserve">2.5</w:t>
+      </w:r>
+      <w:r>
+        <w:tab/>
+      </w:r>
       <w:r>
         <w:t xml:space="preserve">Conceptual framework</w:t>
       </w:r>
@@ -1477,6 +1546,15 @@
         <w:pStyle w:val="Heading1"/>
       </w:pPr>
       <w:r>
+        <w:rPr>
+          <w:rStyle w:val="SectionNumber"/>
+        </w:rPr>
+        <w:t xml:space="preserve">3</w:t>
+      </w:r>
+      <w:r>
+        <w:tab/>
+      </w:r>
+      <w:r>
         <w:t xml:space="preserve">Data and methods</w:t>
       </w:r>
     </w:p>
@@ -1485,6 +1563,15 @@
       <w:pPr>
         <w:pStyle w:val="Heading2"/>
       </w:pPr>
+      <w:r>
+        <w:rPr>
+          <w:rStyle w:val="SectionNumber"/>
+        </w:rPr>
+        <w:t xml:space="preserve">3.1</w:t>
+      </w:r>
+      <w:r>
+        <w:tab/>
+      </w:r>
       <w:r>
         <w:t xml:space="preserve">The Time Use Survey 2024</w:t>
       </w:r>
@@ -1612,6 +1699,15 @@
         <w:pStyle w:val="Heading2"/>
       </w:pPr>
       <w:r>
+        <w:rPr>
+          <w:rStyle w:val="SectionNumber"/>
+        </w:rPr>
+        <w:t xml:space="preserve">3.2</w:t>
+      </w:r>
+      <w:r>
+        <w:tab/>
+      </w:r>
+      <w:r>
         <w:t xml:space="preserve">Identifying mothers, children and</w:t>
       </w:r>
       <w:r>
@@ -1847,6 +1943,15 @@
       <w:pPr>
         <w:pStyle w:val="Heading2"/>
       </w:pPr>
+      <w:r>
+        <w:rPr>
+          <w:rStyle w:val="SectionNumber"/>
+        </w:rPr>
+        <w:t xml:space="preserve">3.3</w:t>
+      </w:r>
+      <w:r>
+        <w:tab/>
+      </w:r>
       <w:r>
         <w:t xml:space="preserve">Time outcomes</w:t>
       </w:r>
@@ -2613,6 +2718,15 @@
       <w:pPr>
         <w:pStyle w:val="Heading2"/>
       </w:pPr>
+      <w:r>
+        <w:rPr>
+          <w:rStyle w:val="SectionNumber"/>
+        </w:rPr>
+        <w:t xml:space="preserve">3.4</w:t>
+      </w:r>
+      <w:r>
+        <w:tab/>
+      </w:r>
       <w:r>
         <w:t xml:space="preserve">Empirical strategy</w:t>
       </w:r>
@@ -2720,13 +2834,14 @@
         <m:r>
           <m:t> </m:t>
         </m:r>
-        <m:r>
-          <m:t>G</m:t>
-        </m:r>
         <m:sSub>
           <m:e>
             <m:r>
-              <m:t>M</m:t>
+              <m:rPr>
+                <m:nor/>
+                <m:sty m:val="i"/>
+              </m:rPr>
+              <m:t>GM</m:t>
             </m:r>
           </m:e>
           <m:sub>
@@ -2879,13 +2994,14 @@
         <w:t xml:space="preserve"> </w:t>
       </w:r>
       <m:oMath>
-        <m:r>
-          <m:t>G</m:t>
-        </m:r>
         <m:sSub>
           <m:e>
             <m:r>
-              <m:t>M</m:t>
+              <m:rPr>
+                <m:nor/>
+                <m:sty m:val="i"/>
+              </m:rPr>
+              <m:t>GM</m:t>
             </m:r>
           </m:e>
           <m:sub>
@@ -2925,55 +3041,55 @@
         <w:t xml:space="preserve"> </w:t>
       </w:r>
       <w:r>
-        <w:t xml:space="preserve">includes the mother’s age band and education, the husband’s education</w:t>
-      </w:r>
-      <w:r>
-        <w:t xml:space="preserve"> </w:t>
-      </w:r>
-      <w:r>
-        <w:t xml:space="preserve">and usual employment (with a separate category for mothers without a</w:t>
-      </w:r>
-      <w:r>
-        <w:t xml:space="preserve"> </w:t>
-      </w:r>
-      <w:r>
-        <w:t xml:space="preserve">linked husband), the household’s per-capita consumption quintile, urban</w:t>
-      </w:r>
-      <w:r>
-        <w:t xml:space="preserve"> </w:t>
-      </w:r>
-      <w:r>
-        <w:t xml:space="preserve">residence, the number of children under six and aged six to 14, the</w:t>
-      </w:r>
-      <w:r>
-        <w:t xml:space="preserve"> </w:t>
-      </w:r>
-      <w:r>
-        <w:t xml:space="preserve">number of the mother’s own children aged six to 17, caste group,</w:t>
-      </w:r>
-      <w:r>
-        <w:t xml:space="preserve"> </w:t>
-      </w:r>
-      <w:r>
-        <w:t xml:space="preserve">religion, whether any member needs special care, and whether the diary</w:t>
-      </w:r>
-      <w:r>
-        <w:t xml:space="preserve"> </w:t>
-      </w:r>
-      <w:r>
-        <w:t xml:space="preserve">was reported by a proxy. State fixed effects absorb regional kinship</w:t>
-      </w:r>
-      <w:r>
-        <w:t xml:space="preserve"> </w:t>
-      </w:r>
-      <w:r>
-        <w:t xml:space="preserve">systems and labor markets, and day-of-week fixed effects absorb the</w:t>
-      </w:r>
-      <w:r>
-        <w:t xml:space="preserve"> </w:t>
-      </w:r>
-      <w:r>
-        <w:t xml:space="preserve">weekly cycle. I do not control for household size in the main</w:t>
+        <w:t xml:space="preserve">includes the mother’s age band and education, the husband’s</w:t>
+      </w:r>
+      <w:r>
+        <w:t xml:space="preserve"> </w:t>
+      </w:r>
+      <w:r>
+        <w:t xml:space="preserve">education and usual employment (with a separate category for mothers</w:t>
+      </w:r>
+      <w:r>
+        <w:t xml:space="preserve"> </w:t>
+      </w:r>
+      <w:r>
+        <w:t xml:space="preserve">without a linked husband), the household’s per-capita consumption</w:t>
+      </w:r>
+      <w:r>
+        <w:t xml:space="preserve"> </w:t>
+      </w:r>
+      <w:r>
+        <w:t xml:space="preserve">quintile, urban residence, the number of children under six and aged six</w:t>
+      </w:r>
+      <w:r>
+        <w:t xml:space="preserve"> </w:t>
+      </w:r>
+      <w:r>
+        <w:t xml:space="preserve">to 14, the number of the mother’s own children aged six to 17, caste</w:t>
+      </w:r>
+      <w:r>
+        <w:t xml:space="preserve"> </w:t>
+      </w:r>
+      <w:r>
+        <w:t xml:space="preserve">group, religion, whether any member needs special care, and whether the</w:t>
+      </w:r>
+      <w:r>
+        <w:t xml:space="preserve"> </w:t>
+      </w:r>
+      <w:r>
+        <w:t xml:space="preserve">diary was reported by a proxy. State fixed effects absorb regional</w:t>
+      </w:r>
+      <w:r>
+        <w:t xml:space="preserve"> </w:t>
+      </w:r>
+      <w:r>
+        <w:t xml:space="preserve">kinship systems and labor markets, and day-of-week fixed effects absorb</w:t>
+      </w:r>
+      <w:r>
+        <w:t xml:space="preserve"> </w:t>
+      </w:r>
+      <w:r>
+        <w:t xml:space="preserve">the weekly cycle. I do not control for household size in the main</w:t>
       </w:r>
       <w:r>
         <w:t xml:space="preserve"> </w:t>
@@ -3223,6 +3339,15 @@
         <w:pStyle w:val="Heading2"/>
       </w:pPr>
       <w:r>
+        <w:rPr>
+          <w:rStyle w:val="SectionNumber"/>
+        </w:rPr>
+        <w:t xml:space="preserve">3.5</w:t>
+      </w:r>
+      <w:r>
+        <w:tab/>
+      </w:r>
+      <w:r>
         <w:t xml:space="preserve">Ethics, data availability and the use of AI</w:t>
       </w:r>
       <w:r>
@@ -3290,6 +3415,15 @@
         <w:pStyle w:val="Heading1"/>
       </w:pPr>
       <w:r>
+        <w:rPr>
+          <w:rStyle w:val="SectionNumber"/>
+        </w:rPr>
+        <w:t xml:space="preserve">4</w:t>
+      </w:r>
+      <w:r>
+        <w:tab/>
+      </w:r>
+      <w:r>
         <w:t xml:space="preserve">Results</w:t>
       </w:r>
     </w:p>
@@ -3298,6 +3432,15 @@
       <w:pPr>
         <w:pStyle w:val="Heading2"/>
       </w:pPr>
+      <w:r>
+        <w:rPr>
+          <w:rStyle w:val="SectionNumber"/>
+        </w:rPr>
+        <w:t xml:space="preserve">4.1</w:t>
+      </w:r>
+      <w:r>
+        <w:tab/>
+      </w:r>
       <w:r>
         <w:t xml:space="preserve">Mothers’ time</w:t>
       </w:r>
@@ -4555,6 +4698,15 @@
         <w:pStyle w:val="Heading2"/>
       </w:pPr>
       <w:r>
+        <w:rPr>
+          <w:rStyle w:val="SectionNumber"/>
+        </w:rPr>
+        <w:t xml:space="preserve">4.2</w:t>
+      </w:r>
+      <w:r>
+        <w:tab/>
+      </w:r>
+      <w:r>
         <w:t xml:space="preserve">Who provides childcare in three-generation</w:t>
       </w:r>
       <w:r>
@@ -5092,6 +5244,15 @@
       <w:pPr>
         <w:pStyle w:val="Heading2"/>
       </w:pPr>
+      <w:r>
+        <w:rPr>
+          <w:rStyle w:val="SectionNumber"/>
+        </w:rPr>
+        <w:t xml:space="preserve">4.3</w:t>
+      </w:r>
+      <w:r>
+        <w:tab/>
+      </w:r>
       <w:r>
         <w:t xml:space="preserve">The older generation’s</w:t>
       </w:r>
@@ -6065,6 +6226,15 @@
         <w:pStyle w:val="Heading2"/>
       </w:pPr>
       <w:r>
+        <w:rPr>
+          <w:rStyle w:val="SectionNumber"/>
+        </w:rPr>
+        <w:t xml:space="preserve">4.4</w:t>
+      </w:r>
+      <w:r>
+        <w:tab/>
+      </w:r>
+      <w:r>
         <w:t xml:space="preserve">Which grandmothers matter</w:t>
       </w:r>
     </w:p>
@@ -6884,6 +7054,15 @@
       <w:pPr>
         <w:pStyle w:val="Heading2"/>
       </w:pPr>
+      <w:r>
+        <w:rPr>
+          <w:rStyle w:val="SectionNumber"/>
+        </w:rPr>
+        <w:t xml:space="preserve">4.5</w:t>
+      </w:r>
+      <w:r>
+        <w:tab/>
+      </w:r>
       <w:r>
         <w:t xml:space="preserve">Differences by household</w:t>
       </w:r>
@@ -7736,6 +7915,15 @@
         <w:pStyle w:val="Heading2"/>
       </w:pPr>
       <w:r>
+        <w:rPr>
+          <w:rStyle w:val="SectionNumber"/>
+        </w:rPr>
+        <w:t xml:space="preserve">4.6</w:t>
+      </w:r>
+      <w:r>
+        <w:tab/>
+      </w:r>
+      <w:r>
         <w:t xml:space="preserve">A placebo: mothers of school-age</w:t>
       </w:r>
       <w:r>
@@ -8333,6 +8521,15 @@
         <w:pStyle w:val="Heading2"/>
       </w:pPr>
       <w:r>
+        <w:rPr>
+          <w:rStyle w:val="SectionNumber"/>
+        </w:rPr>
+        <w:t xml:space="preserve">4.7</w:t>
+      </w:r>
+      <w:r>
+        <w:tab/>
+      </w:r>
+      <w:r>
         <w:t xml:space="preserve">Robustness</w:t>
       </w:r>
     </w:p>
@@ -9243,6 +9440,15 @@
         <w:pStyle w:val="Heading1"/>
       </w:pPr>
       <w:r>
+        <w:rPr>
+          <w:rStyle w:val="SectionNumber"/>
+        </w:rPr>
+        <w:t xml:space="preserve">5</w:t>
+      </w:r>
+      <w:r>
+        <w:tab/>
+      </w:r>
+      <w:r>
         <w:t xml:space="preserve">Discussion and conclusion</w:t>
       </w:r>
     </w:p>
@@ -9251,6 +9457,15 @@
       <w:pPr>
         <w:pStyle w:val="Heading2"/>
       </w:pPr>
+      <w:r>
+        <w:rPr>
+          <w:rStyle w:val="SectionNumber"/>
+        </w:rPr>
+        <w:t xml:space="preserve">5.1</w:t>
+      </w:r>
+      <w:r>
+        <w:tab/>
+      </w:r>
       <w:r>
         <w:t xml:space="preserve">Interpretation</w:t>
       </w:r>
@@ -9609,6 +9824,15 @@
         <w:pStyle w:val="Heading2"/>
       </w:pPr>
       <w:r>
+        <w:rPr>
+          <w:rStyle w:val="SectionNumber"/>
+        </w:rPr>
+        <w:t xml:space="preserve">5.2</w:t>
+      </w:r>
+      <w:r>
+        <w:tab/>
+      </w:r>
+      <w:r>
         <w:t xml:space="preserve">Implications for research and</w:t>
       </w:r>
       <w:r>
@@ -9711,6 +9935,15 @@
         <w:pStyle w:val="Heading2"/>
       </w:pPr>
       <w:r>
+        <w:rPr>
+          <w:rStyle w:val="SectionNumber"/>
+        </w:rPr>
+        <w:t xml:space="preserve">5.3</w:t>
+      </w:r>
+      <w:r>
+        <w:tab/>
+      </w:r>
+      <w:r>
         <w:t xml:space="preserve">Limitations</w:t>
       </w:r>
     </w:p>
@@ -9860,6 +10093,15 @@
       <w:pPr>
         <w:pStyle w:val="Heading2"/>
       </w:pPr>
+      <w:r>
+        <w:rPr>
+          <w:rStyle w:val="SectionNumber"/>
+        </w:rPr>
+        <w:t xml:space="preserve">5.4</w:t>
+      </w:r>
+      <w:r>
+        <w:tab/>
+      </w:r>
       <w:r>
         <w:t xml:space="preserve">Conclusion</w:t>
       </w:r>
@@ -10757,7 +10999,7 @@
         <w:pStyle w:val="BodyText"/>
       </w:pPr>
       <w:r>
-        <w:t xml:space="preserve">Field E, Pande R, Rigol N, Schaner S, Moore CT (2021) On her own</w:t>
+        <w:t xml:space="preserve">Field E, Pande R, Rigol N, Schaner S, Troyer Moore C (2021) On her own</w:t>
       </w:r>
       <w:r>
         <w:t xml:space="preserve"> </w:t>
@@ -10788,7 +11030,7 @@
         <w:pStyle w:val="BodyText"/>
       </w:pPr>
       <w:r>
-        <w:t xml:space="preserve">Fletcher E, Pande R, Moore CT (2017) Women and work in</w:t>
+        <w:t xml:space="preserve">Fletcher E, Pande R, Troyer Moore C (2017) Women and work in</w:t>
       </w:r>
       <w:r>
         <w:t xml:space="preserve"> </w:t>
@@ -10803,13 +11045,13 @@
         <w:t xml:space="preserve"> </w:t>
       </w:r>
       <w:r>
-        <w:t xml:space="preserve">Descriptive evidence and a review of potential policies. Harvard Kennedy</w:t>
-      </w:r>
-      <w:r>
-        <w:t xml:space="preserve"> </w:t>
-      </w:r>
-      <w:r>
-        <w:t xml:space="preserve">School.</w:t>
+        <w:t xml:space="preserve">Descriptive evidence and a review of potential policies. HKS Faculty</w:t>
+      </w:r>
+      <w:r>
+        <w:t xml:space="preserve"> </w:t>
+      </w:r>
+      <w:r>
+        <w:t xml:space="preserve">Research Working Paper RWP18-004, Harvard Kennedy School, Cambridge, MA.</w:t>
       </w:r>
       <w:r>
         <w:t xml:space="preserve"> </w:t>
@@ -10899,7 +11141,7 @@
         <w:t xml:space="preserve"> </w:t>
       </w:r>
       <w:r>
-        <w:t xml:space="preserve">diaries? Annals of Economics and Statistics 231–245.</w:t>
+        <w:t xml:space="preserve">diaries? Annals of Economics and Statistics 105/106:231–245.</w:t>
       </w:r>
       <w:r>
         <w:t xml:space="preserve"> </w:t>
@@ -11054,19 +11296,43 @@
         <w:t xml:space="preserve"> </w:t>
       </w:r>
       <w:r>
-        <w:t xml:space="preserve">University of Southern California (2020) Longitudinal ageing study in</w:t>
-      </w:r>
-      <w:r>
-        <w:t xml:space="preserve"> </w:t>
-      </w:r>
-      <w:r>
-        <w:t xml:space="preserve">india (</w:t>
+        <w:t xml:space="preserve">University of Southern California (2020)</w:t>
+      </w:r>
+      <w:r>
+        <w:t xml:space="preserve"> </w:t>
+      </w:r>
+      <w:r>
+        <w:t xml:space="preserve">Longitudinal Ageing Study in</w:t>
+      </w:r>
+      <w:r>
+        <w:t xml:space="preserve"> </w:t>
+      </w:r>
+      <w:r>
+        <w:t xml:space="preserve">India</w:t>
+      </w:r>
+      <w:r>
+        <w:t xml:space="preserve"> </w:t>
+      </w:r>
+      <w:r>
+        <w:t xml:space="preserve">(</w:t>
       </w:r>
       <w:r>
         <w:t xml:space="preserve">LASI</w:t>
       </w:r>
       <w:r>
-        <w:t xml:space="preserve">) wave 1, 2017–18, india report. IIPS, Mumbai</w:t>
+        <w:t xml:space="preserve">) wave 1, 2017–18,</w:t>
+      </w:r>
+      <w:r>
+        <w:t xml:space="preserve"> </w:t>
+      </w:r>
+      <w:r>
+        <w:t xml:space="preserve">India</w:t>
+      </w:r>
+      <w:r>
+        <w:t xml:space="preserve"> </w:t>
+      </w:r>
+      <w:r>
+        <w:t xml:space="preserve">report. IIPS, Mumbai</w:t>
       </w:r>
     </w:p>
     <w:p>

</xml_diff>

<commit_message>
Paper 02 (JPopE): drop postal address line from title page; name Claude (Anthropic) in the AI-use statements (Methods, author note, title page); rebuild; main text 7,009 words
</commit_message>
<xml_diff>
--- a/submission/02_grandparent_care/package/manuscript_anonymised.docx
+++ b/submission/02_grandparent_care/package/manuscript_anonymised.docx
@@ -3386,25 +3386,31 @@
         <w:t xml:space="preserve"> </w:t>
       </w:r>
       <w:r>
-        <w:t xml:space="preserve">available on acceptance. AI tools (Claude and other AI assistants) were</w:t>
-      </w:r>
-      <w:r>
-        <w:t xml:space="preserve"> </w:t>
-      </w:r>
-      <w:r>
-        <w:t xml:space="preserve">used to help write and check analysis code, to check references and to</w:t>
-      </w:r>
-      <w:r>
-        <w:t xml:space="preserve"> </w:t>
-      </w:r>
-      <w:r>
-        <w:t xml:space="preserve">draft text. The author reviewed and verified all code, results,</w:t>
-      </w:r>
-      <w:r>
-        <w:t xml:space="preserve"> </w:t>
-      </w:r>
-      <w:r>
-        <w:t xml:space="preserve">references and text and takes full responsibility for the content.</w:t>
+        <w:t xml:space="preserve">available on acceptance. AI tools (Claude (Anthropic) and other AI</w:t>
+      </w:r>
+      <w:r>
+        <w:t xml:space="preserve"> </w:t>
+      </w:r>
+      <w:r>
+        <w:t xml:space="preserve">assistants) were used to help write and check analysis code, to check</w:t>
+      </w:r>
+      <w:r>
+        <w:t xml:space="preserve"> </w:t>
+      </w:r>
+      <w:r>
+        <w:t xml:space="preserve">references and to draft text. The author reviewed and verified all code,</w:t>
+      </w:r>
+      <w:r>
+        <w:t xml:space="preserve"> </w:t>
+      </w:r>
+      <w:r>
+        <w:t xml:space="preserve">results, references and text and takes full responsibility for the</w:t>
+      </w:r>
+      <w:r>
+        <w:t xml:space="preserve"> </w:t>
+      </w:r>
+      <w:r>
+        <w:t xml:space="preserve">content.</w:t>
       </w:r>
     </w:p>
     <w:bookmarkEnd w:id="21"/>

</xml_diff>

<commit_message>
paper 02 JPopE Gate-2: define CI at first use, thank referees, Fletcher et al. to published IPF 2019 version, ESM_1 header with journal/author/affiliation/email; rebuilt PDFs and docx
</commit_message>
<xml_diff>
--- a/submission/02_grandparent_care/package/manuscript_anonymised.docx
+++ b/submission/02_grandparent_care/package/manuscript_anonymised.docx
@@ -274,13 +274,13 @@
         <w:t xml:space="preserve"> </w:t>
       </w:r>
       <w:r>
-        <w:t xml:space="preserve">rise with education and income (Klasen and Pieters 2015; Fletcher et al.</w:t>
-      </w:r>
-      <w:r>
-        <w:t xml:space="preserve"> </w:t>
-      </w:r>
-      <w:r>
-        <w:t xml:space="preserve">2017; Chatterjee et al. 2018). A common presumption, in policy</w:t>
+        <w:t xml:space="preserve">rise with education and income (Klasen and Pieters 2015; Chatterjee et</w:t>
+      </w:r>
+      <w:r>
+        <w:t xml:space="preserve"> </w:t>
+      </w:r>
+      <w:r>
+        <w:t xml:space="preserve">al. 2018; Fletcher et al. 2019). A common presumption, in policy</w:t>
       </w:r>
       <w:r>
         <w:t xml:space="preserve"> </w:t>
@@ -681,6 +681,12 @@
       <w:pPr>
         <w:pStyle w:val="BodyText"/>
       </w:pPr>
+      <w:r>
+        <w:t xml:space="preserve">Each estimate below is reported with its 95% confidence interval (CI).</w:t>
+      </w:r>
+      <w:r>
+        <w:t xml:space="preserve"> </w:t>
+      </w:r>
       <w:r>
         <w:t xml:space="preserve">The pooled association between a coresident grandmother and the mother’s</w:t>
       </w:r>
@@ -10342,7 +10348,7 @@
       </w:r>
     </w:p>
     <w:bookmarkEnd w:id="43"/>
-    <w:bookmarkStart w:id="86" w:name="references"/>
+    <w:bookmarkStart w:id="85" w:name="references"/>
     <w:p>
       <w:pPr>
         <w:pStyle w:val="Heading1"/>
@@ -11036,7 +11042,7 @@
         <w:pStyle w:val="BodyText"/>
       </w:pPr>
       <w:r>
-        <w:t xml:space="preserve">Fletcher E, Pande R, Troyer Moore C (2017) Women and work in</w:t>
+        <w:t xml:space="preserve">Fletcher EK, Pande R, Troyer Moore C (2019) Women and work in</w:t>
       </w:r>
       <w:r>
         <w:t xml:space="preserve"> </w:t>
@@ -11051,43 +11057,32 @@
         <w:t xml:space="preserve"> </w:t>
       </w:r>
       <w:r>
-        <w:t xml:space="preserve">Descriptive evidence and a review of potential policies. HKS Faculty</w:t>
-      </w:r>
-      <w:r>
-        <w:t xml:space="preserve"> </w:t>
-      </w:r>
-      <w:r>
-        <w:t xml:space="preserve">Research Working Paper RWP18-004, Harvard Kennedy School, Cambridge, MA.</w:t>
+        <w:t xml:space="preserve">Descriptive evidence and a review of potential policies. India Policy</w:t>
+      </w:r>
+      <w:r>
+        <w:t xml:space="preserve"> </w:t>
+      </w:r>
+      <w:r>
+        <w:t xml:space="preserve">Forum 15:149–198</w:t>
+      </w:r>
+    </w:p>
+    <w:p>
+      <w:pPr>
+        <w:pStyle w:val="BodyText"/>
+      </w:pPr>
+      <w:r>
+        <w:t xml:space="preserve">Folbre N (2006) Measuring care: Gender, empowerment, and the care</w:t>
+      </w:r>
+      <w:r>
+        <w:t xml:space="preserve"> </w:t>
+      </w:r>
+      <w:r>
+        <w:t xml:space="preserve">economy. Journal of Human Development 7:183–199.</w:t>
       </w:r>
       <w:r>
         <w:t xml:space="preserve"> </w:t>
       </w:r>
       <w:hyperlink r:id="rId63">
-        <w:r>
-          <w:rPr>
-            <w:rStyle w:val="Hyperlink"/>
-          </w:rPr>
-          <w:t xml:space="preserve">https://doi.org/10.2139/ssrn.3116310</w:t>
-        </w:r>
-      </w:hyperlink>
-    </w:p>
-    <w:p>
-      <w:pPr>
-        <w:pStyle w:val="BodyText"/>
-      </w:pPr>
-      <w:r>
-        <w:t xml:space="preserve">Folbre N (2006) Measuring care: Gender, empowerment, and the care</w:t>
-      </w:r>
-      <w:r>
-        <w:t xml:space="preserve"> </w:t>
-      </w:r>
-      <w:r>
-        <w:t xml:space="preserve">economy. Journal of Human Development 7:183–199.</w:t>
-      </w:r>
-      <w:r>
-        <w:t xml:space="preserve"> </w:t>
-      </w:r>
-      <w:hyperlink r:id="rId64">
         <w:r>
           <w:rPr>
             <w:rStyle w:val="Hyperlink"/>
@@ -11121,7 +11116,7 @@
       <w:r>
         <w:t xml:space="preserve"> </w:t>
       </w:r>
-      <w:hyperlink r:id="rId65">
+      <w:hyperlink r:id="rId64">
         <w:r>
           <w:rPr>
             <w:rStyle w:val="Hyperlink"/>
@@ -11152,7 +11147,7 @@
       <w:r>
         <w:t xml:space="preserve"> </w:t>
       </w:r>
-      <w:hyperlink r:id="rId66">
+      <w:hyperlink r:id="rId65">
         <w:r>
           <w:rPr>
             <w:rStyle w:val="Hyperlink"/>
@@ -11186,7 +11181,7 @@
       <w:r>
         <w:t xml:space="preserve"> </w:t>
       </w:r>
-      <w:hyperlink r:id="rId67">
+      <w:hyperlink r:id="rId66">
         <w:r>
           <w:rPr>
             <w:rStyle w:val="Hyperlink"/>
@@ -11217,7 +11212,7 @@
       <w:r>
         <w:t xml:space="preserve"> </w:t>
       </w:r>
-      <w:hyperlink r:id="rId68">
+      <w:hyperlink r:id="rId67">
         <w:r>
           <w:rPr>
             <w:rStyle w:val="Hyperlink"/>
@@ -11242,7 +11237,7 @@
       <w:r>
         <w:t xml:space="preserve"> </w:t>
       </w:r>
-      <w:hyperlink r:id="rId69">
+      <w:hyperlink r:id="rId68">
         <w:r>
           <w:rPr>
             <w:rStyle w:val="Hyperlink"/>
@@ -11276,7 +11271,7 @@
       <w:r>
         <w:t xml:space="preserve"> </w:t>
       </w:r>
-      <w:hyperlink r:id="rId70">
+      <w:hyperlink r:id="rId69">
         <w:r>
           <w:rPr>
             <w:rStyle w:val="Hyperlink"/>
@@ -11357,7 +11352,7 @@
       <w:r>
         <w:t xml:space="preserve"> </w:t>
       </w:r>
-      <w:hyperlink r:id="rId71">
+      <w:hyperlink r:id="rId70">
         <w:r>
           <w:rPr>
             <w:rStyle w:val="Hyperlink"/>
@@ -11382,7 +11377,7 @@
       <w:r>
         <w:t xml:space="preserve"> </w:t>
       </w:r>
-      <w:hyperlink r:id="rId72">
+      <w:hyperlink r:id="rId71">
         <w:r>
           <w:rPr>
             <w:rStyle w:val="Hyperlink"/>
@@ -11425,7 +11420,7 @@
       <w:r>
         <w:t xml:space="preserve"> </w:t>
       </w:r>
-      <w:hyperlink r:id="rId73">
+      <w:hyperlink r:id="rId72">
         <w:r>
           <w:rPr>
             <w:rStyle w:val="Hyperlink"/>
@@ -11450,7 +11445,7 @@
       <w:r>
         <w:t xml:space="preserve"> </w:t>
       </w:r>
-      <w:hyperlink r:id="rId74">
+      <w:hyperlink r:id="rId73">
         <w:r>
           <w:rPr>
             <w:rStyle w:val="Hyperlink"/>
@@ -11490,7 +11485,7 @@
       <w:r>
         <w:t xml:space="preserve"> </w:t>
       </w:r>
-      <w:hyperlink r:id="rId75">
+      <w:hyperlink r:id="rId74">
         <w:r>
           <w:rPr>
             <w:rStyle w:val="Hyperlink"/>
@@ -11515,7 +11510,7 @@
       <w:r>
         <w:t xml:space="preserve"> </w:t>
       </w:r>
-      <w:hyperlink r:id="rId76">
+      <w:hyperlink r:id="rId75">
         <w:r>
           <w:rPr>
             <w:rStyle w:val="Hyperlink"/>
@@ -11555,7 +11550,7 @@
       <w:r>
         <w:t xml:space="preserve"> </w:t>
       </w:r>
-      <w:hyperlink r:id="rId77">
+      <w:hyperlink r:id="rId76">
         <w:r>
           <w:rPr>
             <w:rStyle w:val="Hyperlink"/>
@@ -11630,7 +11625,7 @@
       <w:r>
         <w:t xml:space="preserve"> </w:t>
       </w:r>
-      <w:hyperlink r:id="rId78">
+      <w:hyperlink r:id="rId77">
         <w:r>
           <w:rPr>
             <w:rStyle w:val="Hyperlink"/>
@@ -11655,7 +11650,7 @@
       <w:r>
         <w:t xml:space="preserve"> </w:t>
       </w:r>
-      <w:hyperlink r:id="rId79">
+      <w:hyperlink r:id="rId78">
         <w:r>
           <w:rPr>
             <w:rStyle w:val="Hyperlink"/>
@@ -11680,7 +11675,7 @@
       <w:r>
         <w:t xml:space="preserve"> </w:t>
       </w:r>
-      <w:hyperlink r:id="rId80">
+      <w:hyperlink r:id="rId79">
         <w:r>
           <w:rPr>
             <w:rStyle w:val="Hyperlink"/>
@@ -11705,7 +11700,7 @@
       <w:r>
         <w:t xml:space="preserve"> </w:t>
       </w:r>
-      <w:hyperlink r:id="rId81">
+      <w:hyperlink r:id="rId80">
         <w:r>
           <w:rPr>
             <w:rStyle w:val="Hyperlink"/>
@@ -11748,7 +11743,7 @@
       <w:r>
         <w:t xml:space="preserve"> </w:t>
       </w:r>
-      <w:hyperlink r:id="rId82">
+      <w:hyperlink r:id="rId81">
         <w:r>
           <w:rPr>
             <w:rStyle w:val="Hyperlink"/>
@@ -11779,7 +11774,7 @@
       <w:r>
         <w:t xml:space="preserve"> </w:t>
       </w:r>
-      <w:hyperlink r:id="rId83">
+      <w:hyperlink r:id="rId82">
         <w:r>
           <w:rPr>
             <w:rStyle w:val="Hyperlink"/>
@@ -11816,7 +11811,7 @@
       <w:r>
         <w:t xml:space="preserve"> </w:t>
       </w:r>
-      <w:hyperlink r:id="rId84">
+      <w:hyperlink r:id="rId83">
         <w:r>
           <w:rPr>
             <w:rStyle w:val="Hyperlink"/>
@@ -11841,7 +11836,7 @@
       <w:r>
         <w:t xml:space="preserve"> </w:t>
       </w:r>
-      <w:hyperlink r:id="rId85">
+      <w:hyperlink r:id="rId84">
         <w:r>
           <w:rPr>
             <w:rStyle w:val="Hyperlink"/>
@@ -11899,7 +11894,7 @@
         <w:t xml:space="preserve">Nations, New York</w:t>
       </w:r>
     </w:p>
-    <w:bookmarkEnd w:id="86"/>
+    <w:bookmarkEnd w:id="85"/>
     <w:sectPr>
       <w:footerReference w:type="default" r:id="rId9"/>
       <w:footnotePr>

</xml_diff>

<commit_message>
paper 02 JPopE Gate-2 return: define FSU and AI at first use, spell out UNFPA, sort references by first author then year (Altonji 1997 before 2005), plainer abstract (150 words, numbers unchanged), Consent for publication; Editorial Manager in portal checklist; rebuilt PDFs and docx
</commit_message>
<xml_diff>
--- a/submission/02_grandparent_care/package/manuscript_anonymised.docx
+++ b/submission/02_grandparent_care/package/manuscript_anonymised.docx
@@ -29,7 +29,7 @@
         <w:pStyle w:val="Abstract"/>
       </w:pPr>
       <w:r>
-        <w:t xml:space="preserve">Do coresident grandmothers relieve mothers of childcare, and what do they give up? Same-day time diaries from India’s Time Use Survey 2024 cover both generations in each household. I compare 49,992 married mothers of children under six, 36% of whom live with a grandmother, and 26,062 women and 19,382 men aged 45 to 80 in the generation above them. The innovation is to measure grandmothers’ own time and to assign grandmothers and young children correctly in rosters without parent identifiers. Grandmothers living with a young grandchild report 79.5 minutes more childcare a day and less domestic work, free time and sleep. Mothers’ childcare and paid work differ little between households with and without a grandmother, the confidence intervals include zero, and the estimates are fragile. The contribution is to show that grandmother care is a costly transfer of older women’s time, while its benefit for mothers’ work is not established.</w:t>
+        <w:t xml:space="preserve">Do grandmothers at home relieve mothers of childcare, and what do they give up? Same-day time diaries from India’s Time Use Survey 2024 cover both generations in each household. I compare 49,992 married mothers of children under six, 36% of whom live with a grandmother, and 26,062 women and 19,382 men aged 45 to 80 in the generation above them. The innovation is to measure grandmothers’ own time and to link them correctly to young children, although household lists do not record each child’s mother. Grandmothers living with a young grandchild report 79.5 minutes more childcare a day and less domestic work, free time and sleep. Mothers’ childcare and paid work differ little between households with and without a grandmother; the differences could be zero and change with the method. The contribution is to show that grandmother care costs older women time, while its benefit for mothers’ work is unproven.</w:t>
       </w:r>
     </w:p>
     <w:p>
@@ -187,11 +187,11 @@
         <w:t xml:space="preserve">J22</w:t>
       </w:r>
     </w:p>
-    <w:bookmarkStart w:id="9" w:name="introduction"/>
     <w:p>
       <w:pPr>
         <w:pStyle w:val="Heading1"/>
       </w:pPr>
+      <w:bookmarkStart w:id="9" w:name="_introduction"/>
       <w:r>
         <w:rPr>
           <w:rStyle w:val="SectionNumber"/>
@@ -204,6 +204,7 @@
       <w:r>
         <w:t xml:space="preserve">Introduction</w:t>
       </w:r>
+      <w:bookmarkEnd w:id="9"/>
     </w:p>
     <w:p>
       <w:pPr>
@@ -366,85 +367,85 @@
         <w:t xml:space="preserve"> </w:t>
       </w:r>
       <w:r>
-        <w:t xml:space="preserve">(International Institute for Population Sciences et al. 2020; UNFPA and</w:t>
-      </w:r>
-      <w:r>
-        <w:t xml:space="preserve"> </w:t>
-      </w:r>
-      <w:r>
-        <w:t xml:space="preserve">International Institute for Population Sciences 2023). There are also</w:t>
-      </w:r>
-      <w:r>
-        <w:t xml:space="preserve"> </w:t>
-      </w:r>
-      <w:r>
-        <w:t xml:space="preserve">reasons to doubt that the evidence from other settings carries over.</w:t>
-      </w:r>
-      <w:r>
-        <w:t xml:space="preserve"> </w:t>
-      </w:r>
-      <w:r>
-        <w:t xml:space="preserve">Residence after marriage is predominantly patrilocal, so the coresident</w:t>
-      </w:r>
-      <w:r>
-        <w:t xml:space="preserve"> </w:t>
-      </w:r>
-      <w:r>
-        <w:t xml:space="preserve">grandmother is typically the mother-in-law, and the literature describes</w:t>
-      </w:r>
-      <w:r>
-        <w:t xml:space="preserve"> </w:t>
-      </w:r>
-      <w:r>
-        <w:t xml:space="preserve">the young daughter-in-law as the junior member of a hierarchy in which</w:t>
-      </w:r>
-      <w:r>
-        <w:t xml:space="preserve"> </w:t>
-      </w:r>
-      <w:r>
-        <w:t xml:space="preserve">her mobility and work outside the home are shaped by her husband’s</w:t>
-      </w:r>
-      <w:r>
-        <w:t xml:space="preserve"> </w:t>
-      </w:r>
-      <w:r>
-        <w:t xml:space="preserve">parents (Dyson and Moore 1983; Kandiyoti 1988; Jayachandran 2015;</w:t>
-      </w:r>
-      <w:r>
-        <w:t xml:space="preserve"> </w:t>
-      </w:r>
-      <w:r>
-        <w:t xml:space="preserve">Anukriti et al. 2020). Women in joint households in rural India are less</w:t>
-      </w:r>
-      <w:r>
-        <w:t xml:space="preserve"> </w:t>
-      </w:r>
-      <w:r>
-        <w:t xml:space="preserve">likely to be employed than women in nuclear households (Dhanaraj and</w:t>
-      </w:r>
-      <w:r>
-        <w:t xml:space="preserve"> </w:t>
-      </w:r>
-      <w:r>
-        <w:t xml:space="preserve">Mahambare 2019). A three-generation household is also a larger</w:t>
-      </w:r>
-      <w:r>
-        <w:t xml:space="preserve"> </w:t>
-      </w:r>
-      <w:r>
-        <w:t xml:space="preserve">household, with more meals to cook. Coresidence can therefore add to a</w:t>
-      </w:r>
-      <w:r>
-        <w:t xml:space="preserve"> </w:t>
-      </w:r>
-      <w:r>
-        <w:t xml:space="preserve">mother’s work as well as bring a potential substitute for her childcare.</w:t>
-      </w:r>
-      <w:r>
-        <w:t xml:space="preserve"> </w:t>
-      </w:r>
-      <w:r>
-        <w:t xml:space="preserve">I call these the</w:t>
+        <w:t xml:space="preserve">(International Institute for Population Sciences et al. 2020; United</w:t>
+      </w:r>
+      <w:r>
+        <w:t xml:space="preserve"> </w:t>
+      </w:r>
+      <w:r>
+        <w:t xml:space="preserve">Nations Population Fund and International Institute for Population</w:t>
+      </w:r>
+      <w:r>
+        <w:t xml:space="preserve"> </w:t>
+      </w:r>
+      <w:r>
+        <w:t xml:space="preserve">Sciences 2023). There are also reasons to doubt that the evidence from</w:t>
+      </w:r>
+      <w:r>
+        <w:t xml:space="preserve"> </w:t>
+      </w:r>
+      <w:r>
+        <w:t xml:space="preserve">other settings carries over. Residence after marriage is predominantly</w:t>
+      </w:r>
+      <w:r>
+        <w:t xml:space="preserve"> </w:t>
+      </w:r>
+      <w:r>
+        <w:t xml:space="preserve">patrilocal, so the coresident grandmother is typically the</w:t>
+      </w:r>
+      <w:r>
+        <w:t xml:space="preserve"> </w:t>
+      </w:r>
+      <w:r>
+        <w:t xml:space="preserve">mother-in-law, and the literature describes the young daughter-in-law as</w:t>
+      </w:r>
+      <w:r>
+        <w:t xml:space="preserve"> </w:t>
+      </w:r>
+      <w:r>
+        <w:t xml:space="preserve">the junior member of a hierarchy in which her mobility and work outside</w:t>
+      </w:r>
+      <w:r>
+        <w:t xml:space="preserve"> </w:t>
+      </w:r>
+      <w:r>
+        <w:t xml:space="preserve">the home are shaped by her husband’s parents (Dyson and Moore 1983;</w:t>
+      </w:r>
+      <w:r>
+        <w:t xml:space="preserve"> </w:t>
+      </w:r>
+      <w:r>
+        <w:t xml:space="preserve">Kandiyoti 1988; Jayachandran 2015; Anukriti et al. 2020). Women in joint</w:t>
+      </w:r>
+      <w:r>
+        <w:t xml:space="preserve"> </w:t>
+      </w:r>
+      <w:r>
+        <w:t xml:space="preserve">households in rural India are less likely to be employed than women in</w:t>
+      </w:r>
+      <w:r>
+        <w:t xml:space="preserve"> </w:t>
+      </w:r>
+      <w:r>
+        <w:t xml:space="preserve">nuclear households (Dhanaraj and Mahambare 2019). A three-generation</w:t>
+      </w:r>
+      <w:r>
+        <w:t xml:space="preserve"> </w:t>
+      </w:r>
+      <w:r>
+        <w:t xml:space="preserve">household is also a larger household, with more meals to cook.</w:t>
+      </w:r>
+      <w:r>
+        <w:t xml:space="preserve"> </w:t>
+      </w:r>
+      <w:r>
+        <w:t xml:space="preserve">Coresidence can therefore add to a mother’s work as well as bring a</w:t>
+      </w:r>
+      <w:r>
+        <w:t xml:space="preserve"> </w:t>
+      </w:r>
+      <w:r>
+        <w:t xml:space="preserve">potential substitute for her childcare. I call these the</w:t>
       </w:r>
       <w:r>
         <w:t xml:space="preserve"> </w:t>
@@ -855,12 +856,11 @@
         <w:t xml:space="preserve">cross-section.</w:t>
       </w:r>
     </w:p>
-    <w:bookmarkEnd w:id="9"/>
-    <w:bookmarkStart w:id="15" w:name="background-and-conceptual-framework"/>
     <w:p>
       <w:pPr>
         <w:pStyle w:val="Heading1"/>
       </w:pPr>
+      <w:bookmarkStart w:id="10" w:name="_78e1b52b0f703051a79244e00e492d61582b0e3"/>
       <w:r>
         <w:rPr>
           <w:rStyle w:val="SectionNumber"/>
@@ -879,12 +879,13 @@
       <w:r>
         <w:t xml:space="preserve">framework</w:t>
       </w:r>
-    </w:p>
-    <w:bookmarkStart w:id="10" w:name="X29b95bf9a6693f926e8c4d669e21478d1a9d47e"/>
+      <w:bookmarkEnd w:id="10"/>
+    </w:p>
     <w:p>
       <w:pPr>
         <w:pStyle w:val="Heading2"/>
       </w:pPr>
+      <w:bookmarkStart w:id="11" w:name="_29b95bf9a6693f926e8c4d669e21478d1a9d47e"/>
       <w:r>
         <w:rPr>
           <w:rStyle w:val="SectionNumber"/>
@@ -903,6 +904,7 @@
       <w:r>
         <w:t xml:space="preserve">employment</w:t>
       </w:r>
+      <w:bookmarkEnd w:id="11"/>
     </w:p>
     <w:p>
       <w:pPr>
@@ -1070,12 +1072,11 @@
         <w:t xml:space="preserve">daughter-in-law’s time as well as help with it.</w:t>
       </w:r>
     </w:p>
-    <w:bookmarkEnd w:id="10"/>
-    <w:bookmarkStart w:id="11" w:name="Xb41eb730f0155ef637132b6eacff04b5712ca21"/>
     <w:p>
       <w:pPr>
         <w:pStyle w:val="Heading2"/>
       </w:pPr>
+      <w:bookmarkStart w:id="12" w:name="_b41eb730f0155ef637132b6eacff04b5712ca21"/>
       <w:r>
         <w:rPr>
           <w:rStyle w:val="SectionNumber"/>
@@ -1094,6 +1095,7 @@
       <w:r>
         <w:t xml:space="preserve">transfers</w:t>
       </w:r>
+      <w:bookmarkEnd w:id="12"/>
     </w:p>
     <w:p>
       <w:pPr>
@@ -1199,12 +1201,11 @@
         <w:t xml:space="preserve">capacity to give care.</w:t>
       </w:r>
     </w:p>
-    <w:bookmarkEnd w:id="11"/>
-    <w:bookmarkStart w:id="12" w:name="patrilocality-and-womens-work-in-india"/>
     <w:p>
       <w:pPr>
         <w:pStyle w:val="Heading2"/>
       </w:pPr>
+      <w:bookmarkStart w:id="13" w:name="_fcd87c5521d4a0d5b432e8a5b5e11f6efbb1c8f"/>
       <w:r>
         <w:rPr>
           <w:rStyle w:val="SectionNumber"/>
@@ -1223,6 +1224,7 @@
       <w:r>
         <w:t xml:space="preserve">India</w:t>
       </w:r>
+      <w:bookmarkEnd w:id="13"/>
     </w:p>
     <w:p>
       <w:pPr>
@@ -1316,12 +1318,11 @@
         <w:t xml:space="preserve">decision-making, not time.</w:t>
       </w:r>
     </w:p>
-    <w:bookmarkEnd w:id="12"/>
-    <w:bookmarkStart w:id="13" w:name="measuring-childcare-in-time-diaries"/>
     <w:p>
       <w:pPr>
         <w:pStyle w:val="Heading2"/>
       </w:pPr>
+      <w:bookmarkStart w:id="14" w:name="_aa597b8d1b44508c81b23d6fdf2b4c3af969429"/>
       <w:r>
         <w:rPr>
           <w:rStyle w:val="SectionNumber"/>
@@ -1340,6 +1341,7 @@
       <w:r>
         <w:t xml:space="preserve">diaries</w:t>
       </w:r>
+      <w:bookmarkEnd w:id="14"/>
     </w:p>
     <w:p>
       <w:pPr>
@@ -1403,12 +1405,11 @@
         <w:t xml:space="preserve">the care that requires her, or the reverse.</w:t>
       </w:r>
     </w:p>
-    <w:bookmarkEnd w:id="13"/>
-    <w:bookmarkStart w:id="14" w:name="conceptual-framework"/>
     <w:p>
       <w:pPr>
         <w:pStyle w:val="Heading2"/>
       </w:pPr>
+      <w:bookmarkStart w:id="15" w:name="_1b505399bed3acc8fdc04835fb05f12ea6338bd"/>
       <w:r>
         <w:rPr>
           <w:rStyle w:val="SectionNumber"/>
@@ -1421,6 +1422,7 @@
       <w:r>
         <w:t xml:space="preserve">Conceptual framework</w:t>
       </w:r>
+      <w:bookmarkEnd w:id="15"/>
     </w:p>
     <w:p>
       <w:pPr>
@@ -1544,13 +1546,11 @@
         <w:t xml:space="preserve">interpretation discussed below.</w:t>
       </w:r>
     </w:p>
-    <w:bookmarkEnd w:id="14"/>
-    <w:bookmarkEnd w:id="15"/>
-    <w:bookmarkStart w:id="22" w:name="data-and-methods"/>
     <w:p>
       <w:pPr>
         <w:pStyle w:val="Heading1"/>
       </w:pPr>
+      <w:bookmarkStart w:id="16" w:name="_b9a8e801bfeea5bd8eadcb0dda61d19118fd322"/>
       <w:r>
         <w:rPr>
           <w:rStyle w:val="SectionNumber"/>
@@ -1563,12 +1563,13 @@
       <w:r>
         <w:t xml:space="preserve">Data and methods</w:t>
       </w:r>
-    </w:p>
-    <w:bookmarkStart w:id="16" w:name="the-time-use-survey-2024"/>
+      <w:bookmarkEnd w:id="16"/>
+    </w:p>
     <w:p>
       <w:pPr>
         <w:pStyle w:val="Heading2"/>
       </w:pPr>
+      <w:bookmarkStart w:id="17" w:name="_c1850aa0144690795d1fc6cde6032883bfcb8fb"/>
       <w:r>
         <w:rPr>
           <w:rStyle w:val="SectionNumber"/>
@@ -1581,6 +1582,7 @@
       <w:r>
         <w:t xml:space="preserve">The Time Use Survey 2024</w:t>
       </w:r>
+      <w:bookmarkEnd w:id="17"/>
     </w:p>
     <w:p>
       <w:pPr>
@@ -1611,25 +1613,25 @@
         <w:t xml:space="preserve"> </w:t>
       </w:r>
       <w:r>
-        <w:t xml:space="preserve">drawn in a stratified multi-stage design with First Stage Units</w:t>
-      </w:r>
-      <w:r>
-        <w:t xml:space="preserve"> </w:t>
-      </w:r>
-      <w:r>
-        <w:t xml:space="preserve">(villages and urban blocks) as primary sampling units. Every member aged</w:t>
-      </w:r>
-      <w:r>
-        <w:t xml:space="preserve"> </w:t>
-      </w:r>
-      <w:r>
-        <w:t xml:space="preserve">six and above reports a 24-hour diary for the day before the interview,</w:t>
-      </w:r>
-      <w:r>
-        <w:t xml:space="preserve"> </w:t>
-      </w:r>
-      <w:r>
-        <w:t xml:space="preserve">from 4 a.m. to 4 a.m., in time slots that can contain several</w:t>
+        <w:t xml:space="preserve">drawn in a stratified multi-stage design with First Stage Units (FSU),</w:t>
+      </w:r>
+      <w:r>
+        <w:t xml:space="preserve"> </w:t>
+      </w:r>
+      <w:r>
+        <w:t xml:space="preserve">that is, villages and urban blocks, as primary sampling units. Every</w:t>
+      </w:r>
+      <w:r>
+        <w:t xml:space="preserve"> </w:t>
+      </w:r>
+      <w:r>
+        <w:t xml:space="preserve">member aged six and above reports a 24-hour diary for the day before the</w:t>
+      </w:r>
+      <w:r>
+        <w:t xml:space="preserve"> </w:t>
+      </w:r>
+      <w:r>
+        <w:t xml:space="preserve">interview, from 4 a.m. to 4 a.m., in time slots that can contain several</w:t>
       </w:r>
       <w:r>
         <w:t xml:space="preserve"> </w:t>
@@ -1647,31 +1649,31 @@
         <w:t xml:space="preserve"> </w:t>
       </w:r>
       <w:r>
-        <w:t xml:space="preserve">for 450,457 diarists in 139,487 households and 9,969 First Stage Units.</w:t>
-      </w:r>
-      <w:r>
-        <w:t xml:space="preserve"> </w:t>
-      </w:r>
-      <w:r>
-        <w:t xml:space="preserve">Minutes of major activities are summed to the person-day, and all but</w:t>
-      </w:r>
-      <w:r>
-        <w:t xml:space="preserve"> </w:t>
-      </w:r>
-      <w:r>
-        <w:t xml:space="preserve">five of the 450,457 diaries sum to exactly 1,440 minutes. I exclude 49</w:t>
-      </w:r>
-      <w:r>
-        <w:t xml:space="preserve"> </w:t>
-      </w:r>
-      <w:r>
-        <w:t xml:space="preserve">persons recorded as third gender from the analyses because the sample is</w:t>
-      </w:r>
-      <w:r>
-        <w:t xml:space="preserve"> </w:t>
-      </w:r>
-      <w:r>
-        <w:t xml:space="preserve">too small for separate estimates; they remain in household composition.</w:t>
+        <w:t xml:space="preserve">for 450,457 diarists in 139,487 households and 9,969 FSUs. Minutes of</w:t>
+      </w:r>
+      <w:r>
+        <w:t xml:space="preserve"> </w:t>
+      </w:r>
+      <w:r>
+        <w:t xml:space="preserve">major activities are summed to the person-day, and all but five of the</w:t>
+      </w:r>
+      <w:r>
+        <w:t xml:space="preserve"> </w:t>
+      </w:r>
+      <w:r>
+        <w:t xml:space="preserve">450,457 diaries sum to exactly 1,440 minutes. I exclude 49 persons</w:t>
+      </w:r>
+      <w:r>
+        <w:t xml:space="preserve"> </w:t>
+      </w:r>
+      <w:r>
+        <w:t xml:space="preserve">recorded as third gender from the analyses because the sample is too</w:t>
+      </w:r>
+      <w:r>
+        <w:t xml:space="preserve"> </w:t>
+      </w:r>
+      <w:r>
+        <w:t xml:space="preserve">small for separate estimates; they remain in household composition.</w:t>
       </w:r>
       <w:r>
         <w:t xml:space="preserve"> </w:t>
@@ -1683,27 +1685,20 @@
         <w:t xml:space="preserve"> </w:t>
       </w:r>
       <w:r>
-        <w:t xml:space="preserve">the First Stage Unit (Solon et al. 2015; Abadie et al. 2023). The survey</w:t>
-      </w:r>
-      <w:r>
-        <w:t xml:space="preserve"> </w:t>
-      </w:r>
-      <w:r>
-        <w:t xml:space="preserve">construction checks and the sample construction are in Online Resource</w:t>
-      </w:r>
-      <w:r>
-        <w:t xml:space="preserve"> </w:t>
-      </w:r>
-      <w:r>
-        <w:t xml:space="preserve">1.</w:t>
-      </w:r>
-    </w:p>
-    <w:bookmarkEnd w:id="16"/>
-    <w:bookmarkStart w:id="17" w:name="X86e15d5dc2f18420692202b3a7cf5da3d5f9521"/>
+        <w:t xml:space="preserve">the FSU (Solon et al. 2015; Abadie et al. 2023). The survey construction</w:t>
+      </w:r>
+      <w:r>
+        <w:t xml:space="preserve"> </w:t>
+      </w:r>
+      <w:r>
+        <w:t xml:space="preserve">checks and the sample construction are in Online Resource 1.</w:t>
+      </w:r>
+    </w:p>
     <w:p>
       <w:pPr>
         <w:pStyle w:val="Heading2"/>
       </w:pPr>
+      <w:bookmarkStart w:id="18" w:name="_86e15d5dc2f18420692202b3a7cf5da3d5f9521"/>
       <w:r>
         <w:rPr>
           <w:rStyle w:val="SectionNumber"/>
@@ -1722,6 +1717,7 @@
       <w:r>
         <w:t xml:space="preserve">grandparents</w:t>
       </w:r>
+      <w:bookmarkEnd w:id="18"/>
     </w:p>
     <w:p>
       <w:pPr>
@@ -1943,12 +1939,11 @@
         <w:t xml:space="preserve">their usual principal activity status.</w:t>
       </w:r>
     </w:p>
-    <w:bookmarkEnd w:id="17"/>
-    <w:bookmarkStart w:id="19" w:name="time-outcomes"/>
     <w:p>
       <w:pPr>
         <w:pStyle w:val="Heading2"/>
       </w:pPr>
+      <w:bookmarkStart w:id="19" w:name="_524723a5178f7f1f02cee38483187a22ad9da83"/>
       <w:r>
         <w:rPr>
           <w:rStyle w:val="SectionNumber"/>
@@ -1961,6 +1956,7 @@
       <w:r>
         <w:t xml:space="preserve">Time outcomes</w:t>
       </w:r>
+      <w:bookmarkEnd w:id="19"/>
     </w:p>
     <w:p>
       <w:pPr>
@@ -2028,7 +2024,7 @@
       <w:r>
         <w:t xml:space="preserve"> </w:t>
       </w:r>
-      <w:hyperlink w:anchor="tab:desc">
+      <w:hyperlink w:anchor="_32eab13c41a40ee25acd11afb5cf39d70818b1b">
         <w:r>
           <w:rPr>
             <w:rStyle w:val="Hyperlink"/>
@@ -2073,7 +2069,7 @@
         <w:t xml:space="preserve">nuclear households, which motivates the regression approach.</w:t>
       </w:r>
     </w:p>
-    <w:bookmarkStart w:id="18" w:name="tab:desc"/>
+    <w:bookmarkStart w:id="20" w:name="_32eab13c41a40ee25acd11afb5cf39d70818b1b"/>
     <w:p>
       <w:pPr>
         <w:pStyle w:val="TableCaption"/>
@@ -2699,10 +2695,10 @@
         </w:tc>
       </w:tr>
     </w:tbl>
-    <w:bookmarkEnd w:id="18"/>
-    <w:p>
-      <w:pPr>
-        <w:pStyle w:val="BodyText"/>
+    <w:bookmarkEnd w:id="20"/>
+    <w:p>
+      <w:pPr>
+        <w:pStyle w:val="FirstParagraph"/>
       </w:pPr>
       <w:r>
         <w:rPr>
@@ -2718,12 +2714,11 @@
         <w:t xml:space="preserve">Married women aged 18–49 at head or junior level in households with a child under six, excluding head-level women who live with a junior married woman of childbearing age. Survey-weighted means; FSU-clustered standard errors in parentheses. Employed is a share (three decimals).</w:t>
       </w:r>
     </w:p>
-    <w:bookmarkEnd w:id="19"/>
-    <w:bookmarkStart w:id="20" w:name="empirical-strategy"/>
     <w:p>
       <w:pPr>
         <w:pStyle w:val="Heading2"/>
       </w:pPr>
+      <w:bookmarkStart w:id="21" w:name="_bdc33038afa4dbf56141151eaf4e1f0fb828ac7"/>
       <w:r>
         <w:rPr>
           <w:rStyle w:val="SectionNumber"/>
@@ -2736,6 +2731,7 @@
       <w:r>
         <w:t xml:space="preserve">Empirical strategy</w:t>
       </w:r>
+      <w:bookmarkEnd w:id="21"/>
     </w:p>
     <w:p>
       <w:pPr>
@@ -2844,7 +2840,6 @@
           <m:e>
             <m:r>
               <m:rPr>
-                <m:nor/>
                 <m:sty m:val="i"/>
               </m:rPr>
               <m:t>GM</m:t>
@@ -3004,7 +2999,6 @@
           <m:e>
             <m:r>
               <m:rPr>
-                <m:nor/>
                 <m:sty m:val="i"/>
               </m:rPr>
               <m:t>GM</m:t>
@@ -3338,12 +3332,11 @@
         <w:t xml:space="preserve">the junior couple’s fertility rather than on the decision to coreside.</w:t>
       </w:r>
     </w:p>
-    <w:bookmarkEnd w:id="20"/>
-    <w:bookmarkStart w:id="21" w:name="X90b7888b522092842ac45b955dfaad9113e43e6"/>
     <w:p>
       <w:pPr>
         <w:pStyle w:val="Heading2"/>
       </w:pPr>
+      <w:bookmarkStart w:id="22" w:name="_39cc1ca9d7d0bee0fc59c334569c147cedf5f3b"/>
       <w:r>
         <w:rPr>
           <w:rStyle w:val="SectionNumber"/>
@@ -3354,7 +3347,13 @@
         <w:tab/>
       </w:r>
       <w:r>
-        <w:t xml:space="preserve">Ethics, data availability and the use of AI</w:t>
+        <w:t xml:space="preserve">Ethics, data availability and the use of artificial</w:t>
+      </w:r>
+      <w:r>
+        <w:t xml:space="preserve"> </w:t>
+      </w:r>
+      <w:r>
+        <w:t xml:space="preserve">intelligence</w:t>
       </w:r>
       <w:r>
         <w:t xml:space="preserve"> </w:t>
@@ -3362,6 +3361,7 @@
       <w:r>
         <w:t xml:space="preserve">tools</w:t>
       </w:r>
+      <w:bookmarkEnd w:id="22"/>
     </w:p>
     <w:p>
       <w:pPr>
@@ -3392,40 +3392,38 @@
         <w:t xml:space="preserve"> </w:t>
       </w:r>
       <w:r>
-        <w:t xml:space="preserve">available on acceptance. AI tools (Claude (Anthropic) and other AI</w:t>
-      </w:r>
-      <w:r>
-        <w:t xml:space="preserve"> </w:t>
-      </w:r>
-      <w:r>
-        <w:t xml:space="preserve">assistants) were used to help write and check analysis code, to check</w:t>
-      </w:r>
-      <w:r>
-        <w:t xml:space="preserve"> </w:t>
-      </w:r>
-      <w:r>
-        <w:t xml:space="preserve">references and to draft text. The author reviewed and verified all code,</w:t>
-      </w:r>
-      <w:r>
-        <w:t xml:space="preserve"> </w:t>
-      </w:r>
-      <w:r>
-        <w:t xml:space="preserve">results, references and text and takes full responsibility for the</w:t>
-      </w:r>
-      <w:r>
-        <w:t xml:space="preserve"> </w:t>
-      </w:r>
-      <w:r>
-        <w:t xml:space="preserve">content.</w:t>
-      </w:r>
-    </w:p>
-    <w:bookmarkEnd w:id="21"/>
-    <w:bookmarkEnd w:id="22"/>
-    <w:bookmarkStart w:id="37" w:name="results"/>
+        <w:t xml:space="preserve">available on acceptance. Artificial intelligence (AI) tools (Claude</w:t>
+      </w:r>
+      <w:r>
+        <w:t xml:space="preserve"> </w:t>
+      </w:r>
+      <w:r>
+        <w:t xml:space="preserve">(Anthropic) and other AI assistants) were used to help write and check</w:t>
+      </w:r>
+      <w:r>
+        <w:t xml:space="preserve"> </w:t>
+      </w:r>
+      <w:r>
+        <w:t xml:space="preserve">analysis code, to check references and to draft text. The author</w:t>
+      </w:r>
+      <w:r>
+        <w:t xml:space="preserve"> </w:t>
+      </w:r>
+      <w:r>
+        <w:t xml:space="preserve">reviewed and verified all code, results, references and text and takes</w:t>
+      </w:r>
+      <w:r>
+        <w:t xml:space="preserve"> </w:t>
+      </w:r>
+      <w:r>
+        <w:t xml:space="preserve">full responsibility for the content.</w:t>
+      </w:r>
+    </w:p>
     <w:p>
       <w:pPr>
         <w:pStyle w:val="Heading1"/>
       </w:pPr>
+      <w:bookmarkStart w:id="23" w:name="_results"/>
       <w:r>
         <w:rPr>
           <w:rStyle w:val="SectionNumber"/>
@@ -3438,12 +3436,13 @@
       <w:r>
         <w:t xml:space="preserve">Results</w:t>
       </w:r>
-    </w:p>
-    <w:bookmarkStart w:id="24" w:name="mothers-time"/>
+      <w:bookmarkEnd w:id="23"/>
+    </w:p>
     <w:p>
       <w:pPr>
         <w:pStyle w:val="Heading2"/>
       </w:pPr>
+      <w:bookmarkStart w:id="24" w:name="_28f7920bf6ad7f23f996a76558ed9ba58103167"/>
       <w:r>
         <w:rPr>
           <w:rStyle w:val="SectionNumber"/>
@@ -3456,6 +3455,7 @@
       <w:r>
         <w:t xml:space="preserve">Mothers’ time</w:t>
       </w:r>
+      <w:bookmarkEnd w:id="24"/>
     </w:p>
     <w:p>
       <w:pPr>
@@ -3467,7 +3467,7 @@
       <w:r>
         <w:t xml:space="preserve"> </w:t>
       </w:r>
-      <w:hyperlink w:anchor="tab:main">
+      <w:hyperlink w:anchor="_2d3306491f8074877991796d556fbadbc1a72cc">
         <w:r>
           <w:rPr>
             <w:rStyle w:val="Hyperlink"/>
@@ -3542,7 +3542,7 @@
         <w:t xml:space="preserve">the lower supervision is not confined to primary care.</w:t>
       </w:r>
     </w:p>
-    <w:bookmarkStart w:id="23" w:name="tab:main"/>
+    <w:bookmarkStart w:id="25" w:name="_2d3306491f8074877991796d556fbadbc1a72cc"/>
     <w:p>
       <w:pPr>
         <w:pStyle w:val="TableCaption"/>
@@ -4554,10 +4554,10 @@
         </w:tc>
       </w:tr>
     </w:tbl>
-    <w:bookmarkEnd w:id="23"/>
-    <w:p>
-      <w:pPr>
-        <w:pStyle w:val="BodyText"/>
+    <w:bookmarkEnd w:id="25"/>
+    <w:p>
+      <w:pPr>
+        <w:pStyle w:val="FirstParagraph"/>
       </w:pPr>
       <w:r>
         <w:rPr>
@@ -4703,12 +4703,11 @@
         <w:t xml:space="preserve">by grandmother and by household arrangement.</w:t>
       </w:r>
     </w:p>
-    <w:bookmarkEnd w:id="24"/>
-    <w:bookmarkStart w:id="26" w:name="X1113e58cf5848ee7a44104feba01ee8193a7640"/>
     <w:p>
       <w:pPr>
         <w:pStyle w:val="Heading2"/>
       </w:pPr>
+      <w:bookmarkStart w:id="26" w:name="_1113e58cf5848ee7a44104feba01ee8193a7640"/>
       <w:r>
         <w:rPr>
           <w:rStyle w:val="SectionNumber"/>
@@ -4727,6 +4726,7 @@
       <w:r>
         <w:t xml:space="preserve">households</w:t>
       </w:r>
+      <w:bookmarkEnd w:id="26"/>
     </w:p>
     <w:p>
       <w:pPr>
@@ -4738,7 +4738,7 @@
       <w:r>
         <w:t xml:space="preserve"> </w:t>
       </w:r>
-      <w:hyperlink w:anchor="tab:who">
+      <w:hyperlink w:anchor="_be3d5bb4bcb5dc58eff7bb083b7ad594321de31">
         <w:r>
           <w:rPr>
             <w:rStyle w:val="Hyperlink"/>
@@ -4855,7 +4855,7 @@
         <w:t xml:space="preserve">household’s total.</w:t>
       </w:r>
     </w:p>
-    <w:bookmarkStart w:id="25" w:name="tab:who"/>
+    <w:bookmarkStart w:id="27" w:name="_be3d5bb4bcb5dc58eff7bb083b7ad594321de31"/>
     <w:p>
       <w:pPr>
         <w:pStyle w:val="TableCaption"/>
@@ -5231,10 +5231,10 @@
         </w:tc>
       </w:tr>
     </w:tbl>
-    <w:bookmarkEnd w:id="25"/>
-    <w:p>
-      <w:pPr>
-        <w:pStyle w:val="BodyText"/>
+    <w:bookmarkEnd w:id="27"/>
+    <w:p>
+      <w:pPr>
+        <w:pStyle w:val="FirstParagraph"/>
       </w:pPr>
       <w:r>
         <w:rPr>
@@ -5250,12 +5250,11 @@
         <w:t xml:space="preserve">Unit: mothers in the analysis sample. Minutes of primary childcare of each household member, survey-weighted means with FSU-clustered standard errors; 95 percent confidence intervals use the normal approximation. Other members include husbands who are not linked through the roster. All members is the household total and includes care given to other children in the household.</w:t>
       </w:r>
     </w:p>
-    <w:bookmarkEnd w:id="26"/>
-    <w:bookmarkStart w:id="28" w:name="the-older-generations-time"/>
     <w:p>
       <w:pPr>
         <w:pStyle w:val="Heading2"/>
       </w:pPr>
+      <w:bookmarkStart w:id="28" w:name="_38a0774d74550bc09629a15d8faf6b2a470da44"/>
       <w:r>
         <w:rPr>
           <w:rStyle w:val="SectionNumber"/>
@@ -5274,6 +5273,7 @@
       <w:r>
         <w:t xml:space="preserve">time</w:t>
       </w:r>
+      <w:bookmarkEnd w:id="28"/>
     </w:p>
     <w:p>
       <w:pPr>
@@ -5285,7 +5285,7 @@
       <w:r>
         <w:t xml:space="preserve"> </w:t>
       </w:r>
-      <w:hyperlink w:anchor="tab:og">
+      <w:hyperlink w:anchor="_f294cdcd745397e2585ca03b9caa9755a4c1ee4">
         <w:r>
           <w:rPr>
             <w:rStyle w:val="Hyperlink"/>
@@ -5396,7 +5396,7 @@
         <w:t xml:space="preserve">time and sleep rather than on earnings.</w:t>
       </w:r>
     </w:p>
-    <w:bookmarkStart w:id="27" w:name="tab:og"/>
+    <w:bookmarkStart w:id="29" w:name="_f294cdcd745397e2585ca03b9caa9755a4c1ee4"/>
     <w:p>
       <w:pPr>
         <w:pStyle w:val="TableCaption"/>
@@ -6162,10 +6162,10 @@
         </w:tc>
       </w:tr>
     </w:tbl>
-    <w:bookmarkEnd w:id="27"/>
-    <w:p>
-      <w:pPr>
-        <w:pStyle w:val="BodyText"/>
+    <w:bookmarkEnd w:id="29"/>
+    <w:p>
+      <w:pPr>
+        <w:pStyle w:val="FirstParagraph"/>
       </w:pPr>
       <w:r>
         <w:rPr>
@@ -6231,12 +6231,11 @@
         <w:t xml:space="preserve">differs by gender beyond the amount of care.</w:t>
       </w:r>
     </w:p>
-    <w:bookmarkEnd w:id="28"/>
-    <w:bookmarkStart w:id="30" w:name="which-grandmothers-matter"/>
     <w:p>
       <w:pPr>
         <w:pStyle w:val="Heading2"/>
       </w:pPr>
+      <w:bookmarkStart w:id="30" w:name="_1e764ce523a6bcb8d53ff8bd725268f1520e403"/>
       <w:r>
         <w:rPr>
           <w:rStyle w:val="SectionNumber"/>
@@ -6249,6 +6248,7 @@
       <w:r>
         <w:t xml:space="preserve">Which grandmothers matter</w:t>
       </w:r>
+      <w:bookmarkEnd w:id="30"/>
     </w:p>
     <w:p>
       <w:pPr>
@@ -6260,7 +6260,7 @@
       <w:r>
         <w:t xml:space="preserve"> </w:t>
       </w:r>
-      <w:hyperlink w:anchor="tab:gptype">
+      <w:hyperlink w:anchor="_d728e339bf7a235f4b8e0946bfe97b624c3cc63">
         <w:r>
           <w:rPr>
             <w:rStyle w:val="Hyperlink"/>
@@ -6335,7 +6335,7 @@
         <w:t xml:space="preserve">to be in paid work and so more available at home.</w:t>
       </w:r>
     </w:p>
-    <w:bookmarkStart w:id="29" w:name="tab:gptype"/>
+    <w:bookmarkStart w:id="31" w:name="_d728e339bf7a235f4b8e0946bfe97b624c3cc63"/>
     <w:p>
       <w:pPr>
         <w:pStyle w:val="TableCaption"/>
@@ -6911,10 +6911,10 @@
         </w:tc>
       </w:tr>
     </w:tbl>
-    <w:bookmarkEnd w:id="29"/>
-    <w:p>
-      <w:pPr>
-        <w:pStyle w:val="BodyText"/>
+    <w:bookmarkEnd w:id="31"/>
+    <w:p>
+      <w:pPr>
+        <w:pStyle w:val="FirstParagraph"/>
       </w:pPr>
       <w:r>
         <w:rPr>
@@ -7060,12 +7060,11 @@
         <w:t xml:space="preserve">they do not rule out selection.</w:t>
       </w:r>
     </w:p>
-    <w:bookmarkEnd w:id="30"/>
-    <w:bookmarkStart w:id="32" w:name="differences-by-household-arrangement"/>
     <w:p>
       <w:pPr>
         <w:pStyle w:val="Heading2"/>
       </w:pPr>
+      <w:bookmarkStart w:id="32" w:name="_6642d9e0e0ab4474145932a3534ba7a0a99f8ef"/>
       <w:r>
         <w:rPr>
           <w:rStyle w:val="SectionNumber"/>
@@ -7084,6 +7083,7 @@
       <w:r>
         <w:t xml:space="preserve">arrangement</w:t>
       </w:r>
+      <w:bookmarkEnd w:id="32"/>
     </w:p>
     <w:p>
       <w:pPr>
@@ -7095,7 +7095,7 @@
       <w:r>
         <w:t xml:space="preserve"> </w:t>
       </w:r>
-      <w:hyperlink w:anchor="tab:het">
+      <w:hyperlink w:anchor="_43bf129cbf290ef8eb59d2eab67c8b98afea1c7">
         <w:r>
           <w:rPr>
             <w:rStyle w:val="Hyperlink"/>
@@ -7194,7 +7194,7 @@
         <w:t xml:space="preserve">compared with -2.1 minutes (CI -4.6 to 0.4) in the pooled specification.</w:t>
       </w:r>
     </w:p>
-    <w:bookmarkStart w:id="31" w:name="tab:het"/>
+    <w:bookmarkStart w:id="33" w:name="_43bf129cbf290ef8eb59d2eab67c8b98afea1c7"/>
     <w:p>
       <w:pPr>
         <w:pStyle w:val="TableCaption"/>
@@ -7815,10 +7815,10 @@
         </w:tc>
       </w:tr>
     </w:tbl>
-    <w:bookmarkEnd w:id="31"/>
-    <w:p>
-      <w:pPr>
-        <w:pStyle w:val="BodyText"/>
+    <w:bookmarkEnd w:id="33"/>
+    <w:p>
+      <w:pPr>
+        <w:pStyle w:val="FirstParagraph"/>
       </w:pPr>
       <w:r>
         <w:rPr>
@@ -7920,12 +7920,11 @@
         <w:t xml:space="preserve">as evidence of no association.</w:t>
       </w:r>
     </w:p>
-    <w:bookmarkEnd w:id="32"/>
-    <w:bookmarkStart w:id="34" w:name="a-placebo-mothers-of-school-age-children"/>
     <w:p>
       <w:pPr>
         <w:pStyle w:val="Heading2"/>
       </w:pPr>
+      <w:bookmarkStart w:id="34" w:name="_86d69f2043119dc4cf7f5e853d310eb8eb07deb"/>
       <w:r>
         <w:rPr>
           <w:rStyle w:val="SectionNumber"/>
@@ -7944,6 +7943,7 @@
       <w:r>
         <w:t xml:space="preserve">children</w:t>
       </w:r>
+      <w:bookmarkEnd w:id="34"/>
     </w:p>
     <w:p>
       <w:pPr>
@@ -7979,7 +7979,7 @@
       <w:r>
         <w:t xml:space="preserve"> </w:t>
       </w:r>
-      <w:hyperlink w:anchor="tab:placebo">
+      <w:hyperlink w:anchor="_309c9316dd1f02b0d2fa325578a010c13f69733">
         <w:r>
           <w:rPr>
             <w:rStyle w:val="Hyperlink"/>
@@ -8084,7 +8084,7 @@
         <w:t xml:space="preserve">main estimates reflects household traits.</w:t>
       </w:r>
     </w:p>
-    <w:bookmarkStart w:id="33" w:name="tab:placebo"/>
+    <w:bookmarkStart w:id="35" w:name="_309c9316dd1f02b0d2fa325578a010c13f69733"/>
     <w:p>
       <w:pPr>
         <w:pStyle w:val="TableCaption"/>
@@ -8507,10 +8507,10 @@
         </w:tc>
       </w:tr>
     </w:tbl>
-    <w:bookmarkEnd w:id="33"/>
-    <w:p>
-      <w:pPr>
-        <w:pStyle w:val="BodyText"/>
+    <w:bookmarkEnd w:id="35"/>
+    <w:p>
+      <w:pPr>
+        <w:pStyle w:val="FirstParagraph"/>
       </w:pPr>
       <w:r>
         <w:rPr>
@@ -8526,12 +8526,11 @@
         <w:t xml:space="preserve">Estimate [95 percent confidence interval] for the grandmother indicator. Column 1: analysis sample (49,992 mothers). Column 2: mothers defined in the same way with no child under six in the household and an identified youngest own child aged 6 to 14 (19,829 mothers). Difference: column 1 minus column 2, with a standard error that ignores the covariance of the two estimates. Controls as in the main specification.</w:t>
       </w:r>
     </w:p>
-    <w:bookmarkEnd w:id="34"/>
-    <w:bookmarkStart w:id="36" w:name="robustness"/>
     <w:p>
       <w:pPr>
         <w:pStyle w:val="Heading2"/>
       </w:pPr>
+      <w:bookmarkStart w:id="36" w:name="_robustness"/>
       <w:r>
         <w:rPr>
           <w:rStyle w:val="SectionNumber"/>
@@ -8544,6 +8543,7 @@
       <w:r>
         <w:t xml:space="preserve">Robustness</w:t>
       </w:r>
+      <w:bookmarkEnd w:id="36"/>
     </w:p>
     <w:p>
       <w:pPr>
@@ -8555,7 +8555,7 @@
       <w:r>
         <w:t xml:space="preserve"> </w:t>
       </w:r>
-      <w:hyperlink w:anchor="tab:robust">
+      <w:hyperlink w:anchor="_12c2d691ce7d94f18eabedfa7fc910ecf3de0b8">
         <w:r>
           <w:rPr>
             <w:rStyle w:val="Hyperlink"/>
@@ -8713,7 +8713,7 @@
         <w:t xml:space="preserve">model, is -2.33 for childcare and -1.00 for employment.</w:t>
       </w:r>
     </w:p>
-    <w:bookmarkStart w:id="35" w:name="tab:robust"/>
+    <w:bookmarkStart w:id="37" w:name="_12c2d691ce7d94f18eabedfa7fc910ecf3de0b8"/>
     <w:p>
       <w:pPr>
         <w:pStyle w:val="TableCaption"/>
@@ -9425,10 +9425,10 @@
         </w:tc>
       </w:tr>
     </w:tbl>
-    <w:bookmarkEnd w:id="35"/>
-    <w:p>
-      <w:pPr>
-        <w:pStyle w:val="BodyText"/>
+    <w:bookmarkEnd w:id="37"/>
+    <w:p>
+      <w:pPr>
+        <w:pStyle w:val="FirstParagraph"/>
       </w:pPr>
       <w:r>
         <w:rPr>
@@ -9444,13 +9444,11 @@
         <w:t xml:space="preserve">Coefficient on the grandmother indicator (or any grandparent) in the main specification, unless stated. The extensive-margin row is a linear probability model. The Oster rows use the short regression without controls or fixed effects on the same sample.</w:t>
       </w:r>
     </w:p>
-    <w:bookmarkEnd w:id="36"/>
-    <w:bookmarkEnd w:id="37"/>
-    <w:bookmarkStart w:id="42" w:name="discussion-and-conclusion"/>
     <w:p>
       <w:pPr>
         <w:pStyle w:val="Heading1"/>
       </w:pPr>
+      <w:bookmarkStart w:id="38" w:name="_93520e2074376248722efed6c9320763a7cf0cc"/>
       <w:r>
         <w:rPr>
           <w:rStyle w:val="SectionNumber"/>
@@ -9463,12 +9461,13 @@
       <w:r>
         <w:t xml:space="preserve">Discussion and conclusion</w:t>
       </w:r>
-    </w:p>
-    <w:bookmarkStart w:id="38" w:name="interpretation"/>
+      <w:bookmarkEnd w:id="38"/>
+    </w:p>
     <w:p>
       <w:pPr>
         <w:pStyle w:val="Heading2"/>
       </w:pPr>
+      <w:bookmarkStart w:id="39" w:name="_interpretation"/>
       <w:r>
         <w:rPr>
           <w:rStyle w:val="SectionNumber"/>
@@ -9481,6 +9480,7 @@
       <w:r>
         <w:t xml:space="preserve">Interpretation</w:t>
       </w:r>
+      <w:bookmarkEnd w:id="39"/>
     </w:p>
     <w:p>
       <w:pPr>
@@ -9516,7 +9516,7 @@
       <w:r>
         <w:t xml:space="preserve"> </w:t>
       </w:r>
-      <w:hyperlink w:anchor="tab:robust">
+      <w:hyperlink w:anchor="_12c2d691ce7d94f18eabedfa7fc910ecf3de0b8">
         <w:r>
           <w:rPr>
             <w:rStyle w:val="Hyperlink"/>
@@ -9536,7 +9536,7 @@
       <w:r>
         <w:t xml:space="preserve"> </w:t>
       </w:r>
-      <w:hyperlink w:anchor="tab:gptype">
+      <w:hyperlink w:anchor="_d728e339bf7a235f4b8e0946bfe97b624c3cc63">
         <w:r>
           <w:rPr>
             <w:rStyle w:val="Hyperlink"/>
@@ -9553,7 +9553,7 @@
       <w:r>
         <w:t xml:space="preserve"> </w:t>
       </w:r>
-      <w:hyperlink w:anchor="tab:het">
+      <w:hyperlink w:anchor="_43bf129cbf290ef8eb59d2eab67c8b98afea1c7">
         <w:r>
           <w:rPr>
             <w:rStyle w:val="Hyperlink"/>
@@ -9829,12 +9829,11 @@
         <w:t xml:space="preserve">on what else constrains it.</w:t>
       </w:r>
     </w:p>
-    <w:bookmarkEnd w:id="38"/>
-    <w:bookmarkStart w:id="39" w:name="implications-for-research-and-policy"/>
     <w:p>
       <w:pPr>
         <w:pStyle w:val="Heading2"/>
       </w:pPr>
+      <w:bookmarkStart w:id="40" w:name="_66837de03c0eab1417e14763b40f6fc3c46692e"/>
       <w:r>
         <w:rPr>
           <w:rStyle w:val="SectionNumber"/>
@@ -9853,6 +9852,7 @@
       <w:r>
         <w:t xml:space="preserve">policy</w:t>
       </w:r>
+      <w:bookmarkEnd w:id="40"/>
     </w:p>
     <w:p>
       <w:pPr>
@@ -9883,69 +9883,74 @@
         <w:t xml:space="preserve"> </w:t>
       </w:r>
       <w:r>
-        <w:t xml:space="preserve">ages (International Institute for Population Sciences et al. 2020; UNFPA</w:t>
-      </w:r>
-      <w:r>
-        <w:t xml:space="preserve"> </w:t>
-      </w:r>
-      <w:r>
-        <w:t xml:space="preserve">and International Institute for Population Sciences 2023), the supply of</w:t>
-      </w:r>
-      <w:r>
-        <w:t xml:space="preserve"> </w:t>
-      </w:r>
-      <w:r>
-        <w:t xml:space="preserve">grandmother care will depend on older women’s health, employment and</w:t>
-      </w:r>
-      <w:r>
-        <w:t xml:space="preserve"> </w:t>
-      </w:r>
-      <w:r>
-        <w:t xml:space="preserve">household position, and the implicit cost to them belongs in any</w:t>
-      </w:r>
-      <w:r>
-        <w:t xml:space="preserve"> </w:t>
-      </w:r>
-      <w:r>
-        <w:t xml:space="preserve">assessment of how families, and public provision, share the care of</w:t>
-      </w:r>
-      <w:r>
-        <w:t xml:space="preserve"> </w:t>
-      </w:r>
-      <w:r>
-        <w:t xml:space="preserve">young children. Expanding formal childcare may matter for mothers in</w:t>
-      </w:r>
-      <w:r>
-        <w:t xml:space="preserve"> </w:t>
-      </w:r>
-      <w:r>
-        <w:t xml:space="preserve">extended households as well as in nuclear ones, although its effect will</w:t>
-      </w:r>
-      <w:r>
-        <w:t xml:space="preserve"> </w:t>
-      </w:r>
-      <w:r>
-        <w:t xml:space="preserve">depend on whether the constraints of the extended household also bind on</w:t>
-      </w:r>
-      <w:r>
-        <w:t xml:space="preserve"> </w:t>
-      </w:r>
-      <w:r>
-        <w:t xml:space="preserve">the use of formal care. All of these statements rest on conditional</w:t>
-      </w:r>
-      <w:r>
-        <w:t xml:space="preserve"> </w:t>
-      </w:r>
-      <w:r>
-        <w:t xml:space="preserve">associations from one cross-section and should be treated with caution.</w:t>
-      </w:r>
-    </w:p>
-    <w:bookmarkEnd w:id="39"/>
-    <w:bookmarkStart w:id="40" w:name="limitations"/>
+        <w:t xml:space="preserve">ages (International Institute for Population Sciences et al. 2020;</w:t>
+      </w:r>
+      <w:r>
+        <w:t xml:space="preserve"> </w:t>
+      </w:r>
+      <w:r>
+        <w:t xml:space="preserve">United Nations Population Fund and International Institute for</w:t>
+      </w:r>
+      <w:r>
+        <w:t xml:space="preserve"> </w:t>
+      </w:r>
+      <w:r>
+        <w:t xml:space="preserve">Population Sciences 2023), the supply of grandmother care will depend on</w:t>
+      </w:r>
+      <w:r>
+        <w:t xml:space="preserve"> </w:t>
+      </w:r>
+      <w:r>
+        <w:t xml:space="preserve">older women’s health, employment and household position, and the</w:t>
+      </w:r>
+      <w:r>
+        <w:t xml:space="preserve"> </w:t>
+      </w:r>
+      <w:r>
+        <w:t xml:space="preserve">implicit cost to them belongs in any assessment of how families, and</w:t>
+      </w:r>
+      <w:r>
+        <w:t xml:space="preserve"> </w:t>
+      </w:r>
+      <w:r>
+        <w:t xml:space="preserve">public provision, share the care of young children. Expanding formal</w:t>
+      </w:r>
+      <w:r>
+        <w:t xml:space="preserve"> </w:t>
+      </w:r>
+      <w:r>
+        <w:t xml:space="preserve">childcare may matter for mothers in extended households as well as in</w:t>
+      </w:r>
+      <w:r>
+        <w:t xml:space="preserve"> </w:t>
+      </w:r>
+      <w:r>
+        <w:t xml:space="preserve">nuclear ones, although its effect will depend on whether the constraints</w:t>
+      </w:r>
+      <w:r>
+        <w:t xml:space="preserve"> </w:t>
+      </w:r>
+      <w:r>
+        <w:t xml:space="preserve">of the extended household also bind on the use of formal care. All of</w:t>
+      </w:r>
+      <w:r>
+        <w:t xml:space="preserve"> </w:t>
+      </w:r>
+      <w:r>
+        <w:t xml:space="preserve">these statements rest on conditional associations from one cross-section</w:t>
+      </w:r>
+      <w:r>
+        <w:t xml:space="preserve"> </w:t>
+      </w:r>
+      <w:r>
+        <w:t xml:space="preserve">and should be treated with caution.</w:t>
+      </w:r>
+    </w:p>
     <w:p>
       <w:pPr>
         <w:pStyle w:val="Heading2"/>
       </w:pPr>
+      <w:bookmarkStart w:id="41" w:name="_limitations"/>
       <w:r>
         <w:rPr>
           <w:rStyle w:val="SectionNumber"/>
@@ -9958,6 +9963,7 @@
       <w:r>
         <w:t xml:space="preserve">Limitations</w:t>
       </w:r>
+      <w:bookmarkEnd w:id="41"/>
     </w:p>
     <w:p>
       <w:pPr>
@@ -10099,12 +10105,11 @@
         <w:t xml:space="preserve">tests.</w:t>
       </w:r>
     </w:p>
-    <w:bookmarkEnd w:id="40"/>
-    <w:bookmarkStart w:id="41" w:name="conclusion"/>
     <w:p>
       <w:pPr>
         <w:pStyle w:val="Heading2"/>
       </w:pPr>
+      <w:bookmarkStart w:id="42" w:name="_conclusion"/>
       <w:r>
         <w:rPr>
           <w:rStyle w:val="SectionNumber"/>
@@ -10117,6 +10122,7 @@
       <w:r>
         <w:t xml:space="preserve">Conclusion</w:t>
       </w:r>
+      <w:bookmarkEnd w:id="42"/>
     </w:p>
     <w:p>
       <w:pPr>
@@ -10204,13 +10210,11 @@
         <w:t xml:space="preserve">falls on older women’s rest and leisure.</w:t>
       </w:r>
     </w:p>
-    <w:bookmarkEnd w:id="41"/>
-    <w:bookmarkEnd w:id="42"/>
-    <w:bookmarkStart w:id="43" w:name="statements-and-declarations"/>
     <w:p>
       <w:pPr>
         <w:pStyle w:val="Heading1"/>
       </w:pPr>
+      <w:bookmarkStart w:id="43" w:name="_ad61382512a69fb2431cb9ccd9664860b940cd1"/>
       <w:r>
         <w:t xml:space="preserve">Statements and</w:t>
       </w:r>
@@ -10220,6 +10224,7 @@
       <w:r>
         <w:t xml:space="preserve">Declarations</w:t>
       </w:r>
+      <w:bookmarkEnd w:id="43"/>
     </w:p>
     <w:p>
       <w:pPr>
@@ -10320,6 +10325,24 @@
           <w:b/>
           <w:bCs/>
         </w:rPr>
+        <w:t xml:space="preserve">Consent for publication.</w:t>
+      </w:r>
+      <w:r>
+        <w:t xml:space="preserve"> </w:t>
+      </w:r>
+      <w:r>
+        <w:t xml:space="preserve">Not applicable.</w:t>
+      </w:r>
+    </w:p>
+    <w:p>
+      <w:pPr>
+        <w:pStyle w:val="BodyText"/>
+      </w:pPr>
+      <w:r>
+        <w:rPr>
+          <w:b/>
+          <w:bCs/>
+        </w:rPr>
         <w:t xml:space="preserve">Data availability.</w:t>
       </w:r>
       <w:r>
@@ -10347,26 +10370,26 @@
         <w:t xml:space="preserve">made available on acceptance.</w:t>
       </w:r>
     </w:p>
-    <w:bookmarkEnd w:id="43"/>
-    <w:bookmarkStart w:id="85" w:name="references"/>
     <w:p>
       <w:pPr>
         <w:pStyle w:val="Heading1"/>
       </w:pPr>
+      <w:bookmarkStart w:id="44" w:name="_references"/>
       <w:r>
         <w:t xml:space="preserve">References</w:t>
       </w:r>
+      <w:bookmarkEnd w:id="44"/>
     </w:p>
     <w:p>
       <w:pPr>
         <w:pStyle w:val="FirstParagraph"/>
       </w:pPr>
-      <w:bookmarkStart w:id="44" w:name="refs"/>
-      <w:bookmarkEnd w:id="44"/>
-    </w:p>
-    <w:p>
-      <w:pPr>
-        <w:pStyle w:val="BodyText"/>
+      <w:bookmarkStart w:id="45" w:name="_refs"/>
+      <w:bookmarkEnd w:id="45"/>
+    </w:p>
+    <w:p>
+      <w:pPr>
+        <w:pStyle w:val="FirstParagraph"/>
       </w:pPr>
       <w:r>
         <w:t xml:space="preserve"> </w:t>
@@ -10392,7 +10415,7 @@
       <w:r>
         <w:t xml:space="preserve"> </w:t>
       </w:r>
-      <w:hyperlink r:id="rId45">
+      <w:hyperlink r:id="rId46">
         <w:r>
           <w:rPr>
             <w:rStyle w:val="Hyperlink"/>
@@ -10435,55 +10458,12 @@
       <w:r>
         <w:t xml:space="preserve"> </w:t>
       </w:r>
-      <w:hyperlink r:id="rId46">
+      <w:hyperlink r:id="rId47">
         <w:r>
           <w:rPr>
             <w:rStyle w:val="Hyperlink"/>
           </w:rPr>
           <w:t xml:space="preserve">https://doi.org/10.1177/0958928707081068</w:t>
-        </w:r>
-      </w:hyperlink>
-    </w:p>
-    <w:p>
-      <w:pPr>
-        <w:pStyle w:val="BodyText"/>
-      </w:pPr>
-      <w:r>
-        <w:t xml:space="preserve">Altonji JG, Elder TE, Taber CR (2005) Selection on observed and</w:t>
-      </w:r>
-      <w:r>
-        <w:t xml:space="preserve"> </w:t>
-      </w:r>
-      <w:r>
-        <w:t xml:space="preserve">unobserved variables: Assessing the effectiveness of</w:t>
-      </w:r>
-      <w:r>
-        <w:t xml:space="preserve"> </w:t>
-      </w:r>
-      <w:r>
-        <w:t xml:space="preserve">Catholic</w:t>
-      </w:r>
-      <w:r>
-        <w:t xml:space="preserve"> </w:t>
-      </w:r>
-      <w:r>
-        <w:t xml:space="preserve">schools.</w:t>
-      </w:r>
-      <w:r>
-        <w:t xml:space="preserve"> </w:t>
-      </w:r>
-      <w:r>
-        <w:t xml:space="preserve">Journal of Political Economy 113:151–184.</w:t>
-      </w:r>
-      <w:r>
-        <w:t xml:space="preserve"> </w:t>
-      </w:r>
-      <w:hyperlink r:id="rId47">
-        <w:r>
-          <w:rPr>
-            <w:rStyle w:val="Hyperlink"/>
-          </w:rPr>
-          <w:t xml:space="preserve">https://doi.org/10.1086/426036</w:t>
         </w:r>
       </w:hyperlink>
     </w:p>
@@ -10523,6 +10503,49 @@
         <w:pStyle w:val="BodyText"/>
       </w:pPr>
       <w:r>
+        <w:t xml:space="preserve">Altonji JG, Elder TE, Taber CR (2005) Selection on observed and</w:t>
+      </w:r>
+      <w:r>
+        <w:t xml:space="preserve"> </w:t>
+      </w:r>
+      <w:r>
+        <w:t xml:space="preserve">unobserved variables: Assessing the effectiveness of</w:t>
+      </w:r>
+      <w:r>
+        <w:t xml:space="preserve"> </w:t>
+      </w:r>
+      <w:r>
+        <w:t xml:space="preserve">Catholic</w:t>
+      </w:r>
+      <w:r>
+        <w:t xml:space="preserve"> </w:t>
+      </w:r>
+      <w:r>
+        <w:t xml:space="preserve">schools.</w:t>
+      </w:r>
+      <w:r>
+        <w:t xml:space="preserve"> </w:t>
+      </w:r>
+      <w:r>
+        <w:t xml:space="preserve">Journal of Political Economy 113:151–184.</w:t>
+      </w:r>
+      <w:r>
+        <w:t xml:space="preserve"> </w:t>
+      </w:r>
+      <w:hyperlink r:id="rId49">
+        <w:r>
+          <w:rPr>
+            <w:rStyle w:val="Hyperlink"/>
+          </w:rPr>
+          <w:t xml:space="preserve">https://doi.org/10.1086/426036</w:t>
+        </w:r>
+      </w:hyperlink>
+    </w:p>
+    <w:p>
+      <w:pPr>
+        <w:pStyle w:val="BodyText"/>
+      </w:pPr>
+      <w:r>
         <w:t xml:space="preserve">Anukriti S, Herrera-Almanza C, Pathak PK, Karra M (2020) Curse of the</w:t>
       </w:r>
       <w:r>
@@ -10549,7 +10572,7 @@
       <w:r>
         <w:t xml:space="preserve"> </w:t>
       </w:r>
-      <w:hyperlink r:id="rId49">
+      <w:hyperlink r:id="rId50">
         <w:r>
           <w:rPr>
             <w:rStyle w:val="Hyperlink"/>
@@ -10580,7 +10603,7 @@
       <w:r>
         <w:t xml:space="preserve"> </w:t>
       </w:r>
-      <w:hyperlink r:id="rId50">
+      <w:hyperlink r:id="rId51">
         <w:r>
           <w:rPr>
             <w:rStyle w:val="Hyperlink"/>
@@ -10632,7 +10655,7 @@
       <w:r>
         <w:t xml:space="preserve"> </w:t>
       </w:r>
-      <w:hyperlink r:id="rId51">
+      <w:hyperlink r:id="rId52">
         <w:r>
           <w:rPr>
             <w:rStyle w:val="Hyperlink"/>
@@ -10692,7 +10715,7 @@
       <w:r>
         <w:t xml:space="preserve"> </w:t>
       </w:r>
-      <w:hyperlink r:id="rId52">
+      <w:hyperlink r:id="rId53">
         <w:r>
           <w:rPr>
             <w:rStyle w:val="Hyperlink"/>
@@ -10717,7 +10740,7 @@
       <w:r>
         <w:t xml:space="preserve"> </w:t>
       </w:r>
-      <w:hyperlink r:id="rId53">
+      <w:hyperlink r:id="rId54">
         <w:r>
           <w:rPr>
             <w:rStyle w:val="Hyperlink"/>
@@ -10748,7 +10771,7 @@
       <w:r>
         <w:t xml:space="preserve"> </w:t>
       </w:r>
-      <w:hyperlink r:id="rId54">
+      <w:hyperlink r:id="rId55">
         <w:r>
           <w:rPr>
             <w:rStyle w:val="Hyperlink"/>
@@ -10773,7 +10796,7 @@
       <w:r>
         <w:t xml:space="preserve"> </w:t>
       </w:r>
-      <w:hyperlink r:id="rId55">
+      <w:hyperlink r:id="rId56">
         <w:r>
           <w:rPr>
             <w:rStyle w:val="Hyperlink"/>
@@ -10798,7 +10821,7 @@
       <w:r>
         <w:t xml:space="preserve"> </w:t>
       </w:r>
-      <w:hyperlink r:id="rId56">
+      <w:hyperlink r:id="rId57">
         <w:r>
           <w:rPr>
             <w:rStyle w:val="Hyperlink"/>
@@ -10843,7 +10866,7 @@
       <w:r>
         <w:t xml:space="preserve"> </w:t>
       </w:r>
-      <w:hyperlink r:id="rId57">
+      <w:hyperlink r:id="rId58">
         <w:r>
           <w:rPr>
             <w:rStyle w:val="Hyperlink"/>
@@ -10877,7 +10900,7 @@
       <w:r>
         <w:t xml:space="preserve"> </w:t>
       </w:r>
-      <w:hyperlink r:id="rId58">
+      <w:hyperlink r:id="rId59">
         <w:r>
           <w:rPr>
             <w:rStyle w:val="Hyperlink"/>
@@ -10917,7 +10940,7 @@
       <w:r>
         <w:t xml:space="preserve"> </w:t>
       </w:r>
-      <w:hyperlink r:id="rId59">
+      <w:hyperlink r:id="rId60">
         <w:r>
           <w:rPr>
             <w:rStyle w:val="Hyperlink"/>
@@ -10957,7 +10980,7 @@
       <w:r>
         <w:t xml:space="preserve"> </w:t>
       </w:r>
-      <w:hyperlink r:id="rId60">
+      <w:hyperlink r:id="rId61">
         <w:r>
           <w:rPr>
             <w:rStyle w:val="Hyperlink"/>
@@ -10997,7 +11020,7 @@
       <w:r>
         <w:t xml:space="preserve"> </w:t>
       </w:r>
-      <w:hyperlink r:id="rId61">
+      <w:hyperlink r:id="rId62">
         <w:r>
           <w:rPr>
             <w:rStyle w:val="Hyperlink"/>
@@ -11028,7 +11051,7 @@
       <w:r>
         <w:t xml:space="preserve"> </w:t>
       </w:r>
-      <w:hyperlink r:id="rId62">
+      <w:hyperlink r:id="rId63">
         <w:r>
           <w:rPr>
             <w:rStyle w:val="Hyperlink"/>
@@ -11082,7 +11105,7 @@
       <w:r>
         <w:t xml:space="preserve"> </w:t>
       </w:r>
-      <w:hyperlink r:id="rId63">
+      <w:hyperlink r:id="rId64">
         <w:r>
           <w:rPr>
             <w:rStyle w:val="Hyperlink"/>
@@ -11116,7 +11139,7 @@
       <w:r>
         <w:t xml:space="preserve"> </w:t>
       </w:r>
-      <w:hyperlink r:id="rId64">
+      <w:hyperlink r:id="rId65">
         <w:r>
           <w:rPr>
             <w:rStyle w:val="Hyperlink"/>
@@ -11147,7 +11170,7 @@
       <w:r>
         <w:t xml:space="preserve"> </w:t>
       </w:r>
-      <w:hyperlink r:id="rId65">
+      <w:hyperlink r:id="rId66">
         <w:r>
           <w:rPr>
             <w:rStyle w:val="Hyperlink"/>
@@ -11181,7 +11204,7 @@
       <w:r>
         <w:t xml:space="preserve"> </w:t>
       </w:r>
-      <w:hyperlink r:id="rId66">
+      <w:hyperlink r:id="rId67">
         <w:r>
           <w:rPr>
             <w:rStyle w:val="Hyperlink"/>
@@ -11212,7 +11235,7 @@
       <w:r>
         <w:t xml:space="preserve"> </w:t>
       </w:r>
-      <w:hyperlink r:id="rId67">
+      <w:hyperlink r:id="rId68">
         <w:r>
           <w:rPr>
             <w:rStyle w:val="Hyperlink"/>
@@ -11237,7 +11260,7 @@
       <w:r>
         <w:t xml:space="preserve"> </w:t>
       </w:r>
-      <w:hyperlink r:id="rId68">
+      <w:hyperlink r:id="rId69">
         <w:r>
           <w:rPr>
             <w:rStyle w:val="Hyperlink"/>
@@ -11271,7 +11294,7 @@
       <w:r>
         <w:t xml:space="preserve"> </w:t>
       </w:r>
-      <w:hyperlink r:id="rId69">
+      <w:hyperlink r:id="rId70">
         <w:r>
           <w:rPr>
             <w:rStyle w:val="Hyperlink"/>
@@ -11352,7 +11375,7 @@
       <w:r>
         <w:t xml:space="preserve"> </w:t>
       </w:r>
-      <w:hyperlink r:id="rId70">
+      <w:hyperlink r:id="rId71">
         <w:r>
           <w:rPr>
             <w:rStyle w:val="Hyperlink"/>
@@ -11377,7 +11400,7 @@
       <w:r>
         <w:t xml:space="preserve"> </w:t>
       </w:r>
-      <w:hyperlink r:id="rId71">
+      <w:hyperlink r:id="rId72">
         <w:r>
           <w:rPr>
             <w:rStyle w:val="Hyperlink"/>
@@ -11420,7 +11443,7 @@
       <w:r>
         <w:t xml:space="preserve"> </w:t>
       </w:r>
-      <w:hyperlink r:id="rId72">
+      <w:hyperlink r:id="rId73">
         <w:r>
           <w:rPr>
             <w:rStyle w:val="Hyperlink"/>
@@ -11445,7 +11468,7 @@
       <w:r>
         <w:t xml:space="preserve"> </w:t>
       </w:r>
-      <w:hyperlink r:id="rId73">
+      <w:hyperlink r:id="rId74">
         <w:r>
           <w:rPr>
             <w:rStyle w:val="Hyperlink"/>
@@ -11485,7 +11508,7 @@
       <w:r>
         <w:t xml:space="preserve"> </w:t>
       </w:r>
-      <w:hyperlink r:id="rId74">
+      <w:hyperlink r:id="rId75">
         <w:r>
           <w:rPr>
             <w:rStyle w:val="Hyperlink"/>
@@ -11510,7 +11533,7 @@
       <w:r>
         <w:t xml:space="preserve"> </w:t>
       </w:r>
-      <w:hyperlink r:id="rId75">
+      <w:hyperlink r:id="rId76">
         <w:r>
           <w:rPr>
             <w:rStyle w:val="Hyperlink"/>
@@ -11550,7 +11573,7 @@
       <w:r>
         <w:t xml:space="preserve"> </w:t>
       </w:r>
-      <w:hyperlink r:id="rId76">
+      <w:hyperlink r:id="rId77">
         <w:r>
           <w:rPr>
             <w:rStyle w:val="Hyperlink"/>
@@ -11625,7 +11648,7 @@
       <w:r>
         <w:t xml:space="preserve"> </w:t>
       </w:r>
-      <w:hyperlink r:id="rId77">
+      <w:hyperlink r:id="rId78">
         <w:r>
           <w:rPr>
             <w:rStyle w:val="Hyperlink"/>
@@ -11650,7 +11673,7 @@
       <w:r>
         <w:t xml:space="preserve"> </w:t>
       </w:r>
-      <w:hyperlink r:id="rId78">
+      <w:hyperlink r:id="rId79">
         <w:r>
           <w:rPr>
             <w:rStyle w:val="Hyperlink"/>
@@ -11675,7 +11698,7 @@
       <w:r>
         <w:t xml:space="preserve"> </w:t>
       </w:r>
-      <w:hyperlink r:id="rId79">
+      <w:hyperlink r:id="rId80">
         <w:r>
           <w:rPr>
             <w:rStyle w:val="Hyperlink"/>
@@ -11700,7 +11723,7 @@
       <w:r>
         <w:t xml:space="preserve"> </w:t>
       </w:r>
-      <w:hyperlink r:id="rId80">
+      <w:hyperlink r:id="rId81">
         <w:r>
           <w:rPr>
             <w:rStyle w:val="Hyperlink"/>
@@ -11743,7 +11766,7 @@
       <w:r>
         <w:t xml:space="preserve"> </w:t>
       </w:r>
-      <w:hyperlink r:id="rId81">
+      <w:hyperlink r:id="rId82">
         <w:r>
           <w:rPr>
             <w:rStyle w:val="Hyperlink"/>
@@ -11774,7 +11797,7 @@
       <w:r>
         <w:t xml:space="preserve"> </w:t>
       </w:r>
-      <w:hyperlink r:id="rId82">
+      <w:hyperlink r:id="rId83">
         <w:r>
           <w:rPr>
             <w:rStyle w:val="Hyperlink"/>
@@ -11811,7 +11834,7 @@
       <w:r>
         <w:t xml:space="preserve"> </w:t>
       </w:r>
-      <w:hyperlink r:id="rId83">
+      <w:hyperlink r:id="rId84">
         <w:r>
           <w:rPr>
             <w:rStyle w:val="Hyperlink"/>
@@ -11836,7 +11859,7 @@
       <w:r>
         <w:t xml:space="preserve"> </w:t>
       </w:r>
-      <w:hyperlink r:id="rId84">
+      <w:hyperlink r:id="rId85">
         <w:r>
           <w:rPr>
             <w:rStyle w:val="Hyperlink"/>
@@ -11850,19 +11873,19 @@
         <w:pStyle w:val="BodyText"/>
       </w:pPr>
       <w:r>
-        <w:t xml:space="preserve">UNFPA, International Institute for Population Sciences (2023) India</w:t>
-      </w:r>
-      <w:r>
-        <w:t xml:space="preserve"> </w:t>
-      </w:r>
-      <w:r>
-        <w:t xml:space="preserve">ageing report 2023: Caring for our elders: Institutional responses.</w:t>
-      </w:r>
-      <w:r>
-        <w:t xml:space="preserve"> </w:t>
-      </w:r>
-      <w:r>
-        <w:t xml:space="preserve">United Nations Population Fund, New Delhi</w:t>
+        <w:t xml:space="preserve">United Nations Population Fund, International Institute for Population</w:t>
+      </w:r>
+      <w:r>
+        <w:t xml:space="preserve"> </w:t>
+      </w:r>
+      <w:r>
+        <w:t xml:space="preserve">Sciences (2023) India ageing report 2023: Caring for our elders:</w:t>
+      </w:r>
+      <w:r>
+        <w:t xml:space="preserve"> </w:t>
+      </w:r>
+      <w:r>
+        <w:t xml:space="preserve">Institutional responses. United Nations Population Fund, New Delhi</w:t>
       </w:r>
     </w:p>
     <w:p>
@@ -11894,7 +11917,6 @@
         <w:t xml:space="preserve">Nations, New York</w:t>
       </w:r>
     </w:p>
-    <w:bookmarkEnd w:id="85"/>
     <w:sectPr>
       <w:footerReference w:type="default" r:id="rId9"/>
       <w:footnotePr>
@@ -12034,10 +12056,10 @@
   <w:docDefaults>
     <w:rPrDefault>
       <w:rPr>
-        <w:rFonts w:ascii="Times New Roman" w:cs="Times New Roman" w:eastAsia="Times New Roman" w:hAnsi="Times New Roman"/>
+        <w:rFonts w:ascii="Times New Roman" w:hAnsi="Times New Roman" w:eastAsia="Times New Roman" w:cs="Times New Roman"/>
         <w:sz w:val="24"/>
         <w:szCs w:val="24"/>
-        <w:lang w:bidi="ar-SA" w:eastAsia="zh-CN" w:val="en-US"/>
+        <w:lang w:val="en-US" w:eastAsia="zh-CN" w:bidi="ar-SA"/>
       </w:rPr>
     </w:rPrDefault>
     <w:pPrDefault>
@@ -12046,8 +12068,8 @@
       </w:pPr>
     </w:pPrDefault>
   </w:docDefaults>
-  <w:latentStyles w:count="276" w:defLockedState="0" w:defQFormat="0" w:defSemiHidden="0" w:defUIPriority="0" w:defUnhideWhenUsed="0"/>
-  <w:style w:default="1" w:styleId="Normal" w:type="paragraph">
+  <w:latentStyles w:defLockedState="0" w:defUIPriority="0" w:defSemiHidden="0" w:defUnhideWhenUsed="0" w:defQFormat="0" w:count="276"/>
+  <w:style w:type="paragraph" w:default="1" w:styleId="Normal">
     <w:name w:val="Normal"/>
     <w:qFormat/>
     <w:pPr>
@@ -12058,20 +12080,20 @@
       <w:sz w:val="22"/>
     </w:rPr>
   </w:style>
-  <w:style w:styleId="BodyText" w:type="paragraph">
+  <w:style w:type="paragraph" w:styleId="BodyText">
     <w:name w:val="Body Text"/>
     <w:basedOn w:val="Normal"/>
     <w:link w:val="BodyTextChar"/>
     <w:qFormat/>
     <w:pPr>
-      <w:spacing w:after="180" w:before="180" w:line="360" w:lineRule="auto"/>
+      <w:spacing w:before="180" w:after="180" w:line="360" w:lineRule="auto"/>
     </w:pPr>
     <w:rPr>
       <w:rFonts w:ascii="Times New Roman" w:hAnsi="Times New Roman" w:cs="Times New Roman" w:eastAsia="Times New Roman"/>
       <w:sz w:val="22"/>
     </w:rPr>
   </w:style>
-  <w:style w:customStyle="1" w:styleId="FirstParagraph" w:type="paragraph">
+  <w:style w:type="paragraph" w:customStyle="1" w:styleId="FirstParagraph">
     <w:name w:val="First Paragraph"/>
     <w:basedOn w:val="BodyText"/>
     <w:next w:val="BodyText"/>
@@ -12084,19 +12106,19 @@
       <w:sz w:val="22"/>
     </w:rPr>
   </w:style>
-  <w:style w:customStyle="1" w:styleId="Compact" w:type="paragraph">
+  <w:style w:type="paragraph" w:customStyle="1" w:styleId="Compact">
     <w:name w:val="Compact"/>
     <w:basedOn w:val="BodyText"/>
     <w:qFormat/>
     <w:pPr>
-      <w:spacing w:after="36" w:before="36" w:line="360" w:lineRule="auto"/>
+      <w:spacing w:before="36" w:after="36" w:line="360" w:lineRule="auto"/>
     </w:pPr>
     <w:rPr>
       <w:rFonts w:ascii="Times New Roman" w:hAnsi="Times New Roman" w:cs="Times New Roman" w:eastAsia="Times New Roman"/>
       <w:sz w:val="22"/>
     </w:rPr>
   </w:style>
-  <w:style w:styleId="Title" w:type="paragraph">
+  <w:style w:type="paragraph" w:styleId="Title">
     <w:name w:val="Title"/>
     <w:basedOn w:val="Normal"/>
     <w:next w:val="BodyText"/>
@@ -12110,26 +12132,26 @@
       <w:jc w:val="center"/>
     </w:pPr>
     <w:rPr>
-      <w:rFonts w:ascii="Times New Roman" w:cs="Times New Roman" w:eastAsia="Times New Roman" w:hAnsi="Times New Roman"/>
+      <w:rFonts w:ascii="Times New Roman" w:hAnsi="Times New Roman" w:eastAsia="Times New Roman" w:cs="Times New Roman"/>
       <w:b/>
       <w:i w:val="0"/>
       <w:sz w:val="28"/>
       <w:szCs w:val="24"/>
     </w:rPr>
   </w:style>
-  <w:style w:customStyle="1" w:styleId="TitleChar" w:type="character">
+  <w:style w:type="character" w:customStyle="1" w:styleId="TitleChar">
     <w:name w:val="Title Char"/>
     <w:basedOn w:val="DefaultParagraphFont"/>
     <w:link w:val="Title"/>
     <w:uiPriority w:val="10"/>
     <w:rsid w:val="00A10FD9"/>
     <w:rPr>
-      <w:rFonts w:ascii="Times New Roman" w:cs="Times New Roman" w:eastAsia="Times New Roman" w:hAnsi="Times New Roman"/>
+      <w:rFonts w:ascii="Times New Roman" w:hAnsi="Times New Roman" w:eastAsia="Times New Roman" w:cs="Times New Roman"/>
       <w:sz w:val="24"/>
       <w:szCs w:val="24"/>
     </w:rPr>
   </w:style>
-  <w:style w:styleId="Subtitle" w:type="paragraph">
+  <w:style w:type="paragraph" w:styleId="Subtitle">
     <w:name w:val="Subtitle"/>
     <w:basedOn w:val="Title"/>
     <w:next w:val="BodyText"/>
@@ -12143,27 +12165,27 @@
       </w:numPr>
     </w:pPr>
     <w:rPr>
-      <w:rFonts w:ascii="Times New Roman" w:cs="Times New Roman" w:eastAsia="Times New Roman" w:hAnsi="Times New Roman"/>
-      <w:spacing w:line="480" w:lineRule="auto" w:val="15"/>
+      <w:rFonts w:ascii="Times New Roman" w:hAnsi="Times New Roman" w:eastAsia="Times New Roman" w:cs="Times New Roman"/>
+      <w:spacing w:val="15" w:line="480" w:lineRule="auto"/>
       <w:sz w:val="22"/>
       <w:szCs w:val="24"/>
     </w:rPr>
   </w:style>
-  <w:style w:customStyle="1" w:styleId="SubtitleChar" w:type="character">
+  <w:style w:type="character" w:customStyle="1" w:styleId="SubtitleChar">
     <w:name w:val="Subtitle Char"/>
     <w:basedOn w:val="DefaultParagraphFont"/>
     <w:link w:val="Subtitle"/>
     <w:uiPriority w:val="11"/>
     <w:rsid w:val="00A10FD9"/>
     <w:rPr>
-      <w:rFonts w:ascii="Times New Roman" w:cs="Times New Roman" w:eastAsia="Times New Roman" w:hAnsi="Times New Roman"/>
+      <w:rFonts w:ascii="Times New Roman" w:hAnsi="Times New Roman" w:eastAsia="Times New Roman" w:cs="Times New Roman"/>
       <w:color w:val="000000"/>
-      <w:spacing w:line="480" w:lineRule="auto" w:val="15"/>
+      <w:spacing w:val="15" w:line="480" w:lineRule="auto"/>
       <w:sz w:val="24"/>
       <w:szCs w:val="24"/>
     </w:rPr>
   </w:style>
-  <w:style w:customStyle="1" w:styleId="Author" w:type="paragraph">
+  <w:style w:type="paragraph" w:customStyle="1" w:styleId="Author">
     <w:name w:val="Author"/>
     <w:basedOn w:val="Title"/>
     <w:next w:val="BodyText"/>
@@ -12178,7 +12200,7 @@
       <w:szCs w:val="24"/>
     </w:rPr>
   </w:style>
-  <w:style w:styleId="Date" w:type="paragraph">
+  <w:style w:type="paragraph" w:styleId="Date">
     <w:name w:val="Date"/>
     <w:basedOn w:val="Title"/>
     <w:next w:val="BodyText"/>
@@ -12193,7 +12215,7 @@
       <w:szCs w:val="24"/>
     </w:rPr>
   </w:style>
-  <w:style w:customStyle="1" w:styleId="AbstractTitle" w:type="paragraph">
+  <w:style w:type="paragraph" w:customStyle="1" w:styleId="AbstractTitle">
     <w:name w:val="Abstract Title"/>
     <w:basedOn w:val="Normal"/>
     <w:next w:val="Abstract"/>
@@ -12201,7 +12223,7 @@
     <w:pPr>
       <w:keepNext/>
       <w:keepLines/>
-      <w:spacing w:after="0" w:before="300" w:line="480" w:lineRule="auto"/>
+      <w:spacing w:before="300" w:after="0" w:line="480" w:lineRule="auto"/>
       <w:jc w:val="center"/>
     </w:pPr>
     <w:rPr>
@@ -12212,7 +12234,7 @@
       <w:szCs w:val="24"/>
     </w:rPr>
   </w:style>
-  <w:style w:customStyle="1" w:styleId="Abstract" w:type="paragraph">
+  <w:style w:type="paragraph" w:customStyle="1" w:styleId="Abstract">
     <w:name w:val="Abstract"/>
     <w:basedOn w:val="Normal"/>
     <w:next w:val="BodyText"/>
@@ -12220,7 +12242,7 @@
     <w:pPr>
       <w:keepNext/>
       <w:keepLines/>
-      <w:spacing w:after="300" w:before="100" w:line="360" w:lineRule="auto"/>
+      <w:spacing w:before="100" w:after="300" w:line="360" w:lineRule="auto"/>
     </w:pPr>
     <w:rPr>
       <w:rFonts w:ascii="Times New Roman" w:hAnsi="Times New Roman" w:cs="Times New Roman" w:eastAsia="Times New Roman"/>
@@ -12228,7 +12250,7 @@
       <w:szCs w:val="24"/>
     </w:rPr>
   </w:style>
-  <w:style w:styleId="Bibliography" w:type="paragraph">
+  <w:style w:type="paragraph" w:styleId="Bibliography">
     <w:name w:val="Bibliography"/>
     <w:basedOn w:val="Normal"/>
     <w:next w:val="Bibliography"/>
@@ -12239,7 +12261,7 @@
       <w:sz w:val="22"/>
     </w:rPr>
   </w:style>
-  <w:style w:styleId="Heading1" w:type="paragraph">
+  <w:style w:type="paragraph" w:styleId="Heading1">
     <w:name w:val="heading 1"/>
     <w:basedOn w:val="Normal"/>
     <w:next w:val="BodyText"/>
@@ -12250,18 +12272,18 @@
     <w:pPr>
       <w:keepNext/>
       <w:keepLines/>
-      <w:spacing w:after="80" w:before="360" w:line="480" w:lineRule="auto"/>
+      <w:spacing w:before="360" w:after="80" w:line="480" w:lineRule="auto"/>
       <w:outlineLvl w:val="0"/>
     </w:pPr>
     <w:rPr>
-      <w:rFonts w:ascii="Times New Roman" w:cs="Times New Roman" w:eastAsia="Times New Roman" w:hAnsi="Times New Roman"/>
+      <w:rFonts w:ascii="Times New Roman" w:hAnsi="Times New Roman" w:eastAsia="Times New Roman" w:cs="Times New Roman"/>
       <w:b/>
       <w:i w:val="0"/>
       <w:sz w:val="24"/>
       <w:szCs w:val="24"/>
     </w:rPr>
   </w:style>
-  <w:style w:styleId="Heading2" w:type="paragraph">
+  <w:style w:type="paragraph" w:styleId="Heading2">
     <w:name w:val="heading 2"/>
     <w:basedOn w:val="Normal"/>
     <w:next w:val="BodyText"/>
@@ -12274,18 +12296,18 @@
     <w:pPr>
       <w:keepNext/>
       <w:keepLines/>
-      <w:spacing w:after="80" w:before="160" w:line="480" w:lineRule="auto"/>
+      <w:spacing w:before="160" w:after="80" w:line="480" w:lineRule="auto"/>
       <w:outlineLvl w:val="1"/>
     </w:pPr>
     <w:rPr>
-      <w:rFonts w:ascii="Times New Roman" w:cs="Times New Roman" w:eastAsia="Times New Roman" w:hAnsi="Times New Roman"/>
+      <w:rFonts w:ascii="Times New Roman" w:hAnsi="Times New Roman" w:eastAsia="Times New Roman" w:cs="Times New Roman"/>
       <w:b/>
       <w:i/>
       <w:sz w:val="22"/>
       <w:szCs w:val="24"/>
     </w:rPr>
   </w:style>
-  <w:style w:styleId="Heading3" w:type="paragraph">
+  <w:style w:type="paragraph" w:styleId="Heading3">
     <w:name w:val="heading 3"/>
     <w:basedOn w:val="Normal"/>
     <w:next w:val="BodyText"/>
@@ -12298,18 +12320,18 @@
     <w:pPr>
       <w:keepNext/>
       <w:keepLines/>
-      <w:spacing w:after="80" w:before="160" w:line="480" w:lineRule="auto"/>
+      <w:spacing w:before="160" w:after="80" w:line="480" w:lineRule="auto"/>
       <w:outlineLvl w:val="2"/>
     </w:pPr>
     <w:rPr>
-      <w:rFonts w:ascii="Times New Roman" w:cs="Times New Roman" w:eastAsia="Times New Roman" w:hAnsi="Times New Roman"/>
+      <w:rFonts w:ascii="Times New Roman" w:hAnsi="Times New Roman" w:eastAsia="Times New Roman" w:cs="Times New Roman"/>
       <w:b/>
       <w:i w:val="0"/>
       <w:sz w:val="22"/>
       <w:szCs w:val="24"/>
     </w:rPr>
   </w:style>
-  <w:style w:styleId="Heading4" w:type="paragraph">
+  <w:style w:type="paragraph" w:styleId="Heading4">
     <w:name w:val="heading 4"/>
     <w:basedOn w:val="Normal"/>
     <w:next w:val="BodyText"/>
@@ -12322,18 +12344,18 @@
     <w:pPr>
       <w:keepNext/>
       <w:keepLines/>
-      <w:spacing w:after="40" w:before="80" w:line="480" w:lineRule="auto"/>
+      <w:spacing w:before="80" w:after="40" w:line="480" w:lineRule="auto"/>
       <w:outlineLvl w:val="3"/>
     </w:pPr>
     <w:rPr>
-      <w:rFonts w:ascii="Times New Roman" w:cs="Times New Roman" w:eastAsia="Times New Roman" w:hAnsi="Times New Roman"/>
+      <w:rFonts w:ascii="Times New Roman" w:hAnsi="Times New Roman" w:eastAsia="Times New Roman" w:cs="Times New Roman"/>
       <w:b/>
       <w:i w:val="0"/>
       <w:iCs/>
       <w:sz w:val="22"/>
     </w:rPr>
   </w:style>
-  <w:style w:styleId="Heading5" w:type="paragraph">
+  <w:style w:type="paragraph" w:styleId="Heading5">
     <w:name w:val="heading 5"/>
     <w:basedOn w:val="Normal"/>
     <w:next w:val="BodyText"/>
@@ -12346,17 +12368,17 @@
     <w:pPr>
       <w:keepNext/>
       <w:keepLines/>
-      <w:spacing w:after="40" w:before="80" w:line="480" w:lineRule="auto"/>
+      <w:spacing w:before="80" w:after="40" w:line="480" w:lineRule="auto"/>
       <w:outlineLvl w:val="4"/>
     </w:pPr>
     <w:rPr>
-      <w:rFonts w:ascii="Times New Roman" w:cs="Times New Roman" w:eastAsia="Times New Roman" w:hAnsi="Times New Roman"/>
+      <w:rFonts w:ascii="Times New Roman" w:hAnsi="Times New Roman" w:eastAsia="Times New Roman" w:cs="Times New Roman"/>
       <w:b/>
       <w:i w:val="0"/>
       <w:sz w:val="22"/>
     </w:rPr>
   </w:style>
-  <w:style w:styleId="Heading6" w:type="paragraph">
+  <w:style w:type="paragraph" w:styleId="Heading6">
     <w:name w:val="heading 6"/>
     <w:basedOn w:val="Normal"/>
     <w:next w:val="BodyText"/>
@@ -12369,18 +12391,18 @@
     <w:pPr>
       <w:keepNext/>
       <w:keepLines/>
-      <w:spacing w:after="0" w:before="40" w:line="480" w:lineRule="auto"/>
+      <w:spacing w:before="40" w:after="0" w:line="480" w:lineRule="auto"/>
       <w:outlineLvl w:val="5"/>
     </w:pPr>
     <w:rPr>
-      <w:rFonts w:ascii="Times New Roman" w:cs="Times New Roman" w:eastAsia="Times New Roman" w:hAnsi="Times New Roman"/>
+      <w:rFonts w:ascii="Times New Roman" w:hAnsi="Times New Roman" w:eastAsia="Times New Roman" w:cs="Times New Roman"/>
       <w:b/>
       <w:i w:val="0"/>
       <w:iCs/>
       <w:sz w:val="22"/>
     </w:rPr>
   </w:style>
-  <w:style w:styleId="Heading7" w:type="paragraph">
+  <w:style w:type="paragraph" w:styleId="Heading7">
     <w:name w:val="heading 7"/>
     <w:basedOn w:val="Normal"/>
     <w:next w:val="BodyText"/>
@@ -12393,17 +12415,17 @@
     <w:pPr>
       <w:keepNext/>
       <w:keepLines/>
-      <w:spacing w:after="0" w:before="40" w:line="480" w:lineRule="auto"/>
+      <w:spacing w:before="40" w:after="0" w:line="480" w:lineRule="auto"/>
       <w:outlineLvl w:val="6"/>
     </w:pPr>
     <w:rPr>
-      <w:rFonts w:ascii="Times New Roman" w:cs="Times New Roman" w:eastAsia="Times New Roman" w:hAnsi="Times New Roman"/>
+      <w:rFonts w:ascii="Times New Roman" w:hAnsi="Times New Roman" w:eastAsia="Times New Roman" w:cs="Times New Roman"/>
       <w:b/>
       <w:i w:val="0"/>
       <w:sz w:val="22"/>
     </w:rPr>
   </w:style>
-  <w:style w:styleId="Heading8" w:type="paragraph">
+  <w:style w:type="paragraph" w:styleId="Heading8">
     <w:name w:val="heading 8"/>
     <w:basedOn w:val="Normal"/>
     <w:next w:val="BodyText"/>
@@ -12420,14 +12442,14 @@
       <w:outlineLvl w:val="7"/>
     </w:pPr>
     <w:rPr>
-      <w:rFonts w:ascii="Times New Roman" w:cs="Times New Roman" w:eastAsia="Times New Roman" w:hAnsi="Times New Roman"/>
+      <w:rFonts w:ascii="Times New Roman" w:hAnsi="Times New Roman" w:eastAsia="Times New Roman" w:cs="Times New Roman"/>
       <w:b/>
       <w:i w:val="0"/>
       <w:iCs/>
       <w:sz w:val="22"/>
     </w:rPr>
   </w:style>
-  <w:style w:styleId="Heading9" w:type="paragraph">
+  <w:style w:type="paragraph" w:styleId="Heading9">
     <w:name w:val="heading 9"/>
     <w:basedOn w:val="Normal"/>
     <w:next w:val="BodyText"/>
@@ -12444,26 +12466,26 @@
       <w:outlineLvl w:val="8"/>
     </w:pPr>
     <w:rPr>
-      <w:rFonts w:ascii="Times New Roman" w:cs="Times New Roman" w:eastAsia="Times New Roman" w:hAnsi="Times New Roman"/>
+      <w:rFonts w:ascii="Times New Roman" w:hAnsi="Times New Roman" w:eastAsia="Times New Roman" w:cs="Times New Roman"/>
       <w:b/>
       <w:i w:val="0"/>
       <w:sz w:val="22"/>
     </w:rPr>
   </w:style>
-  <w:style w:customStyle="1" w:styleId="Heading1Char" w:type="character">
+  <w:style w:type="character" w:customStyle="1" w:styleId="Heading1Char">
     <w:name w:val="Heading 1 Char"/>
     <w:basedOn w:val="DefaultParagraphFont"/>
     <w:link w:val="Heading1"/>
     <w:uiPriority w:val="9"/>
     <w:rsid w:val="00A10FD9"/>
     <w:rPr>
-      <w:rFonts w:ascii="Times New Roman" w:cs="Times New Roman" w:eastAsia="Times New Roman" w:hAnsi="Times New Roman"/>
+      <w:rFonts w:ascii="Times New Roman" w:hAnsi="Times New Roman" w:eastAsia="Times New Roman" w:cs="Times New Roman"/>
       <w:color w:val="000000"/>
       <w:sz w:val="24"/>
       <w:szCs w:val="24"/>
     </w:rPr>
   </w:style>
-  <w:style w:customStyle="1" w:styleId="Heading2Char" w:type="character">
+  <w:style w:type="character" w:customStyle="1" w:styleId="Heading2Char">
     <w:name w:val="Heading 2 Char"/>
     <w:basedOn w:val="DefaultParagraphFont"/>
     <w:link w:val="Heading2"/>
@@ -12471,13 +12493,13 @@
     <w:semiHidden/>
     <w:rsid w:val="00A10FD9"/>
     <w:rPr>
-      <w:rFonts w:ascii="Times New Roman" w:cs="Times New Roman" w:eastAsia="Times New Roman" w:hAnsi="Times New Roman"/>
+      <w:rFonts w:ascii="Times New Roman" w:hAnsi="Times New Roman" w:eastAsia="Times New Roman" w:cs="Times New Roman"/>
       <w:color w:val="000000"/>
       <w:sz w:val="24"/>
       <w:szCs w:val="24"/>
     </w:rPr>
   </w:style>
-  <w:style w:customStyle="1" w:styleId="Heading3Char" w:type="character">
+  <w:style w:type="character" w:customStyle="1" w:styleId="Heading3Char">
     <w:name w:val="Heading 3 Char"/>
     <w:basedOn w:val="DefaultParagraphFont"/>
     <w:link w:val="Heading3"/>
@@ -12485,13 +12507,13 @@
     <w:semiHidden/>
     <w:rsid w:val="00A10FD9"/>
     <w:rPr>
-      <w:rFonts w:ascii="Times New Roman" w:cs="Times New Roman" w:eastAsia="Times New Roman" w:hAnsi="Times New Roman"/>
+      <w:rFonts w:ascii="Times New Roman" w:hAnsi="Times New Roman" w:eastAsia="Times New Roman" w:cs="Times New Roman"/>
       <w:color w:val="000000"/>
       <w:sz w:val="24"/>
       <w:szCs w:val="24"/>
     </w:rPr>
   </w:style>
-  <w:style w:customStyle="1" w:styleId="Heading4Char" w:type="character">
+  <w:style w:type="character" w:customStyle="1" w:styleId="Heading4Char">
     <w:name w:val="Heading 4 Char"/>
     <w:basedOn w:val="DefaultParagraphFont"/>
     <w:link w:val="Heading4"/>
@@ -12499,13 +12521,13 @@
     <w:semiHidden/>
     <w:rsid w:val="00A10FD9"/>
     <w:rPr>
-      <w:rFonts w:ascii="Times New Roman" w:cs="Times New Roman" w:eastAsia="Times New Roman" w:hAnsi="Times New Roman"/>
+      <w:rFonts w:ascii="Times New Roman" w:hAnsi="Times New Roman" w:eastAsia="Times New Roman" w:cs="Times New Roman"/>
       <w:i/>
       <w:iCs/>
       <w:color w:val="000000"/>
     </w:rPr>
   </w:style>
-  <w:style w:customStyle="1" w:styleId="Heading5Char" w:type="character">
+  <w:style w:type="character" w:customStyle="1" w:styleId="Heading5Char">
     <w:name w:val="Heading 5 Char"/>
     <w:basedOn w:val="DefaultParagraphFont"/>
     <w:link w:val="Heading5"/>
@@ -12513,11 +12535,11 @@
     <w:semiHidden/>
     <w:rsid w:val="00A10FD9"/>
     <w:rPr>
-      <w:rFonts w:ascii="Times New Roman" w:cs="Times New Roman" w:eastAsia="Times New Roman" w:hAnsi="Times New Roman"/>
+      <w:rFonts w:ascii="Times New Roman" w:hAnsi="Times New Roman" w:eastAsia="Times New Roman" w:cs="Times New Roman"/>
       <w:color w:val="000000"/>
     </w:rPr>
   </w:style>
-  <w:style w:customStyle="1" w:styleId="Heading6Char" w:type="character">
+  <w:style w:type="character" w:customStyle="1" w:styleId="Heading6Char">
     <w:name w:val="Heading 6 Char"/>
     <w:basedOn w:val="DefaultParagraphFont"/>
     <w:link w:val="Heading6"/>
@@ -12525,13 +12547,13 @@
     <w:semiHidden/>
     <w:rsid w:val="00A10FD9"/>
     <w:rPr>
-      <w:rFonts w:ascii="Times New Roman" w:cs="Times New Roman" w:eastAsia="Times New Roman" w:hAnsi="Times New Roman"/>
+      <w:rFonts w:ascii="Times New Roman" w:hAnsi="Times New Roman" w:eastAsia="Times New Roman" w:cs="Times New Roman"/>
       <w:i/>
       <w:iCs/>
       <w:color w:val="000000"/>
     </w:rPr>
   </w:style>
-  <w:style w:customStyle="1" w:styleId="Heading7Char" w:type="character">
+  <w:style w:type="character" w:customStyle="1" w:styleId="Heading7Char">
     <w:name w:val="Heading 7 Char"/>
     <w:basedOn w:val="DefaultParagraphFont"/>
     <w:link w:val="Heading7"/>
@@ -12539,11 +12561,11 @@
     <w:semiHidden/>
     <w:rsid w:val="00A10FD9"/>
     <w:rPr>
-      <w:rFonts w:ascii="Times New Roman" w:cs="Times New Roman" w:eastAsia="Times New Roman" w:hAnsi="Times New Roman"/>
+      <w:rFonts w:ascii="Times New Roman" w:hAnsi="Times New Roman" w:eastAsia="Times New Roman" w:cs="Times New Roman"/>
       <w:color w:val="000000"/>
     </w:rPr>
   </w:style>
-  <w:style w:customStyle="1" w:styleId="Heading8Char" w:type="character">
+  <w:style w:type="character" w:customStyle="1" w:styleId="Heading8Char">
     <w:name w:val="Heading 8 Char"/>
     <w:basedOn w:val="DefaultParagraphFont"/>
     <w:link w:val="Heading8"/>
@@ -12551,13 +12573,13 @@
     <w:semiHidden/>
     <w:rsid w:val="00A10FD9"/>
     <w:rPr>
-      <w:rFonts w:ascii="Times New Roman" w:cs="Times New Roman" w:eastAsia="Times New Roman" w:hAnsi="Times New Roman"/>
+      <w:rFonts w:ascii="Times New Roman" w:hAnsi="Times New Roman" w:eastAsia="Times New Roman" w:cs="Times New Roman"/>
       <w:i/>
       <w:iCs/>
       <w:color w:val="000000"/>
     </w:rPr>
   </w:style>
-  <w:style w:customStyle="1" w:styleId="Heading9Char" w:type="character">
+  <w:style w:type="character" w:customStyle="1" w:styleId="Heading9Char">
     <w:name w:val="Heading 9 Char"/>
     <w:basedOn w:val="DefaultParagraphFont"/>
     <w:link w:val="Heading9"/>
@@ -12565,11 +12587,11 @@
     <w:semiHidden/>
     <w:rsid w:val="00A10FD9"/>
     <w:rPr>
-      <w:rFonts w:ascii="Times New Roman" w:cs="Times New Roman" w:eastAsia="Times New Roman" w:hAnsi="Times New Roman"/>
+      <w:rFonts w:ascii="Times New Roman" w:hAnsi="Times New Roman" w:eastAsia="Times New Roman" w:cs="Times New Roman"/>
       <w:color w:val="000000"/>
     </w:rPr>
   </w:style>
-  <w:style w:styleId="BlockText" w:type="paragraph">
+  <w:style w:type="paragraph" w:styleId="BlockText">
     <w:name w:val="Block Text"/>
     <w:basedOn w:val="BodyText"/>
     <w:next w:val="BodyText"/>
@@ -12577,7 +12599,7 @@
     <w:unhideWhenUsed/>
     <w:qFormat/>
     <w:pPr>
-      <w:spacing w:after="100" w:before="100" w:line="360" w:lineRule="auto"/>
+      <w:spacing w:before="100" w:after="100" w:line="360" w:lineRule="auto"/>
       <w:ind w:firstLine="0" w:left="480" w:right="480"/>
     </w:pPr>
     <w:rPr>
@@ -12585,7 +12607,7 @@
       <w:sz w:val="22"/>
     </w:rPr>
   </w:style>
-  <w:style w:styleId="FootnoteText" w:type="paragraph">
+  <w:style w:type="paragraph" w:styleId="FootnoteText">
     <w:name w:val="Footnote Text"/>
     <w:basedOn w:val="Normal"/>
     <w:next w:val="FootnoteText"/>
@@ -12597,7 +12619,7 @@
       <w:sz w:val="22"/>
     </w:rPr>
   </w:style>
-  <w:style w:styleId="FootnoteBlockText" w:type="paragraph">
+  <w:style w:type="paragraph" w:styleId="FootnoteBlockText">
     <w:name w:val="Footnote Block Text"/>
     <w:basedOn w:val="FootnoteText"/>
     <w:next w:val="FootnoteText"/>
@@ -12605,7 +12627,7 @@
     <w:unhideWhenUsed/>
     <w:qFormat/>
     <w:pPr>
-      <w:spacing w:after="100" w:before="100" w:line="480" w:lineRule="auto"/>
+      <w:spacing w:before="100" w:after="100" w:line="480" w:lineRule="auto"/>
       <w:ind w:firstLine="0" w:left="480" w:right="480"/>
     </w:pPr>
     <w:rPr>
@@ -12613,24 +12635,24 @@
       <w:sz w:val="22"/>
     </w:rPr>
   </w:style>
-  <w:style w:default="1" w:styleId="DefaultParagraphFont" w:type="character">
+  <w:style w:type="character" w:default="1" w:styleId="DefaultParagraphFont">
     <w:name w:val="Default Paragraph Font"/>
     <w:semiHidden/>
     <w:unhideWhenUsed/>
   </w:style>
-  <w:style w:default="1" w:styleId="Table" w:type="table">
+  <w:style w:type="table" w:default="1" w:styleId="Table">
     <w:name w:val="Table"/>
     <w:basedOn w:val="TableNormal"/>
     <w:semiHidden/>
     <w:unhideWhenUsed/>
     <w:qFormat/>
     <w:tblPr>
-      <w:tblInd w:type="dxa" w:w="0"/>
+      <w:tblInd w:w="0" w:type="dxa"/>
       <w:tblCellMar>
-        <w:top w:type="dxa" w:w="0"/>
-        <w:left w:type="dxa" w:w="108"/>
-        <w:bottom w:type="dxa" w:w="0"/>
-        <w:right w:type="dxa" w:w="108"/>
+        <w:top w:w="0" w:type="dxa"/>
+        <w:left w:w="108" w:type="dxa"/>
+        <w:bottom w:w="0" w:type="dxa"/>
+        <w:right w:w="108" w:type="dxa"/>
       </w:tblCellMar>
     </w:tblPr>
     <w:tblStylePr w:type="firstRow">
@@ -12642,7 +12664,7 @@
       </w:tcPr>
     </w:tblStylePr>
   </w:style>
-  <w:style w:customStyle="1" w:styleId="DefinitionTerm" w:type="paragraph">
+  <w:style w:type="paragraph" w:customStyle="1" w:styleId="DefinitionTerm">
     <w:name w:val="Definition Term"/>
     <w:basedOn w:val="Normal"/>
     <w:next w:val="Definition"/>
@@ -12657,7 +12679,7 @@
       <w:sz w:val="22"/>
     </w:rPr>
   </w:style>
-  <w:style w:customStyle="1" w:styleId="Definition" w:type="paragraph">
+  <w:style w:type="paragraph" w:customStyle="1" w:styleId="Definition">
     <w:name w:val="Definition"/>
     <w:basedOn w:val="Normal"/>
     <w:rPr>
@@ -12665,12 +12687,12 @@
       <w:sz w:val="22"/>
     </w:rPr>
   </w:style>
-  <w:style w:styleId="Caption" w:type="paragraph">
+  <w:style w:type="paragraph" w:styleId="Caption">
     <w:name w:val="Caption"/>
     <w:basedOn w:val="Normal"/>
     <w:link w:val="BodyTextChar"/>
     <w:pPr>
-      <w:spacing w:after="120" w:before="0" w:line="480" w:lineRule="auto"/>
+      <w:spacing w:before="0" w:after="120" w:line="480" w:lineRule="auto"/>
     </w:pPr>
     <w:rPr>
       <w:rFonts w:ascii="Times New Roman" w:hAnsi="Times New Roman" w:cs="Times New Roman" w:eastAsia="Times New Roman"/>
@@ -12678,7 +12700,7 @@
       <w:sz w:val="22"/>
     </w:rPr>
   </w:style>
-  <w:style w:customStyle="1" w:styleId="TableCaption" w:type="paragraph">
+  <w:style w:type="paragraph" w:customStyle="1" w:styleId="TableCaption">
     <w:name w:val="Table Caption"/>
     <w:basedOn w:val="Caption"/>
     <w:pPr>
@@ -12689,7 +12711,7 @@
       <w:sz w:val="22"/>
     </w:rPr>
   </w:style>
-  <w:style w:customStyle="1" w:styleId="ImageCaption" w:type="paragraph">
+  <w:style w:type="paragraph" w:customStyle="1" w:styleId="ImageCaption">
     <w:name w:val="Image Caption"/>
     <w:basedOn w:val="Caption"/>
     <w:rPr>
@@ -12697,7 +12719,7 @@
       <w:sz w:val="22"/>
     </w:rPr>
   </w:style>
-  <w:style w:customStyle="1" w:styleId="Figure" w:type="paragraph">
+  <w:style w:type="paragraph" w:customStyle="1" w:styleId="Figure">
     <w:name w:val="Figure"/>
     <w:basedOn w:val="Normal"/>
     <w:rPr>
@@ -12705,7 +12727,7 @@
       <w:sz w:val="22"/>
     </w:rPr>
   </w:style>
-  <w:style w:customStyle="1" w:styleId="CaptionedFigure" w:type="paragraph">
+  <w:style w:type="paragraph" w:customStyle="1" w:styleId="CaptionedFigure">
     <w:name w:val="Captioned Figure"/>
     <w:basedOn w:val="Figure"/>
     <w:pPr>
@@ -12716,38 +12738,38 @@
       <w:sz w:val="22"/>
     </w:rPr>
   </w:style>
-  <w:style w:customStyle="1" w:styleId="BodyTextChar" w:type="character">
+  <w:style w:type="character" w:customStyle="1" w:styleId="BodyTextChar">
     <w:name w:val="Body Text Char"/>
     <w:basedOn w:val="DefaultParagraphFont"/>
     <w:link w:val="BodyText"/>
   </w:style>
-  <w:style w:customStyle="1" w:styleId="VerbatimChar" w:type="character">
+  <w:style w:type="character" w:customStyle="1" w:styleId="VerbatimChar">
     <w:name w:val="Verbatim Char"/>
     <w:basedOn w:val="BodyTextChar"/>
     <w:rPr>
-      <w:rFonts w:ascii="Times New Roman" w:cs="Times New Roman" w:eastAsia="Times New Roman" w:hAnsi="Times New Roman"/>
+      <w:rFonts w:ascii="Times New Roman" w:hAnsi="Times New Roman" w:eastAsia="Times New Roman" w:cs="Times New Roman"/>
       <w:sz w:val="24"/>
     </w:rPr>
   </w:style>
-  <w:style w:customStyle="1" w:styleId="SectionNumber" w:type="character">
+  <w:style w:type="character" w:customStyle="1" w:styleId="SectionNumber">
     <w:name w:val="Section Number"/>
     <w:basedOn w:val="BodyTextChar"/>
   </w:style>
-  <w:style w:styleId="FootnoteReference" w:type="character">
+  <w:style w:type="character" w:styleId="FootnoteReference">
     <w:name w:val="Footnote Reference"/>
     <w:basedOn w:val="BodyTextChar"/>
     <w:rPr>
       <w:vertAlign w:val="superscript"/>
     </w:rPr>
   </w:style>
-  <w:style w:styleId="Hyperlink" w:type="character">
+  <w:style w:type="character" w:styleId="Hyperlink">
     <w:name w:val="Hyperlink"/>
     <w:basedOn w:val="BodyTextChar"/>
     <w:rPr>
       <w:color w:val="000000"/>
     </w:rPr>
   </w:style>
-  <w:style w:styleId="TOCHeading" w:type="paragraph">
+  <w:style w:type="paragraph" w:styleId="TOCHeading">
     <w:name w:val="TOC Heading"/>
     <w:basedOn w:val="Heading1"/>
     <w:next w:val="BodyText"/>
@@ -12759,7 +12781,7 @@
       <w:outlineLvl w:val="9"/>
     </w:pPr>
     <w:rPr>
-      <w:rFonts w:ascii="Times New Roman" w:cs="Times New Roman" w:eastAsia="Times New Roman" w:hAnsi="Times New Roman"/>
+      <w:rFonts w:ascii="Times New Roman" w:hAnsi="Times New Roman" w:eastAsia="Times New Roman" w:cs="Times New Roman"/>
       <w:b w:val="0"/>
       <w:bCs w:val="0"/>
       <w:sz w:val="22"/>

</xml_diff>

<commit_message>
TU-02 round 3: address full-read must-fix/should-fix/minor items, new who-provides table, age-45 robustness, ESM age table, text-number checker
</commit_message>
<xml_diff>
--- a/submission/02_grandparent_care/package/manuscript_anonymised.docx
+++ b/submission/02_grandparent_care/package/manuscript_anonymised.docx
@@ -29,7 +29,7 @@
         <w:pStyle w:val="Abstract"/>
       </w:pPr>
       <w:r>
-        <w:t xml:space="preserve">Do grandmothers at home relieve mothers of childcare, and what do they give up? Same-day time diaries from India’s Time Use Survey 2024 cover both generations in each household. I compare 49,992 married mothers of children under six, 36% of whom live with a grandmother, and 26,062 women and 19,382 men aged 45 to 80 in the generation above them. The innovation is to measure grandmothers’ own time and to link them correctly to young children, although household lists do not record each child’s mother. Grandmothers living with a young grandchild report 79.5 minutes more childcare a day and less domestic work, free time and sleep. Mothers’ childcare and paid work differ little between households with and without a grandmother; the differences could be zero and change with the method. The contribution is to show that grandmother care costs older women time, while its benefit for mothers’ work is unproven.</w:t>
+        <w:t xml:space="preserve">Do coresident grandmothers relieve mothers of childcare, and what do they give up? India’s Time Use Survey 2024 records same-day diaries for every household member aged six and above. I compare 49,992 married mothers of children under six, 36% of whom live with a grandmother, and study 26,062 women and 19,382 men aged 45 to 80 in the generation above young married women. The roster omits each child’s mother, so I assign children and grandparents by generation. Older women living with a child under six report 79.5 minutes more childcare a day and less domestic work, free time and sleep. Mothers’ childcare and paid-work minutes differ little with and without a grandmother and change with the specification; their employment rate is 1.4 percentage points lower. Grandmother care is associated with a large time cost for older women and, in the pooled sample, with no more paid work by mothers.</w:t>
       </w:r>
     </w:p>
     <w:p>
@@ -275,67 +275,67 @@
         <w:t xml:space="preserve"> </w:t>
       </w:r>
       <w:r>
-        <w:t xml:space="preserve">rise with education and income (Klasen and Pieters 2015; Chatterjee et</w:t>
-      </w:r>
-      <w:r>
-        <w:t xml:space="preserve"> </w:t>
-      </w:r>
-      <w:r>
-        <w:t xml:space="preserve">al. 2018; Fletcher et al. 2019). A common presumption, in policy</w:t>
-      </w:r>
-      <w:r>
-        <w:t xml:space="preserve"> </w:t>
-      </w:r>
-      <w:r>
-        <w:t xml:space="preserve">discussion and in the family itself, is that coresident grandparents,</w:t>
-      </w:r>
-      <w:r>
-        <w:t xml:space="preserve"> </w:t>
-      </w:r>
-      <w:r>
-        <w:t xml:space="preserve">above all grandmothers, absorb much of the care of young children and so</w:t>
-      </w:r>
-      <w:r>
-        <w:t xml:space="preserve"> </w:t>
-      </w:r>
-      <w:r>
-        <w:t xml:space="preserve">free mothers to work, rest or invest in other children. The presumption</w:t>
-      </w:r>
-      <w:r>
-        <w:t xml:space="preserve"> </w:t>
-      </w:r>
-      <w:r>
-        <w:t xml:space="preserve">has empirical support elsewhere: in the United States, Europe, China and</w:t>
-      </w:r>
-      <w:r>
-        <w:t xml:space="preserve"> </w:t>
-      </w:r>
-      <w:r>
-        <w:t xml:space="preserve">Japan the availability of grandparents is associated with, and in</w:t>
-      </w:r>
-      <w:r>
-        <w:t xml:space="preserve"> </w:t>
-      </w:r>
-      <w:r>
-        <w:t xml:space="preserve">several quasi-experimental designs causes, higher maternal employment</w:t>
-      </w:r>
-      <w:r>
-        <w:t xml:space="preserve"> </w:t>
-      </w:r>
-      <w:r>
-        <w:t xml:space="preserve">(Ogawa and Ermisch 1996; Sasaki 2002; Maurer-Fazio et al. 2011; Posadas</w:t>
-      </w:r>
-      <w:r>
-        <w:t xml:space="preserve"> </w:t>
-      </w:r>
-      <w:r>
-        <w:t xml:space="preserve">and Vidal-Fernández 2013; Arpino et al. 2014; Compton and Pollak 2014;</w:t>
-      </w:r>
-      <w:r>
-        <w:t xml:space="preserve"> </w:t>
-      </w:r>
-      <w:r>
-        <w:t xml:space="preserve">Bratti et al. 2018).</w:t>
+        <w:t xml:space="preserve">rise with education and income (Klasen and Pieters 2015; Afridi et al.</w:t>
+      </w:r>
+      <w:r>
+        <w:t xml:space="preserve"> </w:t>
+      </w:r>
+      <w:r>
+        <w:t xml:space="preserve">2018; Chatterjee et al. 2018; Fletcher et al. 2019). A common</w:t>
+      </w:r>
+      <w:r>
+        <w:t xml:space="preserve"> </w:t>
+      </w:r>
+      <w:r>
+        <w:t xml:space="preserve">presumption, in policy discussion and in the family itself, is that</w:t>
+      </w:r>
+      <w:r>
+        <w:t xml:space="preserve"> </w:t>
+      </w:r>
+      <w:r>
+        <w:t xml:space="preserve">coresident grandparents, above all grandmothers, absorb much of the care</w:t>
+      </w:r>
+      <w:r>
+        <w:t xml:space="preserve"> </w:t>
+      </w:r>
+      <w:r>
+        <w:t xml:space="preserve">of young children and so free mothers to work, rest or invest in other</w:t>
+      </w:r>
+      <w:r>
+        <w:t xml:space="preserve"> </w:t>
+      </w:r>
+      <w:r>
+        <w:t xml:space="preserve">children. The presumption has empirical support elsewhere: in the United</w:t>
+      </w:r>
+      <w:r>
+        <w:t xml:space="preserve"> </w:t>
+      </w:r>
+      <w:r>
+        <w:t xml:space="preserve">States, Europe, China and Japan the availability of grandparents is</w:t>
+      </w:r>
+      <w:r>
+        <w:t xml:space="preserve"> </w:t>
+      </w:r>
+      <w:r>
+        <w:t xml:space="preserve">associated with, and in several quasi-experimental designs causes,</w:t>
+      </w:r>
+      <w:r>
+        <w:t xml:space="preserve"> </w:t>
+      </w:r>
+      <w:r>
+        <w:t xml:space="preserve">higher maternal employment (Ogawa and Ermisch 1996; Sasaki 2002;</w:t>
+      </w:r>
+      <w:r>
+        <w:t xml:space="preserve"> </w:t>
+      </w:r>
+      <w:r>
+        <w:t xml:space="preserve">Maurer-Fazio et al. 2011; Posadas and Vidal-Fernández 2013; Arpino et</w:t>
+      </w:r>
+      <w:r>
+        <w:t xml:space="preserve"> </w:t>
+      </w:r>
+      <w:r>
+        <w:t xml:space="preserve">al. 2014; Compton and Pollak 2014; Bratti et al. 2018).</w:t>
       </w:r>
     </w:p>
     <w:p>
@@ -707,31 +707,43 @@
         <w:t xml:space="preserve"> </w:t>
       </w:r>
       <w:r>
-        <w:t xml:space="preserve">minutes (CI -3.8 to 3.0). These estimates are fragile. The childcare</w:t>
-      </w:r>
-      <w:r>
-        <w:t xml:space="preserve"> </w:t>
-      </w:r>
-      <w:r>
-        <w:t xml:space="preserve">estimate ranges from -13.2 to 8.2 minutes across the specifications in</w:t>
-      </w:r>
-      <w:r>
-        <w:t xml:space="preserve"> </w:t>
-      </w:r>
-      <w:r>
-        <w:t xml:space="preserve">the robustness table, and subgroup estimates differ in size and, for</w:t>
-      </w:r>
-      <w:r>
-        <w:t xml:space="preserve"> </w:t>
-      </w:r>
-      <w:r>
-        <w:t xml:space="preserve">paid work, in sign. The grandmother’s side is much clearer: grandmothers</w:t>
-      </w:r>
-      <w:r>
-        <w:t xml:space="preserve"> </w:t>
-      </w:r>
-      <w:r>
-        <w:t xml:space="preserve">who live with a child under six report 85.9 minutes (CI 83.7 to 88.1) of</w:t>
+        <w:t xml:space="preserve">minutes (CI -3.8 to 3.0), and her probability of being employed by usual</w:t>
+      </w:r>
+      <w:r>
+        <w:t xml:space="preserve"> </w:t>
+      </w:r>
+      <w:r>
+        <w:t xml:space="preserve">status is 1.4 percentage points lower (CI -2.3 to -0.4). The minute</w:t>
+      </w:r>
+      <w:r>
+        <w:t xml:space="preserve"> </w:t>
+      </w:r>
+      <w:r>
+        <w:t xml:space="preserve">estimates are fragile. The childcare estimate ranges from -13.2 to 8.3</w:t>
+      </w:r>
+      <w:r>
+        <w:t xml:space="preserve"> </w:t>
+      </w:r>
+      <w:r>
+        <w:t xml:space="preserve">minutes across the specifications in the robustness table, and subgroup</w:t>
+      </w:r>
+      <w:r>
+        <w:t xml:space="preserve"> </w:t>
+      </w:r>
+      <w:r>
+        <w:t xml:space="preserve">estimates differ in size and, for paid work, in sign. The grandmother’s</w:t>
+      </w:r>
+      <w:r>
+        <w:t xml:space="preserve"> </w:t>
+      </w:r>
+      <w:r>
+        <w:t xml:space="preserve">side is much clearer: in households with a child under six, the</w:t>
+      </w:r>
+      <w:r>
+        <w:t xml:space="preserve"> </w:t>
+      </w:r>
+      <w:r>
+        <w:t xml:space="preserve">grandmother or grandmothers together report 85.9 minutes (SE 1.1) of</w:t>
       </w:r>
       <w:r>
         <w:t xml:space="preserve"> </w:t>
@@ -793,37 +805,37 @@
         <w:t xml:space="preserve"> </w:t>
       </w:r>
       <w:r>
-        <w:t xml:space="preserve">association with mothers’ time depends on the grandmother’s age and</w:t>
-      </w:r>
-      <w:r>
-        <w:t xml:space="preserve"> </w:t>
-      </w:r>
-      <w:r>
-        <w:t xml:space="preserve">employment and on the household arrangement. For research on population</w:t>
-      </w:r>
-      <w:r>
-        <w:t xml:space="preserve"> </w:t>
-      </w:r>
-      <w:r>
-        <w:t xml:space="preserve">aging and older women, it measures directly the time that older women</w:t>
-      </w:r>
-      <w:r>
-        <w:t xml:space="preserve"> </w:t>
-      </w:r>
-      <w:r>
-        <w:t xml:space="preserve">give to grandchildren in a patrilocal, middle-income setting and the</w:t>
-      </w:r>
-      <w:r>
-        <w:t xml:space="preserve"> </w:t>
-      </w:r>
-      <w:r>
-        <w:t xml:space="preserve">other parts of their day from which it comes. For the study of family</w:t>
-      </w:r>
-      <w:r>
-        <w:t xml:space="preserve"> </w:t>
-      </w:r>
-      <w:r>
-        <w:t xml:space="preserve">structure and women’s work in South Asia, it documents</w:t>
+        <w:t xml:space="preserve">association with mothers’ time appears to depend on the grandmother’s</w:t>
+      </w:r>
+      <w:r>
+        <w:t xml:space="preserve"> </w:t>
+      </w:r>
+      <w:r>
+        <w:t xml:space="preserve">age and employment and on the household arrangement. For research on</w:t>
+      </w:r>
+      <w:r>
+        <w:t xml:space="preserve"> </w:t>
+      </w:r>
+      <w:r>
+        <w:t xml:space="preserve">population aging and older women, it measures directly the time that</w:t>
+      </w:r>
+      <w:r>
+        <w:t xml:space="preserve"> </w:t>
+      </w:r>
+      <w:r>
+        <w:t xml:space="preserve">older women give to grandchildren in a patrilocal, middle-income setting</w:t>
+      </w:r>
+      <w:r>
+        <w:t xml:space="preserve"> </w:t>
+      </w:r>
+      <w:r>
+        <w:t xml:space="preserve">and the other parts of their day from which it comes. For the study of</w:t>
+      </w:r>
+      <w:r>
+        <w:t xml:space="preserve"> </w:t>
+      </w:r>
+      <w:r>
+        <w:t xml:space="preserve">family structure and women’s work in South Asia, it documents</w:t>
       </w:r>
       <w:r>
         <w:t xml:space="preserve"> </w:t>
@@ -971,61 +983,79 @@
         <w:t xml:space="preserve"> </w:t>
       </w:r>
       <w:r>
-        <w:t xml:space="preserve">availability, and find lower participation among their daughters. The</w:t>
-      </w:r>
-      <w:r>
-        <w:t xml:space="preserve"> </w:t>
-      </w:r>
-      <w:r>
-        <w:t xml:space="preserve">evidence from Asia is closer to the Indian setting because coresidence,</w:t>
-      </w:r>
-      <w:r>
-        <w:t xml:space="preserve"> </w:t>
-      </w:r>
-      <w:r>
-        <w:t xml:space="preserve">not proximity, is the usual arrangement. Ogawa and Ermisch (1996) and</w:t>
-      </w:r>
-      <w:r>
-        <w:t xml:space="preserve"> </w:t>
-      </w:r>
-      <w:r>
-        <w:t xml:space="preserve">Sasaki (2002) find that coresidence with parents or parents-in-law</w:t>
-      </w:r>
-      <w:r>
-        <w:t xml:space="preserve"> </w:t>
-      </w:r>
-      <w:r>
-        <w:t xml:space="preserve">raised Japanese married women’s employment, and Maurer-Fazio et al.</w:t>
-      </w:r>
-      <w:r>
-        <w:t xml:space="preserve"> </w:t>
-      </w:r>
-      <w:r>
-        <w:t xml:space="preserve">(2011) find a similar association in urban China, while Igel and Szydlik</w:t>
-      </w:r>
-      <w:r>
-        <w:t xml:space="preserve"> </w:t>
-      </w:r>
-      <w:r>
-        <w:t xml:space="preserve">(2011) show that welfare states shape the form of grandparental care.</w:t>
-      </w:r>
-      <w:r>
-        <w:t xml:space="preserve"> </w:t>
-      </w:r>
-      <w:r>
-        <w:t xml:space="preserve">For the United States, Bansak et al. (2026) find that living with a</w:t>
-      </w:r>
-      <w:r>
-        <w:t xml:space="preserve"> </w:t>
-      </w:r>
-      <w:r>
-        <w:t xml:space="preserve">grandparent is positively related to employment among Asian mothers but</w:t>
-      </w:r>
-      <w:r>
-        <w:t xml:space="preserve"> </w:t>
-      </w:r>
-      <w:r>
-        <w:t xml:space="preserve">not among white mothers.</w:t>
+        <w:t xml:space="preserve">availability, and find lower participation among their daughters. On the</w:t>
+      </w:r>
+      <w:r>
+        <w:t xml:space="preserve"> </w:t>
+      </w:r>
+      <w:r>
+        <w:t xml:space="preserve">grandmothers’ side, Frimmel et al. (2022) show with Austrian</w:t>
+      </w:r>
+      <w:r>
+        <w:t xml:space="preserve"> </w:t>
+      </w:r>
+      <w:r>
+        <w:t xml:space="preserve">administrative data that a first grandchild raises the probability that</w:t>
+      </w:r>
+      <w:r>
+        <w:t xml:space="preserve"> </w:t>
+      </w:r>
+      <w:r>
+        <w:t xml:space="preserve">a grandmother leaves the labor market, and Igel and Szydlik (2011) show</w:t>
+      </w:r>
+      <w:r>
+        <w:t xml:space="preserve"> </w:t>
+      </w:r>
+      <w:r>
+        <w:t xml:space="preserve">that welfare-state arrangements shape the form of grandparental care</w:t>
+      </w:r>
+      <w:r>
+        <w:t xml:space="preserve"> </w:t>
+      </w:r>
+      <w:r>
+        <w:t xml:space="preserve">across Europe. The evidence from Asia is closer to the Indian setting</w:t>
+      </w:r>
+      <w:r>
+        <w:t xml:space="preserve"> </w:t>
+      </w:r>
+      <w:r>
+        <w:t xml:space="preserve">because coresidence, not proximity, is the usual arrangement. Ogawa and</w:t>
+      </w:r>
+      <w:r>
+        <w:t xml:space="preserve"> </w:t>
+      </w:r>
+      <w:r>
+        <w:t xml:space="preserve">Ermisch (1996) and Sasaki (2002) find that coresidence with parents or</w:t>
+      </w:r>
+      <w:r>
+        <w:t xml:space="preserve"> </w:t>
+      </w:r>
+      <w:r>
+        <w:t xml:space="preserve">parents-in-law raised Japanese married women’s employment, and</w:t>
+      </w:r>
+      <w:r>
+        <w:t xml:space="preserve"> </w:t>
+      </w:r>
+      <w:r>
+        <w:t xml:space="preserve">Maurer-Fazio et al. (2011) find a similar association in urban China.</w:t>
+      </w:r>
+      <w:r>
+        <w:t xml:space="preserve"> </w:t>
+      </w:r>
+      <w:r>
+        <w:t xml:space="preserve">For the United States, Bansak et al. (2026) find that living in an</w:t>
+      </w:r>
+      <w:r>
+        <w:t xml:space="preserve"> </w:t>
+      </w:r>
+      <w:r>
+        <w:t xml:space="preserve">intergenerational household is positively related to employment among</w:t>
+      </w:r>
+      <w:r>
+        <w:t xml:space="preserve"> </w:t>
+      </w:r>
+      <w:r>
+        <w:t xml:space="preserve">Asian women and negatively among white women.</w:t>
       </w:r>
     </w:p>
     <w:p>
@@ -1279,7 +1309,7 @@
         <w:t xml:space="preserve"> </w:t>
       </w:r>
       <w:r>
-        <w:t xml:space="preserve">in rural Uttar Pradesh, status concerns can lead households to withdraw</w:t>
+        <w:t xml:space="preserve">in rural Uttar Pradesh; status concerns can lead households to withdraw</w:t>
       </w:r>
       <w:r>
         <w:t xml:space="preserve"> </w:t>
@@ -1309,13 +1339,19 @@
         <w:t xml:space="preserve"> </w:t>
       </w:r>
       <w:r>
-        <w:t xml:space="preserve">joint households. These studies observe employment, autonomy or</w:t>
-      </w:r>
-      <w:r>
-        <w:t xml:space="preserve"> </w:t>
-      </w:r>
-      <w:r>
-        <w:t xml:space="preserve">decision-making, not time.</w:t>
+        <w:t xml:space="preserve">joint households, and Afridi et al. (2018) decompose the fall in rural</w:t>
+      </w:r>
+      <w:r>
+        <w:t xml:space="preserve"> </w:t>
+      </w:r>
+      <w:r>
+        <w:t xml:space="preserve">married women’s participation over two decades. These studies observe</w:t>
+      </w:r>
+      <w:r>
+        <w:t xml:space="preserve"> </w:t>
+      </w:r>
+      <w:r>
+        <w:t xml:space="preserve">employment, autonomy or decision-making, not time.</w:t>
       </w:r>
     </w:p>
     <w:p>
@@ -1826,25 +1862,67 @@
         <w:t xml:space="preserve"> </w:t>
       </w:r>
       <w:r>
-        <w:t xml:space="preserve">six. Of these, 33% are at junior level, and among junior-level mothers</w:t>
-      </w:r>
-      <w:r>
-        <w:t xml:space="preserve"> </w:t>
-      </w:r>
-      <w:r>
-        <w:t xml:space="preserve">95% are daughters-in-law of the head. The husband is linked to 83% of</w:t>
-      </w:r>
-      <w:r>
-        <w:t xml:space="preserve"> </w:t>
-      </w:r>
-      <w:r>
-        <w:t xml:space="preserve">mothers through the roster; I keep mothers whose husbands live elsewhere</w:t>
-      </w:r>
-      <w:r>
-        <w:t xml:space="preserve"> </w:t>
-      </w:r>
-      <w:r>
-        <w:t xml:space="preserve">in the sample, with an explicit indicator.</w:t>
+        <w:t xml:space="preserve">six. Of these, 33% (weighted) are at junior level, and among</w:t>
+      </w:r>
+      <w:r>
+        <w:t xml:space="preserve"> </w:t>
+      </w:r>
+      <w:r>
+        <w:t xml:space="preserve">junior-level mothers 95% are daughters-in-law of the head. The husband</w:t>
+      </w:r>
+      <w:r>
+        <w:t xml:space="preserve"> </w:t>
+      </w:r>
+      <w:r>
+        <w:t xml:space="preserve">is linked to 83% of mothers through the roster; I keep mothers whose</w:t>
+      </w:r>
+      <w:r>
+        <w:t xml:space="preserve"> </w:t>
+      </w:r>
+      <w:r>
+        <w:t xml:space="preserve">husbands live elsewhere in the sample, with an explicit indicator. A</w:t>
+      </w:r>
+      <w:r>
+        <w:t xml:space="preserve"> </w:t>
+      </w:r>
+      <w:r>
+        <w:t xml:space="preserve">mother’s own children aged six to 17, a control below, are also assigned</w:t>
+      </w:r>
+      <w:r>
+        <w:t xml:space="preserve"> </w:t>
+      </w:r>
+      <w:r>
+        <w:t xml:space="preserve">by roster position: for a head-level mother they are the head’s children</w:t>
+      </w:r>
+      <w:r>
+        <w:t xml:space="preserve"> </w:t>
+      </w:r>
+      <w:r>
+        <w:t xml:space="preserve">of that age, and for a junior-level mother the head’s grandchildren of</w:t>
+      </w:r>
+      <w:r>
+        <w:t xml:space="preserve"> </w:t>
+      </w:r>
+      <w:r>
+        <w:t xml:space="preserve">that age, but only where the household contains a single child-in-law of</w:t>
+      </w:r>
+      <w:r>
+        <w:t xml:space="preserve"> </w:t>
+      </w:r>
+      <w:r>
+        <w:t xml:space="preserve">the head. Otherwise the count is set to missing and replaced by zero</w:t>
+      </w:r>
+      <w:r>
+        <w:t xml:space="preserve"> </w:t>
+      </w:r>
+      <w:r>
+        <w:t xml:space="preserve">with an indicator for an unknown count; the youngest own child used for</w:t>
+      </w:r>
+      <w:r>
+        <w:t xml:space="preserve"> </w:t>
+      </w:r>
+      <w:r>
+        <w:t xml:space="preserve">the placebo sample follows the same rule.</w:t>
       </w:r>
     </w:p>
     <w:p>
@@ -1870,73 +1948,97 @@
         <w:t xml:space="preserve"> </w:t>
       </w:r>
       <w:r>
-        <w:t xml:space="preserve">40 or above. A coresident grandmother is at least one woman in this</w:t>
-      </w:r>
-      <w:r>
-        <w:t xml:space="preserve"> </w:t>
-      </w:r>
-      <w:r>
-        <w:t xml:space="preserve">generation, and a coresident grandfather at least one man. Because each</w:t>
-      </w:r>
-      <w:r>
-        <w:t xml:space="preserve"> </w:t>
-      </w:r>
-      <w:r>
-        <w:t xml:space="preserve">mother is matched to the specific members of the generation above her, a</w:t>
-      </w:r>
-      <w:r>
-        <w:t xml:space="preserve"> </w:t>
-      </w:r>
-      <w:r>
-        <w:t xml:space="preserve">grandmother is never the mother herself (zero self-links). By this</w:t>
-      </w:r>
-      <w:r>
-        <w:t xml:space="preserve"> </w:t>
-      </w:r>
-      <w:r>
-        <w:t xml:space="preserve">definition 36% of mothers of children under six live with a grandmother</w:t>
-      </w:r>
-      <w:r>
-        <w:t xml:space="preserve"> </w:t>
-      </w:r>
-      <w:r>
-        <w:t xml:space="preserve">and 28% with a grandfather; 4.5% live with a grandfather but no</w:t>
-      </w:r>
-      <w:r>
-        <w:t xml:space="preserve"> </w:t>
-      </w:r>
-      <w:r>
-        <w:t xml:space="preserve">grandmother. Among mothers with a coresident grandmother, 83% are at</w:t>
-      </w:r>
-      <w:r>
-        <w:t xml:space="preserve"> </w:t>
-      </w:r>
-      <w:r>
-        <w:t xml:space="preserve">junior level, so most three-generation households are of the patrilocal</w:t>
-      </w:r>
-      <w:r>
-        <w:t xml:space="preserve"> </w:t>
-      </w:r>
-      <w:r>
-        <w:t xml:space="preserve">type in which the young family lives in the older generation’s</w:t>
-      </w:r>
-      <w:r>
-        <w:t xml:space="preserve"> </w:t>
-      </w:r>
-      <w:r>
-        <w:t xml:space="preserve">household. The median age of the youngest coresident grandmother is 57</w:t>
-      </w:r>
-      <w:r>
-        <w:t xml:space="preserve"> </w:t>
-      </w:r>
-      <w:r>
-        <w:t xml:space="preserve">years, 60% of grandmothers are under 60, and 30% report employment as</w:t>
-      </w:r>
-      <w:r>
-        <w:t xml:space="preserve"> </w:t>
-      </w:r>
-      <w:r>
-        <w:t xml:space="preserve">their usual principal activity status.</w:t>
+        <w:t xml:space="preserve">40 or above; the lower limit admits young grandmothers while excluding</w:t>
+      </w:r>
+      <w:r>
+        <w:t xml:space="preserve"> </w:t>
+      </w:r>
+      <w:r>
+        <w:t xml:space="preserve">heads’ spouses who are likely to be the mother’s sisters-in-law rather</w:t>
+      </w:r>
+      <w:r>
+        <w:t xml:space="preserve"> </w:t>
+      </w:r>
+      <w:r>
+        <w:t xml:space="preserve">than her parents-in-law. A coresident grandmother is at least one woman</w:t>
+      </w:r>
+      <w:r>
+        <w:t xml:space="preserve"> </w:t>
+      </w:r>
+      <w:r>
+        <w:t xml:space="preserve">in this generation, and a coresident grandfather at least one man.</w:t>
+      </w:r>
+      <w:r>
+        <w:t xml:space="preserve"> </w:t>
+      </w:r>
+      <w:r>
+        <w:t xml:space="preserve">Because each mother is matched to the specific members of the generation</w:t>
+      </w:r>
+      <w:r>
+        <w:t xml:space="preserve"> </w:t>
+      </w:r>
+      <w:r>
+        <w:t xml:space="preserve">above her, a grandmother is never the mother herself (zero self-links).</w:t>
+      </w:r>
+      <w:r>
+        <w:t xml:space="preserve"> </w:t>
+      </w:r>
+      <w:r>
+        <w:t xml:space="preserve">By this definition 36% (weighted) of mothers of children under six live</w:t>
+      </w:r>
+      <w:r>
+        <w:t xml:space="preserve"> </w:t>
+      </w:r>
+      <w:r>
+        <w:t xml:space="preserve">with a grandmother and 28% with a grandfather; 4.5% live with a</w:t>
+      </w:r>
+      <w:r>
+        <w:t xml:space="preserve"> </w:t>
+      </w:r>
+      <w:r>
+        <w:t xml:space="preserve">grandfather but no grandmother. Among mothers with a coresident</w:t>
+      </w:r>
+      <w:r>
+        <w:t xml:space="preserve"> </w:t>
+      </w:r>
+      <w:r>
+        <w:t xml:space="preserve">grandmother, 83% are at junior level, so most three-generation</w:t>
+      </w:r>
+      <w:r>
+        <w:t xml:space="preserve"> </w:t>
+      </w:r>
+      <w:r>
+        <w:t xml:space="preserve">households are of the patrilocal type in which the young family lives in</w:t>
+      </w:r>
+      <w:r>
+        <w:t xml:space="preserve"> </w:t>
+      </w:r>
+      <w:r>
+        <w:t xml:space="preserve">the older generation’s household. The median age of the youngest</w:t>
+      </w:r>
+      <w:r>
+        <w:t xml:space="preserve"> </w:t>
+      </w:r>
+      <w:r>
+        <w:t xml:space="preserve">coresident grandmother is 57 years, 60% of grandmothers are under 60,</w:t>
+      </w:r>
+      <w:r>
+        <w:t xml:space="preserve"> </w:t>
+      </w:r>
+      <w:r>
+        <w:t xml:space="preserve">and 30% report employment as their usual principal activity status</w:t>
+      </w:r>
+      <w:r>
+        <w:t xml:space="preserve"> </w:t>
+      </w:r>
+      <w:r>
+        <w:t xml:space="preserve">(counts and weighted shares in Table S2 of Online</w:t>
+      </w:r>
+      <w:r>
+        <w:t xml:space="preserve"> </w:t>
+      </w:r>
+      <w:r>
+        <w:t xml:space="preserve">Resource 1).</w:t>
       </w:r>
     </w:p>
     <w:p>
@@ -2048,25 +2150,25 @@
         <w:t xml:space="preserve"> </w:t>
       </w:r>
       <w:r>
-        <w:t xml:space="preserve">146.1 minutes (CI 144.3 to 148.0) of primary childcare a day and mothers</w:t>
-      </w:r>
-      <w:r>
-        <w:t xml:space="preserve"> </w:t>
-      </w:r>
-      <w:r>
-        <w:t xml:space="preserve">with one 144.8 minutes (CI 142.7 to 147.0). The raw comparison mixes the</w:t>
-      </w:r>
-      <w:r>
-        <w:t xml:space="preserve"> </w:t>
-      </w:r>
-      <w:r>
-        <w:t xml:space="preserve">grandmother’s presence with everything that differs between joint and</w:t>
-      </w:r>
-      <w:r>
-        <w:t xml:space="preserve"> </w:t>
-      </w:r>
-      <w:r>
-        <w:t xml:space="preserve">nuclear households, which motivates the regression approach.</w:t>
+        <w:t xml:space="preserve">146.1 minutes (SE 1.0) of primary childcare a day and mothers with one</w:t>
+      </w:r>
+      <w:r>
+        <w:t xml:space="preserve"> </w:t>
+      </w:r>
+      <w:r>
+        <w:t xml:space="preserve">144.8 minutes (SE 1.1). The raw comparison mixes the grandmother’s</w:t>
+      </w:r>
+      <w:r>
+        <w:t xml:space="preserve"> </w:t>
+      </w:r>
+      <w:r>
+        <w:t xml:space="preserve">presence with everything that differs between joint and nuclear</w:t>
+      </w:r>
+      <w:r>
+        <w:t xml:space="preserve"> </w:t>
+      </w:r>
+      <w:r>
+        <w:t xml:space="preserve">households, which motivates the regression approach.</w:t>
       </w:r>
     </w:p>
     <w:bookmarkStart w:id="20" w:name="_32eab13c41a40ee25acd11afb5cf39d70818b1b"/>
@@ -2173,7 +2275,7 @@
               <w:rPr>
                 <w:sz w:val="18"/>
               </w:rPr>
-              <w:t xml:space="preserve">146.1 (0.9)</w:t>
+              <w:t xml:space="preserve">146.1 (1.0)</w:t>
             </w:r>
           </w:p>
         </w:tc>
@@ -2373,7 +2475,7 @@
               <w:rPr>
                 <w:sz w:val="18"/>
               </w:rPr>
-              <w:t xml:space="preserve">358.7 (1.2)</w:t>
+              <w:t xml:space="preserve">358.7 (1.3)</w:t>
             </w:r>
           </w:p>
         </w:tc>
@@ -2711,7 +2813,7 @@
         <w:t xml:space="preserve"> </w:t>
       </w:r>
       <w:r>
-        <w:t xml:space="preserve">Married women aged 18–49 at head or junior level in households with a child under six, excluding head-level women who live with a junior married woman of childbearing age. Survey-weighted means; FSU-clustered standard errors in parentheses. Employed is a share (three decimals).</w:t>
+        <w:t xml:space="preserve">Married women aged 18–49 at head or junior level (head or spouse of head; married child of head or that child’s spouse) in households with a child under six, excluding head-level women who live with a junior married woman of childbearing age. Survey-weighted means; FSU-clustered standard errors in parentheses. Employed is a share (three decimals).</w:t>
       </w:r>
     </w:p>
     <w:p>
@@ -2821,6 +2923,12 @@
             </m:r>
             <m:r>
               <m:t>h</m:t>
+            </m:r>
+            <m:r>
+              <m:t>s</m:t>
+            </m:r>
+            <m:r>
+              <m:t>d</m:t>
             </m:r>
           </m:sub>
         </m:sSub>
@@ -2938,6 +3046,12 @@
             <m:r>
               <m:t>h</m:t>
             </m:r>
+            <m:r>
+              <m:t>s</m:t>
+            </m:r>
+            <m:r>
+              <m:t>d</m:t>
+            </m:r>
           </m:sub>
         </m:sSub>
         <m:r>
@@ -2975,6 +3089,12 @@
             </m:r>
             <m:r>
               <m:t>h</m:t>
+            </m:r>
+            <m:r>
+              <m:t>s</m:t>
+            </m:r>
+            <m:r>
+              <m:t>d</m:t>
             </m:r>
           </m:sub>
         </m:sSub>
@@ -3201,7 +3321,7 @@
         <w:t xml:space="preserve"> </w:t>
       </w:r>
       <w:r>
-        <w:t xml:space="preserve">which is more often driven by the grandparents’ need for support. Most</w:t>
+        <w:t xml:space="preserve">which may more often reflect the grandparents’ need for support. Most</w:t>
       </w:r>
       <w:r>
         <w:t xml:space="preserve"> </w:t>
@@ -3323,13 +3443,67 @@
         <w:t xml:space="preserve"> </w:t>
       </w:r>
       <w:r>
-        <w:t xml:space="preserve">grandchildren are older or not yet born, which depends on the timing of</w:t>
-      </w:r>
-      <w:r>
-        <w:t xml:space="preserve"> </w:t>
-      </w:r>
-      <w:r>
-        <w:t xml:space="preserve">the junior couple’s fertility rather than on the decision to coreside.</w:t>
+        <w:t xml:space="preserve">grandchildren are older or not yet born. Because every member of this</w:t>
+      </w:r>
+      <w:r>
+        <w:t xml:space="preserve"> </w:t>
+      </w:r>
+      <w:r>
+        <w:t xml:space="preserve">sample already lives with a married woman of childbearing age, the</w:t>
+      </w:r>
+      <w:r>
+        <w:t xml:space="preserve"> </w:t>
+      </w:r>
+      <w:r>
+        <w:t xml:space="preserve">comparison turns mainly on the timing of the junior couple’s fertility.</w:t>
+      </w:r>
+      <w:r>
+        <w:t xml:space="preserve"> </w:t>
+      </w:r>
+      <w:r>
+        <w:t xml:space="preserve">Fertility timing and living arrangements can still be chosen together,</w:t>
+      </w:r>
+      <w:r>
+        <w:t xml:space="preserve"> </w:t>
+      </w:r>
+      <w:r>
+        <w:t xml:space="preserve">for example when a couple stays in the parental household because a</w:t>
+      </w:r>
+      <w:r>
+        <w:t xml:space="preserve"> </w:t>
+      </w:r>
+      <w:r>
+        <w:t xml:space="preserve">child is born, so these estimates are also conditional associations. The</w:t>
+      </w:r>
+      <w:r>
+        <w:t xml:space="preserve"> </w:t>
+      </w:r>
+      <w:r>
+        <w:t xml:space="preserve">older-generation sample starts at 45, while the grandmother link for</w:t>
+      </w:r>
+      <w:r>
+        <w:t xml:space="preserve"> </w:t>
+      </w:r>
+      <w:r>
+        <w:t xml:space="preserve">junior-level mothers starts at 40. Online Resource 1 (Table</w:t>
+      </w:r>
+      <w:r>
+        <w:t xml:space="preserve"> </w:t>
+      </w:r>
+      <w:r>
+        <w:t xml:space="preserve">S3) re-estimates the older women’s equations from age 40,</w:t>
+      </w:r>
+      <w:r>
+        <w:t xml:space="preserve"> </w:t>
+      </w:r>
+      <w:r>
+        <w:t xml:space="preserve">and the robustness table defines the grandmother as a woman aged 45 or</w:t>
+      </w:r>
+      <w:r>
+        <w:t xml:space="preserve"> </w:t>
+      </w:r>
+      <w:r>
+        <w:t xml:space="preserve">above.</w:t>
       </w:r>
     </w:p>
     <w:p>
@@ -3515,7 +3689,7 @@
         <w:t xml:space="preserve"> </w:t>
       </w:r>
       <w:r>
-        <w:t xml:space="preserve">shows -2.2 minutes (CI -4.6 to 0.3) for active care and 0.0 minutes (CI</w:t>
+        <w:t xml:space="preserve">shows -2.2 minutes (CI -4.6 to 0.3) for active care and -0.1 minutes (CI</w:t>
       </w:r>
       <w:r>
         <w:t xml:space="preserve"> </w:t>
@@ -3527,19 +3701,37 @@
         <w:t xml:space="preserve"> </w:t>
       </w:r>
       <w:r>
-        <w:t xml:space="preserve">include zero. Mothers with a coresident grandmother also record less</w:t>
-      </w:r>
-      <w:r>
-        <w:t xml:space="preserve"> </w:t>
-      </w:r>
-      <w:r>
-        <w:t xml:space="preserve">childcare as a secondary activity (-9.6 minutes (CI -11.7 to -7.5)), so</w:t>
-      </w:r>
-      <w:r>
-        <w:t xml:space="preserve"> </w:t>
-      </w:r>
-      <w:r>
-        <w:t xml:space="preserve">the lower supervision is not confined to primary care.</w:t>
+        <w:t xml:space="preserve">include zero, and passive minding, the component the first prediction</w:t>
+      </w:r>
+      <w:r>
+        <w:t xml:space="preserve"> </w:t>
+      </w:r>
+      <w:r>
+        <w:t xml:space="preserve">expects to fall most, is almost unchanged, so that prediction is not</w:t>
+      </w:r>
+      <w:r>
+        <w:t xml:space="preserve"> </w:t>
+      </w:r>
+      <w:r>
+        <w:t xml:space="preserve">borne out in primary care. Mothers with a coresident grandmother do</w:t>
+      </w:r>
+      <w:r>
+        <w:t xml:space="preserve"> </w:t>
+      </w:r>
+      <w:r>
+        <w:t xml:space="preserve">record less childcare as a secondary activity (-9.6 minutes (CI -11.8 to</w:t>
+      </w:r>
+      <w:r>
+        <w:t xml:space="preserve"> </w:t>
+      </w:r>
+      <w:r>
+        <w:t xml:space="preserve">-7.5)), so supervision is lower only when it is recorded as a secondary</w:t>
+      </w:r>
+      <w:r>
+        <w:t xml:space="preserve"> </w:t>
+      </w:r>
+      <w:r>
+        <w:t xml:space="preserve">activity, not as primary minding.</w:t>
       </w:r>
     </w:p>
     <w:bookmarkStart w:id="25" w:name="_2d3306491f8074877991796d556fbadbc1a72cc"/>
@@ -3794,7 +3986,7 @@
               <w:rPr>
                 <w:sz w:val="18"/>
               </w:rPr>
-              <w:t xml:space="preserve">[-4.59, 0.25]</w:t>
+              <w:t xml:space="preserve">[-4.60, 0.25]</w:t>
             </w:r>
           </w:p>
         </w:tc>
@@ -4762,97 +4954,129 @@
         <w:t xml:space="preserve"> </w:t>
       </w:r>
       <w:r>
-        <w:t xml:space="preserve">with a grandmother, grandmothers provide 85.9 minutes (CI 83.7 to 88.1)</w:t>
-      </w:r>
-      <w:r>
-        <w:t xml:space="preserve"> </w:t>
-      </w:r>
-      <w:r>
-        <w:t xml:space="preserve">of childcare a day. They also report 148.7 minutes (CI 145.6 to 151.8)</w:t>
-      </w:r>
-      <w:r>
-        <w:t xml:space="preserve"> </w:t>
-      </w:r>
-      <w:r>
-        <w:t xml:space="preserve">of domestic work and 98.9 minutes (CI 94.8 to 102.9) of employment,</w:t>
-      </w:r>
-      <w:r>
-        <w:t xml:space="preserve"> </w:t>
-      </w:r>
-      <w:r>
-        <w:t xml:space="preserve">which shows what else their day contains. Because a grandmother adds a</w:t>
-      </w:r>
-      <w:r>
-        <w:t xml:space="preserve"> </w:t>
-      </w:r>
-      <w:r>
-        <w:t xml:space="preserve">carer, the relevant comparison is total childcare, conditional on the</w:t>
-      </w:r>
-      <w:r>
-        <w:t xml:space="preserve"> </w:t>
-      </w:r>
-      <w:r>
-        <w:t xml:space="preserve">number of children of each age. Summed over all members aged 15 and</w:t>
-      </w:r>
-      <w:r>
-        <w:t xml:space="preserve"> </w:t>
-      </w:r>
-      <w:r>
-        <w:t xml:space="preserve">above, childcare is 88.6 minutes higher (CI 84.0 to 93.2) in households</w:t>
-      </w:r>
-      <w:r>
-        <w:t xml:space="preserve"> </w:t>
-      </w:r>
-      <w:r>
-        <w:t xml:space="preserve">with a grandmother. Children in three-generation households thus receive</w:t>
-      </w:r>
-      <w:r>
-        <w:t xml:space="preserve"> </w:t>
-      </w:r>
-      <w:r>
-        <w:t xml:space="preserve">more adult childcare time, not the same care more cheaply. Part of the</w:t>
-      </w:r>
-      <w:r>
-        <w:t xml:space="preserve"> </w:t>
-      </w:r>
-      <w:r>
-        <w:t xml:space="preserve">difference may reflect two adults recording care of the same child at</w:t>
-      </w:r>
-      <w:r>
-        <w:t xml:space="preserve"> </w:t>
-      </w:r>
-      <w:r>
-        <w:t xml:space="preserve">the same time, and part the care of several grandchildren at once; the</w:t>
-      </w:r>
-      <w:r>
-        <w:t xml:space="preserve"> </w:t>
-      </w:r>
-      <w:r>
-        <w:t xml:space="preserve">diary does not identify the recipient. Husbands’ childcare, for those</w:t>
-      </w:r>
-      <w:r>
-        <w:t xml:space="preserve"> </w:t>
-      </w:r>
-      <w:r>
-        <w:t xml:space="preserve">linked, differs by -14.1 minutes (CI -15.6 to -12.6) with a</w:t>
-      </w:r>
-      <w:r>
-        <w:t xml:space="preserve"> </w:t>
-      </w:r>
-      <w:r>
-        <w:t xml:space="preserve">grandmother’s presence. Grandmothers’ care therefore appears to replace</w:t>
-      </w:r>
-      <w:r>
-        <w:t xml:space="preserve"> </w:t>
-      </w:r>
-      <w:r>
-        <w:t xml:space="preserve">part of fathers’ contribution, which is modest, as well as adding to the</w:t>
-      </w:r>
-      <w:r>
-        <w:t xml:space="preserve"> </w:t>
-      </w:r>
-      <w:r>
-        <w:t xml:space="preserve">household’s total.</w:t>
+        <w:t xml:space="preserve">with a grandmother, the grandmother or grandmothers in the household</w:t>
+      </w:r>
+      <w:r>
+        <w:t xml:space="preserve"> </w:t>
+      </w:r>
+      <w:r>
+        <w:t xml:space="preserve">together provide 85.9 minutes (SE 1.1) of childcare a day. They also</w:t>
+      </w:r>
+      <w:r>
+        <w:t xml:space="preserve"> </w:t>
+      </w:r>
+      <w:r>
+        <w:t xml:space="preserve">report 148.7 minutes (SE 1.6) of domestic work and 98.9 minutes (SE 2.1)</w:t>
+      </w:r>
+      <w:r>
+        <w:t xml:space="preserve"> </w:t>
+      </w:r>
+      <w:r>
+        <w:t xml:space="preserve">of employment (lower panel of Table</w:t>
+      </w:r>
+      <w:r>
+        <w:t xml:space="preserve"> </w:t>
+      </w:r>
+      <w:hyperlink w:anchor="_be3d5bb4bcb5dc58eff7bb083b7ad594321de31">
+        <w:r>
+          <w:rPr>
+            <w:rStyle w:val="Hyperlink"/>
+          </w:rPr>
+          <w:t xml:space="preserve">3</w:t>
+        </w:r>
+      </w:hyperlink>
+      <w:r>
+        <w:t xml:space="preserve">), which shows what</w:t>
+      </w:r>
+      <w:r>
+        <w:t xml:space="preserve"> </w:t>
+      </w:r>
+      <w:r>
+        <w:t xml:space="preserve">else their day contains. Summed over all members aged 15 and above, raw</w:t>
+      </w:r>
+      <w:r>
+        <w:t xml:space="preserve"> </w:t>
+      </w:r>
+      <w:r>
+        <w:t xml:space="preserve">childcare is 324.4 minutes with a grandmother and 201.4 without, a gap</w:t>
+      </w:r>
+      <w:r>
+        <w:t xml:space="preserve"> </w:t>
+      </w:r>
+      <w:r>
+        <w:t xml:space="preserve">of 123.0 minutes. Part of this gap reflects the larger number of</w:t>
+      </w:r>
+      <w:r>
+        <w:t xml:space="preserve"> </w:t>
+      </w:r>
+      <w:r>
+        <w:t xml:space="preserve">children in three-generation households: conditional only on the numbers</w:t>
+      </w:r>
+      <w:r>
+        <w:t xml:space="preserve"> </w:t>
+      </w:r>
+      <w:r>
+        <w:t xml:space="preserve">of children under six and aged six to 14 and on state and day fixed</w:t>
+      </w:r>
+      <w:r>
+        <w:t xml:space="preserve"> </w:t>
+      </w:r>
+      <w:r>
+        <w:t xml:space="preserve">effects, the gap is 115.4 minutes (CI 110.5 to 120.3), and with the full</w:t>
+      </w:r>
+      <w:r>
+        <w:t xml:space="preserve"> </w:t>
+      </w:r>
+      <w:r>
+        <w:t xml:space="preserve">control set it is 88.6 minutes (CI 84.0 to 93.2). Recorded adult</w:t>
+      </w:r>
+      <w:r>
+        <w:t xml:space="preserve"> </w:t>
+      </w:r>
+      <w:r>
+        <w:t xml:space="preserve">childcare time is thus higher in three-generation households. Part of</w:t>
+      </w:r>
+      <w:r>
+        <w:t xml:space="preserve"> </w:t>
+      </w:r>
+      <w:r>
+        <w:t xml:space="preserve">the difference may reflect two adults recording care of the same child</w:t>
+      </w:r>
+      <w:r>
+        <w:t xml:space="preserve"> </w:t>
+      </w:r>
+      <w:r>
+        <w:t xml:space="preserve">at the same time, and part the care of several grandchildren at once;</w:t>
+      </w:r>
+      <w:r>
+        <w:t xml:space="preserve"> </w:t>
+      </w:r>
+      <w:r>
+        <w:t xml:space="preserve">the diary does not identify the recipient. Among mothers with a linked</w:t>
+      </w:r>
+      <w:r>
+        <w:t xml:space="preserve"> </w:t>
+      </w:r>
+      <w:r>
+        <w:t xml:space="preserve">husband, husbands’ childcare averages 36.8 minutes with a grandmother</w:t>
+      </w:r>
+      <w:r>
+        <w:t xml:space="preserve"> </w:t>
+      </w:r>
+      <w:r>
+        <w:t xml:space="preserve">and 48.3 without, and the adjusted difference is -14.1 minutes (CI -15.6</w:t>
+      </w:r>
+      <w:r>
+        <w:t xml:space="preserve"> </w:t>
+      </w:r>
+      <w:r>
+        <w:t xml:space="preserve">to -12.6). Grandmothers’ care is therefore associated with less care by</w:t>
+      </w:r>
+      <w:r>
+        <w:t xml:space="preserve"> </w:t>
+      </w:r>
+      <w:r>
+        <w:t xml:space="preserve">fathers as well as with more care in the household as a whole.</w:t>
       </w:r>
     </w:p>
     <w:bookmarkStart w:id="27" w:name="_be3d5bb4bcb5dc58eff7bb083b7ad594321de31"/>
@@ -4876,6 +5100,7 @@
         <w:gridCol/>
         <w:gridCol/>
         <w:gridCol/>
+        <w:gridCol/>
       </w:tblGrid>
       <w:tr>
         <w:trPr>
@@ -4893,7 +5118,7 @@
               <w:rPr>
                 <w:sz w:val="18"/>
               </w:rPr>
-              <w:t xml:space="preserve">Outcome</w:t>
+              <w:t xml:space="preserve">Provider</w:t>
             </w:r>
           </w:p>
         </w:tc>
@@ -4926,6 +5151,22 @@
                 <w:sz w:val="18"/>
               </w:rPr>
               <w:t xml:space="preserve">Grandmother present</w:t>
+            </w:r>
+          </w:p>
+        </w:tc>
+        <w:tc>
+          <w:tcPr/>
+          <w:p>
+            <w:pPr>
+              <w:pStyle w:val="Compact"/>
+              <w:spacing w:line="240" w:lineRule="auto" w:after="0" w:before="0"/>
+              <w:jc w:val="right"/>
+            </w:pPr>
+            <w:r>
+              <w:rPr>
+                <w:sz w:val="18"/>
+              </w:rPr>
+              <w:t xml:space="preserve">Adjusted difference [95% CI]</w:t>
             </w:r>
           </w:p>
         </w:tc>
@@ -4959,7 +5200,7 @@
               <w:rPr>
                 <w:sz w:val="18"/>
               </w:rPr>
-              <w:t xml:space="preserve">146.1 (0.9)</w:t>
+              <w:t xml:space="preserve">146.1 (1.0)</w:t>
             </w:r>
           </w:p>
         </w:tc>
@@ -4976,6 +5217,22 @@
                 <w:sz w:val="18"/>
               </w:rPr>
               <w:t xml:space="preserve">144.8 (1.1)</w:t>
+            </w:r>
+          </w:p>
+        </w:tc>
+        <w:tc>
+          <w:tcPr/>
+          <w:p>
+            <w:pPr>
+              <w:pStyle w:val="Compact"/>
+              <w:spacing w:line="240" w:lineRule="auto" w:after="0" w:before="0"/>
+              <w:jc w:val="right"/>
+            </w:pPr>
+            <w:r>
+              <w:rPr>
+                <w:sz w:val="18"/>
+              </w:rPr>
+              <w:t xml:space="preserve">-2.09 [-4.58, 0.40]</w:t>
             </w:r>
           </w:p>
         </w:tc>
@@ -4993,7 +5250,7 @@
               <w:rPr>
                 <w:sz w:val="18"/>
               </w:rPr>
-              <w:t xml:space="preserve">Husband (if linked)</w:t>
+              <w:t xml:space="preserve">Husband (zero if not linked)</w:t>
             </w:r>
           </w:p>
         </w:tc>
@@ -5025,7 +5282,23 @@
               <w:rPr>
                 <w:sz w:val="18"/>
               </w:rPr>
-              <w:t xml:space="preserve">24.4 (0.4)</w:t>
+              <w:t xml:space="preserve">24.4 (0.5)</w:t>
+            </w:r>
+          </w:p>
+        </w:tc>
+        <w:tc>
+          <w:tcPr/>
+          <w:p>
+            <w:pPr>
+              <w:pStyle w:val="Compact"/>
+              <w:spacing w:line="240" w:lineRule="auto" w:after="0" w:before="0"/>
+              <w:jc w:val="right"/>
+            </w:pPr>
+            <w:r>
+              <w:rPr>
+                <w:sz w:val="18"/>
+              </w:rPr>
+              <w:t xml:space="preserve">-12.48 [-13.78, -11.17]</w:t>
             </w:r>
           </w:p>
         </w:tc>
@@ -5043,39 +5316,55 @@
               <w:rPr>
                 <w:sz w:val="18"/>
               </w:rPr>
-              <w:t xml:space="preserve">Grandmother(s)</w:t>
-            </w:r>
-          </w:p>
-        </w:tc>
-        <w:tc>
-          <w:tcPr/>
-          <w:p>
-            <w:pPr>
-              <w:pStyle w:val="Compact"/>
-              <w:spacing w:line="240" w:lineRule="auto" w:after="0" w:before="0"/>
-              <w:jc w:val="right"/>
-            </w:pPr>
-            <w:r>
-              <w:rPr>
-                <w:sz w:val="18"/>
-              </w:rPr>
-              <w:t xml:space="preserve">0.0 (0.0)</w:t>
-            </w:r>
-          </w:p>
-        </w:tc>
-        <w:tc>
-          <w:tcPr/>
-          <w:p>
-            <w:pPr>
-              <w:pStyle w:val="Compact"/>
-              <w:spacing w:line="240" w:lineRule="auto" w:after="0" w:before="0"/>
-              <w:jc w:val="right"/>
-            </w:pPr>
-            <w:r>
-              <w:rPr>
-                <w:sz w:val="18"/>
-              </w:rPr>
-              <w:t xml:space="preserve">85.9 (1.1)</w:t>
+              <w:t xml:space="preserve">Linked husbands only</w:t>
+            </w:r>
+          </w:p>
+        </w:tc>
+        <w:tc>
+          <w:tcPr/>
+          <w:p>
+            <w:pPr>
+              <w:pStyle w:val="Compact"/>
+              <w:spacing w:line="240" w:lineRule="auto" w:after="0" w:before="0"/>
+              <w:jc w:val="right"/>
+            </w:pPr>
+            <w:r>
+              <w:rPr>
+                <w:sz w:val="18"/>
+              </w:rPr>
+              <w:t xml:space="preserve">48.3 (0.6)</w:t>
+            </w:r>
+          </w:p>
+        </w:tc>
+        <w:tc>
+          <w:tcPr/>
+          <w:p>
+            <w:pPr>
+              <w:pStyle w:val="Compact"/>
+              <w:spacing w:line="240" w:lineRule="auto" w:after="0" w:before="0"/>
+              <w:jc w:val="right"/>
+            </w:pPr>
+            <w:r>
+              <w:rPr>
+                <w:sz w:val="18"/>
+              </w:rPr>
+              <w:t xml:space="preserve">36.8 (0.6)</w:t>
+            </w:r>
+          </w:p>
+        </w:tc>
+        <w:tc>
+          <w:tcPr/>
+          <w:p>
+            <w:pPr>
+              <w:pStyle w:val="Compact"/>
+              <w:spacing w:line="240" w:lineRule="auto" w:after="0" w:before="0"/>
+              <w:jc w:val="right"/>
+            </w:pPr>
+            <w:r>
+              <w:rPr>
+                <w:sz w:val="18"/>
+              </w:rPr>
+              <w:t xml:space="preserve">-14.10 [-15.62, -12.59]</w:t>
             </w:r>
           </w:p>
         </w:tc>
@@ -5093,39 +5382,55 @@
               <w:rPr>
                 <w:sz w:val="18"/>
               </w:rPr>
-              <w:t xml:space="preserve">Grandfather(s)</w:t>
-            </w:r>
-          </w:p>
-        </w:tc>
-        <w:tc>
-          <w:tcPr/>
-          <w:p>
-            <w:pPr>
-              <w:pStyle w:val="Compact"/>
-              <w:spacing w:line="240" w:lineRule="auto" w:after="0" w:before="0"/>
-              <w:jc w:val="right"/>
-            </w:pPr>
-            <w:r>
-              <w:rPr>
-                <w:sz w:val="18"/>
-              </w:rPr>
-              <w:t xml:space="preserve">3.2 (0.2)</w:t>
-            </w:r>
-          </w:p>
-        </w:tc>
-        <w:tc>
-          <w:tcPr/>
-          <w:p>
-            <w:pPr>
-              <w:pStyle w:val="Compact"/>
-              <w:spacing w:line="240" w:lineRule="auto" w:after="0" w:before="0"/>
-              <w:jc w:val="right"/>
-            </w:pPr>
-            <w:r>
-              <w:rPr>
-                <w:sz w:val="18"/>
-              </w:rPr>
-              <w:t xml:space="preserve">18.0 (0.5)</w:t>
+              <w:t xml:space="preserve">Grandmother(s), together</w:t>
+            </w:r>
+          </w:p>
+        </w:tc>
+        <w:tc>
+          <w:tcPr/>
+          <w:p>
+            <w:pPr>
+              <w:pStyle w:val="Compact"/>
+              <w:spacing w:line="240" w:lineRule="auto" w:after="0" w:before="0"/>
+              <w:jc w:val="right"/>
+            </w:pPr>
+            <w:r>
+              <w:rPr>
+                <w:sz w:val="18"/>
+              </w:rPr>
+              <w:t xml:space="preserve">0.0</w:t>
+            </w:r>
+          </w:p>
+        </w:tc>
+        <w:tc>
+          <w:tcPr/>
+          <w:p>
+            <w:pPr>
+              <w:pStyle w:val="Compact"/>
+              <w:spacing w:line="240" w:lineRule="auto" w:after="0" w:before="0"/>
+              <w:jc w:val="right"/>
+            </w:pPr>
+            <w:r>
+              <w:rPr>
+                <w:sz w:val="18"/>
+              </w:rPr>
+              <w:t xml:space="preserve">85.9 (1.1)</w:t>
+            </w:r>
+          </w:p>
+        </w:tc>
+        <w:tc>
+          <w:tcPr/>
+          <w:p>
+            <w:pPr>
+              <w:pStyle w:val="Compact"/>
+              <w:spacing w:line="240" w:lineRule="auto" w:after="0" w:before="0"/>
+              <w:jc w:val="right"/>
+            </w:pPr>
+            <w:r>
+              <w:rPr>
+                <w:sz w:val="18"/>
+              </w:rPr>
+              <w:t xml:space="preserve">85.50 [83.39, 87.62]</w:t>
             </w:r>
           </w:p>
         </w:tc>
@@ -5143,39 +5448,55 @@
               <w:rPr>
                 <w:sz w:val="18"/>
               </w:rPr>
-              <w:t xml:space="preserve">Other members aged 15+</w:t>
-            </w:r>
-          </w:p>
-        </w:tc>
-        <w:tc>
-          <w:tcPr/>
-          <w:p>
-            <w:pPr>
-              <w:pStyle w:val="Compact"/>
-              <w:spacing w:line="240" w:lineRule="auto" w:after="0" w:before="0"/>
-              <w:jc w:val="right"/>
-            </w:pPr>
-            <w:r>
-              <w:rPr>
-                <w:sz w:val="18"/>
-              </w:rPr>
-              <w:t xml:space="preserve">7.8 (0.3)</w:t>
-            </w:r>
-          </w:p>
-        </w:tc>
-        <w:tc>
-          <w:tcPr/>
-          <w:p>
-            <w:pPr>
-              <w:pStyle w:val="Compact"/>
-              <w:spacing w:line="240" w:lineRule="auto" w:after="0" w:before="0"/>
-              <w:jc w:val="right"/>
-            </w:pPr>
-            <w:r>
-              <w:rPr>
-                <w:sz w:val="18"/>
-              </w:rPr>
-              <w:t xml:space="preserve">51.3 (1.4)</w:t>
+              <w:t xml:space="preserve">Grandfather(s), together</w:t>
+            </w:r>
+          </w:p>
+        </w:tc>
+        <w:tc>
+          <w:tcPr/>
+          <w:p>
+            <w:pPr>
+              <w:pStyle w:val="Compact"/>
+              <w:spacing w:line="240" w:lineRule="auto" w:after="0" w:before="0"/>
+              <w:jc w:val="right"/>
+            </w:pPr>
+            <w:r>
+              <w:rPr>
+                <w:sz w:val="18"/>
+              </w:rPr>
+              <w:t xml:space="preserve">3.2 (0.2)</w:t>
+            </w:r>
+          </w:p>
+        </w:tc>
+        <w:tc>
+          <w:tcPr/>
+          <w:p>
+            <w:pPr>
+              <w:pStyle w:val="Compact"/>
+              <w:spacing w:line="240" w:lineRule="auto" w:after="0" w:before="0"/>
+              <w:jc w:val="right"/>
+            </w:pPr>
+            <w:r>
+              <w:rPr>
+                <w:sz w:val="18"/>
+              </w:rPr>
+              <w:t xml:space="preserve">18.0 (0.5)</w:t>
+            </w:r>
+          </w:p>
+        </w:tc>
+        <w:tc>
+          <w:tcPr/>
+          <w:p>
+            <w:pPr>
+              <w:pStyle w:val="Compact"/>
+              <w:spacing w:line="240" w:lineRule="auto" w:after="0" w:before="0"/>
+              <w:jc w:val="right"/>
+            </w:pPr>
+            <w:r>
+              <w:rPr>
+                <w:sz w:val="18"/>
+              </w:rPr>
+              <w:t xml:space="preserve">11.30 [10.27, 12.33]</w:t>
             </w:r>
           </w:p>
         </w:tc>
@@ -5193,6 +5514,72 @@
               <w:rPr>
                 <w:sz w:val="18"/>
               </w:rPr>
+              <w:t xml:space="preserve">Other members aged 15+</w:t>
+            </w:r>
+          </w:p>
+        </w:tc>
+        <w:tc>
+          <w:tcPr/>
+          <w:p>
+            <w:pPr>
+              <w:pStyle w:val="Compact"/>
+              <w:spacing w:line="240" w:lineRule="auto" w:after="0" w:before="0"/>
+              <w:jc w:val="right"/>
+            </w:pPr>
+            <w:r>
+              <w:rPr>
+                <w:sz w:val="18"/>
+              </w:rPr>
+              <w:t xml:space="preserve">7.8 (0.3)</w:t>
+            </w:r>
+          </w:p>
+        </w:tc>
+        <w:tc>
+          <w:tcPr/>
+          <w:p>
+            <w:pPr>
+              <w:pStyle w:val="Compact"/>
+              <w:spacing w:line="240" w:lineRule="auto" w:after="0" w:before="0"/>
+              <w:jc w:val="right"/>
+            </w:pPr>
+            <w:r>
+              <w:rPr>
+                <w:sz w:val="18"/>
+              </w:rPr>
+              <w:t xml:space="preserve">51.3 (1.4)</w:t>
+            </w:r>
+          </w:p>
+        </w:tc>
+        <w:tc>
+          <w:tcPr/>
+          <w:p>
+            <w:pPr>
+              <w:pStyle w:val="Compact"/>
+              <w:spacing w:line="240" w:lineRule="auto" w:after="0" w:before="0"/>
+              <w:jc w:val="right"/>
+            </w:pPr>
+            <w:r>
+              <w:rPr>
+                <w:sz w:val="18"/>
+              </w:rPr>
+              <w:t xml:space="preserve">6.39 [4.87, 7.90]</w:t>
+            </w:r>
+          </w:p>
+        </w:tc>
+      </w:tr>
+      <w:tr>
+        <w:tc>
+          <w:tcPr/>
+          <w:p>
+            <w:pPr>
+              <w:pStyle w:val="Compact"/>
+              <w:spacing w:line="240" w:lineRule="auto" w:after="0" w:before="0"/>
+              <w:jc w:val="left"/>
+            </w:pPr>
+            <w:r>
+              <w:rPr>
+                <w:sz w:val="18"/>
+              </w:rPr>
               <w:t xml:space="preserve">All members aged 15+</w:t>
             </w:r>
           </w:p>
@@ -5209,7 +5596,7 @@
               <w:rPr>
                 <w:sz w:val="18"/>
               </w:rPr>
-              <w:t xml:space="preserve">201.4 (1.3)</w:t>
+              <w:t xml:space="preserve">201.4 (1.4)</w:t>
             </w:r>
           </w:p>
         </w:tc>
@@ -5227,6 +5614,239 @@
               </w:rPr>
               <w:t xml:space="preserve">324.4 (2.7)</w:t>
             </w:r>
+          </w:p>
+        </w:tc>
+        <w:tc>
+          <w:tcPr/>
+          <w:p>
+            <w:pPr>
+              <w:pStyle w:val="Compact"/>
+              <w:spacing w:line="240" w:lineRule="auto" w:after="0" w:before="0"/>
+              <w:jc w:val="right"/>
+            </w:pPr>
+            <w:r>
+              <w:rPr>
+                <w:sz w:val="18"/>
+              </w:rPr>
+              <w:t xml:space="preserve">88.62 [84.04, 93.20]</w:t>
+            </w:r>
+          </w:p>
+        </w:tc>
+      </w:tr>
+      <w:tr>
+        <w:tc>
+          <w:tcPr/>
+          <w:p>
+            <w:pPr>
+              <w:pStyle w:val="Compact"/>
+              <w:spacing w:line="240" w:lineRule="auto" w:after="0" w:before="0"/>
+              <w:jc w:val="left"/>
+            </w:pPr>
+            <w:r>
+              <w:rPr>
+                <w:sz w:val="18"/>
+              </w:rPr>
+              <w:t xml:space="preserve">conditional on numbers of children only</w:t>
+            </w:r>
+          </w:p>
+        </w:tc>
+        <w:tc>
+          <w:tcPr/>
+          <w:p>
+            <w:pPr>
+              <w:pStyle w:val="Compact"/>
+              <w:spacing w:line="240" w:lineRule="auto" w:after="0" w:before="0"/>
+            </w:pPr>
+          </w:p>
+        </w:tc>
+        <w:tc>
+          <w:tcPr/>
+          <w:p>
+            <w:pPr>
+              <w:pStyle w:val="Compact"/>
+              <w:spacing w:line="240" w:lineRule="auto" w:after="0" w:before="0"/>
+            </w:pPr>
+          </w:p>
+        </w:tc>
+        <w:tc>
+          <w:tcPr/>
+          <w:p>
+            <w:pPr>
+              <w:pStyle w:val="Compact"/>
+              <w:spacing w:line="240" w:lineRule="auto" w:after="0" w:before="0"/>
+              <w:jc w:val="right"/>
+            </w:pPr>
+            <w:r>
+              <w:rPr>
+                <w:sz w:val="18"/>
+              </w:rPr>
+              <w:t xml:space="preserve">115.37 [110.45, 120.29]</w:t>
+            </w:r>
+          </w:p>
+        </w:tc>
+      </w:tr>
+      <w:tr>
+        <w:tc>
+          <w:tcPr/>
+          <w:p>
+            <w:pPr>
+              <w:pStyle w:val="Compact"/>
+              <w:spacing w:line="240" w:lineRule="auto" w:after="0" w:before="0"/>
+              <w:jc w:val="left"/>
+            </w:pPr>
+            <w:r>
+              <w:rPr>
+                <w:i/>
+                <w:iCs/>
+                <w:sz w:val="18"/>
+              </w:rPr>
+              <w:t xml:space="preserve">Grandmother(s), other activities</w:t>
+            </w:r>
+          </w:p>
+        </w:tc>
+        <w:tc>
+          <w:tcPr/>
+          <w:p>
+            <w:pPr>
+              <w:pStyle w:val="Compact"/>
+              <w:spacing w:line="240" w:lineRule="auto" w:after="0" w:before="0"/>
+            </w:pPr>
+          </w:p>
+        </w:tc>
+        <w:tc>
+          <w:tcPr/>
+          <w:p>
+            <w:pPr>
+              <w:pStyle w:val="Compact"/>
+              <w:spacing w:line="240" w:lineRule="auto" w:after="0" w:before="0"/>
+            </w:pPr>
+          </w:p>
+        </w:tc>
+        <w:tc>
+          <w:tcPr/>
+          <w:p>
+            <w:pPr>
+              <w:pStyle w:val="Compact"/>
+              <w:spacing w:line="240" w:lineRule="auto" w:after="0" w:before="0"/>
+            </w:pPr>
+          </w:p>
+        </w:tc>
+      </w:tr>
+      <w:tr>
+        <w:tc>
+          <w:tcPr/>
+          <w:p>
+            <w:pPr>
+              <w:pStyle w:val="Compact"/>
+              <w:spacing w:line="240" w:lineRule="auto" w:after="0" w:before="0"/>
+              <w:jc w:val="left"/>
+            </w:pPr>
+            <w:r>
+              <w:rPr>
+                <w:sz w:val="18"/>
+              </w:rPr>
+              <w:t xml:space="preserve">Unpaid domestic work</w:t>
+            </w:r>
+          </w:p>
+        </w:tc>
+        <w:tc>
+          <w:tcPr/>
+          <w:p>
+            <w:pPr>
+              <w:pStyle w:val="Compact"/>
+              <w:spacing w:line="240" w:lineRule="auto" w:after="0" w:before="0"/>
+              <w:jc w:val="right"/>
+            </w:pPr>
+            <w:r>
+              <w:rPr>
+                <w:sz w:val="18"/>
+              </w:rPr>
+              <w:t xml:space="preserve">–</w:t>
+            </w:r>
+          </w:p>
+        </w:tc>
+        <w:tc>
+          <w:tcPr/>
+          <w:p>
+            <w:pPr>
+              <w:pStyle w:val="Compact"/>
+              <w:spacing w:line="240" w:lineRule="auto" w:after="0" w:before="0"/>
+              <w:jc w:val="right"/>
+            </w:pPr>
+            <w:r>
+              <w:rPr>
+                <w:sz w:val="18"/>
+              </w:rPr>
+              <w:t xml:space="preserve">148.7 (1.6)</w:t>
+            </w:r>
+          </w:p>
+        </w:tc>
+        <w:tc>
+          <w:tcPr/>
+          <w:p>
+            <w:pPr>
+              <w:pStyle w:val="Compact"/>
+              <w:spacing w:line="240" w:lineRule="auto" w:after="0" w:before="0"/>
+            </w:pPr>
+          </w:p>
+        </w:tc>
+      </w:tr>
+      <w:tr>
+        <w:tc>
+          <w:tcPr/>
+          <w:p>
+            <w:pPr>
+              <w:pStyle w:val="Compact"/>
+              <w:spacing w:line="240" w:lineRule="auto" w:after="0" w:before="0"/>
+              <w:jc w:val="left"/>
+            </w:pPr>
+            <w:r>
+              <w:rPr>
+                <w:sz w:val="18"/>
+              </w:rPr>
+              <w:t xml:space="preserve">Employment (incl. travel)</w:t>
+            </w:r>
+          </w:p>
+        </w:tc>
+        <w:tc>
+          <w:tcPr/>
+          <w:p>
+            <w:pPr>
+              <w:pStyle w:val="Compact"/>
+              <w:spacing w:line="240" w:lineRule="auto" w:after="0" w:before="0"/>
+              <w:jc w:val="right"/>
+            </w:pPr>
+            <w:r>
+              <w:rPr>
+                <w:sz w:val="18"/>
+              </w:rPr>
+              <w:t xml:space="preserve">–</w:t>
+            </w:r>
+          </w:p>
+        </w:tc>
+        <w:tc>
+          <w:tcPr/>
+          <w:p>
+            <w:pPr>
+              <w:pStyle w:val="Compact"/>
+              <w:spacing w:line="240" w:lineRule="auto" w:after="0" w:before="0"/>
+              <w:jc w:val="right"/>
+            </w:pPr>
+            <w:r>
+              <w:rPr>
+                <w:sz w:val="18"/>
+              </w:rPr>
+              <w:t xml:space="preserve">98.9 (2.1)</w:t>
+            </w:r>
+          </w:p>
+        </w:tc>
+        <w:tc>
+          <w:tcPr/>
+          <w:p>
+            <w:pPr>
+              <w:pStyle w:val="Compact"/>
+              <w:spacing w:line="240" w:lineRule="auto" w:after="0" w:before="0"/>
+            </w:pPr>
           </w:p>
         </w:tc>
       </w:tr>
@@ -5247,7 +5867,7 @@
         <w:t xml:space="preserve"> </w:t>
       </w:r>
       <w:r>
-        <w:t xml:space="preserve">Unit: mothers in the analysis sample. Minutes of primary childcare of each household member, survey-weighted means with FSU-clustered standard errors; 95 percent confidence intervals use the normal approximation. Other members include husbands who are not linked through the roster. All members is the household total and includes care given to other children in the household.</w:t>
+        <w:t xml:space="preserve">Unit: mothers in the analysis sample (49,992). Columns 1–2: minutes of primary childcare of each household member, survey-weighted means with FSU-clustered standard errors in parentheses. Column 3: coefficient on the grandmother indicator [95 percent confidence interval] from the main specification, with that row as the outcome; the linked-husband row is estimated on mothers with a linked husband (41,447). Husbands who are not linked through the roster count as zero in the husband row and their care falls in Other members. The conditional row controls only for the numbers of children under six and aged 6–14 and state and day fixed effects. All members is the household total and includes care given to other children in the household; its raw difference is 123.0 minutes. Lower panel: minutes of the grandmother(s) in households with a grandmother.</w:t>
       </w:r>
     </w:p>
     <w:p>
@@ -5339,7 +5959,7 @@
         <w:t xml:space="preserve"> </w:t>
       </w:r>
       <w:r>
-        <w:t xml:space="preserve">(-16.6 minutes (CI -20.4 to -12.7)), paid work (4.7 minutes (CI -0.1 to</w:t>
+        <w:t xml:space="preserve">(-16.6 minutes (CI -20.5 to -12.7)), paid work (4.7 minutes (CI -0.1 to</w:t>
       </w:r>
       <w:r>
         <w:t xml:space="preserve"> </w:t>
@@ -5351,7 +5971,7 @@
         <w:t xml:space="preserve"> </w:t>
       </w:r>
       <w:r>
-        <w:t xml:space="preserve">free time (-53.2 minutes (CI -58.0 to -48.5)) and sleep (-9.2 minutes</w:t>
+        <w:t xml:space="preserve">free time (-53.3 minutes (CI -58.0 to -48.5)) and sleep (-9.2 minutes</w:t>
       </w:r>
       <w:r>
         <w:t xml:space="preserve"> </w:t>
@@ -5369,31 +5989,69 @@
         <w:t xml:space="preserve"> </w:t>
       </w:r>
       <w:r>
-        <w:t xml:space="preserve">with confidence intervals that exclude zero, so the care they provide</w:t>
-      </w:r>
-      <w:r>
-        <w:t xml:space="preserve"> </w:t>
-      </w:r>
-      <w:r>
-        <w:t xml:space="preserve">has a cost in their own time. The fall in free time is the largest, at</w:t>
-      </w:r>
-      <w:r>
-        <w:t xml:space="preserve"> </w:t>
-      </w:r>
-      <w:r>
-        <w:t xml:space="preserve">14% of the mean for women without a young grandchild. Their paid work</w:t>
-      </w:r>
-      <w:r>
-        <w:t xml:space="preserve"> </w:t>
-      </w:r>
-      <w:r>
-        <w:t xml:space="preserve">does not fall, so in this sample the cost falls on domestic work, free</w:t>
-      </w:r>
-      <w:r>
-        <w:t xml:space="preserve"> </w:t>
-      </w:r>
-      <w:r>
-        <w:t xml:space="preserve">time and sleep rather than on earnings.</w:t>
+        <w:t xml:space="preserve">with confidence intervals that exclude zero. Lower domestic work need</w:t>
+      </w:r>
+      <w:r>
+        <w:t xml:space="preserve"> </w:t>
+      </w:r>
+      <w:r>
+        <w:t xml:space="preserve">not be a cost to them: mothers in three-generation households spend more</w:t>
+      </w:r>
+      <w:r>
+        <w:t xml:space="preserve"> </w:t>
+      </w:r>
+      <w:r>
+        <w:t xml:space="preserve">time on food and meals (Table</w:t>
+      </w:r>
+      <w:r>
+        <w:t xml:space="preserve"> </w:t>
+      </w:r>
+      <w:hyperlink w:anchor="_2d3306491f8074877991796d556fbadbc1a72cc">
+        <w:r>
+          <w:rPr>
+            <w:rStyle w:val="Hyperlink"/>
+          </w:rPr>
+          <w:t xml:space="preserve">2</w:t>
+        </w:r>
+      </w:hyperlink>
+      <w:r>
+        <w:t xml:space="preserve">), which is consistent with</w:t>
+      </w:r>
+      <w:r>
+        <w:t xml:space="preserve"> </w:t>
+      </w:r>
+      <w:r>
+        <w:t xml:space="preserve">domestic tasks moving to the younger woman, although the two estimates</w:t>
+      </w:r>
+      <w:r>
+        <w:t xml:space="preserve"> </w:t>
+      </w:r>
+      <w:r>
+        <w:t xml:space="preserve">come from separate samples. The cost of the care they provide falls on</w:t>
+      </w:r>
+      <w:r>
+        <w:t xml:space="preserve"> </w:t>
+      </w:r>
+      <w:r>
+        <w:t xml:space="preserve">their free time and sleep. The fall in free time is the largest, at 14%</w:t>
+      </w:r>
+      <w:r>
+        <w:t xml:space="preserve"> </w:t>
+      </w:r>
+      <w:r>
+        <w:t xml:space="preserve">of the mean for women without a young grandchild. Their paid work does</w:t>
+      </w:r>
+      <w:r>
+        <w:t xml:space="preserve"> </w:t>
+      </w:r>
+      <w:r>
+        <w:t xml:space="preserve">not fall, so in this sample the cost falls on free time and sleep rather</w:t>
+      </w:r>
+      <w:r>
+        <w:t xml:space="preserve"> </w:t>
+      </w:r>
+      <w:r>
+        <w:t xml:space="preserve">than on earnings.</w:t>
       </w:r>
     </w:p>
     <w:bookmarkStart w:id="29" w:name="_f294cdcd745397e2585ca03b9caa9755a4c1ee4"/>
@@ -5468,23 +6126,23 @@
               <w:rPr>
                 <w:sz w:val="18"/>
               </w:rPr>
-              <w:t xml:space="preserve">Grandmothers</w:t>
-            </w:r>
-          </w:p>
-        </w:tc>
-        <w:tc>
-          <w:tcPr/>
-          <w:p>
-            <w:pPr>
-              <w:pStyle w:val="Compact"/>
-              <w:spacing w:line="240" w:lineRule="auto" w:after="0" w:before="0"/>
-              <w:jc w:val="right"/>
-            </w:pPr>
-            <w:r>
-              <w:rPr>
-                <w:sz w:val="18"/>
-              </w:rPr>
-              <w:t xml:space="preserve">Grandfathers</w:t>
+              <w:t xml:space="preserve">Older women</w:t>
+            </w:r>
+          </w:p>
+        </w:tc>
+        <w:tc>
+          <w:tcPr/>
+          <w:p>
+            <w:pPr>
+              <w:pStyle w:val="Compact"/>
+              <w:spacing w:line="240" w:lineRule="auto" w:after="0" w:before="0"/>
+              <w:jc w:val="right"/>
+            </w:pPr>
+            <w:r>
+              <w:rPr>
+                <w:sz w:val="18"/>
+              </w:rPr>
+              <w:t xml:space="preserve">Older men</w:t>
             </w:r>
           </w:p>
         </w:tc>
@@ -5730,23 +6388,23 @@
               <w:rPr>
                 <w:sz w:val="18"/>
               </w:rPr>
-              <w:t xml:space="preserve">2.42 [1.99, 2.84]</w:t>
-            </w:r>
-          </w:p>
-        </w:tc>
-        <w:tc>
-          <w:tcPr/>
-          <w:p>
-            <w:pPr>
-              <w:pStyle w:val="Compact"/>
-              <w:spacing w:line="240" w:lineRule="auto" w:after="0" w:before="0"/>
-              <w:jc w:val="right"/>
-            </w:pPr>
-            <w:r>
-              <w:rPr>
-                <w:sz w:val="18"/>
-              </w:rPr>
-              <w:t xml:space="preserve">5.23 [4.30, 6.15]</w:t>
+              <w:t xml:space="preserve">2.42 [2.00, 2.84]</w:t>
+            </w:r>
+          </w:p>
+        </w:tc>
+        <w:tc>
+          <w:tcPr/>
+          <w:p>
+            <w:pPr>
+              <w:pStyle w:val="Compact"/>
+              <w:spacing w:line="240" w:lineRule="auto" w:after="0" w:before="0"/>
+              <w:jc w:val="right"/>
+            </w:pPr>
+            <w:r>
+              <w:rPr>
+                <w:sz w:val="18"/>
+              </w:rPr>
+              <w:t xml:space="preserve">5.23 [4.30, 6.16]</w:t>
             </w:r>
           </w:p>
         </w:tc>
@@ -5780,23 +6438,23 @@
               <w:rPr>
                 <w:sz w:val="18"/>
               </w:rPr>
-              <w:t xml:space="preserve">149.6</w:t>
-            </w:r>
-          </w:p>
-        </w:tc>
-        <w:tc>
-          <w:tcPr/>
-          <w:p>
-            <w:pPr>
-              <w:pStyle w:val="Compact"/>
-              <w:spacing w:line="240" w:lineRule="auto" w:after="0" w:before="0"/>
-              <w:jc w:val="right"/>
-            </w:pPr>
-            <w:r>
-              <w:rPr>
-                <w:sz w:val="18"/>
-              </w:rPr>
-              <w:t xml:space="preserve">-16.57 [-20.45, -12.70]</w:t>
+              <w:t xml:space="preserve">149.7</w:t>
+            </w:r>
+          </w:p>
+        </w:tc>
+        <w:tc>
+          <w:tcPr/>
+          <w:p>
+            <w:pPr>
+              <w:pStyle w:val="Compact"/>
+              <w:spacing w:line="240" w:lineRule="auto" w:after="0" w:before="0"/>
+              <w:jc w:val="right"/>
+            </w:pPr>
+            <w:r>
+              <w:rPr>
+                <w:sz w:val="18"/>
+              </w:rPr>
+              <w:t xml:space="preserve">-16.58 [-20.45, -12.70]</w:t>
             </w:r>
           </w:p>
         </w:tc>
@@ -5878,7 +6536,7 @@
               <w:rPr>
                 <w:sz w:val="18"/>
               </w:rPr>
-              <w:t xml:space="preserve">4.73 [-0.10, 9.57]</w:t>
+              <w:t xml:space="preserve">4.73 [-0.11, 9.57]</w:t>
             </w:r>
           </w:p>
         </w:tc>
@@ -6140,7 +6798,7 @@
               <w:rPr>
                 <w:sz w:val="18"/>
               </w:rPr>
-              <w:t xml:space="preserve">-6.16 [-9.47, -2.85]</w:t>
+              <w:t xml:space="preserve">-6.16 [-9.48, -2.85]</w:t>
             </w:r>
           </w:p>
         </w:tc>
@@ -6216,19 +6874,25 @@
         <w:t xml:space="preserve"> </w:t>
       </w:r>
       <w:r>
-        <w:t xml:space="preserve">differs by 11.8 minutes (CI 3.7 to 19.9). It is higher for older men but</w:t>
-      </w:r>
-      <w:r>
-        <w:t xml:space="preserve"> </w:t>
-      </w:r>
-      <w:r>
-        <w:t xml:space="preserve">not clearly for older women, so the adjustment to a young grandchild</w:t>
-      </w:r>
-      <w:r>
-        <w:t xml:space="preserve"> </w:t>
-      </w:r>
-      <w:r>
-        <w:t xml:space="preserve">differs by gender beyond the amount of care.</w:t>
+        <w:t xml:space="preserve">differs by 11.8 minutes (CI 3.7 to 19.9). It is higher for older men and</w:t>
+      </w:r>
+      <w:r>
+        <w:t xml:space="preserve"> </w:t>
+      </w:r>
+      <w:r>
+        <w:t xml:space="preserve">not clearly for older women, but the women-minus-men difference, -7.1</w:t>
+      </w:r>
+      <w:r>
+        <w:t xml:space="preserve"> </w:t>
+      </w:r>
+      <w:r>
+        <w:t xml:space="preserve">minutes (CI -16.5 to 2.4), is imprecise and includes zero, so the data</w:t>
+      </w:r>
+      <w:r>
+        <w:t xml:space="preserve"> </w:t>
+      </w:r>
+      <w:r>
+        <w:t xml:space="preserve">do not establish a gender difference in the paid-work response.</w:t>
       </w:r>
     </w:p>
     <w:p>
@@ -6455,7 +7119,7 @@
               <w:rPr>
                 <w:sz w:val="18"/>
               </w:rPr>
-              <w:t xml:space="preserve">-3.52 [-7.50, 0.46]</w:t>
+              <w:t xml:space="preserve">-3.52 [-7.50, 0.47]</w:t>
             </w:r>
           </w:p>
         </w:tc>
@@ -6589,7 +7253,7 @@
               <w:rPr>
                 <w:sz w:val="18"/>
               </w:rPr>
-              <w:t xml:space="preserve">-5.24 [-7.93, -2.55]</w:t>
+              <w:t xml:space="preserve">-5.24 [-7.93, -2.56]</w:t>
             </w:r>
           </w:p>
         </w:tc>
@@ -6689,7 +7353,7 @@
               <w:rPr>
                 <w:sz w:val="18"/>
               </w:rPr>
-              <w:t xml:space="preserve">-11.06 [-14.92, -7.19]</w:t>
+              <w:t xml:space="preserve">-11.06 [-14.93, -7.20]</w:t>
             </w:r>
           </w:p>
         </w:tc>
@@ -6739,7 +7403,7 @@
               <w:rPr>
                 <w:sz w:val="18"/>
               </w:rPr>
-              <w:t xml:space="preserve">-8.88 [-12.08, -5.69]</w:t>
+              <w:t xml:space="preserve">-8.89 [-12.08, -5.69]</w:t>
             </w:r>
           </w:p>
         </w:tc>
@@ -6889,23 +7553,23 @@
               <w:rPr>
                 <w:sz w:val="18"/>
               </w:rPr>
-              <w:t xml:space="preserve">-3.12 [-8.07, 1.82]</w:t>
-            </w:r>
-          </w:p>
-        </w:tc>
-        <w:tc>
-          <w:tcPr/>
-          <w:p>
-            <w:pPr>
-              <w:pStyle w:val="Compact"/>
-              <w:spacing w:line="240" w:lineRule="auto" w:after="0" w:before="0"/>
-              <w:jc w:val="right"/>
-            </w:pPr>
-            <w:r>
-              <w:rPr>
-                <w:sz w:val="18"/>
-              </w:rPr>
-              <w:t xml:space="preserve">16.50 [8.99, 24.00]</w:t>
+              <w:t xml:space="preserve">-3.13 [-8.07, 1.82]</w:t>
+            </w:r>
+          </w:p>
+        </w:tc>
+        <w:tc>
+          <w:tcPr/>
+          <w:p>
+            <w:pPr>
+              <w:pStyle w:val="Compact"/>
+              <w:spacing w:line="240" w:lineRule="auto" w:after="0" w:before="0"/>
+              <w:jc w:val="right"/>
+            </w:pPr>
+            <w:r>
+              <w:rPr>
+                <w:sz w:val="18"/>
+              </w:rPr>
+              <w:t xml:space="preserve">16.50 [8.99, 24.01]</w:t>
             </w:r>
           </w:p>
         </w:tc>
@@ -6953,31 +7617,37 @@
         <w:t xml:space="preserve"> </w:t>
       </w:r>
       <w:r>
-        <w:t xml:space="preserve">(CI -14.9 to -7.2). Substitution is concentrated among grandmothers who</w:t>
-      </w:r>
-      <w:r>
-        <w:t xml:space="preserve"> </w:t>
-      </w:r>
-      <w:r>
-        <w:t xml:space="preserve">are not in paid work; with an employed grandmother mothers’ childcare is</w:t>
-      </w:r>
-      <w:r>
-        <w:t xml:space="preserve"> </w:t>
-      </w:r>
-      <w:r>
-        <w:t xml:space="preserve">not lower. Grandmothers’ age, employment and household position are</w:t>
-      </w:r>
-      <w:r>
-        <w:t xml:space="preserve"> </w:t>
-      </w:r>
-      <w:r>
-        <w:t xml:space="preserve">related, and employment is itself a choice made jointly with the care</w:t>
-      </w:r>
-      <w:r>
-        <w:t xml:space="preserve"> </w:t>
-      </w:r>
-      <w:r>
-        <w:t xml:space="preserve">they provide, so these comparisons are descriptive.</w:t>
+        <w:t xml:space="preserve">(CI -14.9 to -7.2). The lower childcare is concentrated among mothers</w:t>
+      </w:r>
+      <w:r>
+        <w:t xml:space="preserve"> </w:t>
+      </w:r>
+      <w:r>
+        <w:t xml:space="preserve">whose grandmother is not in paid work; with an employed grandmother</w:t>
+      </w:r>
+      <w:r>
+        <w:t xml:space="preserve"> </w:t>
+      </w:r>
+      <w:r>
+        <w:t xml:space="preserve">mothers’ childcare is higher. Grandmothers’ age, employment and</w:t>
+      </w:r>
+      <w:r>
+        <w:t xml:space="preserve"> </w:t>
+      </w:r>
+      <w:r>
+        <w:t xml:space="preserve">household position are related, and employment is itself a choice made</w:t>
+      </w:r>
+      <w:r>
+        <w:t xml:space="preserve"> </w:t>
+      </w:r>
+      <w:r>
+        <w:t xml:space="preserve">jointly with the care they provide, so these comparisons are</w:t>
+      </w:r>
+      <w:r>
+        <w:t xml:space="preserve"> </w:t>
+      </w:r>
+      <w:r>
+        <w:t xml:space="preserve">descriptive.</w:t>
       </w:r>
     </w:p>
     <w:p>
@@ -7009,55 +7679,67 @@
         <w:t xml:space="preserve"> </w:t>
       </w:r>
       <w:r>
-        <w:t xml:space="preserve">both together. The interval for the difference between grandmothers and</w:t>
-      </w:r>
-      <w:r>
-        <w:t xml:space="preserve"> </w:t>
-      </w:r>
-      <w:r>
-        <w:t xml:space="preserve">grandfathers includes zero; households with only a grandfather are few,</w:t>
-      </w:r>
-      <w:r>
-        <w:t xml:space="preserve"> </w:t>
-      </w:r>
-      <w:r>
-        <w:t xml:space="preserve">so this comparison is imprecise. Mothers’ paid work is 9.8 minutes</w:t>
-      </w:r>
-      <w:r>
-        <w:t xml:space="preserve"> </w:t>
-      </w:r>
-      <w:r>
-        <w:t xml:space="preserve">higher (CI 4.6 to 15.0) with a grandmother only and 8.1 minutes lower</w:t>
-      </w:r>
-      <w:r>
-        <w:t xml:space="preserve"> </w:t>
-      </w:r>
-      <w:r>
-        <w:t xml:space="preserve">(CI -11.9 to -4.3) with both grandparents, so the pooled employment</w:t>
-      </w:r>
-      <w:r>
-        <w:t xml:space="preserve"> </w:t>
-      </w:r>
-      <w:r>
-        <w:t xml:space="preserve">estimate averages associations of different sign. These gradients are</w:t>
-      </w:r>
-      <w:r>
-        <w:t xml:space="preserve"> </w:t>
-      </w:r>
-      <w:r>
-        <w:t xml:space="preserve">consistent with substitution where the older generation has time to</w:t>
-      </w:r>
-      <w:r>
-        <w:t xml:space="preserve"> </w:t>
-      </w:r>
-      <w:r>
-        <w:t xml:space="preserve">give, which a fixed household trait would not obviously predict, but</w:t>
-      </w:r>
-      <w:r>
-        <w:t xml:space="preserve"> </w:t>
-      </w:r>
-      <w:r>
-        <w:t xml:space="preserve">they do not rule out selection.</w:t>
+        <w:t xml:space="preserve">both together. With both grandparents present mothers’ childcare is not</w:t>
+      </w:r>
+      <w:r>
+        <w:t xml:space="preserve"> </w:t>
+      </w:r>
+      <w:r>
+        <w:t xml:space="preserve">lower, so the pooled reduction comes from households with a single</w:t>
+      </w:r>
+      <w:r>
+        <w:t xml:space="preserve"> </w:t>
+      </w:r>
+      <w:r>
+        <w:t xml:space="preserve">coresident grandparent. The interval for the difference between</w:t>
+      </w:r>
+      <w:r>
+        <w:t xml:space="preserve"> </w:t>
+      </w:r>
+      <w:r>
+        <w:t xml:space="preserve">grandmothers and grandfathers includes zero; households with only a</w:t>
+      </w:r>
+      <w:r>
+        <w:t xml:space="preserve"> </w:t>
+      </w:r>
+      <w:r>
+        <w:t xml:space="preserve">grandfather are few, so this comparison is imprecise. Mothers’ paid work</w:t>
+      </w:r>
+      <w:r>
+        <w:t xml:space="preserve"> </w:t>
+      </w:r>
+      <w:r>
+        <w:t xml:space="preserve">is 9.8 minutes higher (CI 4.6 to 15.0) with a grandmother only and 8.1</w:t>
+      </w:r>
+      <w:r>
+        <w:t xml:space="preserve"> </w:t>
+      </w:r>
+      <w:r>
+        <w:t xml:space="preserve">minutes lower (CI -11.9 to -4.4) with both grandparents, so the pooled</w:t>
+      </w:r>
+      <w:r>
+        <w:t xml:space="preserve"> </w:t>
+      </w:r>
+      <w:r>
+        <w:t xml:space="preserve">employment estimate averages associations of different sign. These</w:t>
+      </w:r>
+      <w:r>
+        <w:t xml:space="preserve"> </w:t>
+      </w:r>
+      <w:r>
+        <w:t xml:space="preserve">gradients are consistent with substitution where the older generation</w:t>
+      </w:r>
+      <w:r>
+        <w:t xml:space="preserve"> </w:t>
+      </w:r>
+      <w:r>
+        <w:t xml:space="preserve">has time to give, which a fixed household trait would not obviously</w:t>
+      </w:r>
+      <w:r>
+        <w:t xml:space="preserve"> </w:t>
+      </w:r>
+      <w:r>
+        <w:t xml:space="preserve">predict, but they do not rule out selection.</w:t>
       </w:r>
     </w:p>
     <w:p>
@@ -7119,13 +7801,13 @@
         <w:t xml:space="preserve"> </w:t>
       </w:r>
       <w:r>
-        <w:t xml:space="preserve">association is -13.2 minutes (CI -17.3 to -9.1) and the employment</w:t>
-      </w:r>
-      <w:r>
-        <w:t xml:space="preserve"> </w:t>
-      </w:r>
-      <w:r>
-        <w:t xml:space="preserve">association 12.5 minutes (CI 5.6 to 19.5). For junior-level mothers, who</w:t>
+        <w:t xml:space="preserve">association is -13.2 minutes (CI -17.3 to -9.2) and the employment</w:t>
+      </w:r>
+      <w:r>
+        <w:t xml:space="preserve"> </w:t>
+      </w:r>
+      <w:r>
+        <w:t xml:space="preserve">association 12.6 minutes (CI 5.6 to 19.5). For junior-level mothers, who</w:t>
       </w:r>
       <w:r>
         <w:t xml:space="preserve"> </w:t>
@@ -7155,19 +7837,19 @@
         <w:t xml:space="preserve"> </w:t>
       </w:r>
       <w:r>
-        <w:t xml:space="preserve">reasons, the first more often by the grandparents’ need for support and</w:t>
-      </w:r>
-      <w:r>
-        <w:t xml:space="preserve"> </w:t>
-      </w:r>
-      <w:r>
-        <w:t xml:space="preserve">the second by the patrilocal norm, and the estimates differ. Because</w:t>
-      </w:r>
-      <w:r>
-        <w:t xml:space="preserve"> </w:t>
-      </w:r>
-      <w:r>
-        <w:t xml:space="preserve">most junior-level mothers live with a grandmother, the pooled</w:t>
+        <w:t xml:space="preserve">reasons, the first possibly more often by the grandparents’ need for</w:t>
+      </w:r>
+      <w:r>
+        <w:t xml:space="preserve"> </w:t>
+      </w:r>
+      <w:r>
+        <w:t xml:space="preserve">support and the second by the patrilocal norm, and the estimates differ.</w:t>
+      </w:r>
+      <w:r>
+        <w:t xml:space="preserve"> </w:t>
+      </w:r>
+      <w:r>
+        <w:t xml:space="preserve">Because most junior-level mothers live with a grandmother, the pooled</w:t>
       </w:r>
       <w:r>
         <w:t xml:space="preserve"> </w:t>
@@ -7645,7 +8327,7 @@
               <w:rPr>
                 <w:sz w:val="18"/>
               </w:rPr>
-              <w:t xml:space="preserve">-3.52 [-7.03, 0.00]</w:t>
+              <w:t xml:space="preserve">-3.52 [-7.04, 0.00]</w:t>
             </w:r>
           </w:p>
         </w:tc>
@@ -7711,7 +8393,7 @@
               <w:rPr>
                 <w:sz w:val="18"/>
               </w:rPr>
-              <w:t xml:space="preserve">-0.10 [-3.20, 2.99]</w:t>
+              <w:t xml:space="preserve">-0.11 [-3.20, 2.99]</w:t>
             </w:r>
           </w:p>
         </w:tc>
@@ -7831,7 +8513,7 @@
         <w:t xml:space="preserve"> </w:t>
       </w:r>
       <w:r>
-        <w:t xml:space="preserve">Main specification, estimated separately by subsample. Estimate [95 percent confidence interval] for the grandmother indicator. Not estimable: fewer than 30 mothers with or without a coresident grandmother in the subsample.</w:t>
+        <w:t xml:space="preserve">Main specification, estimated separately by subsample. Estimate [95 percent confidence interval] for the grandmother indicator. Not estimable: fewer than 30 mothers with or without a coresident grandmother in the subsample. No subsample falls below it.</w:t>
       </w:r>
     </w:p>
     <w:p>
@@ -7845,13 +8527,13 @@
         <w:t xml:space="preserve"> </w:t>
       </w:r>
       <w:r>
-        <w:t xml:space="preserve">minutes (CI -11.6 to -1.9) and -0.5 minutes (CI -3.4 to 2.4). By the</w:t>
-      </w:r>
-      <w:r>
-        <w:t xml:space="preserve"> </w:t>
-      </w:r>
-      <w:r>
-        <w:t xml:space="preserve">mother’s education they are -1.0 minutes (CI -4.4 to 2.3) below</w:t>
+        <w:t xml:space="preserve">minutes (CI -11.7 to -1.9) and -0.5 minutes (CI -3.4 to 2.4). By the</w:t>
+      </w:r>
+      <w:r>
+        <w:t xml:space="preserve"> </w:t>
+      </w:r>
+      <w:r>
+        <w:t xml:space="preserve">mother’s education they are -1.0 minutes (CI -4.4 to 2.4) below</w:t>
       </w:r>
       <w:r>
         <w:t xml:space="preserve"> </w:t>
@@ -7899,7 +8581,7 @@
         <w:t xml:space="preserve"> </w:t>
       </w:r>
       <w:r>
-        <w:t xml:space="preserve">to 3.0), and with two or more -4.3 minutes (CI -8.0 to -0.7). The</w:t>
+        <w:t xml:space="preserve">to 3.0), and with two or more -4.4 minutes (CI -8.0 to -0.7). The</w:t>
       </w:r>
       <w:r>
         <w:t xml:space="preserve"> </w:t>
@@ -8003,7 +8685,7 @@
         <w:t xml:space="preserve"> </w:t>
       </w:r>
       <w:r>
-        <w:t xml:space="preserve">under six in the household. The childcare association is -0.3 minutes</w:t>
+        <w:t xml:space="preserve">under six in the household. The childcare association is -0.4 minutes</w:t>
       </w:r>
       <w:r>
         <w:t xml:space="preserve"> </w:t>
@@ -8015,7 +8697,7 @@
         <w:t xml:space="preserve"> </w:t>
       </w:r>
       <w:r>
-        <w:t xml:space="preserve">the analysis sample, and the difference between the two is -1.7 minutes</w:t>
+        <w:t xml:space="preserve">the analysis sample, and the difference between the two is -1.8 minutes</w:t>
       </w:r>
       <w:r>
         <w:t xml:space="preserve"> </w:t>
@@ -8221,7 +8903,7 @@
               <w:rPr>
                 <w:sz w:val="18"/>
               </w:rPr>
-              <w:t xml:space="preserve">-0.34 [-2.26, 1.57]</w:t>
+              <w:t xml:space="preserve">-0.35 [-2.26, 1.57]</w:t>
             </w:r>
           </w:p>
         </w:tc>
@@ -8271,7 +8953,7 @@
               <w:rPr>
                 <w:sz w:val="18"/>
               </w:rPr>
-              <w:t xml:space="preserve">-2.17 [-4.59, 0.25]</w:t>
+              <w:t xml:space="preserve">-2.17 [-4.60, 0.25]</w:t>
             </w:r>
           </w:p>
         </w:tc>
@@ -8369,7 +9051,7 @@
               <w:rPr>
                 <w:sz w:val="18"/>
               </w:rPr>
-              <w:t xml:space="preserve">0.33 [-0.25, 0.91]</w:t>
+              <w:t xml:space="preserve">0.33 [-0.26, 0.91]</w:t>
             </w:r>
           </w:p>
         </w:tc>
@@ -8591,13 +9273,13 @@
         <w:t xml:space="preserve"> </w:t>
       </w:r>
       <w:r>
-        <w:t xml:space="preserve">(CI -17.3 to -9.1). Requiring a linked husband gives -1.8 minutes (CI</w:t>
-      </w:r>
-      <w:r>
-        <w:t xml:space="preserve"> </w:t>
-      </w:r>
-      <w:r>
-        <w:t xml:space="preserve">-4.5 to 0.9), and dropping proxy-reported diaries gives -3.3 minutes (CI</w:t>
+        <w:t xml:space="preserve">(CI -17.3 to -9.2). Requiring a linked husband gives -1.8 minutes (CI</w:t>
+      </w:r>
+      <w:r>
+        <w:t xml:space="preserve"> </w:t>
+      </w:r>
+      <w:r>
+        <w:t xml:space="preserve">-4.5 to 0.9), and dropping proxy-reported diaries gives -3.4 minutes (CI</w:t>
       </w:r>
       <w:r>
         <w:t xml:space="preserve"> </w:t>
@@ -8609,7 +9291,7 @@
         <w:t xml:space="preserve"> </w:t>
       </w:r>
       <w:r>
-        <w:t xml:space="preserve">(CI -3.4 to 1.6); adding household size gives 8.2 minutes (CI 5.1 to</w:t>
+        <w:t xml:space="preserve">(CI -3.4 to 1.6); adding household size gives 8.3 minutes (CI 5.1 to</w:t>
       </w:r>
       <w:r>
         <w:t xml:space="preserve"> </w:t>
@@ -8651,7 +9333,7 @@
         <w:t xml:space="preserve"> </w:t>
       </w:r>
       <w:r>
-        <w:t xml:space="preserve">range from -13.2 to 8.2 minutes and do not all share a sign, so the main</w:t>
+        <w:t xml:space="preserve">range from -13.2 to 8.3 minutes and do not all share a sign, so the main</w:t>
       </w:r>
       <w:r>
         <w:t xml:space="preserve"> </w:t>
@@ -8710,7 +9392,61 @@
         <w:t xml:space="preserve"> </w:t>
       </w:r>
       <w:r>
-        <w:t xml:space="preserve">model, is -2.33 for childcare and -1.00 for employment.</w:t>
+        <w:t xml:space="preserve">model, is -2.33 for childcare and -1.00 for employment minutes. The</w:t>
+      </w:r>
+      <w:r>
+        <w:t xml:space="preserve"> </w:t>
+      </w:r>
+      <w:r>
+        <w:t xml:space="preserve">degree of selection on unobservables, relative to observables, that</w:t>
+      </w:r>
+      <w:r>
+        <w:t xml:space="preserve"> </w:t>
+      </w:r>
+      <w:r>
+        <w:t xml:space="preserve">would reduce the coefficient to zero is -8.66 for childcare and -0.69</w:t>
+      </w:r>
+      <w:r>
+        <w:t xml:space="preserve"> </w:t>
+      </w:r>
+      <w:r>
+        <w:t xml:space="preserve">for employment; both values are negative, so only selection on</w:t>
+      </w:r>
+      <w:r>
+        <w:t xml:space="preserve"> </w:t>
+      </w:r>
+      <w:r>
+        <w:t xml:space="preserve">unobservables opposite in direction to selection on observables could</w:t>
+      </w:r>
+      <w:r>
+        <w:t xml:space="preserve"> </w:t>
+      </w:r>
+      <w:r>
+        <w:t xml:space="preserve">reduce the coefficients to zero, and for employment the required degree</w:t>
+      </w:r>
+      <w:r>
+        <w:t xml:space="preserve"> </w:t>
+      </w:r>
+      <w:r>
+        <w:t xml:space="preserve">is below one, so the employment estimate is not robust in this sense.</w:t>
+      </w:r>
+      <w:r>
+        <w:t xml:space="preserve"> </w:t>
+      </w:r>
+      <w:r>
+        <w:t xml:space="preserve">Defining the grandmother as a woman aged 45 or above, the lower limit of</w:t>
+      </w:r>
+      <w:r>
+        <w:t xml:space="preserve"> </w:t>
+      </w:r>
+      <w:r>
+        <w:t xml:space="preserve">the older-generation sample, gives -3.1 minutes (CI -5.5 to -0.6) for</w:t>
+      </w:r>
+      <w:r>
+        <w:t xml:space="preserve"> </w:t>
+      </w:r>
+      <w:r>
+        <w:t xml:space="preserve">childcare and 0.6 minutes (CI -2.8 to 3.9) for employment.</w:t>
       </w:r>
     </w:p>
     <w:bookmarkStart w:id="37" w:name="_12c2d691ce7d94f18eabedfa7fc910ecf3de0b8"/>
@@ -9017,23 +9753,23 @@
               <w:rPr>
                 <w:sz w:val="18"/>
               </w:rPr>
-              <w:t xml:space="preserve">-3.34</w:t>
-            </w:r>
-          </w:p>
-        </w:tc>
-        <w:tc>
-          <w:tcPr/>
-          <w:p>
-            <w:pPr>
-              <w:pStyle w:val="Compact"/>
-              <w:spacing w:line="240" w:lineRule="auto" w:after="0" w:before="0"/>
-              <w:jc w:val="right"/>
-            </w:pPr>
-            <w:r>
-              <w:rPr>
-                <w:sz w:val="18"/>
-              </w:rPr>
-              <w:t xml:space="preserve">[-6.21, -0.47]</w:t>
+              <w:t xml:space="preserve">-3.35</w:t>
+            </w:r>
+          </w:p>
+        </w:tc>
+        <w:tc>
+          <w:tcPr/>
+          <w:p>
+            <w:pPr>
+              <w:pStyle w:val="Compact"/>
+              <w:spacing w:line="240" w:lineRule="auto" w:after="0" w:before="0"/>
+              <w:jc w:val="right"/>
+            </w:pPr>
+            <w:r>
+              <w:rPr>
+                <w:sz w:val="18"/>
+              </w:rPr>
+              <w:t xml:space="preserve">[-6.22, -0.47]</w:t>
             </w:r>
           </w:p>
         </w:tc>
@@ -9067,7 +9803,7 @@
               <w:rPr>
                 <w:sz w:val="18"/>
               </w:rPr>
-              <w:t xml:space="preserve">-0.93</w:t>
+              <w:t xml:space="preserve">-0.94</w:t>
             </w:r>
           </w:p>
         </w:tc>
@@ -9301,39 +10037,39 @@
               <w:rPr>
                 <w:sz w:val="18"/>
               </w:rPr>
-              <w:t xml:space="preserve">Extensive margin: any primary childcare (share)</w:t>
-            </w:r>
-          </w:p>
-        </w:tc>
-        <w:tc>
-          <w:tcPr/>
-          <w:p>
-            <w:pPr>
-              <w:pStyle w:val="Compact"/>
-              <w:spacing w:line="240" w:lineRule="auto" w:after="0" w:before="0"/>
-              <w:jc w:val="right"/>
-            </w:pPr>
-            <w:r>
-              <w:rPr>
-                <w:sz w:val="18"/>
-              </w:rPr>
-              <w:t xml:space="preserve">-0.018</w:t>
-            </w:r>
-          </w:p>
-        </w:tc>
-        <w:tc>
-          <w:tcPr/>
-          <w:p>
-            <w:pPr>
-              <w:pStyle w:val="Compact"/>
-              <w:spacing w:line="240" w:lineRule="auto" w:after="0" w:before="0"/>
-              <w:jc w:val="right"/>
-            </w:pPr>
-            <w:r>
-              <w:rPr>
-                <w:sz w:val="18"/>
-              </w:rPr>
-              <w:t xml:space="preserve">[-0.025, -0.010]</w:t>
+              <w:t xml:space="preserve">Grandmother defined as a woman aged 45 or above</w:t>
+            </w:r>
+          </w:p>
+        </w:tc>
+        <w:tc>
+          <w:tcPr/>
+          <w:p>
+            <w:pPr>
+              <w:pStyle w:val="Compact"/>
+              <w:spacing w:line="240" w:lineRule="auto" w:after="0" w:before="0"/>
+              <w:jc w:val="right"/>
+            </w:pPr>
+            <w:r>
+              <w:rPr>
+                <w:sz w:val="18"/>
+              </w:rPr>
+              <w:t xml:space="preserve">-3.08</w:t>
+            </w:r>
+          </w:p>
+        </w:tc>
+        <w:tc>
+          <w:tcPr/>
+          <w:p>
+            <w:pPr>
+              <w:pStyle w:val="Compact"/>
+              <w:spacing w:line="240" w:lineRule="auto" w:after="0" w:before="0"/>
+              <w:jc w:val="right"/>
+            </w:pPr>
+            <w:r>
+              <w:rPr>
+                <w:sz w:val="18"/>
+              </w:rPr>
+              <w:t xml:space="preserve">[-5.54, -0.61]</w:t>
             </w:r>
           </w:p>
         </w:tc>
@@ -9351,33 +10087,40 @@
               <w:rPr>
                 <w:sz w:val="18"/>
               </w:rPr>
-              <w:t xml:space="preserve">Oster bias-adjusted, childcare (delta = 1, Rmax = 1.3 R)</w:t>
-            </w:r>
-          </w:p>
-        </w:tc>
-        <w:tc>
-          <w:tcPr/>
-          <w:p>
-            <w:pPr>
-              <w:pStyle w:val="Compact"/>
-              <w:spacing w:line="240" w:lineRule="auto" w:after="0" w:before="0"/>
-              <w:jc w:val="right"/>
-            </w:pPr>
-            <w:r>
-              <w:rPr>
-                <w:sz w:val="18"/>
-              </w:rPr>
-              <w:t xml:space="preserve">-2.33</w:t>
-            </w:r>
-          </w:p>
-        </w:tc>
-        <w:tc>
-          <w:tcPr/>
-          <w:p>
-            <w:pPr>
-              <w:pStyle w:val="Compact"/>
-              <w:spacing w:line="240" w:lineRule="auto" w:after="0" w:before="0"/>
-            </w:pPr>
+              <w:t xml:space="preserve">Extensive margin: any primary childcare (share)</w:t>
+            </w:r>
+          </w:p>
+        </w:tc>
+        <w:tc>
+          <w:tcPr/>
+          <w:p>
+            <w:pPr>
+              <w:pStyle w:val="Compact"/>
+              <w:spacing w:line="240" w:lineRule="auto" w:after="0" w:before="0"/>
+              <w:jc w:val="right"/>
+            </w:pPr>
+            <w:r>
+              <w:rPr>
+                <w:sz w:val="18"/>
+              </w:rPr>
+              <w:t xml:space="preserve">-0.018</w:t>
+            </w:r>
+          </w:p>
+        </w:tc>
+        <w:tc>
+          <w:tcPr/>
+          <w:p>
+            <w:pPr>
+              <w:pStyle w:val="Compact"/>
+              <w:spacing w:line="240" w:lineRule="auto" w:after="0" w:before="0"/>
+              <w:jc w:val="right"/>
+            </w:pPr>
+            <w:r>
+              <w:rPr>
+                <w:sz w:val="18"/>
+              </w:rPr>
+              <w:t xml:space="preserve">[-0.025, -0.010]</w:t>
+            </w:r>
           </w:p>
         </w:tc>
       </w:tr>
@@ -9394,6 +10137,49 @@
               <w:rPr>
                 <w:sz w:val="18"/>
               </w:rPr>
+              <w:t xml:space="preserve">Oster bias-adjusted, childcare (delta = 1, Rmax = 1.3 R)</w:t>
+            </w:r>
+          </w:p>
+        </w:tc>
+        <w:tc>
+          <w:tcPr/>
+          <w:p>
+            <w:pPr>
+              <w:pStyle w:val="Compact"/>
+              <w:spacing w:line="240" w:lineRule="auto" w:after="0" w:before="0"/>
+              <w:jc w:val="right"/>
+            </w:pPr>
+            <w:r>
+              <w:rPr>
+                <w:sz w:val="18"/>
+              </w:rPr>
+              <w:t xml:space="preserve">-2.33</w:t>
+            </w:r>
+          </w:p>
+        </w:tc>
+        <w:tc>
+          <w:tcPr/>
+          <w:p>
+            <w:pPr>
+              <w:pStyle w:val="Compact"/>
+              <w:spacing w:line="240" w:lineRule="auto" w:after="0" w:before="0"/>
+            </w:pPr>
+          </w:p>
+        </w:tc>
+      </w:tr>
+      <w:tr>
+        <w:tc>
+          <w:tcPr/>
+          <w:p>
+            <w:pPr>
+              <w:pStyle w:val="Compact"/>
+              <w:spacing w:line="240" w:lineRule="auto" w:after="0" w:before="0"/>
+              <w:jc w:val="left"/>
+            </w:pPr>
+            <w:r>
+              <w:rPr>
+                <w:sz w:val="18"/>
+              </w:rPr>
               <w:t xml:space="preserve">Oster bias-adjusted, employment (delta = 1, Rmax = 1.3 R)</w:t>
             </w:r>
           </w:p>
@@ -9411,6 +10197,92 @@
                 <w:sz w:val="18"/>
               </w:rPr>
               <w:t xml:space="preserve">-1.00</w:t>
+            </w:r>
+          </w:p>
+        </w:tc>
+        <w:tc>
+          <w:tcPr/>
+          <w:p>
+            <w:pPr>
+              <w:pStyle w:val="Compact"/>
+              <w:spacing w:line="240" w:lineRule="auto" w:after="0" w:before="0"/>
+            </w:pPr>
+          </w:p>
+        </w:tc>
+      </w:tr>
+      <w:tr>
+        <w:tc>
+          <w:tcPr/>
+          <w:p>
+            <w:pPr>
+              <w:pStyle w:val="Compact"/>
+              <w:spacing w:line="240" w:lineRule="auto" w:after="0" w:before="0"/>
+              <w:jc w:val="left"/>
+            </w:pPr>
+            <w:r>
+              <w:rPr>
+                <w:sz w:val="18"/>
+              </w:rPr>
+              <w:t xml:space="preserve">Oster delta for a zero coefficient, childcare (Rmax = 1.3 R)</w:t>
+            </w:r>
+          </w:p>
+        </w:tc>
+        <w:tc>
+          <w:tcPr/>
+          <w:p>
+            <w:pPr>
+              <w:pStyle w:val="Compact"/>
+              <w:spacing w:line="240" w:lineRule="auto" w:after="0" w:before="0"/>
+              <w:jc w:val="right"/>
+            </w:pPr>
+            <w:r>
+              <w:rPr>
+                <w:sz w:val="18"/>
+              </w:rPr>
+              <w:t xml:space="preserve">-8.66</w:t>
+            </w:r>
+          </w:p>
+        </w:tc>
+        <w:tc>
+          <w:tcPr/>
+          <w:p>
+            <w:pPr>
+              <w:pStyle w:val="Compact"/>
+              <w:spacing w:line="240" w:lineRule="auto" w:after="0" w:before="0"/>
+            </w:pPr>
+          </w:p>
+        </w:tc>
+      </w:tr>
+      <w:tr>
+        <w:tc>
+          <w:tcPr/>
+          <w:p>
+            <w:pPr>
+              <w:pStyle w:val="Compact"/>
+              <w:spacing w:line="240" w:lineRule="auto" w:after="0" w:before="0"/>
+              <w:jc w:val="left"/>
+            </w:pPr>
+            <w:r>
+              <w:rPr>
+                <w:sz w:val="18"/>
+              </w:rPr>
+              <w:t xml:space="preserve">Oster delta for a zero coefficient, employment (Rmax = 1.3 R)</w:t>
+            </w:r>
+          </w:p>
+        </w:tc>
+        <w:tc>
+          <w:tcPr/>
+          <w:p>
+            <w:pPr>
+              <w:pStyle w:val="Compact"/>
+              <w:spacing w:line="240" w:lineRule="auto" w:after="0" w:before="0"/>
+              <w:jc w:val="right"/>
+            </w:pPr>
+            <w:r>
+              <w:rPr>
+                <w:sz w:val="18"/>
+              </w:rPr>
+              <w:t xml:space="preserve">-0.69</w:t>
             </w:r>
           </w:p>
         </w:tc>
@@ -9441,7 +10313,7 @@
         <w:t xml:space="preserve"> </w:t>
       </w:r>
       <w:r>
-        <w:t xml:space="preserve">Coefficient on the grandmother indicator (or any grandparent) in the main specification, unless stated. The extensive-margin row is a linear probability model. The Oster rows use the short regression without controls or fixed effects on the same sample.</w:t>
+        <w:t xml:space="preserve">Coefficient on the grandmother indicator (or any grandparent) in the main specification, unless stated. The extensive-margin row is a linear probability model. The Oster rows use the short regression without controls or fixed effects on the same sample; the bias-adjusted estimate sets delta = 1, and the delta rows give the relative degree of selection on unobservables that would make the coefficient zero. The age-45 row requires the grandmother of a junior-level mother to be aged 45 or above instead of 40.</w:t>
       </w:r>
     </w:p>
     <w:p>
@@ -9606,31 +10478,37 @@
         <w:t xml:space="preserve"> </w:t>
       </w:r>
       <w:r>
-        <w:t xml:space="preserve">not fall. Grandmothering in this setting is a substantial transfer of</w:t>
-      </w:r>
-      <w:r>
-        <w:t xml:space="preserve"> </w:t>
-      </w:r>
-      <w:r>
-        <w:t xml:space="preserve">time from older women, and its cost falls on domestic work, free time</w:t>
-      </w:r>
-      <w:r>
-        <w:t xml:space="preserve"> </w:t>
-      </w:r>
-      <w:r>
-        <w:t xml:space="preserve">and sleep. Children in three-generation households also receive more</w:t>
-      </w:r>
-      <w:r>
-        <w:t xml:space="preserve"> </w:t>
-      </w:r>
-      <w:r>
-        <w:t xml:space="preserve">adult care in total, so the grandmother’s care adds to what children</w:t>
-      </w:r>
-      <w:r>
-        <w:t xml:space="preserve"> </w:t>
-      </w:r>
-      <w:r>
-        <w:t xml:space="preserve">receive.</w:t>
+        <w:t xml:space="preserve">not fall. Grandmothering in this setting is associated with a</w:t>
+      </w:r>
+      <w:r>
+        <w:t xml:space="preserve"> </w:t>
+      </w:r>
+      <w:r>
+        <w:t xml:space="preserve">substantial transfer of time from older women, whose cost falls on their</w:t>
+      </w:r>
+      <w:r>
+        <w:t xml:space="preserve"> </w:t>
+      </w:r>
+      <w:r>
+        <w:t xml:space="preserve">free time and sleep, while their lower domestic work may reflect tasks</w:t>
+      </w:r>
+      <w:r>
+        <w:t xml:space="preserve"> </w:t>
+      </w:r>
+      <w:r>
+        <w:t xml:space="preserve">shifted to mothers. Children in three-generation households also receive</w:t>
+      </w:r>
+      <w:r>
+        <w:t xml:space="preserve"> </w:t>
+      </w:r>
+      <w:r>
+        <w:t xml:space="preserve">more adult care in total, so the grandmother’s care adds to what</w:t>
+      </w:r>
+      <w:r>
+        <w:t xml:space="preserve"> </w:t>
+      </w:r>
+      <w:r>
+        <w:t xml:space="preserve">children receive.</w:t>
       </w:r>
     </w:p>
     <w:p>
@@ -9656,85 +10534,103 @@
         <w:t xml:space="preserve"> </w:t>
       </w:r>
       <w:r>
-        <w:t xml:space="preserve">grandmother is 60 or older and not in paid work and is not lower where</w:t>
-      </w:r>
-      <w:r>
-        <w:t xml:space="preserve"> </w:t>
-      </w:r>
-      <w:r>
-        <w:t xml:space="preserve">she is younger or employed, and among head-level mothers the reduction</w:t>
-      </w:r>
-      <w:r>
-        <w:t xml:space="preserve"> </w:t>
-      </w:r>
-      <w:r>
-        <w:t xml:space="preserve">is larger. The second is the constraint channel: a larger household and</w:t>
-      </w:r>
-      <w:r>
-        <w:t xml:space="preserve"> </w:t>
-      </w:r>
-      <w:r>
-        <w:t xml:space="preserve">a senior woman’s authority raise the mother’s domestic load and the</w:t>
-      </w:r>
-      <w:r>
-        <w:t xml:space="preserve"> </w:t>
-      </w:r>
-      <w:r>
-        <w:t xml:space="preserve">wedge on work outside the home, so any childcare time released is</w:t>
-      </w:r>
-      <w:r>
-        <w:t xml:space="preserve"> </w:t>
-      </w:r>
-      <w:r>
-        <w:t xml:space="preserve">absorbed, which fits the higher time on food and meals. The third is</w:t>
-      </w:r>
-      <w:r>
-        <w:t xml:space="preserve"> </w:t>
-      </w:r>
-      <w:r>
-        <w:t xml:space="preserve">selection: mothers who choose, or are placed in, three-generation</w:t>
-      </w:r>
-      <w:r>
-        <w:t xml:space="preserve"> </w:t>
-      </w:r>
-      <w:r>
-        <w:t xml:space="preserve">households differ in ways that also shape their time. Gradients by the</w:t>
-      </w:r>
-      <w:r>
-        <w:t xml:space="preserve"> </w:t>
-      </w:r>
-      <w:r>
-        <w:t xml:space="preserve">grandmother’s characteristics are harder to attribute to fixed household</w:t>
-      </w:r>
-      <w:r>
-        <w:t xml:space="preserve"> </w:t>
-      </w:r>
-      <w:r>
-        <w:t xml:space="preserve">traits, but selection remains open: the pooled estimate is sensitive to</w:t>
-      </w:r>
-      <w:r>
-        <w:t xml:space="preserve"> </w:t>
-      </w:r>
-      <w:r>
-        <w:t xml:space="preserve">the specification, and the placebo for domestic work is not clean.</w:t>
-      </w:r>
-      <w:r>
-        <w:t xml:space="preserve"> </w:t>
-      </w:r>
-      <w:r>
-        <w:t xml:space="preserve">Fathers’ childcare is also lower with a grandmother present, so part of</w:t>
-      </w:r>
-      <w:r>
-        <w:t xml:space="preserve"> </w:t>
-      </w:r>
-      <w:r>
-        <w:t xml:space="preserve">grandmothers’ care appears to replace fathers’ contribution rather than</w:t>
-      </w:r>
-      <w:r>
-        <w:t xml:space="preserve"> </w:t>
-      </w:r>
-      <w:r>
-        <w:t xml:space="preserve">mothers’.</w:t>
+        <w:t xml:space="preserve">grandmother is 60 or older, and in a separate split where she is not in</w:t>
+      </w:r>
+      <w:r>
+        <w:t xml:space="preserve"> </w:t>
+      </w:r>
+      <w:r>
+        <w:t xml:space="preserve">paid work, and it is higher where she is under 60 (3.1 minutes (CI 0.1</w:t>
+      </w:r>
+      <w:r>
+        <w:t xml:space="preserve"> </w:t>
+      </w:r>
+      <w:r>
+        <w:t xml:space="preserve">to 6.1)) or employed (5.8 minutes (CI 2.0 to 9.6)); among head-level</w:t>
+      </w:r>
+      <w:r>
+        <w:t xml:space="preserve"> </w:t>
+      </w:r>
+      <w:r>
+        <w:t xml:space="preserve">mothers the reduction is larger. The age and employment splits are</w:t>
+      </w:r>
+      <w:r>
+        <w:t xml:space="preserve"> </w:t>
+      </w:r>
+      <w:r>
+        <w:t xml:space="preserve">separate regressions, not a joint classification, and with both</w:t>
+      </w:r>
+      <w:r>
+        <w:t xml:space="preserve"> </w:t>
+      </w:r>
+      <w:r>
+        <w:t xml:space="preserve">grandparents present mothers’ childcare is not lower. The second is the</w:t>
+      </w:r>
+      <w:r>
+        <w:t xml:space="preserve"> </w:t>
+      </w:r>
+      <w:r>
+        <w:t xml:space="preserve">constraint channel: a larger household and a senior woman’s authority</w:t>
+      </w:r>
+      <w:r>
+        <w:t xml:space="preserve"> </w:t>
+      </w:r>
+      <w:r>
+        <w:t xml:space="preserve">raise the mother’s domestic load and the wedge on work outside the home,</w:t>
+      </w:r>
+      <w:r>
+        <w:t xml:space="preserve"> </w:t>
+      </w:r>
+      <w:r>
+        <w:t xml:space="preserve">so any childcare time released is absorbed, which fits the higher time</w:t>
+      </w:r>
+      <w:r>
+        <w:t xml:space="preserve"> </w:t>
+      </w:r>
+      <w:r>
+        <w:t xml:space="preserve">on food and meals. The third is selection: mothers who choose, or are</w:t>
+      </w:r>
+      <w:r>
+        <w:t xml:space="preserve"> </w:t>
+      </w:r>
+      <w:r>
+        <w:t xml:space="preserve">placed in, three-generation households differ in ways that also shape</w:t>
+      </w:r>
+      <w:r>
+        <w:t xml:space="preserve"> </w:t>
+      </w:r>
+      <w:r>
+        <w:t xml:space="preserve">their time. Gradients by the grandmother’s characteristics are harder to</w:t>
+      </w:r>
+      <w:r>
+        <w:t xml:space="preserve"> </w:t>
+      </w:r>
+      <w:r>
+        <w:t xml:space="preserve">attribute to fixed household traits, but selection remains open: the</w:t>
+      </w:r>
+      <w:r>
+        <w:t xml:space="preserve"> </w:t>
+      </w:r>
+      <w:r>
+        <w:t xml:space="preserve">pooled estimate is sensitive to the specification, and the placebo for</w:t>
+      </w:r>
+      <w:r>
+        <w:t xml:space="preserve"> </w:t>
+      </w:r>
+      <w:r>
+        <w:t xml:space="preserve">domestic work is not clean. Fathers’ childcare is also lower with a</w:t>
+      </w:r>
+      <w:r>
+        <w:t xml:space="preserve"> </w:t>
+      </w:r>
+      <w:r>
+        <w:t xml:space="preserve">grandmother present, so part of grandmothers’ care appears to replace</w:t>
+      </w:r>
+      <w:r>
+        <w:t xml:space="preserve"> </w:t>
+      </w:r>
+      <w:r>
+        <w:t xml:space="preserve">fathers’ contribution rather than mothers’.</w:t>
       </w:r>
     </w:p>
     <w:p>
@@ -9760,73 +10656,79 @@
         <w:t xml:space="preserve"> </w:t>
       </w:r>
       <w:r>
-        <w:t xml:space="preserve">2018). The pooled estimates here show no such association in India,</w:t>
-      </w:r>
-      <w:r>
-        <w:t xml:space="preserve"> </w:t>
-      </w:r>
-      <w:r>
-        <w:t xml:space="preserve">although grandmothers provide 37% of the combined childcare of the two</w:t>
-      </w:r>
-      <w:r>
-        <w:t xml:space="preserve"> </w:t>
-      </w:r>
-      <w:r>
-        <w:t xml:space="preserve">women, and the subgroup estimates for paid work differ in sign. The</w:t>
-      </w:r>
-      <w:r>
-        <w:t xml:space="preserve"> </w:t>
-      </w:r>
-      <w:r>
-        <w:t xml:space="preserve">contrast is consistent with the view that the binding constraint on</w:t>
-      </w:r>
-      <w:r>
-        <w:t xml:space="preserve"> </w:t>
-      </w:r>
-      <w:r>
-        <w:t xml:space="preserve">young Indian mothers’ employment is not, or not only, the availability</w:t>
-      </w:r>
-      <w:r>
-        <w:t xml:space="preserve"> </w:t>
-      </w:r>
-      <w:r>
-        <w:t xml:space="preserve">of childcare, and with the evidence that household structure and norms</w:t>
-      </w:r>
-      <w:r>
-        <w:t xml:space="preserve"> </w:t>
-      </w:r>
-      <w:r>
-        <w:t xml:space="preserve">restrict married women’s work in India (Dhanaraj and Mahambare 2019;</w:t>
-      </w:r>
-      <w:r>
-        <w:t xml:space="preserve"> </w:t>
-      </w:r>
-      <w:r>
-        <w:t xml:space="preserve">Anukriti et al. 2020; Jayachandran 2021), although these data cannot</w:t>
-      </w:r>
-      <w:r>
-        <w:t xml:space="preserve"> </w:t>
-      </w:r>
-      <w:r>
-        <w:t xml:space="preserve">establish it. The Norwegian finding that formal childcare mainly crowded</w:t>
-      </w:r>
-      <w:r>
-        <w:t xml:space="preserve"> </w:t>
-      </w:r>
-      <w:r>
-        <w:t xml:space="preserve">out informal care (Havnes and Mogstad 2011) is a useful parallel: when</w:t>
-      </w:r>
-      <w:r>
-        <w:t xml:space="preserve"> </w:t>
-      </w:r>
-      <w:r>
-        <w:t xml:space="preserve">one form of care replaces another, the effect on mothers’ work depends</w:t>
-      </w:r>
-      <w:r>
-        <w:t xml:space="preserve"> </w:t>
-      </w:r>
-      <w:r>
-        <w:t xml:space="preserve">on what else constrains it.</w:t>
+        <w:t xml:space="preserve">2018). The pooled estimates here show no such association in India</w:t>
+      </w:r>
+      <w:r>
+        <w:t xml:space="preserve"> </w:t>
+      </w:r>
+      <w:r>
+        <w:t xml:space="preserve">(mothers’ paid-work minutes differ little, and their employment rate is</w:t>
+      </w:r>
+      <w:r>
+        <w:t xml:space="preserve"> </w:t>
+      </w:r>
+      <w:r>
+        <w:t xml:space="preserve">1.4 percentage points lower), although grandmothers provide 37% of the</w:t>
+      </w:r>
+      <w:r>
+        <w:t xml:space="preserve"> </w:t>
+      </w:r>
+      <w:r>
+        <w:t xml:space="preserve">combined childcare of the two women, and the subgroup estimates for paid</w:t>
+      </w:r>
+      <w:r>
+        <w:t xml:space="preserve"> </w:t>
+      </w:r>
+      <w:r>
+        <w:t xml:space="preserve">work differ in sign. The contrast is consistent with the view that the</w:t>
+      </w:r>
+      <w:r>
+        <w:t xml:space="preserve"> </w:t>
+      </w:r>
+      <w:r>
+        <w:t xml:space="preserve">binding constraint on young Indian mothers’ employment is not, or not</w:t>
+      </w:r>
+      <w:r>
+        <w:t xml:space="preserve"> </w:t>
+      </w:r>
+      <w:r>
+        <w:t xml:space="preserve">only, the availability of childcare, and with the evidence that</w:t>
+      </w:r>
+      <w:r>
+        <w:t xml:space="preserve"> </w:t>
+      </w:r>
+      <w:r>
+        <w:t xml:space="preserve">household structure and norms restrict married women’s work in India</w:t>
+      </w:r>
+      <w:r>
+        <w:t xml:space="preserve"> </w:t>
+      </w:r>
+      <w:r>
+        <w:t xml:space="preserve">(Dhanaraj and Mahambare 2019; Anukriti et al. 2020; Jayachandran 2021),</w:t>
+      </w:r>
+      <w:r>
+        <w:t xml:space="preserve"> </w:t>
+      </w:r>
+      <w:r>
+        <w:t xml:space="preserve">although these data cannot establish it. The Norwegian finding that</w:t>
+      </w:r>
+      <w:r>
+        <w:t xml:space="preserve"> </w:t>
+      </w:r>
+      <w:r>
+        <w:t xml:space="preserve">formal childcare mainly crowded out informal care (Havnes and Mogstad</w:t>
+      </w:r>
+      <w:r>
+        <w:t xml:space="preserve"> </w:t>
+      </w:r>
+      <w:r>
+        <w:t xml:space="preserve">2011) is a useful parallel: when one form of care replaces another, the</w:t>
+      </w:r>
+      <w:r>
+        <w:t xml:space="preserve"> </w:t>
+      </w:r>
+      <w:r>
+        <w:t xml:space="preserve">effect on mothers’ work depends on what else constrains it.</w:t>
       </w:r>
     </w:p>
     <w:p>
@@ -9871,13 +10773,13 @@
         <w:t xml:space="preserve"> </w:t>
       </w:r>
       <w:r>
-        <w:t xml:space="preserve">care is not free: it is provided by older women whose own free time and</w:t>
-      </w:r>
-      <w:r>
-        <w:t xml:space="preserve"> </w:t>
-      </w:r>
-      <w:r>
-        <w:t xml:space="preserve">sleep fall when a young grandchild is present. As India’s population</w:t>
+        <w:t xml:space="preserve">care is not free: it is provided by older women who report less free</w:t>
+      </w:r>
+      <w:r>
+        <w:t xml:space="preserve"> </w:t>
+      </w:r>
+      <w:r>
+        <w:t xml:space="preserve">time and sleep when a young grandchild is present. As India’s population</w:t>
       </w:r>
       <w:r>
         <w:t xml:space="preserve"> </w:t>
@@ -10177,37 +11079,43 @@
         <w:t xml:space="preserve"> </w:t>
       </w:r>
       <w:r>
-        <w:t xml:space="preserve">paid work is small and not robust, while grandmothers’ own childcare is</w:t>
-      </w:r>
-      <w:r>
-        <w:t xml:space="preserve"> </w:t>
-      </w:r>
-      <w:r>
-        <w:t xml:space="preserve">substantial and is associated with less domestic work, free time and</w:t>
-      </w:r>
-      <w:r>
-        <w:t xml:space="preserve"> </w:t>
-      </w:r>
-      <w:r>
-        <w:t xml:space="preserve">sleep for them. Family care in India is best understood as a transfer of</w:t>
-      </w:r>
-      <w:r>
-        <w:t xml:space="preserve"> </w:t>
-      </w:r>
-      <w:r>
-        <w:t xml:space="preserve">time between women of two generations whose terms depend on who the</w:t>
-      </w:r>
-      <w:r>
-        <w:t xml:space="preserve"> </w:t>
-      </w:r>
-      <w:r>
-        <w:t xml:space="preserve">grandmother is and on how the household is arranged, and whose cost</w:t>
-      </w:r>
-      <w:r>
-        <w:t xml:space="preserve"> </w:t>
-      </w:r>
-      <w:r>
-        <w:t xml:space="preserve">falls on older women’s rest and leisure.</w:t>
+        <w:t xml:space="preserve">paid-work minutes is small and not robust, while grandmothers’ own</w:t>
+      </w:r>
+      <w:r>
+        <w:t xml:space="preserve"> </w:t>
+      </w:r>
+      <w:r>
+        <w:t xml:space="preserve">childcare is substantial and is associated with less free time and sleep</w:t>
+      </w:r>
+      <w:r>
+        <w:t xml:space="preserve"> </w:t>
+      </w:r>
+      <w:r>
+        <w:t xml:space="preserve">for them, and with less domestic work that mothers may partly take over.</w:t>
+      </w:r>
+      <w:r>
+        <w:t xml:space="preserve"> </w:t>
+      </w:r>
+      <w:r>
+        <w:t xml:space="preserve">Family care in India is best understood as a transfer of time between</w:t>
+      </w:r>
+      <w:r>
+        <w:t xml:space="preserve"> </w:t>
+      </w:r>
+      <w:r>
+        <w:t xml:space="preserve">women of two generations whose terms depend on who the grandmother is</w:t>
+      </w:r>
+      <w:r>
+        <w:t xml:space="preserve"> </w:t>
+      </w:r>
+      <w:r>
+        <w:t xml:space="preserve">and on how the household is arranged, and whose cost falls on older</w:t>
+      </w:r>
+      <w:r>
+        <w:t xml:space="preserve"> </w:t>
+      </w:r>
+      <w:r>
+        <w:t xml:space="preserve">women’s rest and leisure.</w:t>
       </w:r>
     </w:p>
     <w:p>
@@ -10429,6 +11337,46 @@
         <w:pStyle w:val="BodyText"/>
       </w:pPr>
       <w:r>
+        <w:t xml:space="preserve">Afridi F, Dinkelman T, Mahajan K (2018) Why are fewer married women</w:t>
+      </w:r>
+      <w:r>
+        <w:t xml:space="preserve"> </w:t>
+      </w:r>
+      <w:r>
+        <w:t xml:space="preserve">joining the work force in rural</w:t>
+      </w:r>
+      <w:r>
+        <w:t xml:space="preserve"> </w:t>
+      </w:r>
+      <w:r>
+        <w:t xml:space="preserve">India</w:t>
+      </w:r>
+      <w:r>
+        <w:t xml:space="preserve">? A decomposition analysis over</w:t>
+      </w:r>
+      <w:r>
+        <w:t xml:space="preserve"> </w:t>
+      </w:r>
+      <w:r>
+        <w:t xml:space="preserve">two decades. Journal of Population Economics 31:783–818.</w:t>
+      </w:r>
+      <w:r>
+        <w:t xml:space="preserve"> </w:t>
+      </w:r>
+      <w:hyperlink r:id="rId47">
+        <w:r>
+          <w:rPr>
+            <w:rStyle w:val="Hyperlink"/>
+          </w:rPr>
+          <w:t xml:space="preserve">https://doi.org/10.1007/s00148-017-0671-y</w:t>
+        </w:r>
+      </w:hyperlink>
+    </w:p>
+    <w:p>
+      <w:pPr>
+        <w:pStyle w:val="BodyText"/>
+      </w:pPr>
+      <w:r>
         <w:t xml:space="preserve">Albertini M, Kohli M, Vogel C (2007) Intergenerational transfers of time</w:t>
       </w:r>
       <w:r>
@@ -10458,7 +11406,7 @@
       <w:r>
         <w:t xml:space="preserve"> </w:t>
       </w:r>
-      <w:hyperlink r:id="rId47">
+      <w:hyperlink r:id="rId48">
         <w:r>
           <w:rPr>
             <w:rStyle w:val="Hyperlink"/>
@@ -10489,7 +11437,7 @@
       <w:r>
         <w:t xml:space="preserve"> </w:t>
       </w:r>
-      <w:hyperlink r:id="rId48">
+      <w:hyperlink r:id="rId49">
         <w:r>
           <w:rPr>
             <w:rStyle w:val="Hyperlink"/>
@@ -10532,7 +11480,7 @@
       <w:r>
         <w:t xml:space="preserve"> </w:t>
       </w:r>
-      <w:hyperlink r:id="rId49">
+      <w:hyperlink r:id="rId50">
         <w:r>
           <w:rPr>
             <w:rStyle w:val="Hyperlink"/>
@@ -10572,7 +11520,7 @@
       <w:r>
         <w:t xml:space="preserve"> </w:t>
       </w:r>
-      <w:hyperlink r:id="rId50">
+      <w:hyperlink r:id="rId51">
         <w:r>
           <w:rPr>
             <w:rStyle w:val="Hyperlink"/>
@@ -10603,7 +11551,7 @@
       <w:r>
         <w:t xml:space="preserve"> </w:t>
       </w:r>
-      <w:hyperlink r:id="rId51">
+      <w:hyperlink r:id="rId52">
         <w:r>
           <w:rPr>
             <w:rStyle w:val="Hyperlink"/>
@@ -10655,7 +11603,7 @@
       <w:r>
         <w:t xml:space="preserve"> </w:t>
       </w:r>
-      <w:hyperlink r:id="rId52">
+      <w:hyperlink r:id="rId53">
         <w:r>
           <w:rPr>
             <w:rStyle w:val="Hyperlink"/>
@@ -10715,7 +11663,7 @@
       <w:r>
         <w:t xml:space="preserve"> </w:t>
       </w:r>
-      <w:hyperlink r:id="rId53">
+      <w:hyperlink r:id="rId54">
         <w:r>
           <w:rPr>
             <w:rStyle w:val="Hyperlink"/>
@@ -10740,7 +11688,7 @@
       <w:r>
         <w:t xml:space="preserve"> </w:t>
       </w:r>
-      <w:hyperlink r:id="rId54">
+      <w:hyperlink r:id="rId55">
         <w:r>
           <w:rPr>
             <w:rStyle w:val="Hyperlink"/>
@@ -10771,7 +11719,7 @@
       <w:r>
         <w:t xml:space="preserve"> </w:t>
       </w:r>
-      <w:hyperlink r:id="rId55">
+      <w:hyperlink r:id="rId56">
         <w:r>
           <w:rPr>
             <w:rStyle w:val="Hyperlink"/>
@@ -10796,7 +11744,7 @@
       <w:r>
         <w:t xml:space="preserve"> </w:t>
       </w:r>
-      <w:hyperlink r:id="rId56">
+      <w:hyperlink r:id="rId57">
         <w:r>
           <w:rPr>
             <w:rStyle w:val="Hyperlink"/>
@@ -10821,7 +11769,7 @@
       <w:r>
         <w:t xml:space="preserve"> </w:t>
       </w:r>
-      <w:hyperlink r:id="rId57">
+      <w:hyperlink r:id="rId58">
         <w:r>
           <w:rPr>
             <w:rStyle w:val="Hyperlink"/>
@@ -10866,7 +11814,7 @@
       <w:r>
         <w:t xml:space="preserve"> </w:t>
       </w:r>
-      <w:hyperlink r:id="rId58">
+      <w:hyperlink r:id="rId59">
         <w:r>
           <w:rPr>
             <w:rStyle w:val="Hyperlink"/>
@@ -10900,7 +11848,7 @@
       <w:r>
         <w:t xml:space="preserve"> </w:t>
       </w:r>
-      <w:hyperlink r:id="rId59">
+      <w:hyperlink r:id="rId60">
         <w:r>
           <w:rPr>
             <w:rStyle w:val="Hyperlink"/>
@@ -10940,7 +11888,7 @@
       <w:r>
         <w:t xml:space="preserve"> </w:t>
       </w:r>
-      <w:hyperlink r:id="rId60">
+      <w:hyperlink r:id="rId61">
         <w:r>
           <w:rPr>
             <w:rStyle w:val="Hyperlink"/>
@@ -10980,7 +11928,7 @@
       <w:r>
         <w:t xml:space="preserve"> </w:t>
       </w:r>
-      <w:hyperlink r:id="rId61">
+      <w:hyperlink r:id="rId62">
         <w:r>
           <w:rPr>
             <w:rStyle w:val="Hyperlink"/>
@@ -11020,7 +11968,7 @@
       <w:r>
         <w:t xml:space="preserve"> </w:t>
       </w:r>
-      <w:hyperlink r:id="rId62">
+      <w:hyperlink r:id="rId63">
         <w:r>
           <w:rPr>
             <w:rStyle w:val="Hyperlink"/>
@@ -11051,7 +11999,7 @@
       <w:r>
         <w:t xml:space="preserve"> </w:t>
       </w:r>
-      <w:hyperlink r:id="rId63">
+      <w:hyperlink r:id="rId64">
         <w:r>
           <w:rPr>
             <w:rStyle w:val="Hyperlink"/>
@@ -11105,7 +12053,7 @@
       <w:r>
         <w:t xml:space="preserve"> </w:t>
       </w:r>
-      <w:hyperlink r:id="rId64">
+      <w:hyperlink r:id="rId65">
         <w:r>
           <w:rPr>
             <w:rStyle w:val="Hyperlink"/>
@@ -11139,7 +12087,7 @@
       <w:r>
         <w:t xml:space="preserve"> </w:t>
       </w:r>
-      <w:hyperlink r:id="rId65">
+      <w:hyperlink r:id="rId66">
         <w:r>
           <w:rPr>
             <w:rStyle w:val="Hyperlink"/>
@@ -11170,7 +12118,7 @@
       <w:r>
         <w:t xml:space="preserve"> </w:t>
       </w:r>
-      <w:hyperlink r:id="rId66">
+      <w:hyperlink r:id="rId67">
         <w:r>
           <w:rPr>
             <w:rStyle w:val="Hyperlink"/>
@@ -11184,6 +12132,31 @@
         <w:pStyle w:val="BodyText"/>
       </w:pPr>
       <w:r>
+        <w:t xml:space="preserve">Frimmel W, Halla M, Schmidpeter B, Winter-Ebmer R (2022) Grandmothers’</w:t>
+      </w:r>
+      <w:r>
+        <w:t xml:space="preserve"> </w:t>
+      </w:r>
+      <w:r>
+        <w:t xml:space="preserve">labor supply. Journal of Human Resources 57:1645–1689.</w:t>
+      </w:r>
+      <w:r>
+        <w:t xml:space="preserve"> </w:t>
+      </w:r>
+      <w:hyperlink r:id="rId68">
+        <w:r>
+          <w:rPr>
+            <w:rStyle w:val="Hyperlink"/>
+          </w:rPr>
+          <w:t xml:space="preserve">https://doi.org/10.3368/jhr.58.1.0419-10144R1</w:t>
+        </w:r>
+      </w:hyperlink>
+    </w:p>
+    <w:p>
+      <w:pPr>
+        <w:pStyle w:val="BodyText"/>
+      </w:pPr>
+      <w:r>
         <w:t xml:space="preserve">Havnes T, Mogstad M (2011) Money for nothing?</w:t>
       </w:r>
       <w:r>
@@ -11204,7 +12177,7 @@
       <w:r>
         <w:t xml:space="preserve"> </w:t>
       </w:r>
-      <w:hyperlink r:id="rId67">
+      <w:hyperlink r:id="rId69">
         <w:r>
           <w:rPr>
             <w:rStyle w:val="Hyperlink"/>
@@ -11235,7 +12208,7 @@
       <w:r>
         <w:t xml:space="preserve"> </w:t>
       </w:r>
-      <w:hyperlink r:id="rId68">
+      <w:hyperlink r:id="rId70">
         <w:r>
           <w:rPr>
             <w:rStyle w:val="Hyperlink"/>
@@ -11260,7 +12233,7 @@
       <w:r>
         <w:t xml:space="preserve"> </w:t>
       </w:r>
-      <w:hyperlink r:id="rId69">
+      <w:hyperlink r:id="rId71">
         <w:r>
           <w:rPr>
             <w:rStyle w:val="Hyperlink"/>
@@ -11294,7 +12267,7 @@
       <w:r>
         <w:t xml:space="preserve"> </w:t>
       </w:r>
-      <w:hyperlink r:id="rId70">
+      <w:hyperlink r:id="rId72">
         <w:r>
           <w:rPr>
             <w:rStyle w:val="Hyperlink"/>
@@ -11375,7 +12348,7 @@
       <w:r>
         <w:t xml:space="preserve"> </w:t>
       </w:r>
-      <w:hyperlink r:id="rId71">
+      <w:hyperlink r:id="rId73">
         <w:r>
           <w:rPr>
             <w:rStyle w:val="Hyperlink"/>
@@ -11400,7 +12373,7 @@
       <w:r>
         <w:t xml:space="preserve"> </w:t>
       </w:r>
-      <w:hyperlink r:id="rId72">
+      <w:hyperlink r:id="rId74">
         <w:r>
           <w:rPr>
             <w:rStyle w:val="Hyperlink"/>
@@ -11443,7 +12416,7 @@
       <w:r>
         <w:t xml:space="preserve"> </w:t>
       </w:r>
-      <w:hyperlink r:id="rId73">
+      <w:hyperlink r:id="rId75">
         <w:r>
           <w:rPr>
             <w:rStyle w:val="Hyperlink"/>
@@ -11468,7 +12441,7 @@
       <w:r>
         <w:t xml:space="preserve"> </w:t>
       </w:r>
-      <w:hyperlink r:id="rId74">
+      <w:hyperlink r:id="rId76">
         <w:r>
           <w:rPr>
             <w:rStyle w:val="Hyperlink"/>
@@ -11508,7 +12481,7 @@
       <w:r>
         <w:t xml:space="preserve"> </w:t>
       </w:r>
-      <w:hyperlink r:id="rId75">
+      <w:hyperlink r:id="rId77">
         <w:r>
           <w:rPr>
             <w:rStyle w:val="Hyperlink"/>
@@ -11533,7 +12506,7 @@
       <w:r>
         <w:t xml:space="preserve"> </w:t>
       </w:r>
-      <w:hyperlink r:id="rId76">
+      <w:hyperlink r:id="rId78">
         <w:r>
           <w:rPr>
             <w:rStyle w:val="Hyperlink"/>
@@ -11573,7 +12546,7 @@
       <w:r>
         <w:t xml:space="preserve"> </w:t>
       </w:r>
-      <w:hyperlink r:id="rId77">
+      <w:hyperlink r:id="rId79">
         <w:r>
           <w:rPr>
             <w:rStyle w:val="Hyperlink"/>
@@ -11648,7 +12621,7 @@
       <w:r>
         <w:t xml:space="preserve"> </w:t>
       </w:r>
-      <w:hyperlink r:id="rId78">
+      <w:hyperlink r:id="rId80">
         <w:r>
           <w:rPr>
             <w:rStyle w:val="Hyperlink"/>
@@ -11673,7 +12646,7 @@
       <w:r>
         <w:t xml:space="preserve"> </w:t>
       </w:r>
-      <w:hyperlink r:id="rId79">
+      <w:hyperlink r:id="rId81">
         <w:r>
           <w:rPr>
             <w:rStyle w:val="Hyperlink"/>
@@ -11698,7 +12671,7 @@
       <w:r>
         <w:t xml:space="preserve"> </w:t>
       </w:r>
-      <w:hyperlink r:id="rId80">
+      <w:hyperlink r:id="rId82">
         <w:r>
           <w:rPr>
             <w:rStyle w:val="Hyperlink"/>
@@ -11723,7 +12696,7 @@
       <w:r>
         <w:t xml:space="preserve"> </w:t>
       </w:r>
-      <w:hyperlink r:id="rId81">
+      <w:hyperlink r:id="rId83">
         <w:r>
           <w:rPr>
             <w:rStyle w:val="Hyperlink"/>
@@ -11766,7 +12739,7 @@
       <w:r>
         <w:t xml:space="preserve"> </w:t>
       </w:r>
-      <w:hyperlink r:id="rId82">
+      <w:hyperlink r:id="rId84">
         <w:r>
           <w:rPr>
             <w:rStyle w:val="Hyperlink"/>
@@ -11797,7 +12770,7 @@
       <w:r>
         <w:t xml:space="preserve"> </w:t>
       </w:r>
-      <w:hyperlink r:id="rId83">
+      <w:hyperlink r:id="rId85">
         <w:r>
           <w:rPr>
             <w:rStyle w:val="Hyperlink"/>
@@ -11834,7 +12807,7 @@
       <w:r>
         <w:t xml:space="preserve"> </w:t>
       </w:r>
-      <w:hyperlink r:id="rId84">
+      <w:hyperlink r:id="rId86">
         <w:r>
           <w:rPr>
             <w:rStyle w:val="Hyperlink"/>
@@ -11859,7 +12832,7 @@
       <w:r>
         <w:t xml:space="preserve"> </w:t>
       </w:r>
-      <w:hyperlink r:id="rId85">
+      <w:hyperlink r:id="rId87">
         <w:r>
           <w:rPr>
             <w:rStyle w:val="Hyperlink"/>

</xml_diff>

<commit_message>
TU-02 round 3b: within-generation employment check, Table 8 N column and paid-work panel, older women 50-80 check, domestic components table (ESM S4), abstract and causal-wording fixes
</commit_message>
<xml_diff>
--- a/submission/02_grandparent_care/package/manuscript_anonymised.docx
+++ b/submission/02_grandparent_care/package/manuscript_anonymised.docx
@@ -29,7 +29,7 @@
         <w:pStyle w:val="Abstract"/>
       </w:pPr>
       <w:r>
-        <w:t xml:space="preserve">Do coresident grandmothers relieve mothers of childcare, and what do they give up? India’s Time Use Survey 2024 records same-day diaries for every household member aged six and above. I compare 49,992 married mothers of children under six, 36% of whom live with a grandmother, and study 26,062 women and 19,382 men aged 45 to 80 in the generation above young married women. The roster omits each child’s mother, so I assign children and grandparents by generation. Older women living with a child under six report 79.5 minutes more childcare a day and less domestic work, free time and sleep. Mothers’ childcare and paid-work minutes differ little with and without a grandmother and change with the specification; their employment rate is 1.4 percentage points lower. Grandmother care is associated with a large time cost for older women and, in the pooled sample, with no more paid work by mothers.</w:t>
+        <w:t xml:space="preserve">Do coresident grandmothers relieve mothers of childcare, and what do they give up? Using diaries for every household member in India’s Time Use Survey 2024, I compare 49,992 married mothers of children under six, 36% of whom live with a grandmother, and study 26,062 women and 19,382 men aged 45 to 80 in the generation above young married women. Older women living with a child under six report 79.5 minutes more childcare a day and less domestic work, free time and sleep. Mothers’ primary childcare differs little in the pooled estimate but is lower, with intervals excluding zero, in six of ten alternative specifications and higher in one; their secondary childcare is 9.6 minutes lower. Their employment rate is 1.4 percentage points lower overall but 2.2 points higher within the mother’s household generation. These are conditional associations, and grandmother care is associated with a large time cost for older women.</w:t>
       </w:r>
     </w:p>
     <w:p>
@@ -4818,43 +4818,37 @@
         <w:t xml:space="preserve"> </w:t>
       </w:r>
       <w:r>
-        <w:t xml:space="preserve">measure shows more paid work with a grandmother present, and the</w:t>
-      </w:r>
-      <w:r>
-        <w:t xml:space="preserve"> </w:t>
-      </w:r>
-      <w:r>
-        <w:t xml:space="preserve">employment-rate estimate points to a small reduction, a pattern that is</w:t>
-      </w:r>
-      <w:r>
-        <w:t xml:space="preserve"> </w:t>
-      </w:r>
-      <w:r>
-        <w:t xml:space="preserve">consistent with the constraint channel in patrilocal households although</w:t>
-      </w:r>
-      <w:r>
-        <w:t xml:space="preserve"> </w:t>
-      </w:r>
-      <w:r>
-        <w:t xml:space="preserve">these data do not isolate it. Free time is 4.3 minutes higher (CI 1.4 to</w:t>
-      </w:r>
-      <w:r>
-        <w:t xml:space="preserve"> </w:t>
-      </w:r>
-      <w:r>
-        <w:t xml:space="preserve">7.3) and sleep 3.1 minutes lower (CI -5.3 to -0.9). Both intervals</w:t>
-      </w:r>
-      <w:r>
-        <w:t xml:space="preserve"> </w:t>
-      </w:r>
-      <w:r>
-        <w:t xml:space="preserve">exclude zero, but the differences amount to a few minutes in a day of</w:t>
-      </w:r>
-      <w:r>
-        <w:t xml:space="preserve"> </w:t>
-      </w:r>
-      <w:r>
-        <w:t xml:space="preserve">1,440.</w:t>
+        <w:t xml:space="preserve">pooled measure shows more paid work with a grandmother present, and the</w:t>
+      </w:r>
+      <w:r>
+        <w:t xml:space="preserve"> </w:t>
+      </w:r>
+      <w:r>
+        <w:t xml:space="preserve">pooled employment-rate estimate is negative; the next paragraph examines</w:t>
+      </w:r>
+      <w:r>
+        <w:t xml:space="preserve"> </w:t>
+      </w:r>
+      <w:r>
+        <w:t xml:space="preserve">whether this reflects the composition of the sample. Free time is 4.3</w:t>
+      </w:r>
+      <w:r>
+        <w:t xml:space="preserve"> </w:t>
+      </w:r>
+      <w:r>
+        <w:t xml:space="preserve">minutes higher (CI 1.4 to 7.3) and sleep 3.1 minutes lower (CI -5.3 to</w:t>
+      </w:r>
+      <w:r>
+        <w:t xml:space="preserve"> </w:t>
+      </w:r>
+      <w:r>
+        <w:t xml:space="preserve">-0.9). Both intervals exclude zero, but the differences amount to a few</w:t>
+      </w:r>
+      <w:r>
+        <w:t xml:space="preserve"> </w:t>
+      </w:r>
+      <w:r>
+        <w:t xml:space="preserve">minutes in a day of 1,440.</w:t>
       </w:r>
     </w:p>
     <w:p>
@@ -4862,37 +4856,171 @@
         <w:pStyle w:val="BodyText"/>
       </w:pPr>
       <w:r>
+        <w:t xml:space="preserve">The pooled paid-work estimates mix two household arrangements with</w:t>
+      </w:r>
+      <w:r>
+        <w:t xml:space="preserve"> </w:t>
+      </w:r>
+      <w:r>
+        <w:t xml:space="preserve">different levels of employment. Junior-level mothers, most of whom live</w:t>
+      </w:r>
+      <w:r>
+        <w:t xml:space="preserve"> </w:t>
+      </w:r>
+      <w:r>
+        <w:t xml:space="preserve">with a grandmother, are less often employed than head-level mothers,</w:t>
+      </w:r>
+      <w:r>
+        <w:t xml:space="preserve"> </w:t>
+      </w:r>
+      <w:r>
+        <w:t xml:space="preserve">whichever household they live in, so a pooled comparison partly</w:t>
+      </w:r>
+      <w:r>
+        <w:t xml:space="preserve"> </w:t>
+      </w:r>
+      <w:r>
+        <w:t xml:space="preserve">contrasts the two generations. Estimated separately, a grandmother is</w:t>
+      </w:r>
+      <w:r>
+        <w:t xml:space="preserve"> </w:t>
+      </w:r>
+      <w:r>
+        <w:t xml:space="preserve">associated with more paid work among head-level mothers (12.6 minutes</w:t>
+      </w:r>
+      <w:r>
+        <w:t xml:space="preserve"> </w:t>
+      </w:r>
+      <w:r>
+        <w:t xml:space="preserve">(CI 5.6 to 19.5)) and among junior-level mothers (7.6 minutes (CI 1.2 to</w:t>
+      </w:r>
+      <w:r>
+        <w:t xml:space="preserve"> </w:t>
+      </w:r>
+      <w:r>
+        <w:t xml:space="preserve">13.9); subgroup analysis below). Adding an indicator for the mother’s</w:t>
+      </w:r>
+      <w:r>
+        <w:t xml:space="preserve"> </w:t>
+      </w:r>
+      <w:r>
+        <w:t xml:space="preserve">generation to the pooled model (robustness checks below, panel B) turns</w:t>
+      </w:r>
+      <w:r>
+        <w:t xml:space="preserve"> </w:t>
+      </w:r>
+      <w:r>
+        <w:t xml:space="preserve">the employment-minutes estimate into 10.5 minutes (CI 5.5 to 15.5) and</w:t>
+      </w:r>
+      <w:r>
+        <w:t xml:space="preserve"> </w:t>
+      </w:r>
+      <w:r>
+        <w:t xml:space="preserve">the employment-rate estimate into 2.2 percentage points higher (CI 0.8</w:t>
+      </w:r>
+      <w:r>
+        <w:t xml:space="preserve"> </w:t>
+      </w:r>
+      <w:r>
+        <w:t xml:space="preserve">to 3.5); adding household size as well gives 9.2 minutes (CI 3.6 to</w:t>
+      </w:r>
+      <w:r>
+        <w:t xml:space="preserve"> </w:t>
+      </w:r>
+      <w:r>
+        <w:t xml:space="preserve">14.7) and 2.2 percentage points higher (CI 0.7 to 3.7). The negative</w:t>
+      </w:r>
+      <w:r>
+        <w:t xml:space="preserve"> </w:t>
+      </w:r>
+      <w:r>
+        <w:t xml:space="preserve">pooled estimates are therefore consistent with composition: grandmothers</w:t>
+      </w:r>
+      <w:r>
+        <w:t xml:space="preserve"> </w:t>
+      </w:r>
+      <w:r>
+        <w:t xml:space="preserve">live mainly in junior-level households, where mothers’ employment is</w:t>
+      </w:r>
+      <w:r>
+        <w:t xml:space="preserve"> </w:t>
+      </w:r>
+      <w:r>
+        <w:t xml:space="preserve">low. The within-generation estimates also vary across other subgroups</w:t>
+      </w:r>
+      <w:r>
+        <w:t xml:space="preserve"> </w:t>
+      </w:r>
+      <w:r>
+        <w:t xml:space="preserve">(subgroup analysis below), so they do not establish a positive</w:t>
+      </w:r>
+      <w:r>
+        <w:t xml:space="preserve"> </w:t>
+      </w:r>
+      <w:r>
+        <w:t xml:space="preserve">association for all mothers. Generation is itself part of how a</w:t>
+      </w:r>
+      <w:r>
+        <w:t xml:space="preserve"> </w:t>
+      </w:r>
+      <w:r>
+        <w:t xml:space="preserve">grandmother comes to be present, so neither the pooled nor the</w:t>
+      </w:r>
+      <w:r>
+        <w:t xml:space="preserve"> </w:t>
+      </w:r>
+      <w:r>
+        <w:t xml:space="preserve">within-generation estimate is causal, and the within-generation</w:t>
+      </w:r>
+      <w:r>
+        <w:t xml:space="preserve"> </w:t>
+      </w:r>
+      <w:r>
+        <w:t xml:space="preserve">estimates give no sign that grandmothers’ presence goes with less paid</w:t>
+      </w:r>
+      <w:r>
+        <w:t xml:space="preserve"> </w:t>
+      </w:r>
+      <w:r>
+        <w:t xml:space="preserve">work by mothers of the same generation.</w:t>
+      </w:r>
+    </w:p>
+    <w:p>
+      <w:pPr>
+        <w:pStyle w:val="BodyText"/>
+      </w:pPr>
+      <w:r>
         <w:t xml:space="preserve">Taken together, the pooled estimates show small differences in mothers’</w:t>
       </w:r>
       <w:r>
         <w:t xml:space="preserve"> </w:t>
       </w:r>
       <w:r>
-        <w:t xml:space="preserve">time, no sign that a grandmother’s presence raises mothers’ paid work,</w:t>
-      </w:r>
-      <w:r>
-        <w:t xml:space="preserve"> </w:t>
-      </w:r>
-      <w:r>
-        <w:t xml:space="preserve">and an association with childcare whose interval includes zero. They do</w:t>
-      </w:r>
-      <w:r>
-        <w:t xml:space="preserve"> </w:t>
-      </w:r>
-      <w:r>
-        <w:t xml:space="preserve">not show that grandmothers relieve mothers of care, and, as the</w:t>
-      </w:r>
-      <w:r>
-        <w:t xml:space="preserve"> </w:t>
-      </w:r>
-      <w:r>
-        <w:t xml:space="preserve">robustness checks and subgroup results below show, they hide differences</w:t>
-      </w:r>
-      <w:r>
-        <w:t xml:space="preserve"> </w:t>
-      </w:r>
-      <w:r>
-        <w:t xml:space="preserve">by grandmother and by household arrangement.</w:t>
+        <w:t xml:space="preserve">time and an association with primary childcare whose interval includes</w:t>
+      </w:r>
+      <w:r>
+        <w:t xml:space="preserve"> </w:t>
+      </w:r>
+      <w:r>
+        <w:t xml:space="preserve">zero, and paid work is higher only once the mother’s generation is held</w:t>
+      </w:r>
+      <w:r>
+        <w:t xml:space="preserve"> </w:t>
+      </w:r>
+      <w:r>
+        <w:t xml:space="preserve">constant. They do not show that grandmothers relieve mothers of care,</w:t>
+      </w:r>
+      <w:r>
+        <w:t xml:space="preserve"> </w:t>
+      </w:r>
+      <w:r>
+        <w:t xml:space="preserve">and, as the robustness checks and subgroup results below show, they hide</w:t>
+      </w:r>
+      <w:r>
+        <w:t xml:space="preserve"> </w:t>
+      </w:r>
+      <w:r>
+        <w:t xml:space="preserve">differences by grandmother and by household arrangement.</w:t>
       </w:r>
     </w:p>
     <w:p>
@@ -5923,85 +6051,109 @@
         <w:t xml:space="preserve"> </w:t>
       </w:r>
       <w:r>
-        <w:t xml:space="preserve">turns to the providers of care. Among older-generation women, a child</w:t>
-      </w:r>
-      <w:r>
-        <w:t xml:space="preserve"> </w:t>
-      </w:r>
-      <w:r>
-        <w:t xml:space="preserve">under six in the household is associated with 79.5 minutes more (CI 77.4</w:t>
-      </w:r>
-      <w:r>
-        <w:t xml:space="preserve"> </w:t>
-      </w:r>
-      <w:r>
-        <w:t xml:space="preserve">to 81.6) primary childcare a day, against a mean of 4.0 minutes for</w:t>
-      </w:r>
-      <w:r>
-        <w:t xml:space="preserve"> </w:t>
-      </w:r>
-      <w:r>
-        <w:t xml:space="preserve">women without a young grandchild. On the care side the third prediction</w:t>
-      </w:r>
-      <w:r>
-        <w:t xml:space="preserve"> </w:t>
-      </w:r>
-      <w:r>
-        <w:t xml:space="preserve">of the framework holds: grandmothers report more childcare when a young</w:t>
-      </w:r>
-      <w:r>
-        <w:t xml:space="preserve"> </w:t>
-      </w:r>
-      <w:r>
-        <w:t xml:space="preserve">grandchild is present. The associations with grandmothers’ domestic work</w:t>
-      </w:r>
-      <w:r>
-        <w:t xml:space="preserve"> </w:t>
-      </w:r>
-      <w:r>
-        <w:t xml:space="preserve">(-16.6 minutes (CI -20.5 to -12.7)), paid work (4.7 minutes (CI -0.1 to</w:t>
-      </w:r>
-      <w:r>
-        <w:t xml:space="preserve"> </w:t>
-      </w:r>
-      <w:r>
-        <w:t xml:space="preserve">9.6)), employment status (1.6 percentage points higher (CI 0.4 to 2.8)),</w:t>
-      </w:r>
-      <w:r>
-        <w:t xml:space="preserve"> </w:t>
-      </w:r>
-      <w:r>
-        <w:t xml:space="preserve">free time (-53.3 minutes (CI -58.0 to -48.5)) and sleep (-9.2 minutes</w:t>
-      </w:r>
-      <w:r>
-        <w:t xml:space="preserve"> </w:t>
-      </w:r>
-      <w:r>
-        <w:t xml:space="preserve">(CI -12.0 to -6.4)) indicate where that time comes from. Grandmothers</w:t>
-      </w:r>
-      <w:r>
-        <w:t xml:space="preserve"> </w:t>
-      </w:r>
-      <w:r>
-        <w:t xml:space="preserve">with a young grandchild report less domestic work, free time and sleep,</w:t>
-      </w:r>
-      <w:r>
-        <w:t xml:space="preserve"> </w:t>
-      </w:r>
-      <w:r>
-        <w:t xml:space="preserve">with confidence intervals that exclude zero. Lower domestic work need</w:t>
-      </w:r>
-      <w:r>
-        <w:t xml:space="preserve"> </w:t>
-      </w:r>
-      <w:r>
-        <w:t xml:space="preserve">not be a cost to them: mothers in three-generation households spend more</w:t>
-      </w:r>
-      <w:r>
-        <w:t xml:space="preserve"> </w:t>
-      </w:r>
-      <w:r>
-        <w:t xml:space="preserve">time on food and meals (Table</w:t>
+        <w:t xml:space="preserve">turns to the providers of care. The older-generation sample can include</w:t>
+      </w:r>
+      <w:r>
+        <w:t xml:space="preserve"> </w:t>
+      </w:r>
+      <w:r>
+        <w:t xml:space="preserve">a woman aged 45 to 49 who is herself the mother of a late-born child;</w:t>
+      </w:r>
+      <w:r>
+        <w:t xml:space="preserve"> </w:t>
+      </w:r>
+      <w:r>
+        <w:t xml:space="preserve">dropping the 2,834 women aged 45 to 49 leaves 23,228 women and gives a</w:t>
+      </w:r>
+      <w:r>
+        <w:t xml:space="preserve"> </w:t>
+      </w:r>
+      <w:r>
+        <w:t xml:space="preserve">childcare association of 79.0 minutes (CI 76.8 to 81.2) (Table</w:t>
+      </w:r>
+      <w:r>
+        <w:t xml:space="preserve"> </w:t>
+      </w:r>
+      <w:r>
+        <w:t xml:space="preserve">S3 in Online Resource 1), close to the main estimate. Among</w:t>
+      </w:r>
+      <w:r>
+        <w:t xml:space="preserve"> </w:t>
+      </w:r>
+      <w:r>
+        <w:t xml:space="preserve">older-generation women, a child under six in the household is associated</w:t>
+      </w:r>
+      <w:r>
+        <w:t xml:space="preserve"> </w:t>
+      </w:r>
+      <w:r>
+        <w:t xml:space="preserve">with 79.5 minutes more (CI 77.4 to 81.6) primary childcare a day,</w:t>
+      </w:r>
+      <w:r>
+        <w:t xml:space="preserve"> </w:t>
+      </w:r>
+      <w:r>
+        <w:t xml:space="preserve">against a mean of 4.0 minutes for women without a young grandchild. On</w:t>
+      </w:r>
+      <w:r>
+        <w:t xml:space="preserve"> </w:t>
+      </w:r>
+      <w:r>
+        <w:t xml:space="preserve">the care side the third prediction of the framework holds: grandmothers</w:t>
+      </w:r>
+      <w:r>
+        <w:t xml:space="preserve"> </w:t>
+      </w:r>
+      <w:r>
+        <w:t xml:space="preserve">report more childcare when a young grandchild is present. The</w:t>
+      </w:r>
+      <w:r>
+        <w:t xml:space="preserve"> </w:t>
+      </w:r>
+      <w:r>
+        <w:t xml:space="preserve">associations with grandmothers’ domestic work (-16.6 minutes (CI -20.5</w:t>
+      </w:r>
+      <w:r>
+        <w:t xml:space="preserve"> </w:t>
+      </w:r>
+      <w:r>
+        <w:t xml:space="preserve">to -12.7)), paid work (4.7 minutes (CI -0.1 to 9.6)), employment status</w:t>
+      </w:r>
+      <w:r>
+        <w:t xml:space="preserve"> </w:t>
+      </w:r>
+      <w:r>
+        <w:t xml:space="preserve">(1.6 percentage points higher (CI 0.4 to 2.8)), free time (-53.3 minutes</w:t>
+      </w:r>
+      <w:r>
+        <w:t xml:space="preserve"> </w:t>
+      </w:r>
+      <w:r>
+        <w:t xml:space="preserve">(CI -58.0 to -48.5)) and sleep (-9.2 minutes (CI -12.0 to -6.4)) show</w:t>
+      </w:r>
+      <w:r>
+        <w:t xml:space="preserve"> </w:t>
+      </w:r>
+      <w:r>
+        <w:t xml:space="preserve">what else differs in their day. Grandmothers with a young grandchild</w:t>
+      </w:r>
+      <w:r>
+        <w:t xml:space="preserve"> </w:t>
+      </w:r>
+      <w:r>
+        <w:t xml:space="preserve">report less domestic work, free time and sleep, with confidence</w:t>
+      </w:r>
+      <w:r>
+        <w:t xml:space="preserve"> </w:t>
+      </w:r>
+      <w:r>
+        <w:t xml:space="preserve">intervals that exclude zero. Mothers’ total domestic work does not</w:t>
+      </w:r>
+      <w:r>
+        <w:t xml:space="preserve"> </w:t>
+      </w:r>
+      <w:r>
+        <w:t xml:space="preserve">differ with a grandmother present (Table</w:t>
       </w:r>
       <w:r>
         <w:t xml:space="preserve"> </w:t>
@@ -6015,43 +6167,67 @@
         </w:r>
       </w:hyperlink>
       <w:r>
-        <w:t xml:space="preserve">), which is consistent with</w:t>
-      </w:r>
-      <w:r>
-        <w:t xml:space="preserve"> </w:t>
-      </w:r>
-      <w:r>
-        <w:t xml:space="preserve">domestic tasks moving to the younger woman, although the two estimates</w:t>
-      </w:r>
-      <w:r>
-        <w:t xml:space="preserve"> </w:t>
-      </w:r>
-      <w:r>
-        <w:t xml:space="preserve">come from separate samples. The cost of the care they provide falls on</w:t>
-      </w:r>
-      <w:r>
-        <w:t xml:space="preserve"> </w:t>
-      </w:r>
-      <w:r>
-        <w:t xml:space="preserve">their free time and sleep. The fall in free time is the largest, at 14%</w:t>
-      </w:r>
-      <w:r>
-        <w:t xml:space="preserve"> </w:t>
-      </w:r>
-      <w:r>
-        <w:t xml:space="preserve">of the mean for women without a young grandchild. Their paid work does</w:t>
-      </w:r>
-      <w:r>
-        <w:t xml:space="preserve"> </w:t>
-      </w:r>
-      <w:r>
-        <w:t xml:space="preserve">not fall, so in this sample the cost falls on free time and sleep rather</w:t>
-      </w:r>
-      <w:r>
-        <w:t xml:space="preserve"> </w:t>
-      </w:r>
-      <w:r>
-        <w:t xml:space="preserve">than on earnings.</w:t>
+        <w:t xml:space="preserve">), and across its</w:t>
+      </w:r>
+      <w:r>
+        <w:t xml:space="preserve"> </w:t>
+      </w:r>
+      <w:r>
+        <w:t xml:space="preserve">components (Table S4 in Online Resource 1) higher time</w:t>
+      </w:r>
+      <w:r>
+        <w:t xml:space="preserve"> </w:t>
+      </w:r>
+      <w:r>
+        <w:t xml:space="preserve">on food and meals is offset by lower time on cleaning, so these</w:t>
+      </w:r>
+      <w:r>
+        <w:t xml:space="preserve"> </w:t>
+      </w:r>
+      <w:r>
+        <w:t xml:space="preserve">estimates, which come from separate samples and treatments, give no</w:t>
+      </w:r>
+      <w:r>
+        <w:t xml:space="preserve"> </w:t>
+      </w:r>
+      <w:r>
+        <w:t xml:space="preserve">clear sign of domestic tasks moving from the grandmother to the mother;</w:t>
+      </w:r>
+      <w:r>
+        <w:t xml:space="preserve"> </w:t>
+      </w:r>
+      <w:r>
+        <w:t xml:space="preserve">the placebo for domestic work (below) also suggests a larger household</w:t>
+      </w:r>
+      <w:r>
+        <w:t xml:space="preserve"> </w:t>
+      </w:r>
+      <w:r>
+        <w:t xml:space="preserve">workload for mothers. The extra care they report is accompanied by less</w:t>
+      </w:r>
+      <w:r>
+        <w:t xml:space="preserve"> </w:t>
+      </w:r>
+      <w:r>
+        <w:t xml:space="preserve">free time and sleep. The fall in free time is the largest, at 14% of</w:t>
+      </w:r>
+      <w:r>
+        <w:t xml:space="preserve"> </w:t>
+      </w:r>
+      <w:r>
+        <w:t xml:space="preserve">the mean for women without a young grandchild. Their paid work does not</w:t>
+      </w:r>
+      <w:r>
+        <w:t xml:space="preserve"> </w:t>
+      </w:r>
+      <w:r>
+        <w:t xml:space="preserve">fall, so in this sample the extra childcare is accompanied by less free</w:t>
+      </w:r>
+      <w:r>
+        <w:t xml:space="preserve"> </w:t>
+      </w:r>
+      <w:r>
+        <w:t xml:space="preserve">time and sleep but not by less paid work.</w:t>
       </w:r>
     </w:p>
     <w:bookmarkStart w:id="29" w:name="_f294cdcd745397e2585ca03b9caa9755a4c1ee4"/>
@@ -7703,43 +7879,55 @@
         <w:t xml:space="preserve"> </w:t>
       </w:r>
       <w:r>
-        <w:t xml:space="preserve">grandfather are few, so this comparison is imprecise. Mothers’ paid work</w:t>
-      </w:r>
-      <w:r>
-        <w:t xml:space="preserve"> </w:t>
-      </w:r>
-      <w:r>
-        <w:t xml:space="preserve">is 9.8 minutes higher (CI 4.6 to 15.0) with a grandmother only and 8.1</w:t>
-      </w:r>
-      <w:r>
-        <w:t xml:space="preserve"> </w:t>
-      </w:r>
-      <w:r>
-        <w:t xml:space="preserve">minutes lower (CI -11.9 to -4.4) with both grandparents, so the pooled</w:t>
-      </w:r>
-      <w:r>
-        <w:t xml:space="preserve"> </w:t>
-      </w:r>
-      <w:r>
-        <w:t xml:space="preserve">employment estimate averages associations of different sign. These</w:t>
-      </w:r>
-      <w:r>
-        <w:t xml:space="preserve"> </w:t>
-      </w:r>
-      <w:r>
-        <w:t xml:space="preserve">gradients are consistent with substitution where the older generation</w:t>
-      </w:r>
-      <w:r>
-        <w:t xml:space="preserve"> </w:t>
-      </w:r>
-      <w:r>
-        <w:t xml:space="preserve">has time to give, which a fixed household trait would not obviously</w:t>
-      </w:r>
-      <w:r>
-        <w:t xml:space="preserve"> </w:t>
-      </w:r>
-      <w:r>
-        <w:t xml:space="preserve">predict, but they do not rule out selection.</w:t>
+        <w:t xml:space="preserve">grandfather are a small share of the sample (4.5%), so this comparison</w:t>
+      </w:r>
+      <w:r>
+        <w:t xml:space="preserve"> </w:t>
+      </w:r>
+      <w:r>
+        <w:t xml:space="preserve">is imprecise. Mothers’ paid work is 9.8 minutes higher (CI 4.6 to 15.0)</w:t>
+      </w:r>
+      <w:r>
+        <w:t xml:space="preserve"> </w:t>
+      </w:r>
+      <w:r>
+        <w:t xml:space="preserve">with a grandmother only and 8.1 minutes lower (CI -11.9 to -4.4) with</w:t>
+      </w:r>
+      <w:r>
+        <w:t xml:space="preserve"> </w:t>
+      </w:r>
+      <w:r>
+        <w:t xml:space="preserve">both grandparents, so the pooled employment estimate averages</w:t>
+      </w:r>
+      <w:r>
+        <w:t xml:space="preserve"> </w:t>
+      </w:r>
+      <w:r>
+        <w:t xml:space="preserve">associations of different sign. These gradients do not follow the</w:t>
+      </w:r>
+      <w:r>
+        <w:t xml:space="preserve"> </w:t>
+      </w:r>
+      <w:r>
+        <w:t xml:space="preserve">capacity ordering of the framework uniformly: some fit substitution</w:t>
+      </w:r>
+      <w:r>
+        <w:t xml:space="preserve"> </w:t>
+      </w:r>
+      <w:r>
+        <w:t xml:space="preserve">where the older generation has time to give and others run against it,</w:t>
+      </w:r>
+      <w:r>
+        <w:t xml:space="preserve"> </w:t>
+      </w:r>
+      <w:r>
+        <w:t xml:space="preserve">and grandmother age and employment are themselves tied to the household</w:t>
+      </w:r>
+      <w:r>
+        <w:t xml:space="preserve"> </w:t>
+      </w:r>
+      <w:r>
+        <w:t xml:space="preserve">arrangement, so they do not separate substitution from selection.</w:t>
       </w:r>
     </w:p>
     <w:p>
@@ -9351,19 +9539,37 @@
         <w:t xml:space="preserve"> </w:t>
       </w:r>
       <w:r>
-        <w:t xml:space="preserve">arrangement is held constant. The bias-adjusted coefficient of Oster</w:t>
-      </w:r>
-      <w:r>
-        <w:t xml:space="preserve"> </w:t>
-      </w:r>
-      <w:r>
-        <w:t xml:space="preserve">(2019), which assumes that unobservables are as important as observables</w:t>
-      </w:r>
-      <w:r>
-        <w:t xml:space="preserve"> </w:t>
-      </w:r>
-      <w:r>
-        <w:t xml:space="preserve">and that the maximum attainable</w:t>
+        <w:t xml:space="preserve">arrangement is held constant. Of the ten alternative childcare</w:t>
+      </w:r>
+      <w:r>
+        <w:t xml:space="preserve"> </w:t>
+      </w:r>
+      <w:r>
+        <w:t xml:space="preserve">specifications, six give a negative estimate whose interval excludes</w:t>
+      </w:r>
+      <w:r>
+        <w:t xml:space="preserve"> </w:t>
+      </w:r>
+      <w:r>
+        <w:t xml:space="preserve">zero and one a positive one, so the pooled baseline is closer to zero</w:t>
+      </w:r>
+      <w:r>
+        <w:t xml:space="preserve"> </w:t>
+      </w:r>
+      <w:r>
+        <w:t xml:space="preserve">than most alternatives. The bias-adjusted coefficient of Oster (2019),</w:t>
+      </w:r>
+      <w:r>
+        <w:t xml:space="preserve"> </w:t>
+      </w:r>
+      <w:r>
+        <w:t xml:space="preserve">which assumes that unobservables are as important as observables and</w:t>
+      </w:r>
+      <w:r>
+        <w:t xml:space="preserve"> </w:t>
+      </w:r>
+      <w:r>
+        <w:t xml:space="preserve">that the maximum attainable</w:t>
       </w:r>
       <w:r>
         <w:t xml:space="preserve"> </w:t>
@@ -9386,67 +9592,97 @@
         <w:t xml:space="preserve"> </w:t>
       </w:r>
       <w:r>
-        <w:t xml:space="preserve">is 1.3 times that of the full</w:t>
-      </w:r>
-      <w:r>
-        <w:t xml:space="preserve"> </w:t>
-      </w:r>
-      <w:r>
-        <w:t xml:space="preserve">model, is -2.33 for childcare and -1.00 for employment minutes. The</w:t>
-      </w:r>
-      <w:r>
-        <w:t xml:space="preserve"> </w:t>
-      </w:r>
-      <w:r>
-        <w:t xml:space="preserve">degree of selection on unobservables, relative to observables, that</w:t>
-      </w:r>
-      <w:r>
-        <w:t xml:space="preserve"> </w:t>
-      </w:r>
-      <w:r>
-        <w:t xml:space="preserve">would reduce the coefficient to zero is -8.66 for childcare and -0.69</w:t>
-      </w:r>
-      <w:r>
-        <w:t xml:space="preserve"> </w:t>
-      </w:r>
-      <w:r>
-        <w:t xml:space="preserve">for employment; both values are negative, so only selection on</w:t>
-      </w:r>
-      <w:r>
-        <w:t xml:space="preserve"> </w:t>
-      </w:r>
-      <w:r>
-        <w:t xml:space="preserve">unobservables opposite in direction to selection on observables could</w:t>
-      </w:r>
-      <w:r>
-        <w:t xml:space="preserve"> </w:t>
-      </w:r>
-      <w:r>
-        <w:t xml:space="preserve">reduce the coefficients to zero, and for employment the required degree</w:t>
-      </w:r>
-      <w:r>
-        <w:t xml:space="preserve"> </w:t>
-      </w:r>
-      <w:r>
-        <w:t xml:space="preserve">is below one, so the employment estimate is not robust in this sense.</w:t>
-      </w:r>
-      <w:r>
-        <w:t xml:space="preserve"> </w:t>
-      </w:r>
-      <w:r>
-        <w:t xml:space="preserve">Defining the grandmother as a woman aged 45 or above, the lower limit of</w:t>
-      </w:r>
-      <w:r>
-        <w:t xml:space="preserve"> </w:t>
-      </w:r>
-      <w:r>
-        <w:t xml:space="preserve">the older-generation sample, gives -3.1 minutes (CI -5.5 to -0.6) for</w:t>
-      </w:r>
-      <w:r>
-        <w:t xml:space="preserve"> </w:t>
-      </w:r>
-      <w:r>
-        <w:t xml:space="preserve">childcare and 0.6 minutes (CI -2.8 to 3.9) for employment.</w:t>
+        <w:t xml:space="preserve">is 1.3 times that of the full model,</w:t>
+      </w:r>
+      <w:r>
+        <w:t xml:space="preserve"> </w:t>
+      </w:r>
+      <w:r>
+        <w:t xml:space="preserve">is -2.33 for childcare and -1.00 for employment minutes. The degree of</w:t>
+      </w:r>
+      <w:r>
+        <w:t xml:space="preserve"> </w:t>
+      </w:r>
+      <w:r>
+        <w:t xml:space="preserve">selection on unobservables, relative to observables, that would reduce</w:t>
+      </w:r>
+      <w:r>
+        <w:t xml:space="preserve"> </w:t>
+      </w:r>
+      <w:r>
+        <w:t xml:space="preserve">the coefficient to zero is -8.66 for childcare and -0.69 for employment;</w:t>
+      </w:r>
+      <w:r>
+        <w:t xml:space="preserve"> </w:t>
+      </w:r>
+      <w:r>
+        <w:t xml:space="preserve">both values are negative, so only selection on unobservables opposite in</w:t>
+      </w:r>
+      <w:r>
+        <w:t xml:space="preserve"> </w:t>
+      </w:r>
+      <w:r>
+        <w:t xml:space="preserve">direction to selection on observables could reduce the coefficients to</w:t>
+      </w:r>
+      <w:r>
+        <w:t xml:space="preserve"> </w:t>
+      </w:r>
+      <w:r>
+        <w:t xml:space="preserve">zero, and for employment the required degree is below one, so the</w:t>
+      </w:r>
+      <w:r>
+        <w:t xml:space="preserve"> </w:t>
+      </w:r>
+      <w:r>
+        <w:t xml:space="preserve">employment estimate is not robust in this sense. Defining the</w:t>
+      </w:r>
+      <w:r>
+        <w:t xml:space="preserve"> </w:t>
+      </w:r>
+      <w:r>
+        <w:t xml:space="preserve">grandmother as a woman aged 45 or above, the lower limit of the</w:t>
+      </w:r>
+      <w:r>
+        <w:t xml:space="preserve"> </w:t>
+      </w:r>
+      <w:r>
+        <w:t xml:space="preserve">older-generation sample, gives -3.1 minutes (CI -5.5 to -0.6) for</w:t>
+      </w:r>
+      <w:r>
+        <w:t xml:space="preserve"> </w:t>
+      </w:r>
+      <w:r>
+        <w:t xml:space="preserve">childcare and 0.6 minutes (CI -2.8 to 3.9) for employment minutes. The</w:t>
+      </w:r>
+      <w:r>
+        <w:t xml:space="preserve"> </w:t>
+      </w:r>
+      <w:r>
+        <w:t xml:space="preserve">stricter definition moves the childcare estimate towards the negative</w:t>
+      </w:r>
+      <w:r>
+        <w:t xml:space="preserve"> </w:t>
+      </w:r>
+      <w:r>
+        <w:t xml:space="preserve">alternatives, so the near-zero baseline should not be read as evidence</w:t>
+      </w:r>
+      <w:r>
+        <w:t xml:space="preserve"> </w:t>
+      </w:r>
+      <w:r>
+        <w:t xml:space="preserve">of no substitution; nor does the stricter definition change the</w:t>
+      </w:r>
+      <w:r>
+        <w:t xml:space="preserve"> </w:t>
+      </w:r>
+      <w:r>
+        <w:t xml:space="preserve">conclusion on paid work, whose interval includes zero, as in the</w:t>
+      </w:r>
+      <w:r>
+        <w:t xml:space="preserve"> </w:t>
+      </w:r>
+      <w:r>
+        <w:t xml:space="preserve">baseline.</w:t>
       </w:r>
     </w:p>
     <w:bookmarkStart w:id="37" w:name="_12c2d691ce7d94f18eabedfa7fc910ecf3de0b8"/>
@@ -9455,18 +9691,19 @@
         <w:pStyle w:val="TableCaption"/>
       </w:pPr>
       <w:r>
-        <w:t>Table 8: Robustness: mothers’ primary childcare minutes</w:t>
+        <w:t>Table 8: Robustness: mothers’ primary childcare and paid work</w:t>
       </w:r>
     </w:p>
     <w:tbl>
       <w:tblPr>
         <w:tblStyle w:val="Table"/>
         <w:tblLook w:firstRow="1" w:lastRow="0" w:firstColumn="0" w:lastColumn="0" w:noHBand="0" w:noVBand="0" w:val="0020"/>
-        <w:tblCaption w:val="Robustness: mothers’ primary childcare minutes"/>
+        <w:tblCaption w:val="Robustness: mothers’ primary childcare and paid work"/>
         <w:tblW w:type="pct" w:w="5000"/>
         <w:tblLayout w:type="autofit"/>
       </w:tblPr>
       <w:tblGrid>
+        <w:gridCol/>
         <w:gridCol/>
         <w:gridCol/>
         <w:gridCol/>
@@ -9523,6 +9760,22 @@
             </w:r>
           </w:p>
         </w:tc>
+        <w:tc>
+          <w:tcPr/>
+          <w:p>
+            <w:pPr>
+              <w:pStyle w:val="Compact"/>
+              <w:spacing w:line="240" w:lineRule="auto" w:after="0" w:before="0"/>
+              <w:jc w:val="right"/>
+            </w:pPr>
+            <w:r>
+              <w:rPr>
+                <w:sz w:val="18"/>
+              </w:rPr>
+              <w:t xml:space="preserve">N</w:t>
+            </w:r>
+          </w:p>
+        </w:tc>
       </w:tr>
       <w:tr>
         <w:tc>
@@ -9535,42 +9788,39 @@
             </w:pPr>
             <w:r>
               <w:rPr>
-                <w:sz w:val="18"/>
-              </w:rPr>
-              <w:t xml:space="preserve">Baseline</w:t>
-            </w:r>
-          </w:p>
-        </w:tc>
-        <w:tc>
-          <w:tcPr/>
-          <w:p>
-            <w:pPr>
-              <w:pStyle w:val="Compact"/>
-              <w:spacing w:line="240" w:lineRule="auto" w:after="0" w:before="0"/>
-              <w:jc w:val="right"/>
-            </w:pPr>
-            <w:r>
-              <w:rPr>
-                <w:sz w:val="18"/>
-              </w:rPr>
-              <w:t xml:space="preserve">-2.09</w:t>
-            </w:r>
-          </w:p>
-        </w:tc>
-        <w:tc>
-          <w:tcPr/>
-          <w:p>
-            <w:pPr>
-              <w:pStyle w:val="Compact"/>
-              <w:spacing w:line="240" w:lineRule="auto" w:after="0" w:before="0"/>
-              <w:jc w:val="right"/>
-            </w:pPr>
-            <w:r>
-              <w:rPr>
-                <w:sz w:val="18"/>
-              </w:rPr>
-              <w:t xml:space="preserve">[-4.58, 0.40]</w:t>
-            </w:r>
+                <w:i/>
+                <w:iCs/>
+                <w:sz w:val="18"/>
+              </w:rPr>
+              <w:t xml:space="preserve">A. Mothers’ primary childcare (minutes)</w:t>
+            </w:r>
+          </w:p>
+        </w:tc>
+        <w:tc>
+          <w:tcPr/>
+          <w:p>
+            <w:pPr>
+              <w:pStyle w:val="Compact"/>
+              <w:spacing w:line="240" w:lineRule="auto" w:after="0" w:before="0"/>
+            </w:pPr>
+          </w:p>
+        </w:tc>
+        <w:tc>
+          <w:tcPr/>
+          <w:p>
+            <w:pPr>
+              <w:pStyle w:val="Compact"/>
+              <w:spacing w:line="240" w:lineRule="auto" w:after="0" w:before="0"/>
+            </w:pPr>
+          </w:p>
+        </w:tc>
+        <w:tc>
+          <w:tcPr/>
+          <w:p>
+            <w:pPr>
+              <w:pStyle w:val="Compact"/>
+              <w:spacing w:line="240" w:lineRule="auto" w:after="0" w:before="0"/>
+            </w:pPr>
           </w:p>
         </w:tc>
       </w:tr>
@@ -9587,39 +9837,55 @@
               <w:rPr>
                 <w:sz w:val="18"/>
               </w:rPr>
-              <w:t xml:space="preserve">Only married woman aged 18–49 in the household</w:t>
-            </w:r>
-          </w:p>
-        </w:tc>
-        <w:tc>
-          <w:tcPr/>
-          <w:p>
-            <w:pPr>
-              <w:pStyle w:val="Compact"/>
-              <w:spacing w:line="240" w:lineRule="auto" w:after="0" w:before="0"/>
-              <w:jc w:val="right"/>
-            </w:pPr>
-            <w:r>
-              <w:rPr>
-                <w:sz w:val="18"/>
-              </w:rPr>
-              <w:t xml:space="preserve">-3.18</w:t>
-            </w:r>
-          </w:p>
-        </w:tc>
-        <w:tc>
-          <w:tcPr/>
-          <w:p>
-            <w:pPr>
-              <w:pStyle w:val="Compact"/>
-              <w:spacing w:line="240" w:lineRule="auto" w:after="0" w:before="0"/>
-              <w:jc w:val="right"/>
-            </w:pPr>
-            <w:r>
-              <w:rPr>
-                <w:sz w:val="18"/>
-              </w:rPr>
-              <w:t xml:space="preserve">[-5.84, -0.52]</w:t>
+              <w:t xml:space="preserve">Baseline</w:t>
+            </w:r>
+          </w:p>
+        </w:tc>
+        <w:tc>
+          <w:tcPr/>
+          <w:p>
+            <w:pPr>
+              <w:pStyle w:val="Compact"/>
+              <w:spacing w:line="240" w:lineRule="auto" w:after="0" w:before="0"/>
+              <w:jc w:val="right"/>
+            </w:pPr>
+            <w:r>
+              <w:rPr>
+                <w:sz w:val="18"/>
+              </w:rPr>
+              <w:t xml:space="preserve">-2.09</w:t>
+            </w:r>
+          </w:p>
+        </w:tc>
+        <w:tc>
+          <w:tcPr/>
+          <w:p>
+            <w:pPr>
+              <w:pStyle w:val="Compact"/>
+              <w:spacing w:line="240" w:lineRule="auto" w:after="0" w:before="0"/>
+              <w:jc w:val="right"/>
+            </w:pPr>
+            <w:r>
+              <w:rPr>
+                <w:sz w:val="18"/>
+              </w:rPr>
+              <w:t xml:space="preserve">[-4.58, 0.40]</w:t>
+            </w:r>
+          </w:p>
+        </w:tc>
+        <w:tc>
+          <w:tcPr/>
+          <w:p>
+            <w:pPr>
+              <w:pStyle w:val="Compact"/>
+              <w:spacing w:line="240" w:lineRule="auto" w:after="0" w:before="0"/>
+              <w:jc w:val="right"/>
+            </w:pPr>
+            <w:r>
+              <w:rPr>
+                <w:sz w:val="18"/>
+              </w:rPr>
+              <w:t xml:space="preserve">49,992</w:t>
             </w:r>
           </w:p>
         </w:tc>
@@ -9637,39 +9903,55 @@
               <w:rPr>
                 <w:sz w:val="18"/>
               </w:rPr>
-              <w:t xml:space="preserve">Head-level mothers only (head or spouse of head)</w:t>
-            </w:r>
-          </w:p>
-        </w:tc>
-        <w:tc>
-          <w:tcPr/>
-          <w:p>
-            <w:pPr>
-              <w:pStyle w:val="Compact"/>
-              <w:spacing w:line="240" w:lineRule="auto" w:after="0" w:before="0"/>
-              <w:jc w:val="right"/>
-            </w:pPr>
-            <w:r>
-              <w:rPr>
-                <w:sz w:val="18"/>
-              </w:rPr>
-              <w:t xml:space="preserve">-13.21</w:t>
-            </w:r>
-          </w:p>
-        </w:tc>
-        <w:tc>
-          <w:tcPr/>
-          <w:p>
-            <w:pPr>
-              <w:pStyle w:val="Compact"/>
-              <w:spacing w:line="240" w:lineRule="auto" w:after="0" w:before="0"/>
-              <w:jc w:val="right"/>
-            </w:pPr>
-            <w:r>
-              <w:rPr>
-                <w:sz w:val="18"/>
-              </w:rPr>
-              <w:t xml:space="preserve">[-17.27, -9.15]</w:t>
+              <w:t xml:space="preserve">Only married woman aged 18–49 in the household</w:t>
+            </w:r>
+          </w:p>
+        </w:tc>
+        <w:tc>
+          <w:tcPr/>
+          <w:p>
+            <w:pPr>
+              <w:pStyle w:val="Compact"/>
+              <w:spacing w:line="240" w:lineRule="auto" w:after="0" w:before="0"/>
+              <w:jc w:val="right"/>
+            </w:pPr>
+            <w:r>
+              <w:rPr>
+                <w:sz w:val="18"/>
+              </w:rPr>
+              <w:t xml:space="preserve">-3.18</w:t>
+            </w:r>
+          </w:p>
+        </w:tc>
+        <w:tc>
+          <w:tcPr/>
+          <w:p>
+            <w:pPr>
+              <w:pStyle w:val="Compact"/>
+              <w:spacing w:line="240" w:lineRule="auto" w:after="0" w:before="0"/>
+              <w:jc w:val="right"/>
+            </w:pPr>
+            <w:r>
+              <w:rPr>
+                <w:sz w:val="18"/>
+              </w:rPr>
+              <w:t xml:space="preserve">[-5.84, -0.52]</w:t>
+            </w:r>
+          </w:p>
+        </w:tc>
+        <w:tc>
+          <w:tcPr/>
+          <w:p>
+            <w:pPr>
+              <w:pStyle w:val="Compact"/>
+              <w:spacing w:line="240" w:lineRule="auto" w:after="0" w:before="0"/>
+              <w:jc w:val="right"/>
+            </w:pPr>
+            <w:r>
+              <w:rPr>
+                <w:sz w:val="18"/>
+              </w:rPr>
+              <w:t xml:space="preserve">42,764</w:t>
             </w:r>
           </w:p>
         </w:tc>
@@ -9687,39 +9969,55 @@
               <w:rPr>
                 <w:sz w:val="18"/>
               </w:rPr>
-              <w:t xml:space="preserve">Mothers with a linked husband only</w:t>
-            </w:r>
-          </w:p>
-        </w:tc>
-        <w:tc>
-          <w:tcPr/>
-          <w:p>
-            <w:pPr>
-              <w:pStyle w:val="Compact"/>
-              <w:spacing w:line="240" w:lineRule="auto" w:after="0" w:before="0"/>
-              <w:jc w:val="right"/>
-            </w:pPr>
-            <w:r>
-              <w:rPr>
-                <w:sz w:val="18"/>
-              </w:rPr>
-              <w:t xml:space="preserve">-1.79</w:t>
-            </w:r>
-          </w:p>
-        </w:tc>
-        <w:tc>
-          <w:tcPr/>
-          <w:p>
-            <w:pPr>
-              <w:pStyle w:val="Compact"/>
-              <w:spacing w:line="240" w:lineRule="auto" w:after="0" w:before="0"/>
-              <w:jc w:val="right"/>
-            </w:pPr>
-            <w:r>
-              <w:rPr>
-                <w:sz w:val="18"/>
-              </w:rPr>
-              <w:t xml:space="preserve">[-4.46, 0.88]</w:t>
+              <w:t xml:space="preserve">Head-level mothers only (head or spouse of head)</w:t>
+            </w:r>
+          </w:p>
+        </w:tc>
+        <w:tc>
+          <w:tcPr/>
+          <w:p>
+            <w:pPr>
+              <w:pStyle w:val="Compact"/>
+              <w:spacing w:line="240" w:lineRule="auto" w:after="0" w:before="0"/>
+              <w:jc w:val="right"/>
+            </w:pPr>
+            <w:r>
+              <w:rPr>
+                <w:sz w:val="18"/>
+              </w:rPr>
+              <w:t xml:space="preserve">-13.21</w:t>
+            </w:r>
+          </w:p>
+        </w:tc>
+        <w:tc>
+          <w:tcPr/>
+          <w:p>
+            <w:pPr>
+              <w:pStyle w:val="Compact"/>
+              <w:spacing w:line="240" w:lineRule="auto" w:after="0" w:before="0"/>
+              <w:jc w:val="right"/>
+            </w:pPr>
+            <w:r>
+              <w:rPr>
+                <w:sz w:val="18"/>
+              </w:rPr>
+              <w:t xml:space="preserve">[-17.27, -9.15]</w:t>
+            </w:r>
+          </w:p>
+        </w:tc>
+        <w:tc>
+          <w:tcPr/>
+          <w:p>
+            <w:pPr>
+              <w:pStyle w:val="Compact"/>
+              <w:spacing w:line="240" w:lineRule="auto" w:after="0" w:before="0"/>
+              <w:jc w:val="right"/>
+            </w:pPr>
+            <w:r>
+              <w:rPr>
+                <w:sz w:val="18"/>
+              </w:rPr>
+              <w:t xml:space="preserve">32,742</w:t>
             </w:r>
           </w:p>
         </w:tc>
@@ -9737,39 +10035,55 @@
               <w:rPr>
                 <w:sz w:val="18"/>
               </w:rPr>
-              <w:t xml:space="preserve">Self-reported diaries only</w:t>
-            </w:r>
-          </w:p>
-        </w:tc>
-        <w:tc>
-          <w:tcPr/>
-          <w:p>
-            <w:pPr>
-              <w:pStyle w:val="Compact"/>
-              <w:spacing w:line="240" w:lineRule="auto" w:after="0" w:before="0"/>
-              <w:jc w:val="right"/>
-            </w:pPr>
-            <w:r>
-              <w:rPr>
-                <w:sz w:val="18"/>
-              </w:rPr>
-              <w:t xml:space="preserve">-3.35</w:t>
-            </w:r>
-          </w:p>
-        </w:tc>
-        <w:tc>
-          <w:tcPr/>
-          <w:p>
-            <w:pPr>
-              <w:pStyle w:val="Compact"/>
-              <w:spacing w:line="240" w:lineRule="auto" w:after="0" w:before="0"/>
-              <w:jc w:val="right"/>
-            </w:pPr>
-            <w:r>
-              <w:rPr>
-                <w:sz w:val="18"/>
-              </w:rPr>
-              <w:t xml:space="preserve">[-6.22, -0.47]</w:t>
+              <w:t xml:space="preserve">Mothers with a linked husband only</w:t>
+            </w:r>
+          </w:p>
+        </w:tc>
+        <w:tc>
+          <w:tcPr/>
+          <w:p>
+            <w:pPr>
+              <w:pStyle w:val="Compact"/>
+              <w:spacing w:line="240" w:lineRule="auto" w:after="0" w:before="0"/>
+              <w:jc w:val="right"/>
+            </w:pPr>
+            <w:r>
+              <w:rPr>
+                <w:sz w:val="18"/>
+              </w:rPr>
+              <w:t xml:space="preserve">-1.79</w:t>
+            </w:r>
+          </w:p>
+        </w:tc>
+        <w:tc>
+          <w:tcPr/>
+          <w:p>
+            <w:pPr>
+              <w:pStyle w:val="Compact"/>
+              <w:spacing w:line="240" w:lineRule="auto" w:after="0" w:before="0"/>
+              <w:jc w:val="right"/>
+            </w:pPr>
+            <w:r>
+              <w:rPr>
+                <w:sz w:val="18"/>
+              </w:rPr>
+              <w:t xml:space="preserve">[-4.46, 0.88]</w:t>
+            </w:r>
+          </w:p>
+        </w:tc>
+        <w:tc>
+          <w:tcPr/>
+          <w:p>
+            <w:pPr>
+              <w:pStyle w:val="Compact"/>
+              <w:spacing w:line="240" w:lineRule="auto" w:after="0" w:before="0"/>
+              <w:jc w:val="right"/>
+            </w:pPr>
+            <w:r>
+              <w:rPr>
+                <w:sz w:val="18"/>
+              </w:rPr>
+              <w:t xml:space="preserve">41,447</w:t>
             </w:r>
           </w:p>
         </w:tc>
@@ -9787,39 +10101,55 @@
               <w:rPr>
                 <w:sz w:val="18"/>
               </w:rPr>
-              <w:t xml:space="preserve">Controlling for other women aged 15+</w:t>
-            </w:r>
-          </w:p>
-        </w:tc>
-        <w:tc>
-          <w:tcPr/>
-          <w:p>
-            <w:pPr>
-              <w:pStyle w:val="Compact"/>
-              <w:spacing w:line="240" w:lineRule="auto" w:after="0" w:before="0"/>
-              <w:jc w:val="right"/>
-            </w:pPr>
-            <w:r>
-              <w:rPr>
-                <w:sz w:val="18"/>
-              </w:rPr>
-              <w:t xml:space="preserve">-0.94</w:t>
-            </w:r>
-          </w:p>
-        </w:tc>
-        <w:tc>
-          <w:tcPr/>
-          <w:p>
-            <w:pPr>
-              <w:pStyle w:val="Compact"/>
-              <w:spacing w:line="240" w:lineRule="auto" w:after="0" w:before="0"/>
-              <w:jc w:val="right"/>
-            </w:pPr>
-            <w:r>
-              <w:rPr>
-                <w:sz w:val="18"/>
-              </w:rPr>
-              <w:t xml:space="preserve">[-3.43, 1.56]</w:t>
+              <w:t xml:space="preserve">Self-reported diaries only</w:t>
+            </w:r>
+          </w:p>
+        </w:tc>
+        <w:tc>
+          <w:tcPr/>
+          <w:p>
+            <w:pPr>
+              <w:pStyle w:val="Compact"/>
+              <w:spacing w:line="240" w:lineRule="auto" w:after="0" w:before="0"/>
+              <w:jc w:val="right"/>
+            </w:pPr>
+            <w:r>
+              <w:rPr>
+                <w:sz w:val="18"/>
+              </w:rPr>
+              <w:t xml:space="preserve">-3.35</w:t>
+            </w:r>
+          </w:p>
+        </w:tc>
+        <w:tc>
+          <w:tcPr/>
+          <w:p>
+            <w:pPr>
+              <w:pStyle w:val="Compact"/>
+              <w:spacing w:line="240" w:lineRule="auto" w:after="0" w:before="0"/>
+              <w:jc w:val="right"/>
+            </w:pPr>
+            <w:r>
+              <w:rPr>
+                <w:sz w:val="18"/>
+              </w:rPr>
+              <w:t xml:space="preserve">[-6.22, -0.47]</w:t>
+            </w:r>
+          </w:p>
+        </w:tc>
+        <w:tc>
+          <w:tcPr/>
+          <w:p>
+            <w:pPr>
+              <w:pStyle w:val="Compact"/>
+              <w:spacing w:line="240" w:lineRule="auto" w:after="0" w:before="0"/>
+              <w:jc w:val="right"/>
+            </w:pPr>
+            <w:r>
+              <w:rPr>
+                <w:sz w:val="18"/>
+              </w:rPr>
+              <w:t xml:space="preserve">39,018</w:t>
             </w:r>
           </w:p>
         </w:tc>
@@ -9837,39 +10167,55 @@
               <w:rPr>
                 <w:sz w:val="18"/>
               </w:rPr>
-              <w:t xml:space="preserve">Controlling for household size</w:t>
-            </w:r>
-          </w:p>
-        </w:tc>
-        <w:tc>
-          <w:tcPr/>
-          <w:p>
-            <w:pPr>
-              <w:pStyle w:val="Compact"/>
-              <w:spacing w:line="240" w:lineRule="auto" w:after="0" w:before="0"/>
-              <w:jc w:val="right"/>
-            </w:pPr>
-            <w:r>
-              <w:rPr>
-                <w:sz w:val="18"/>
-              </w:rPr>
-              <w:t xml:space="preserve">8.25</w:t>
-            </w:r>
-          </w:p>
-        </w:tc>
-        <w:tc>
-          <w:tcPr/>
-          <w:p>
-            <w:pPr>
-              <w:pStyle w:val="Compact"/>
-              <w:spacing w:line="240" w:lineRule="auto" w:after="0" w:before="0"/>
-              <w:jc w:val="right"/>
-            </w:pPr>
-            <w:r>
-              <w:rPr>
-                <w:sz w:val="18"/>
-              </w:rPr>
-              <w:t xml:space="preserve">[5.10, 11.39]</w:t>
+              <w:t xml:space="preserve">Controlling for other women aged 15+</w:t>
+            </w:r>
+          </w:p>
+        </w:tc>
+        <w:tc>
+          <w:tcPr/>
+          <w:p>
+            <w:pPr>
+              <w:pStyle w:val="Compact"/>
+              <w:spacing w:line="240" w:lineRule="auto" w:after="0" w:before="0"/>
+              <w:jc w:val="right"/>
+            </w:pPr>
+            <w:r>
+              <w:rPr>
+                <w:sz w:val="18"/>
+              </w:rPr>
+              <w:t xml:space="preserve">-0.94</w:t>
+            </w:r>
+          </w:p>
+        </w:tc>
+        <w:tc>
+          <w:tcPr/>
+          <w:p>
+            <w:pPr>
+              <w:pStyle w:val="Compact"/>
+              <w:spacing w:line="240" w:lineRule="auto" w:after="0" w:before="0"/>
+              <w:jc w:val="right"/>
+            </w:pPr>
+            <w:r>
+              <w:rPr>
+                <w:sz w:val="18"/>
+              </w:rPr>
+              <w:t xml:space="preserve">[-3.43, 1.56]</w:t>
+            </w:r>
+          </w:p>
+        </w:tc>
+        <w:tc>
+          <w:tcPr/>
+          <w:p>
+            <w:pPr>
+              <w:pStyle w:val="Compact"/>
+              <w:spacing w:line="240" w:lineRule="auto" w:after="0" w:before="0"/>
+              <w:jc w:val="right"/>
+            </w:pPr>
+            <w:r>
+              <w:rPr>
+                <w:sz w:val="18"/>
+              </w:rPr>
+              <w:t xml:space="preserve">49,992</w:t>
             </w:r>
           </w:p>
         </w:tc>
@@ -9887,39 +10233,55 @@
               <w:rPr>
                 <w:sz w:val="18"/>
               </w:rPr>
-              <w:t xml:space="preserve">Controlling for mother’s generation (junior)</w:t>
-            </w:r>
-          </w:p>
-        </w:tc>
-        <w:tc>
-          <w:tcPr/>
-          <w:p>
-            <w:pPr>
-              <w:pStyle w:val="Compact"/>
-              <w:spacing w:line="240" w:lineRule="auto" w:after="0" w:before="0"/>
-              <w:jc w:val="right"/>
-            </w:pPr>
-            <w:r>
-              <w:rPr>
-                <w:sz w:val="18"/>
-              </w:rPr>
-              <w:t xml:space="preserve">-6.75</w:t>
-            </w:r>
-          </w:p>
-        </w:tc>
-        <w:tc>
-          <w:tcPr/>
-          <w:p>
-            <w:pPr>
-              <w:pStyle w:val="Compact"/>
-              <w:spacing w:line="240" w:lineRule="auto" w:after="0" w:before="0"/>
-              <w:jc w:val="right"/>
-            </w:pPr>
-            <w:r>
-              <w:rPr>
-                <w:sz w:val="18"/>
-              </w:rPr>
-              <w:t xml:space="preserve">[-9.94, -3.57]</w:t>
+              <w:t xml:space="preserve">Controlling for household size</w:t>
+            </w:r>
+          </w:p>
+        </w:tc>
+        <w:tc>
+          <w:tcPr/>
+          <w:p>
+            <w:pPr>
+              <w:pStyle w:val="Compact"/>
+              <w:spacing w:line="240" w:lineRule="auto" w:after="0" w:before="0"/>
+              <w:jc w:val="right"/>
+            </w:pPr>
+            <w:r>
+              <w:rPr>
+                <w:sz w:val="18"/>
+              </w:rPr>
+              <w:t xml:space="preserve">8.25</w:t>
+            </w:r>
+          </w:p>
+        </w:tc>
+        <w:tc>
+          <w:tcPr/>
+          <w:p>
+            <w:pPr>
+              <w:pStyle w:val="Compact"/>
+              <w:spacing w:line="240" w:lineRule="auto" w:after="0" w:before="0"/>
+              <w:jc w:val="right"/>
+            </w:pPr>
+            <w:r>
+              <w:rPr>
+                <w:sz w:val="18"/>
+              </w:rPr>
+              <w:t xml:space="preserve">[5.10, 11.39]</w:t>
+            </w:r>
+          </w:p>
+        </w:tc>
+        <w:tc>
+          <w:tcPr/>
+          <w:p>
+            <w:pPr>
+              <w:pStyle w:val="Compact"/>
+              <w:spacing w:line="240" w:lineRule="auto" w:after="0" w:before="0"/>
+              <w:jc w:val="right"/>
+            </w:pPr>
+            <w:r>
+              <w:rPr>
+                <w:sz w:val="18"/>
+              </w:rPr>
+              <w:t xml:space="preserve">49,992</w:t>
             </w:r>
           </w:p>
         </w:tc>
@@ -9937,39 +10299,55 @@
               <w:rPr>
                 <w:sz w:val="18"/>
               </w:rPr>
-              <w:t xml:space="preserve">Unweighted</w:t>
-            </w:r>
-          </w:p>
-        </w:tc>
-        <w:tc>
-          <w:tcPr/>
-          <w:p>
-            <w:pPr>
-              <w:pStyle w:val="Compact"/>
-              <w:spacing w:line="240" w:lineRule="auto" w:after="0" w:before="0"/>
-              <w:jc w:val="right"/>
-            </w:pPr>
-            <w:r>
-              <w:rPr>
-                <w:sz w:val="18"/>
-              </w:rPr>
-              <w:t xml:space="preserve">-1.81</w:t>
-            </w:r>
-          </w:p>
-        </w:tc>
-        <w:tc>
-          <w:tcPr/>
-          <w:p>
-            <w:pPr>
-              <w:pStyle w:val="Compact"/>
-              <w:spacing w:line="240" w:lineRule="auto" w:after="0" w:before="0"/>
-              <w:jc w:val="right"/>
-            </w:pPr>
-            <w:r>
-              <w:rPr>
-                <w:sz w:val="18"/>
-              </w:rPr>
-              <w:t xml:space="preserve">[-4.01, 0.39]</w:t>
+              <w:t xml:space="preserve">Controlling for mother’s generation (junior)</w:t>
+            </w:r>
+          </w:p>
+        </w:tc>
+        <w:tc>
+          <w:tcPr/>
+          <w:p>
+            <w:pPr>
+              <w:pStyle w:val="Compact"/>
+              <w:spacing w:line="240" w:lineRule="auto" w:after="0" w:before="0"/>
+              <w:jc w:val="right"/>
+            </w:pPr>
+            <w:r>
+              <w:rPr>
+                <w:sz w:val="18"/>
+              </w:rPr>
+              <w:t xml:space="preserve">-6.75</w:t>
+            </w:r>
+          </w:p>
+        </w:tc>
+        <w:tc>
+          <w:tcPr/>
+          <w:p>
+            <w:pPr>
+              <w:pStyle w:val="Compact"/>
+              <w:spacing w:line="240" w:lineRule="auto" w:after="0" w:before="0"/>
+              <w:jc w:val="right"/>
+            </w:pPr>
+            <w:r>
+              <w:rPr>
+                <w:sz w:val="18"/>
+              </w:rPr>
+              <w:t xml:space="preserve">[-9.94, -3.57]</w:t>
+            </w:r>
+          </w:p>
+        </w:tc>
+        <w:tc>
+          <w:tcPr/>
+          <w:p>
+            <w:pPr>
+              <w:pStyle w:val="Compact"/>
+              <w:spacing w:line="240" w:lineRule="auto" w:after="0" w:before="0"/>
+              <w:jc w:val="right"/>
+            </w:pPr>
+            <w:r>
+              <w:rPr>
+                <w:sz w:val="18"/>
+              </w:rPr>
+              <w:t xml:space="preserve">49,992</w:t>
             </w:r>
           </w:p>
         </w:tc>
@@ -9987,39 +10365,55 @@
               <w:rPr>
                 <w:sz w:val="18"/>
               </w:rPr>
-              <w:t xml:space="preserve">Any grandparent instead of grandmother</w:t>
-            </w:r>
-          </w:p>
-        </w:tc>
-        <w:tc>
-          <w:tcPr/>
-          <w:p>
-            <w:pPr>
-              <w:pStyle w:val="Compact"/>
-              <w:spacing w:line="240" w:lineRule="auto" w:after="0" w:before="0"/>
-              <w:jc w:val="right"/>
-            </w:pPr>
-            <w:r>
-              <w:rPr>
-                <w:sz w:val="18"/>
-              </w:rPr>
-              <w:t xml:space="preserve">-3.26</w:t>
-            </w:r>
-          </w:p>
-        </w:tc>
-        <w:tc>
-          <w:tcPr/>
-          <w:p>
-            <w:pPr>
-              <w:pStyle w:val="Compact"/>
-              <w:spacing w:line="240" w:lineRule="auto" w:after="0" w:before="0"/>
-              <w:jc w:val="right"/>
-            </w:pPr>
-            <w:r>
-              <w:rPr>
-                <w:sz w:val="18"/>
-              </w:rPr>
-              <w:t xml:space="preserve">[-5.73, -0.79]</w:t>
+              <w:t xml:space="preserve">Unweighted</w:t>
+            </w:r>
+          </w:p>
+        </w:tc>
+        <w:tc>
+          <w:tcPr/>
+          <w:p>
+            <w:pPr>
+              <w:pStyle w:val="Compact"/>
+              <w:spacing w:line="240" w:lineRule="auto" w:after="0" w:before="0"/>
+              <w:jc w:val="right"/>
+            </w:pPr>
+            <w:r>
+              <w:rPr>
+                <w:sz w:val="18"/>
+              </w:rPr>
+              <w:t xml:space="preserve">-1.81</w:t>
+            </w:r>
+          </w:p>
+        </w:tc>
+        <w:tc>
+          <w:tcPr/>
+          <w:p>
+            <w:pPr>
+              <w:pStyle w:val="Compact"/>
+              <w:spacing w:line="240" w:lineRule="auto" w:after="0" w:before="0"/>
+              <w:jc w:val="right"/>
+            </w:pPr>
+            <w:r>
+              <w:rPr>
+                <w:sz w:val="18"/>
+              </w:rPr>
+              <w:t xml:space="preserve">[-4.01, 0.39]</w:t>
+            </w:r>
+          </w:p>
+        </w:tc>
+        <w:tc>
+          <w:tcPr/>
+          <w:p>
+            <w:pPr>
+              <w:pStyle w:val="Compact"/>
+              <w:spacing w:line="240" w:lineRule="auto" w:after="0" w:before="0"/>
+              <w:jc w:val="right"/>
+            </w:pPr>
+            <w:r>
+              <w:rPr>
+                <w:sz w:val="18"/>
+              </w:rPr>
+              <w:t xml:space="preserve">49,992</w:t>
             </w:r>
           </w:p>
         </w:tc>
@@ -10037,39 +10431,55 @@
               <w:rPr>
                 <w:sz w:val="18"/>
               </w:rPr>
-              <w:t xml:space="preserve">Grandmother defined as a woman aged 45 or above</w:t>
-            </w:r>
-          </w:p>
-        </w:tc>
-        <w:tc>
-          <w:tcPr/>
-          <w:p>
-            <w:pPr>
-              <w:pStyle w:val="Compact"/>
-              <w:spacing w:line="240" w:lineRule="auto" w:after="0" w:before="0"/>
-              <w:jc w:val="right"/>
-            </w:pPr>
-            <w:r>
-              <w:rPr>
-                <w:sz w:val="18"/>
-              </w:rPr>
-              <w:t xml:space="preserve">-3.08</w:t>
-            </w:r>
-          </w:p>
-        </w:tc>
-        <w:tc>
-          <w:tcPr/>
-          <w:p>
-            <w:pPr>
-              <w:pStyle w:val="Compact"/>
-              <w:spacing w:line="240" w:lineRule="auto" w:after="0" w:before="0"/>
-              <w:jc w:val="right"/>
-            </w:pPr>
-            <w:r>
-              <w:rPr>
-                <w:sz w:val="18"/>
-              </w:rPr>
-              <w:t xml:space="preserve">[-5.54, -0.61]</w:t>
+              <w:t xml:space="preserve">Any grandparent instead of grandmother</w:t>
+            </w:r>
+          </w:p>
+        </w:tc>
+        <w:tc>
+          <w:tcPr/>
+          <w:p>
+            <w:pPr>
+              <w:pStyle w:val="Compact"/>
+              <w:spacing w:line="240" w:lineRule="auto" w:after="0" w:before="0"/>
+              <w:jc w:val="right"/>
+            </w:pPr>
+            <w:r>
+              <w:rPr>
+                <w:sz w:val="18"/>
+              </w:rPr>
+              <w:t xml:space="preserve">-3.26</w:t>
+            </w:r>
+          </w:p>
+        </w:tc>
+        <w:tc>
+          <w:tcPr/>
+          <w:p>
+            <w:pPr>
+              <w:pStyle w:val="Compact"/>
+              <w:spacing w:line="240" w:lineRule="auto" w:after="0" w:before="0"/>
+              <w:jc w:val="right"/>
+            </w:pPr>
+            <w:r>
+              <w:rPr>
+                <w:sz w:val="18"/>
+              </w:rPr>
+              <w:t xml:space="preserve">[-5.73, -0.79]</w:t>
+            </w:r>
+          </w:p>
+        </w:tc>
+        <w:tc>
+          <w:tcPr/>
+          <w:p>
+            <w:pPr>
+              <w:pStyle w:val="Compact"/>
+              <w:spacing w:line="240" w:lineRule="auto" w:after="0" w:before="0"/>
+              <w:jc w:val="right"/>
+            </w:pPr>
+            <w:r>
+              <w:rPr>
+                <w:sz w:val="18"/>
+              </w:rPr>
+              <w:t xml:space="preserve">49,992</w:t>
             </w:r>
           </w:p>
         </w:tc>
@@ -10087,39 +10497,55 @@
               <w:rPr>
                 <w:sz w:val="18"/>
               </w:rPr>
-              <w:t xml:space="preserve">Extensive margin: any primary childcare (share)</w:t>
-            </w:r>
-          </w:p>
-        </w:tc>
-        <w:tc>
-          <w:tcPr/>
-          <w:p>
-            <w:pPr>
-              <w:pStyle w:val="Compact"/>
-              <w:spacing w:line="240" w:lineRule="auto" w:after="0" w:before="0"/>
-              <w:jc w:val="right"/>
-            </w:pPr>
-            <w:r>
-              <w:rPr>
-                <w:sz w:val="18"/>
-              </w:rPr>
-              <w:t xml:space="preserve">-0.018</w:t>
-            </w:r>
-          </w:p>
-        </w:tc>
-        <w:tc>
-          <w:tcPr/>
-          <w:p>
-            <w:pPr>
-              <w:pStyle w:val="Compact"/>
-              <w:spacing w:line="240" w:lineRule="auto" w:after="0" w:before="0"/>
-              <w:jc w:val="right"/>
-            </w:pPr>
-            <w:r>
-              <w:rPr>
-                <w:sz w:val="18"/>
-              </w:rPr>
-              <w:t xml:space="preserve">[-0.025, -0.010]</w:t>
+              <w:t xml:space="preserve">Grandmother defined as a woman aged 45 or above</w:t>
+            </w:r>
+          </w:p>
+        </w:tc>
+        <w:tc>
+          <w:tcPr/>
+          <w:p>
+            <w:pPr>
+              <w:pStyle w:val="Compact"/>
+              <w:spacing w:line="240" w:lineRule="auto" w:after="0" w:before="0"/>
+              <w:jc w:val="right"/>
+            </w:pPr>
+            <w:r>
+              <w:rPr>
+                <w:sz w:val="18"/>
+              </w:rPr>
+              <w:t xml:space="preserve">-3.08</w:t>
+            </w:r>
+          </w:p>
+        </w:tc>
+        <w:tc>
+          <w:tcPr/>
+          <w:p>
+            <w:pPr>
+              <w:pStyle w:val="Compact"/>
+              <w:spacing w:line="240" w:lineRule="auto" w:after="0" w:before="0"/>
+              <w:jc w:val="right"/>
+            </w:pPr>
+            <w:r>
+              <w:rPr>
+                <w:sz w:val="18"/>
+              </w:rPr>
+              <w:t xml:space="preserve">[-5.54, -0.61]</w:t>
+            </w:r>
+          </w:p>
+        </w:tc>
+        <w:tc>
+          <w:tcPr/>
+          <w:p>
+            <w:pPr>
+              <w:pStyle w:val="Compact"/>
+              <w:spacing w:line="240" w:lineRule="auto" w:after="0" w:before="0"/>
+              <w:jc w:val="right"/>
+            </w:pPr>
+            <w:r>
+              <w:rPr>
+                <w:sz w:val="18"/>
+              </w:rPr>
+              <w:t xml:space="preserve">49,992</w:t>
             </w:r>
           </w:p>
         </w:tc>
@@ -10137,33 +10563,56 @@
               <w:rPr>
                 <w:sz w:val="18"/>
               </w:rPr>
-              <w:t xml:space="preserve">Oster bias-adjusted, childcare (delta = 1, Rmax = 1.3 R)</w:t>
-            </w:r>
-          </w:p>
-        </w:tc>
-        <w:tc>
-          <w:tcPr/>
-          <w:p>
-            <w:pPr>
-              <w:pStyle w:val="Compact"/>
-              <w:spacing w:line="240" w:lineRule="auto" w:after="0" w:before="0"/>
-              <w:jc w:val="right"/>
-            </w:pPr>
-            <w:r>
-              <w:rPr>
-                <w:sz w:val="18"/>
-              </w:rPr>
-              <w:t xml:space="preserve">-2.33</w:t>
-            </w:r>
-          </w:p>
-        </w:tc>
-        <w:tc>
-          <w:tcPr/>
-          <w:p>
-            <w:pPr>
-              <w:pStyle w:val="Compact"/>
-              <w:spacing w:line="240" w:lineRule="auto" w:after="0" w:before="0"/>
-            </w:pPr>
+              <w:t xml:space="preserve">Extensive margin: any primary childcare (share)</w:t>
+            </w:r>
+          </w:p>
+        </w:tc>
+        <w:tc>
+          <w:tcPr/>
+          <w:p>
+            <w:pPr>
+              <w:pStyle w:val="Compact"/>
+              <w:spacing w:line="240" w:lineRule="auto" w:after="0" w:before="0"/>
+              <w:jc w:val="right"/>
+            </w:pPr>
+            <w:r>
+              <w:rPr>
+                <w:sz w:val="18"/>
+              </w:rPr>
+              <w:t xml:space="preserve">-0.018</w:t>
+            </w:r>
+          </w:p>
+        </w:tc>
+        <w:tc>
+          <w:tcPr/>
+          <w:p>
+            <w:pPr>
+              <w:pStyle w:val="Compact"/>
+              <w:spacing w:line="240" w:lineRule="auto" w:after="0" w:before="0"/>
+              <w:jc w:val="right"/>
+            </w:pPr>
+            <w:r>
+              <w:rPr>
+                <w:sz w:val="18"/>
+              </w:rPr>
+              <w:t xml:space="preserve">[-0.025, -0.010]</w:t>
+            </w:r>
+          </w:p>
+        </w:tc>
+        <w:tc>
+          <w:tcPr/>
+          <w:p>
+            <w:pPr>
+              <w:pStyle w:val="Compact"/>
+              <w:spacing w:line="240" w:lineRule="auto" w:after="0" w:before="0"/>
+              <w:jc w:val="right"/>
+            </w:pPr>
+            <w:r>
+              <w:rPr>
+                <w:sz w:val="18"/>
+              </w:rPr>
+              <w:t xml:space="preserve">49,992</w:t>
+            </w:r>
           </w:p>
         </w:tc>
       </w:tr>
@@ -10180,33 +10629,49 @@
               <w:rPr>
                 <w:sz w:val="18"/>
               </w:rPr>
-              <w:t xml:space="preserve">Oster bias-adjusted, employment (delta = 1, Rmax = 1.3 R)</w:t>
-            </w:r>
-          </w:p>
-        </w:tc>
-        <w:tc>
-          <w:tcPr/>
-          <w:p>
-            <w:pPr>
-              <w:pStyle w:val="Compact"/>
-              <w:spacing w:line="240" w:lineRule="auto" w:after="0" w:before="0"/>
-              <w:jc w:val="right"/>
-            </w:pPr>
-            <w:r>
-              <w:rPr>
-                <w:sz w:val="18"/>
-              </w:rPr>
-              <w:t xml:space="preserve">-1.00</w:t>
-            </w:r>
-          </w:p>
-        </w:tc>
-        <w:tc>
-          <w:tcPr/>
-          <w:p>
-            <w:pPr>
-              <w:pStyle w:val="Compact"/>
-              <w:spacing w:line="240" w:lineRule="auto" w:after="0" w:before="0"/>
-            </w:pPr>
+              <w:t xml:space="preserve">Oster bias-adjusted, childcare (delta = 1, Rmax = 1.3 R)</w:t>
+            </w:r>
+          </w:p>
+        </w:tc>
+        <w:tc>
+          <w:tcPr/>
+          <w:p>
+            <w:pPr>
+              <w:pStyle w:val="Compact"/>
+              <w:spacing w:line="240" w:lineRule="auto" w:after="0" w:before="0"/>
+              <w:jc w:val="right"/>
+            </w:pPr>
+            <w:r>
+              <w:rPr>
+                <w:sz w:val="18"/>
+              </w:rPr>
+              <w:t xml:space="preserve">-2.33</w:t>
+            </w:r>
+          </w:p>
+        </w:tc>
+        <w:tc>
+          <w:tcPr/>
+          <w:p>
+            <w:pPr>
+              <w:pStyle w:val="Compact"/>
+              <w:spacing w:line="240" w:lineRule="auto" w:after="0" w:before="0"/>
+            </w:pPr>
+          </w:p>
+        </w:tc>
+        <w:tc>
+          <w:tcPr/>
+          <w:p>
+            <w:pPr>
+              <w:pStyle w:val="Compact"/>
+              <w:spacing w:line="240" w:lineRule="auto" w:after="0" w:before="0"/>
+              <w:jc w:val="right"/>
+            </w:pPr>
+            <w:r>
+              <w:rPr>
+                <w:sz w:val="18"/>
+              </w:rPr>
+              <w:t xml:space="preserve">49,992</w:t>
+            </w:r>
           </w:p>
         </w:tc>
       </w:tr>
@@ -10252,6 +10717,22 @@
             </w:pPr>
           </w:p>
         </w:tc>
+        <w:tc>
+          <w:tcPr/>
+          <w:p>
+            <w:pPr>
+              <w:pStyle w:val="Compact"/>
+              <w:spacing w:line="240" w:lineRule="auto" w:after="0" w:before="0"/>
+              <w:jc w:val="right"/>
+            </w:pPr>
+            <w:r>
+              <w:rPr>
+                <w:sz w:val="18"/>
+              </w:rPr>
+              <w:t xml:space="preserve">49,992</w:t>
+            </w:r>
+          </w:p>
+        </w:tc>
       </w:tr>
       <w:tr>
         <w:tc>
@@ -10264,9 +10745,577 @@
             </w:pPr>
             <w:r>
               <w:rPr>
-                <w:sz w:val="18"/>
-              </w:rPr>
-              <w:t xml:space="preserve">Oster delta for a zero coefficient, employment (Rmax = 1.3 R)</w:t>
+                <w:i/>
+                <w:iCs/>
+                <w:sz w:val="18"/>
+              </w:rPr>
+              <w:t xml:space="preserve">B. Mothers’ paid work</w:t>
+            </w:r>
+          </w:p>
+        </w:tc>
+        <w:tc>
+          <w:tcPr/>
+          <w:p>
+            <w:pPr>
+              <w:pStyle w:val="Compact"/>
+              <w:spacing w:line="240" w:lineRule="auto" w:after="0" w:before="0"/>
+            </w:pPr>
+          </w:p>
+        </w:tc>
+        <w:tc>
+          <w:tcPr/>
+          <w:p>
+            <w:pPr>
+              <w:pStyle w:val="Compact"/>
+              <w:spacing w:line="240" w:lineRule="auto" w:after="0" w:before="0"/>
+            </w:pPr>
+          </w:p>
+        </w:tc>
+        <w:tc>
+          <w:tcPr/>
+          <w:p>
+            <w:pPr>
+              <w:pStyle w:val="Compact"/>
+              <w:spacing w:line="240" w:lineRule="auto" w:after="0" w:before="0"/>
+            </w:pPr>
+          </w:p>
+        </w:tc>
+      </w:tr>
+      <w:tr>
+        <w:tc>
+          <w:tcPr/>
+          <w:p>
+            <w:pPr>
+              <w:pStyle w:val="Compact"/>
+              <w:spacing w:line="240" w:lineRule="auto" w:after="0" w:before="0"/>
+              <w:jc w:val="left"/>
+            </w:pPr>
+            <w:r>
+              <w:rPr>
+                <w:sz w:val="18"/>
+              </w:rPr>
+              <w:t xml:space="preserve">Baseline, employment minutes</w:t>
+            </w:r>
+          </w:p>
+        </w:tc>
+        <w:tc>
+          <w:tcPr/>
+          <w:p>
+            <w:pPr>
+              <w:pStyle w:val="Compact"/>
+              <w:spacing w:line="240" w:lineRule="auto" w:after="0" w:before="0"/>
+              <w:jc w:val="right"/>
+            </w:pPr>
+            <w:r>
+              <w:rPr>
+                <w:sz w:val="18"/>
+              </w:rPr>
+              <w:t xml:space="preserve">-0.41</w:t>
+            </w:r>
+          </w:p>
+        </w:tc>
+        <w:tc>
+          <w:tcPr/>
+          <w:p>
+            <w:pPr>
+              <w:pStyle w:val="Compact"/>
+              <w:spacing w:line="240" w:lineRule="auto" w:after="0" w:before="0"/>
+              <w:jc w:val="right"/>
+            </w:pPr>
+            <w:r>
+              <w:rPr>
+                <w:sz w:val="18"/>
+              </w:rPr>
+              <w:t xml:space="preserve">[-3.79, 2.97]</w:t>
+            </w:r>
+          </w:p>
+        </w:tc>
+        <w:tc>
+          <w:tcPr/>
+          <w:p>
+            <w:pPr>
+              <w:pStyle w:val="Compact"/>
+              <w:spacing w:line="240" w:lineRule="auto" w:after="0" w:before="0"/>
+              <w:jc w:val="right"/>
+            </w:pPr>
+            <w:r>
+              <w:rPr>
+                <w:sz w:val="18"/>
+              </w:rPr>
+              <w:t xml:space="preserve">49,992</w:t>
+            </w:r>
+          </w:p>
+        </w:tc>
+      </w:tr>
+      <w:tr>
+        <w:tc>
+          <w:tcPr/>
+          <w:p>
+            <w:pPr>
+              <w:pStyle w:val="Compact"/>
+              <w:spacing w:line="240" w:lineRule="auto" w:after="0" w:before="0"/>
+              <w:jc w:val="left"/>
+            </w:pPr>
+            <w:r>
+              <w:rPr>
+                <w:sz w:val="18"/>
+              </w:rPr>
+              <w:t xml:space="preserve">Employment minutes, controlling for mother’s generation</w:t>
+            </w:r>
+          </w:p>
+        </w:tc>
+        <w:tc>
+          <w:tcPr/>
+          <w:p>
+            <w:pPr>
+              <w:pStyle w:val="Compact"/>
+              <w:spacing w:line="240" w:lineRule="auto" w:after="0" w:before="0"/>
+              <w:jc w:val="right"/>
+            </w:pPr>
+            <w:r>
+              <w:rPr>
+                <w:sz w:val="18"/>
+              </w:rPr>
+              <w:t xml:space="preserve">10.52</w:t>
+            </w:r>
+          </w:p>
+        </w:tc>
+        <w:tc>
+          <w:tcPr/>
+          <w:p>
+            <w:pPr>
+              <w:pStyle w:val="Compact"/>
+              <w:spacing w:line="240" w:lineRule="auto" w:after="0" w:before="0"/>
+              <w:jc w:val="right"/>
+            </w:pPr>
+            <w:r>
+              <w:rPr>
+                <w:sz w:val="18"/>
+              </w:rPr>
+              <w:t xml:space="preserve">[5.52, 15.51]</w:t>
+            </w:r>
+          </w:p>
+        </w:tc>
+        <w:tc>
+          <w:tcPr/>
+          <w:p>
+            <w:pPr>
+              <w:pStyle w:val="Compact"/>
+              <w:spacing w:line="240" w:lineRule="auto" w:after="0" w:before="0"/>
+              <w:jc w:val="right"/>
+            </w:pPr>
+            <w:r>
+              <w:rPr>
+                <w:sz w:val="18"/>
+              </w:rPr>
+              <w:t xml:space="preserve">49,992</w:t>
+            </w:r>
+          </w:p>
+        </w:tc>
+      </w:tr>
+      <w:tr>
+        <w:tc>
+          <w:tcPr/>
+          <w:p>
+            <w:pPr>
+              <w:pStyle w:val="Compact"/>
+              <w:spacing w:line="240" w:lineRule="auto" w:after="0" w:before="0"/>
+              <w:jc w:val="left"/>
+            </w:pPr>
+            <w:r>
+              <w:rPr>
+                <w:sz w:val="18"/>
+              </w:rPr>
+              <w:t xml:space="preserve">Employment minutes, controlling for generation and household size</w:t>
+            </w:r>
+          </w:p>
+        </w:tc>
+        <w:tc>
+          <w:tcPr/>
+          <w:p>
+            <w:pPr>
+              <w:pStyle w:val="Compact"/>
+              <w:spacing w:line="240" w:lineRule="auto" w:after="0" w:before="0"/>
+              <w:jc w:val="right"/>
+            </w:pPr>
+            <w:r>
+              <w:rPr>
+                <w:sz w:val="18"/>
+              </w:rPr>
+              <w:t xml:space="preserve">9.17</w:t>
+            </w:r>
+          </w:p>
+        </w:tc>
+        <w:tc>
+          <w:tcPr/>
+          <w:p>
+            <w:pPr>
+              <w:pStyle w:val="Compact"/>
+              <w:spacing w:line="240" w:lineRule="auto" w:after="0" w:before="0"/>
+              <w:jc w:val="right"/>
+            </w:pPr>
+            <w:r>
+              <w:rPr>
+                <w:sz w:val="18"/>
+              </w:rPr>
+              <w:t xml:space="preserve">[3.60, 14.74]</w:t>
+            </w:r>
+          </w:p>
+        </w:tc>
+        <w:tc>
+          <w:tcPr/>
+          <w:p>
+            <w:pPr>
+              <w:pStyle w:val="Compact"/>
+              <w:spacing w:line="240" w:lineRule="auto" w:after="0" w:before="0"/>
+              <w:jc w:val="right"/>
+            </w:pPr>
+            <w:r>
+              <w:rPr>
+                <w:sz w:val="18"/>
+              </w:rPr>
+              <w:t xml:space="preserve">49,992</w:t>
+            </w:r>
+          </w:p>
+        </w:tc>
+      </w:tr>
+      <w:tr>
+        <w:tc>
+          <w:tcPr/>
+          <w:p>
+            <w:pPr>
+              <w:pStyle w:val="Compact"/>
+              <w:spacing w:line="240" w:lineRule="auto" w:after="0" w:before="0"/>
+              <w:jc w:val="left"/>
+            </w:pPr>
+            <w:r>
+              <w:rPr>
+                <w:sz w:val="18"/>
+              </w:rPr>
+              <w:t xml:space="preserve">Employment minutes, grandmother aged 45 or above</w:t>
+            </w:r>
+          </w:p>
+        </w:tc>
+        <w:tc>
+          <w:tcPr/>
+          <w:p>
+            <w:pPr>
+              <w:pStyle w:val="Compact"/>
+              <w:spacing w:line="240" w:lineRule="auto" w:after="0" w:before="0"/>
+              <w:jc w:val="right"/>
+            </w:pPr>
+            <w:r>
+              <w:rPr>
+                <w:sz w:val="18"/>
+              </w:rPr>
+              <w:t xml:space="preserve">0.56</w:t>
+            </w:r>
+          </w:p>
+        </w:tc>
+        <w:tc>
+          <w:tcPr/>
+          <w:p>
+            <w:pPr>
+              <w:pStyle w:val="Compact"/>
+              <w:spacing w:line="240" w:lineRule="auto" w:after="0" w:before="0"/>
+              <w:jc w:val="right"/>
+            </w:pPr>
+            <w:r>
+              <w:rPr>
+                <w:sz w:val="18"/>
+              </w:rPr>
+              <w:t xml:space="preserve">[-2.78, 3.90]</w:t>
+            </w:r>
+          </w:p>
+        </w:tc>
+        <w:tc>
+          <w:tcPr/>
+          <w:p>
+            <w:pPr>
+              <w:pStyle w:val="Compact"/>
+              <w:spacing w:line="240" w:lineRule="auto" w:after="0" w:before="0"/>
+              <w:jc w:val="right"/>
+            </w:pPr>
+            <w:r>
+              <w:rPr>
+                <w:sz w:val="18"/>
+              </w:rPr>
+              <w:t xml:space="preserve">49,992</w:t>
+            </w:r>
+          </w:p>
+        </w:tc>
+      </w:tr>
+      <w:tr>
+        <w:tc>
+          <w:tcPr/>
+          <w:p>
+            <w:pPr>
+              <w:pStyle w:val="Compact"/>
+              <w:spacing w:line="240" w:lineRule="auto" w:after="0" w:before="0"/>
+              <w:jc w:val="left"/>
+            </w:pPr>
+            <w:r>
+              <w:rPr>
+                <w:sz w:val="18"/>
+              </w:rPr>
+              <w:t xml:space="preserve">Baseline, employed (usual status, share)</w:t>
+            </w:r>
+          </w:p>
+        </w:tc>
+        <w:tc>
+          <w:tcPr/>
+          <w:p>
+            <w:pPr>
+              <w:pStyle w:val="Compact"/>
+              <w:spacing w:line="240" w:lineRule="auto" w:after="0" w:before="0"/>
+              <w:jc w:val="right"/>
+            </w:pPr>
+            <w:r>
+              <w:rPr>
+                <w:sz w:val="18"/>
+              </w:rPr>
+              <w:t xml:space="preserve">-0.014</w:t>
+            </w:r>
+          </w:p>
+        </w:tc>
+        <w:tc>
+          <w:tcPr/>
+          <w:p>
+            <w:pPr>
+              <w:pStyle w:val="Compact"/>
+              <w:spacing w:line="240" w:lineRule="auto" w:after="0" w:before="0"/>
+              <w:jc w:val="right"/>
+            </w:pPr>
+            <w:r>
+              <w:rPr>
+                <w:sz w:val="18"/>
+              </w:rPr>
+              <w:t xml:space="preserve">[-0.023, -0.004]</w:t>
+            </w:r>
+          </w:p>
+        </w:tc>
+        <w:tc>
+          <w:tcPr/>
+          <w:p>
+            <w:pPr>
+              <w:pStyle w:val="Compact"/>
+              <w:spacing w:line="240" w:lineRule="auto" w:after="0" w:before="0"/>
+              <w:jc w:val="right"/>
+            </w:pPr>
+            <w:r>
+              <w:rPr>
+                <w:sz w:val="18"/>
+              </w:rPr>
+              <w:t xml:space="preserve">49,992</w:t>
+            </w:r>
+          </w:p>
+        </w:tc>
+      </w:tr>
+      <w:tr>
+        <w:tc>
+          <w:tcPr/>
+          <w:p>
+            <w:pPr>
+              <w:pStyle w:val="Compact"/>
+              <w:spacing w:line="240" w:lineRule="auto" w:after="0" w:before="0"/>
+              <w:jc w:val="left"/>
+            </w:pPr>
+            <w:r>
+              <w:rPr>
+                <w:sz w:val="18"/>
+              </w:rPr>
+              <w:t xml:space="preserve">Employed (share), controlling for mother’s generation</w:t>
+            </w:r>
+          </w:p>
+        </w:tc>
+        <w:tc>
+          <w:tcPr/>
+          <w:p>
+            <w:pPr>
+              <w:pStyle w:val="Compact"/>
+              <w:spacing w:line="240" w:lineRule="auto" w:after="0" w:before="0"/>
+              <w:jc w:val="right"/>
+            </w:pPr>
+            <w:r>
+              <w:rPr>
+                <w:sz w:val="18"/>
+              </w:rPr>
+              <w:t xml:space="preserve">0.022</w:t>
+            </w:r>
+          </w:p>
+        </w:tc>
+        <w:tc>
+          <w:tcPr/>
+          <w:p>
+            <w:pPr>
+              <w:pStyle w:val="Compact"/>
+              <w:spacing w:line="240" w:lineRule="auto" w:after="0" w:before="0"/>
+              <w:jc w:val="right"/>
+            </w:pPr>
+            <w:r>
+              <w:rPr>
+                <w:sz w:val="18"/>
+              </w:rPr>
+              <w:t xml:space="preserve">[0.008, 0.035]</w:t>
+            </w:r>
+          </w:p>
+        </w:tc>
+        <w:tc>
+          <w:tcPr/>
+          <w:p>
+            <w:pPr>
+              <w:pStyle w:val="Compact"/>
+              <w:spacing w:line="240" w:lineRule="auto" w:after="0" w:before="0"/>
+              <w:jc w:val="right"/>
+            </w:pPr>
+            <w:r>
+              <w:rPr>
+                <w:sz w:val="18"/>
+              </w:rPr>
+              <w:t xml:space="preserve">49,992</w:t>
+            </w:r>
+          </w:p>
+        </w:tc>
+      </w:tr>
+      <w:tr>
+        <w:tc>
+          <w:tcPr/>
+          <w:p>
+            <w:pPr>
+              <w:pStyle w:val="Compact"/>
+              <w:spacing w:line="240" w:lineRule="auto" w:after="0" w:before="0"/>
+              <w:jc w:val="left"/>
+            </w:pPr>
+            <w:r>
+              <w:rPr>
+                <w:sz w:val="18"/>
+              </w:rPr>
+              <w:t xml:space="preserve">Employed (share), controlling for generation and household size</w:t>
+            </w:r>
+          </w:p>
+        </w:tc>
+        <w:tc>
+          <w:tcPr/>
+          <w:p>
+            <w:pPr>
+              <w:pStyle w:val="Compact"/>
+              <w:spacing w:line="240" w:lineRule="auto" w:after="0" w:before="0"/>
+              <w:jc w:val="right"/>
+            </w:pPr>
+            <w:r>
+              <w:rPr>
+                <w:sz w:val="18"/>
+              </w:rPr>
+              <w:t xml:space="preserve">0.022</w:t>
+            </w:r>
+          </w:p>
+        </w:tc>
+        <w:tc>
+          <w:tcPr/>
+          <w:p>
+            <w:pPr>
+              <w:pStyle w:val="Compact"/>
+              <w:spacing w:line="240" w:lineRule="auto" w:after="0" w:before="0"/>
+              <w:jc w:val="right"/>
+            </w:pPr>
+            <w:r>
+              <w:rPr>
+                <w:sz w:val="18"/>
+              </w:rPr>
+              <w:t xml:space="preserve">[0.007, 0.037]</w:t>
+            </w:r>
+          </w:p>
+        </w:tc>
+        <w:tc>
+          <w:tcPr/>
+          <w:p>
+            <w:pPr>
+              <w:pStyle w:val="Compact"/>
+              <w:spacing w:line="240" w:lineRule="auto" w:after="0" w:before="0"/>
+              <w:jc w:val="right"/>
+            </w:pPr>
+            <w:r>
+              <w:rPr>
+                <w:sz w:val="18"/>
+              </w:rPr>
+              <w:t xml:space="preserve">49,992</w:t>
+            </w:r>
+          </w:p>
+        </w:tc>
+      </w:tr>
+      <w:tr>
+        <w:tc>
+          <w:tcPr/>
+          <w:p>
+            <w:pPr>
+              <w:pStyle w:val="Compact"/>
+              <w:spacing w:line="240" w:lineRule="auto" w:after="0" w:before="0"/>
+              <w:jc w:val="left"/>
+            </w:pPr>
+            <w:r>
+              <w:rPr>
+                <w:sz w:val="18"/>
+              </w:rPr>
+              <w:t xml:space="preserve">Oster bias-adjusted, employment minutes (delta = 1, Rmax = 1.3 R)</w:t>
+            </w:r>
+          </w:p>
+        </w:tc>
+        <w:tc>
+          <w:tcPr/>
+          <w:p>
+            <w:pPr>
+              <w:pStyle w:val="Compact"/>
+              <w:spacing w:line="240" w:lineRule="auto" w:after="0" w:before="0"/>
+              <w:jc w:val="right"/>
+            </w:pPr>
+            <w:r>
+              <w:rPr>
+                <w:sz w:val="18"/>
+              </w:rPr>
+              <w:t xml:space="preserve">-1.00</w:t>
+            </w:r>
+          </w:p>
+        </w:tc>
+        <w:tc>
+          <w:tcPr/>
+          <w:p>
+            <w:pPr>
+              <w:pStyle w:val="Compact"/>
+              <w:spacing w:line="240" w:lineRule="auto" w:after="0" w:before="0"/>
+            </w:pPr>
+          </w:p>
+        </w:tc>
+        <w:tc>
+          <w:tcPr/>
+          <w:p>
+            <w:pPr>
+              <w:pStyle w:val="Compact"/>
+              <w:spacing w:line="240" w:lineRule="auto" w:after="0" w:before="0"/>
+              <w:jc w:val="right"/>
+            </w:pPr>
+            <w:r>
+              <w:rPr>
+                <w:sz w:val="18"/>
+              </w:rPr>
+              <w:t xml:space="preserve">49,992</w:t>
+            </w:r>
+          </w:p>
+        </w:tc>
+      </w:tr>
+      <w:tr>
+        <w:tc>
+          <w:tcPr/>
+          <w:p>
+            <w:pPr>
+              <w:pStyle w:val="Compact"/>
+              <w:spacing w:line="240" w:lineRule="auto" w:after="0" w:before="0"/>
+              <w:jc w:val="left"/>
+            </w:pPr>
+            <w:r>
+              <w:rPr>
+                <w:sz w:val="18"/>
+              </w:rPr>
+              <w:t xml:space="preserve">Oster delta for a zero coefficient, employment minutes (Rmax = 1.3 R)</w:t>
             </w:r>
           </w:p>
         </w:tc>
@@ -10293,6 +11342,22 @@
               <w:pStyle w:val="Compact"/>
               <w:spacing w:line="240" w:lineRule="auto" w:after="0" w:before="0"/>
             </w:pPr>
+          </w:p>
+        </w:tc>
+        <w:tc>
+          <w:tcPr/>
+          <w:p>
+            <w:pPr>
+              <w:pStyle w:val="Compact"/>
+              <w:spacing w:line="240" w:lineRule="auto" w:after="0" w:before="0"/>
+              <w:jc w:val="right"/>
+            </w:pPr>
+            <w:r>
+              <w:rPr>
+                <w:sz w:val="18"/>
+              </w:rPr>
+              <w:t xml:space="preserve">49,992</w:t>
+            </w:r>
           </w:p>
         </w:tc>
       </w:tr>
@@ -10313,7 +11378,7 @@
         <w:t xml:space="preserve"> </w:t>
       </w:r>
       <w:r>
-        <w:t xml:space="preserve">Coefficient on the grandmother indicator (or any grandparent) in the main specification, unless stated. The extensive-margin row is a linear probability model. The Oster rows use the short regression without controls or fixed effects on the same sample; the bias-adjusted estimate sets delta = 1, and the delta rows give the relative degree of selection on unobservables that would make the coefficient zero. The age-45 row requires the grandmother of a junior-level mother to be aged 45 or above instead of 40.</w:t>
+        <w:t xml:space="preserve">Coefficient on the grandmother indicator (or any grandparent) in the main specification, unless stated. N is the number of mothers in each regression. The extensive-margin row is a linear probability model. The Oster rows use the short regression without controls or fixed effects on the same sample; the bias-adjusted estimate sets delta = 1, and the delta rows give the relative degree of selection on unobservables that would make the coefficient zero. The age-45 rows require the grandmother of a junior-level mother to be aged 45 or above instead of 40. The generation control is an indicator for a junior-level mother.</w:t>
       </w:r>
     </w:p>
     <w:p>
@@ -10478,37 +11543,31 @@
         <w:t xml:space="preserve"> </w:t>
       </w:r>
       <w:r>
-        <w:t xml:space="preserve">not fall. Grandmothering in this setting is associated with a</w:t>
-      </w:r>
-      <w:r>
-        <w:t xml:space="preserve"> </w:t>
-      </w:r>
-      <w:r>
-        <w:t xml:space="preserve">substantial transfer of time from older women, whose cost falls on their</w:t>
-      </w:r>
-      <w:r>
-        <w:t xml:space="preserve"> </w:t>
-      </w:r>
-      <w:r>
-        <w:t xml:space="preserve">free time and sleep, while their lower domestic work may reflect tasks</w:t>
-      </w:r>
-      <w:r>
-        <w:t xml:space="preserve"> </w:t>
-      </w:r>
-      <w:r>
-        <w:t xml:space="preserve">shifted to mothers. Children in three-generation households also receive</w:t>
-      </w:r>
-      <w:r>
-        <w:t xml:space="preserve"> </w:t>
-      </w:r>
-      <w:r>
-        <w:t xml:space="preserve">more adult care in total, so the grandmother’s care adds to what</w:t>
-      </w:r>
-      <w:r>
-        <w:t xml:space="preserve"> </w:t>
-      </w:r>
-      <w:r>
-        <w:t xml:space="preserve">children receive.</w:t>
+        <w:t xml:space="preserve">not fall. Grandmothering in this setting is associated with</w:t>
+      </w:r>
+      <w:r>
+        <w:t xml:space="preserve"> </w:t>
+      </w:r>
+      <w:r>
+        <w:t xml:space="preserve">substantially more childcare time by older women, together with less</w:t>
+      </w:r>
+      <w:r>
+        <w:t xml:space="preserve"> </w:t>
+      </w:r>
+      <w:r>
+        <w:t xml:space="preserve">free time and sleep. Recorded adult childcare in three-generation</w:t>
+      </w:r>
+      <w:r>
+        <w:t xml:space="preserve"> </w:t>
+      </w:r>
+      <w:r>
+        <w:t xml:space="preserve">households is also higher in total, although part of this may reflect</w:t>
+      </w:r>
+      <w:r>
+        <w:t xml:space="preserve"> </w:t>
+      </w:r>
+      <w:r>
+        <w:t xml:space="preserve">simultaneous or shared recording.</w:t>
       </w:r>
     </w:p>
     <w:p>
@@ -10582,55 +11641,61 @@
         <w:t xml:space="preserve"> </w:t>
       </w:r>
       <w:r>
-        <w:t xml:space="preserve">so any childcare time released is absorbed, which fits the higher time</w:t>
-      </w:r>
-      <w:r>
-        <w:t xml:space="preserve"> </w:t>
-      </w:r>
-      <w:r>
-        <w:t xml:space="preserve">on food and meals. The third is selection: mothers who choose, or are</w:t>
-      </w:r>
-      <w:r>
-        <w:t xml:space="preserve"> </w:t>
-      </w:r>
-      <w:r>
-        <w:t xml:space="preserve">placed in, three-generation households differ in ways that also shape</w:t>
-      </w:r>
-      <w:r>
-        <w:t xml:space="preserve"> </w:t>
-      </w:r>
-      <w:r>
-        <w:t xml:space="preserve">their time. Gradients by the grandmother’s characteristics are harder to</w:t>
-      </w:r>
-      <w:r>
-        <w:t xml:space="preserve"> </w:t>
-      </w:r>
-      <w:r>
-        <w:t xml:space="preserve">attribute to fixed household traits, but selection remains open: the</w:t>
-      </w:r>
-      <w:r>
-        <w:t xml:space="preserve"> </w:t>
-      </w:r>
-      <w:r>
-        <w:t xml:space="preserve">pooled estimate is sensitive to the specification, and the placebo for</w:t>
-      </w:r>
-      <w:r>
-        <w:t xml:space="preserve"> </w:t>
-      </w:r>
-      <w:r>
-        <w:t xml:space="preserve">domestic work is not clean. Fathers’ childcare is also lower with a</w:t>
-      </w:r>
-      <w:r>
-        <w:t xml:space="preserve"> </w:t>
-      </w:r>
-      <w:r>
-        <w:t xml:space="preserve">grandmother present, so part of grandmothers’ care appears to replace</w:t>
-      </w:r>
-      <w:r>
-        <w:t xml:space="preserve"> </w:t>
-      </w:r>
-      <w:r>
-        <w:t xml:space="preserve">fathers’ contribution rather than mothers’.</w:t>
+        <w:t xml:space="preserve">so any childcare time released is absorbed; mothers’ time on food and</w:t>
+      </w:r>
+      <w:r>
+        <w:t xml:space="preserve"> </w:t>
+      </w:r>
+      <w:r>
+        <w:t xml:space="preserve">meals is higher, but their total domestic work is not, so the diaries</w:t>
+      </w:r>
+      <w:r>
+        <w:t xml:space="preserve"> </w:t>
+      </w:r>
+      <w:r>
+        <w:t xml:space="preserve">give this reading little direct support. The third is selection: mothers</w:t>
+      </w:r>
+      <w:r>
+        <w:t xml:space="preserve"> </w:t>
+      </w:r>
+      <w:r>
+        <w:t xml:space="preserve">who choose, or are placed in, three-generation households differ in ways</w:t>
+      </w:r>
+      <w:r>
+        <w:t xml:space="preserve"> </w:t>
+      </w:r>
+      <w:r>
+        <w:t xml:space="preserve">that also shape their time. Gradients by the grandmother’s</w:t>
+      </w:r>
+      <w:r>
+        <w:t xml:space="preserve"> </w:t>
+      </w:r>
+      <w:r>
+        <w:t xml:space="preserve">characteristics are harder to attribute to fixed household traits, but</w:t>
+      </w:r>
+      <w:r>
+        <w:t xml:space="preserve"> </w:t>
+      </w:r>
+      <w:r>
+        <w:t xml:space="preserve">selection remains open: the pooled estimate is sensitive to the</w:t>
+      </w:r>
+      <w:r>
+        <w:t xml:space="preserve"> </w:t>
+      </w:r>
+      <w:r>
+        <w:t xml:space="preserve">specification, and the placebo for domestic work is not clean. Fathers’</w:t>
+      </w:r>
+      <w:r>
+        <w:t xml:space="preserve"> </w:t>
+      </w:r>
+      <w:r>
+        <w:t xml:space="preserve">childcare is also lower with a grandmother present, among mothers with a</w:t>
+      </w:r>
+      <w:r>
+        <w:t xml:space="preserve"> </w:t>
+      </w:r>
+      <w:r>
+        <w:t xml:space="preserve">linked husband as well as overall.</w:t>
       </w:r>
     </w:p>
     <w:p>
@@ -10668,67 +11733,85 @@
         <w:t xml:space="preserve"> </w:t>
       </w:r>
       <w:r>
-        <w:t xml:space="preserve">1.4 percentage points lower), although grandmothers provide 37% of the</w:t>
-      </w:r>
-      <w:r>
-        <w:t xml:space="preserve"> </w:t>
-      </w:r>
-      <w:r>
-        <w:t xml:space="preserve">combined childcare of the two women, and the subgroup estimates for paid</w:t>
-      </w:r>
-      <w:r>
-        <w:t xml:space="preserve"> </w:t>
-      </w:r>
-      <w:r>
-        <w:t xml:space="preserve">work differ in sign. The contrast is consistent with the view that the</w:t>
-      </w:r>
-      <w:r>
-        <w:t xml:space="preserve"> </w:t>
-      </w:r>
-      <w:r>
-        <w:t xml:space="preserve">binding constraint on young Indian mothers’ employment is not, or not</w:t>
-      </w:r>
-      <w:r>
-        <w:t xml:space="preserve"> </w:t>
-      </w:r>
-      <w:r>
-        <w:t xml:space="preserve">only, the availability of childcare, and with the evidence that</w:t>
-      </w:r>
-      <w:r>
-        <w:t xml:space="preserve"> </w:t>
-      </w:r>
-      <w:r>
-        <w:t xml:space="preserve">household structure and norms restrict married women’s work in India</w:t>
-      </w:r>
-      <w:r>
-        <w:t xml:space="preserve"> </w:t>
-      </w:r>
-      <w:r>
-        <w:t xml:space="preserve">(Dhanaraj and Mahambare 2019; Anukriti et al. 2020; Jayachandran 2021),</w:t>
-      </w:r>
-      <w:r>
-        <w:t xml:space="preserve"> </w:t>
-      </w:r>
-      <w:r>
-        <w:t xml:space="preserve">although these data cannot establish it. The Norwegian finding that</w:t>
-      </w:r>
-      <w:r>
-        <w:t xml:space="preserve"> </w:t>
-      </w:r>
-      <w:r>
-        <w:t xml:space="preserve">formal childcare mainly crowded out informal care (Havnes and Mogstad</w:t>
-      </w:r>
-      <w:r>
-        <w:t xml:space="preserve"> </w:t>
-      </w:r>
-      <w:r>
-        <w:t xml:space="preserve">2011) is a useful parallel: when one form of care replaces another, the</w:t>
-      </w:r>
-      <w:r>
-        <w:t xml:space="preserve"> </w:t>
-      </w:r>
-      <w:r>
-        <w:t xml:space="preserve">effect on mothers’ work depends on what else constrains it.</w:t>
+        <w:t xml:space="preserve">1.4 percentage points lower), even though grandmothers provide 37% of</w:t>
+      </w:r>
+      <w:r>
+        <w:t xml:space="preserve"> </w:t>
+      </w:r>
+      <w:r>
+        <w:t xml:space="preserve">the combined childcare of the two women. Within the mother’s household</w:t>
+      </w:r>
+      <w:r>
+        <w:t xml:space="preserve"> </w:t>
+      </w:r>
+      <w:r>
+        <w:t xml:space="preserve">generation, however, the employment rate is 2.2 percentage points higher</w:t>
+      </w:r>
+      <w:r>
+        <w:t xml:space="preserve"> </w:t>
+      </w:r>
+      <w:r>
+        <w:t xml:space="preserve">(CI 0.8 to 3.5), so the Indian estimates are not clearly at odds with</w:t>
+      </w:r>
+      <w:r>
+        <w:t xml:space="preserve"> </w:t>
+      </w:r>
+      <w:r>
+        <w:t xml:space="preserve">those studies: one difference is that grandmothers here live mainly in</w:t>
+      </w:r>
+      <w:r>
+        <w:t xml:space="preserve"> </w:t>
+      </w:r>
+      <w:r>
+        <w:t xml:space="preserve">junior-level households, where mothers’ employment is low, although the</w:t>
+      </w:r>
+      <w:r>
+        <w:t xml:space="preserve"> </w:t>
+      </w:r>
+      <w:r>
+        <w:t xml:space="preserve">within-generation estimate varies across subgroups and the Oster bounds</w:t>
+      </w:r>
+      <w:r>
+        <w:t xml:space="preserve"> </w:t>
+      </w:r>
+      <w:r>
+        <w:t xml:space="preserve">for employment are weak. Whether household norms in such households</w:t>
+      </w:r>
+      <w:r>
+        <w:t xml:space="preserve"> </w:t>
+      </w:r>
+      <w:r>
+        <w:t xml:space="preserve">restrict married women’s work (Dhanaraj and Mahambare 2019; Anukriti et</w:t>
+      </w:r>
+      <w:r>
+        <w:t xml:space="preserve"> </w:t>
+      </w:r>
+      <w:r>
+        <w:t xml:space="preserve">al. 2020; Jayachandran 2021) cannot be established with these data. The</w:t>
+      </w:r>
+      <w:r>
+        <w:t xml:space="preserve"> </w:t>
+      </w:r>
+      <w:r>
+        <w:t xml:space="preserve">Norwegian finding that formal childcare mainly crowded out informal care</w:t>
+      </w:r>
+      <w:r>
+        <w:t xml:space="preserve"> </w:t>
+      </w:r>
+      <w:r>
+        <w:t xml:space="preserve">(Havnes and Mogstad 2011) is a useful parallel: when one form of care</w:t>
+      </w:r>
+      <w:r>
+        <w:t xml:space="preserve"> </w:t>
+      </w:r>
+      <w:r>
+        <w:t xml:space="preserve">replaces another, the effect on mothers’ work depends on what else</w:t>
+      </w:r>
+      <w:r>
+        <w:t xml:space="preserve"> </w:t>
+      </w:r>
+      <w:r>
+        <w:t xml:space="preserve">constrains it.</w:t>
       </w:r>
     </w:p>
     <w:p>
@@ -10773,25 +11856,25 @@
         <w:t xml:space="preserve"> </w:t>
       </w:r>
       <w:r>
-        <w:t xml:space="preserve">care is not free: it is provided by older women who report less free</w:t>
-      </w:r>
-      <w:r>
-        <w:t xml:space="preserve"> </w:t>
-      </w:r>
-      <w:r>
-        <w:t xml:space="preserve">time and sleep when a young grandchild is present. As India’s population</w:t>
-      </w:r>
-      <w:r>
-        <w:t xml:space="preserve"> </w:t>
-      </w:r>
-      <w:r>
-        <w:t xml:space="preserve">ages (International Institute for Population Sciences et al. 2020;</w:t>
-      </w:r>
-      <w:r>
-        <w:t xml:space="preserve"> </w:t>
-      </w:r>
-      <w:r>
-        <w:t xml:space="preserve">United Nations Population Fund and International Institute for</w:t>
+        <w:t xml:space="preserve">care appears costly to those who provide it: older women report less</w:t>
+      </w:r>
+      <w:r>
+        <w:t xml:space="preserve"> </w:t>
+      </w:r>
+      <w:r>
+        <w:t xml:space="preserve">free time and sleep when a young grandchild is present. As India’s</w:t>
+      </w:r>
+      <w:r>
+        <w:t xml:space="preserve"> </w:t>
+      </w:r>
+      <w:r>
+        <w:t xml:space="preserve">population ages (International Institute for Population Sciences et al.</w:t>
+      </w:r>
+      <w:r>
+        <w:t xml:space="preserve"> </w:t>
+      </w:r>
+      <w:r>
+        <w:t xml:space="preserve">2020; United Nations Population Fund and International Institute for</w:t>
       </w:r>
       <w:r>
         <w:t xml:space="preserve"> </w:t>
@@ -10884,127 +11967,127 @@
         <w:t xml:space="preserve"> </w:t>
       </w:r>
       <w:r>
-        <w:t xml:space="preserve">of arrangements and the coefficient-stability bounds narrow but do not</w:t>
-      </w:r>
-      <w:r>
-        <w:t xml:space="preserve"> </w:t>
-      </w:r>
-      <w:r>
-        <w:t xml:space="preserve">eliminate the scope for selection. Most junior-level mothers live with a</w:t>
-      </w:r>
-      <w:r>
-        <w:t xml:space="preserve"> </w:t>
-      </w:r>
-      <w:r>
-        <w:t xml:space="preserve">grandmother, so the grandmother indicator is entangled with the</w:t>
-      </w:r>
-      <w:r>
-        <w:t xml:space="preserve"> </w:t>
-      </w:r>
-      <w:r>
-        <w:t xml:space="preserve">household arrangement, and a design that compares mothers within the</w:t>
-      </w:r>
-      <w:r>
-        <w:t xml:space="preserve"> </w:t>
-      </w:r>
-      <w:r>
-        <w:t xml:space="preserve">same arrangement would be preferable. The survey offers no credible</w:t>
-      </w:r>
-      <w:r>
-        <w:t xml:space="preserve"> </w:t>
-      </w:r>
-      <w:r>
-        <w:t xml:space="preserve">instrument for coresidence. One diary day per person measures a day, not</w:t>
-      </w:r>
-      <w:r>
-        <w:t xml:space="preserve"> </w:t>
-      </w:r>
-      <w:r>
-        <w:t xml:space="preserve">a routine (Frazis and Stewart 2012), which adds noise to individual</w:t>
-      </w:r>
-      <w:r>
-        <w:t xml:space="preserve"> </w:t>
-      </w:r>
-      <w:r>
-        <w:t xml:space="preserve">outcomes but does not bias population means. Children under six are</w:t>
-      </w:r>
-      <w:r>
-        <w:t xml:space="preserve"> </w:t>
-      </w:r>
-      <w:r>
-        <w:t xml:space="preserve">counted from the roster and assigned to a mother by a generational rule;</w:t>
-      </w:r>
-      <w:r>
-        <w:t xml:space="preserve"> </w:t>
-      </w:r>
-      <w:r>
-        <w:t xml:space="preserve">the estimate that restricts to households with a single married woman of</w:t>
-      </w:r>
-      <w:r>
-        <w:t xml:space="preserve"> </w:t>
-      </w:r>
-      <w:r>
-        <w:t xml:space="preserve">childbearing age is -3.2 minutes (CI -5.8 to -0.5), but misassignment in</w:t>
-      </w:r>
-      <w:r>
-        <w:t xml:space="preserve"> </w:t>
-      </w:r>
-      <w:r>
-        <w:t xml:space="preserve">households with several junior couples cannot be ruled out. The roster</w:t>
-      </w:r>
-      <w:r>
-        <w:t xml:space="preserve"> </w:t>
-      </w:r>
-      <w:r>
-        <w:t xml:space="preserve">code for parents of the head does not distinguish the head’s own parents</w:t>
-      </w:r>
-      <w:r>
-        <w:t xml:space="preserve"> </w:t>
-      </w:r>
-      <w:r>
-        <w:t xml:space="preserve">from the spouse’s parents, so for head-level mothers the maternal and</w:t>
-      </w:r>
-      <w:r>
-        <w:t xml:space="preserve"> </w:t>
-      </w:r>
-      <w:r>
-        <w:t xml:space="preserve">paternal grandmother cannot be separated. Grandmother age proxies for</w:t>
-      </w:r>
-      <w:r>
-        <w:t xml:space="preserve"> </w:t>
-      </w:r>
-      <w:r>
-        <w:t xml:space="preserve">health only imperfectly. Finally, the survey does not record which child</w:t>
-      </w:r>
-      <w:r>
-        <w:t xml:space="preserve"> </w:t>
-      </w:r>
-      <w:r>
-        <w:t xml:space="preserve">a care episode is for, so in households with several young children the</w:t>
-      </w:r>
-      <w:r>
-        <w:t xml:space="preserve"> </w:t>
-      </w:r>
-      <w:r>
-        <w:t xml:space="preserve">grandmother’s recorded care may serve children other than the mother’s.</w:t>
-      </w:r>
-      <w:r>
-        <w:t xml:space="preserve"> </w:t>
-      </w:r>
-      <w:r>
-        <w:t xml:space="preserve">Future rounds that record the recipient of care, and surveys that follow</w:t>
-      </w:r>
-      <w:r>
-        <w:t xml:space="preserve"> </w:t>
-      </w:r>
-      <w:r>
-        <w:t xml:space="preserve">the same families over the birth of a grandchild, would allow sharper</w:t>
-      </w:r>
-      <w:r>
-        <w:t xml:space="preserve"> </w:t>
-      </w:r>
-      <w:r>
-        <w:t xml:space="preserve">tests.</w:t>
+        <w:t xml:space="preserve">of arrangements and the coefficient-stability bounds are partly</w:t>
+      </w:r>
+      <w:r>
+        <w:t xml:space="preserve"> </w:t>
+      </w:r>
+      <w:r>
+        <w:t xml:space="preserve">inconclusive and do not eliminate the scope for selection. Most</w:t>
+      </w:r>
+      <w:r>
+        <w:t xml:space="preserve"> </w:t>
+      </w:r>
+      <w:r>
+        <w:t xml:space="preserve">junior-level mothers live with a grandmother, so the grandmother</w:t>
+      </w:r>
+      <w:r>
+        <w:t xml:space="preserve"> </w:t>
+      </w:r>
+      <w:r>
+        <w:t xml:space="preserve">indicator is entangled with the household arrangement, and a design that</w:t>
+      </w:r>
+      <w:r>
+        <w:t xml:space="preserve"> </w:t>
+      </w:r>
+      <w:r>
+        <w:t xml:space="preserve">compares mothers within the same arrangement would be preferable. The</w:t>
+      </w:r>
+      <w:r>
+        <w:t xml:space="preserve"> </w:t>
+      </w:r>
+      <w:r>
+        <w:t xml:space="preserve">survey offers no credible instrument for coresidence. One diary day per</w:t>
+      </w:r>
+      <w:r>
+        <w:t xml:space="preserve"> </w:t>
+      </w:r>
+      <w:r>
+        <w:t xml:space="preserve">person measures a day, not a routine (Frazis and Stewart 2012), which</w:t>
+      </w:r>
+      <w:r>
+        <w:t xml:space="preserve"> </w:t>
+      </w:r>
+      <w:r>
+        <w:t xml:space="preserve">adds noise to individual outcomes but does not bias population means.</w:t>
+      </w:r>
+      <w:r>
+        <w:t xml:space="preserve"> </w:t>
+      </w:r>
+      <w:r>
+        <w:t xml:space="preserve">Children under six are counted from the roster and assigned to a mother</w:t>
+      </w:r>
+      <w:r>
+        <w:t xml:space="preserve"> </w:t>
+      </w:r>
+      <w:r>
+        <w:t xml:space="preserve">by a generational rule; the estimate that restricts to households with a</w:t>
+      </w:r>
+      <w:r>
+        <w:t xml:space="preserve"> </w:t>
+      </w:r>
+      <w:r>
+        <w:t xml:space="preserve">single married woman of childbearing age is -3.2 minutes (CI -5.8 to</w:t>
+      </w:r>
+      <w:r>
+        <w:t xml:space="preserve"> </w:t>
+      </w:r>
+      <w:r>
+        <w:t xml:space="preserve">-0.5), but misassignment in households with several junior couples</w:t>
+      </w:r>
+      <w:r>
+        <w:t xml:space="preserve"> </w:t>
+      </w:r>
+      <w:r>
+        <w:t xml:space="preserve">cannot be ruled out. The roster code for parents of the head does not</w:t>
+      </w:r>
+      <w:r>
+        <w:t xml:space="preserve"> </w:t>
+      </w:r>
+      <w:r>
+        <w:t xml:space="preserve">distinguish the head’s own parents from the spouse’s parents, so for</w:t>
+      </w:r>
+      <w:r>
+        <w:t xml:space="preserve"> </w:t>
+      </w:r>
+      <w:r>
+        <w:t xml:space="preserve">head-level mothers the maternal and paternal grandmother cannot be</w:t>
+      </w:r>
+      <w:r>
+        <w:t xml:space="preserve"> </w:t>
+      </w:r>
+      <w:r>
+        <w:t xml:space="preserve">separated. Grandmother age proxies for health only imperfectly. Finally,</w:t>
+      </w:r>
+      <w:r>
+        <w:t xml:space="preserve"> </w:t>
+      </w:r>
+      <w:r>
+        <w:t xml:space="preserve">the survey does not record which child a care episode is for, so in</w:t>
+      </w:r>
+      <w:r>
+        <w:t xml:space="preserve"> </w:t>
+      </w:r>
+      <w:r>
+        <w:t xml:space="preserve">households with several young children the grandmother’s recorded care</w:t>
+      </w:r>
+      <w:r>
+        <w:t xml:space="preserve"> </w:t>
+      </w:r>
+      <w:r>
+        <w:t xml:space="preserve">may serve children other than the mother’s. Future rounds that record</w:t>
+      </w:r>
+      <w:r>
+        <w:t xml:space="preserve"> </w:t>
+      </w:r>
+      <w:r>
+        <w:t xml:space="preserve">the recipient of care, and surveys that follow the same families over</w:t>
+      </w:r>
+      <w:r>
+        <w:t xml:space="preserve"> </w:t>
+      </w:r>
+      <w:r>
+        <w:t xml:space="preserve">the birth of a grandchild, would allow sharper tests.</w:t>
       </w:r>
     </w:p>
     <w:p>
@@ -11091,31 +12174,31 @@
         <w:t xml:space="preserve"> </w:t>
       </w:r>
       <w:r>
-        <w:t xml:space="preserve">for them, and with less domestic work that mothers may partly take over.</w:t>
-      </w:r>
-      <w:r>
-        <w:t xml:space="preserve"> </w:t>
-      </w:r>
-      <w:r>
-        <w:t xml:space="preserve">Family care in India is best understood as a transfer of time between</w:t>
-      </w:r>
-      <w:r>
-        <w:t xml:space="preserve"> </w:t>
-      </w:r>
-      <w:r>
-        <w:t xml:space="preserve">women of two generations whose terms depend on who the grandmother is</w:t>
-      </w:r>
-      <w:r>
-        <w:t xml:space="preserve"> </w:t>
-      </w:r>
-      <w:r>
-        <w:t xml:space="preserve">and on how the household is arranged, and whose cost falls on older</w:t>
-      </w:r>
-      <w:r>
-        <w:t xml:space="preserve"> </w:t>
-      </w:r>
-      <w:r>
-        <w:t xml:space="preserve">women’s rest and leisure.</w:t>
+        <w:t xml:space="preserve">for them, and with less domestic work, which the diaries cannot clearly</w:t>
+      </w:r>
+      <w:r>
+        <w:t xml:space="preserve"> </w:t>
+      </w:r>
+      <w:r>
+        <w:t xml:space="preserve">trace to mothers. Family care in India involves the time of women of two</w:t>
+      </w:r>
+      <w:r>
+        <w:t xml:space="preserve"> </w:t>
+      </w:r>
+      <w:r>
+        <w:t xml:space="preserve">generations whose terms depend on who the grandmother is and on how the</w:t>
+      </w:r>
+      <w:r>
+        <w:t xml:space="preserve"> </w:t>
+      </w:r>
+      <w:r>
+        <w:t xml:space="preserve">household is arranged, and the time older women give is associated with</w:t>
+      </w:r>
+      <w:r>
+        <w:t xml:space="preserve"> </w:t>
+      </w:r>
+      <w:r>
+        <w:t xml:space="preserve">less rest and leisure for them.</w:t>
       </w:r>
     </w:p>
     <w:p>

</xml_diff>

<commit_message>
TU-02 round 4: PaperChecker 31 Oct should-fix 1-5 and minor 1-4 (multiple-testing and coresidence limits, Oster hedge, Table S2 employment cells and median age, Maurer-Fazio wording, SE defined, primary-childcare note, raw 37%)
</commit_message>
<xml_diff>
--- a/submission/02_grandparent_care/package/manuscript_anonymised.docx
+++ b/submission/02_grandparent_care/package/manuscript_anonymised.docx
@@ -683,73 +683,79 @@
         <w:pStyle w:val="BodyText"/>
       </w:pPr>
       <w:r>
-        <w:t xml:space="preserve">Each estimate below is reported with its 95% confidence interval (CI).</w:t>
-      </w:r>
-      <w:r>
-        <w:t xml:space="preserve"> </w:t>
-      </w:r>
-      <w:r>
-        <w:t xml:space="preserve">The pooled association between a coresident grandmother and the mother’s</w:t>
-      </w:r>
-      <w:r>
-        <w:t xml:space="preserve"> </w:t>
-      </w:r>
-      <w:r>
-        <w:t xml:space="preserve">primary childcare is small: -2.1 minutes (CI -4.6 to 0.4). The</w:t>
-      </w:r>
-      <w:r>
-        <w:t xml:space="preserve"> </w:t>
-      </w:r>
-      <w:r>
-        <w:t xml:space="preserve">association with the mother’s paid work, including travel, is -0.4</w:t>
-      </w:r>
-      <w:r>
-        <w:t xml:space="preserve"> </w:t>
-      </w:r>
-      <w:r>
-        <w:t xml:space="preserve">minutes (CI -3.8 to 3.0), and her probability of being employed by usual</w:t>
-      </w:r>
-      <w:r>
-        <w:t xml:space="preserve"> </w:t>
-      </w:r>
-      <w:r>
-        <w:t xml:space="preserve">status is 1.4 percentage points lower (CI -2.3 to -0.4). The minute</w:t>
-      </w:r>
-      <w:r>
-        <w:t xml:space="preserve"> </w:t>
-      </w:r>
-      <w:r>
-        <w:t xml:space="preserve">estimates are fragile. The childcare estimate ranges from -13.2 to 8.3</w:t>
-      </w:r>
-      <w:r>
-        <w:t xml:space="preserve"> </w:t>
-      </w:r>
-      <w:r>
-        <w:t xml:space="preserve">minutes across the specifications in the robustness table, and subgroup</w:t>
-      </w:r>
-      <w:r>
-        <w:t xml:space="preserve"> </w:t>
-      </w:r>
-      <w:r>
-        <w:t xml:space="preserve">estimates differ in size and, for paid work, in sign. The grandmother’s</w:t>
-      </w:r>
-      <w:r>
-        <w:t xml:space="preserve"> </w:t>
-      </w:r>
-      <w:r>
-        <w:t xml:space="preserve">side is much clearer: in households with a child under six, the</w:t>
-      </w:r>
-      <w:r>
-        <w:t xml:space="preserve"> </w:t>
-      </w:r>
-      <w:r>
-        <w:t xml:space="preserve">grandmother or grandmothers together report 85.9 minutes (SE 1.1) of</w:t>
-      </w:r>
-      <w:r>
-        <w:t xml:space="preserve"> </w:t>
-      </w:r>
-      <w:r>
-        <w:t xml:space="preserve">childcare a day, 37% of the combined childcare of mother and</w:t>
+        <w:t xml:space="preserve">Each estimate below is reported with its 95% confidence interval (CI);</w:t>
+      </w:r>
+      <w:r>
+        <w:t xml:space="preserve"> </w:t>
+      </w:r>
+      <w:r>
+        <w:t xml:space="preserve">means are reported with their standard error (SE). The pooled</w:t>
+      </w:r>
+      <w:r>
+        <w:t xml:space="preserve"> </w:t>
+      </w:r>
+      <w:r>
+        <w:t xml:space="preserve">association between a coresident grandmother and the mother’s primary</w:t>
+      </w:r>
+      <w:r>
+        <w:t xml:space="preserve"> </w:t>
+      </w:r>
+      <w:r>
+        <w:t xml:space="preserve">childcare is small: -2.1 minutes (CI -4.6 to 0.4). The association with</w:t>
+      </w:r>
+      <w:r>
+        <w:t xml:space="preserve"> </w:t>
+      </w:r>
+      <w:r>
+        <w:t xml:space="preserve">the mother’s paid work, including travel, is -0.4 minutes (CI -3.8 to</w:t>
+      </w:r>
+      <w:r>
+        <w:t xml:space="preserve"> </w:t>
+      </w:r>
+      <w:r>
+        <w:t xml:space="preserve">3.0), and her probability of being employed by usual status is 1.4</w:t>
+      </w:r>
+      <w:r>
+        <w:t xml:space="preserve"> </w:t>
+      </w:r>
+      <w:r>
+        <w:t xml:space="preserve">percentage points lower (CI -2.3 to -0.4). The minute estimates are</w:t>
+      </w:r>
+      <w:r>
+        <w:t xml:space="preserve"> </w:t>
+      </w:r>
+      <w:r>
+        <w:t xml:space="preserve">fragile. The childcare estimate ranges from -13.2 to 8.3 minutes across</w:t>
+      </w:r>
+      <w:r>
+        <w:t xml:space="preserve"> </w:t>
+      </w:r>
+      <w:r>
+        <w:t xml:space="preserve">the specifications in the robustness table, and subgroup estimates</w:t>
+      </w:r>
+      <w:r>
+        <w:t xml:space="preserve"> </w:t>
+      </w:r>
+      <w:r>
+        <w:t xml:space="preserve">differ in size and, for paid work, in sign. The grandmother’s side is</w:t>
+      </w:r>
+      <w:r>
+        <w:t xml:space="preserve"> </w:t>
+      </w:r>
+      <w:r>
+        <w:t xml:space="preserve">much clearer: in households with a child under six, the grandmother or</w:t>
+      </w:r>
+      <w:r>
+        <w:t xml:space="preserve"> </w:t>
+      </w:r>
+      <w:r>
+        <w:t xml:space="preserve">grandmothers together report 85.9 minutes (SE 1.1) of childcare a day,</w:t>
+      </w:r>
+      <w:r>
+        <w:t xml:space="preserve"> </w:t>
+      </w:r>
+      <w:r>
+        <w:t xml:space="preserve">37% of the combined raw (unadjusted) childcare minutes of mother and</w:t>
       </w:r>
       <w:r>
         <w:t xml:space="preserve"> </w:t>
@@ -2813,7 +2819,7 @@
         <w:t xml:space="preserve"> </w:t>
       </w:r>
       <w:r>
-        <w:t xml:space="preserve">Married women aged 18–49 at head or junior level (head or spouse of head; married child of head or that child’s spouse) in households with a child under six, excluding head-level women who live with a junior married woman of childbearing age. Survey-weighted means; FSU-clustered standard errors in parentheses. Employed is a share (three decimals).</w:t>
+        <w:t xml:space="preserve">Married women aged 18–49 at head or junior level (head or spouse of head; married child of head or that child’s spouse) in households with a child under six, excluding head-level women who live with a junior married woman of childbearing age. Survey-weighted means; FSU-clustered standard errors in parentheses. Employed is a share (three decimals). Primary childcare also includes other childcare (ICATUS 417–419) and accompanying children (442), not shown separately, so active and passive care do not sum to it.</w:t>
       </w:r>
     </w:p>
     <w:p>
@@ -4762,7 +4768,7 @@
         <w:t xml:space="preserve"> </w:t>
       </w:r>
       <w:r>
-        <w:t xml:space="preserve">Each row is a separate regression of the outcome (minutes per day, or a 0/1 indicator for usual employment) on an indicator for a coresident grandmother and the full control set, with state and day-of-week fixed effects. Mean: outcome mean for mothers without a coresident grandmother. Survey-weighted; FSU-clustered standard errors; 95 percent confidence intervals use the normal approximation.</w:t>
+        <w:t xml:space="preserve">Each row is a separate regression of the outcome (minutes per day, or a 0/1 indicator for usual employment) on an indicator for a coresident grandmother and the full control set, with state and day-of-week fixed effects. Mean: outcome mean for mothers without a coresident grandmother. Survey-weighted; FSU-clustered standard errors; 95 percent confidence intervals use the normal approximation. Primary childcare also includes other childcare (ICATUS 417–419) and accompanying children (442), not shown separately.</w:t>
       </w:r>
     </w:p>
     <w:p>
@@ -4874,115 +4880,121 @@
         <w:t xml:space="preserve"> </w:t>
       </w:r>
       <w:r>
-        <w:t xml:space="preserve">whichever household they live in, so a pooled comparison partly</w:t>
-      </w:r>
-      <w:r>
-        <w:t xml:space="preserve"> </w:t>
-      </w:r>
-      <w:r>
-        <w:t xml:space="preserve">contrasts the two generations. Estimated separately, a grandmother is</w:t>
-      </w:r>
-      <w:r>
-        <w:t xml:space="preserve"> </w:t>
-      </w:r>
-      <w:r>
-        <w:t xml:space="preserve">associated with more paid work among head-level mothers (12.6 minutes</w:t>
-      </w:r>
-      <w:r>
-        <w:t xml:space="preserve"> </w:t>
-      </w:r>
-      <w:r>
-        <w:t xml:space="preserve">(CI 5.6 to 19.5)) and among junior-level mothers (7.6 minutes (CI 1.2 to</w:t>
-      </w:r>
-      <w:r>
-        <w:t xml:space="preserve"> </w:t>
-      </w:r>
-      <w:r>
-        <w:t xml:space="preserve">13.9); subgroup analysis below). Adding an indicator for the mother’s</w:t>
-      </w:r>
-      <w:r>
-        <w:t xml:space="preserve"> </w:t>
-      </w:r>
-      <w:r>
-        <w:t xml:space="preserve">generation to the pooled model (robustness checks below, panel B) turns</w:t>
-      </w:r>
-      <w:r>
-        <w:t xml:space="preserve"> </w:t>
-      </w:r>
-      <w:r>
-        <w:t xml:space="preserve">the employment-minutes estimate into 10.5 minutes (CI 5.5 to 15.5) and</w:t>
-      </w:r>
-      <w:r>
-        <w:t xml:space="preserve"> </w:t>
-      </w:r>
-      <w:r>
-        <w:t xml:space="preserve">the employment-rate estimate into 2.2 percentage points higher (CI 0.8</w:t>
-      </w:r>
-      <w:r>
-        <w:t xml:space="preserve"> </w:t>
-      </w:r>
-      <w:r>
-        <w:t xml:space="preserve">to 3.5); adding household size as well gives 9.2 minutes (CI 3.6 to</w:t>
-      </w:r>
-      <w:r>
-        <w:t xml:space="preserve"> </w:t>
-      </w:r>
-      <w:r>
-        <w:t xml:space="preserve">14.7) and 2.2 percentage points higher (CI 0.7 to 3.7). The negative</w:t>
-      </w:r>
-      <w:r>
-        <w:t xml:space="preserve"> </w:t>
-      </w:r>
-      <w:r>
-        <w:t xml:space="preserve">pooled estimates are therefore consistent with composition: grandmothers</w:t>
-      </w:r>
-      <w:r>
-        <w:t xml:space="preserve"> </w:t>
-      </w:r>
-      <w:r>
-        <w:t xml:space="preserve">live mainly in junior-level households, where mothers’ employment is</w:t>
-      </w:r>
-      <w:r>
-        <w:t xml:space="preserve"> </w:t>
-      </w:r>
-      <w:r>
-        <w:t xml:space="preserve">low. The within-generation estimates also vary across other subgroups</w:t>
-      </w:r>
-      <w:r>
-        <w:t xml:space="preserve"> </w:t>
-      </w:r>
-      <w:r>
-        <w:t xml:space="preserve">(subgroup analysis below), so they do not establish a positive</w:t>
-      </w:r>
-      <w:r>
-        <w:t xml:space="preserve"> </w:t>
-      </w:r>
-      <w:r>
-        <w:t xml:space="preserve">association for all mothers. Generation is itself part of how a</w:t>
-      </w:r>
-      <w:r>
-        <w:t xml:space="preserve"> </w:t>
-      </w:r>
-      <w:r>
-        <w:t xml:space="preserve">grandmother comes to be present, so neither the pooled nor the</w:t>
-      </w:r>
-      <w:r>
-        <w:t xml:space="preserve"> </w:t>
-      </w:r>
-      <w:r>
-        <w:t xml:space="preserve">within-generation estimate is causal, and the within-generation</w:t>
-      </w:r>
-      <w:r>
-        <w:t xml:space="preserve"> </w:t>
-      </w:r>
-      <w:r>
-        <w:t xml:space="preserve">estimates give no sign that grandmothers’ presence goes with less paid</w:t>
-      </w:r>
-      <w:r>
-        <w:t xml:space="preserve"> </w:t>
-      </w:r>
-      <w:r>
-        <w:t xml:space="preserve">work by mothers of the same generation.</w:t>
+        <w:t xml:space="preserve">whichever household they live in (Table S2 of Online</w:t>
+      </w:r>
+      <w:r>
+        <w:t xml:space="preserve"> </w:t>
+      </w:r>
+      <w:r>
+        <w:t xml:space="preserve">Resource 1), so a pooled comparison partly contrasts the two</w:t>
+      </w:r>
+      <w:r>
+        <w:t xml:space="preserve"> </w:t>
+      </w:r>
+      <w:r>
+        <w:t xml:space="preserve">generations. Estimated separately, a grandmother is associated with more</w:t>
+      </w:r>
+      <w:r>
+        <w:t xml:space="preserve"> </w:t>
+      </w:r>
+      <w:r>
+        <w:t xml:space="preserve">paid work among head-level mothers (12.6 minutes (CI 5.6 to 19.5)) and</w:t>
+      </w:r>
+      <w:r>
+        <w:t xml:space="preserve"> </w:t>
+      </w:r>
+      <w:r>
+        <w:t xml:space="preserve">among junior-level mothers (7.6 minutes (CI 1.2 to 13.9); subgroup</w:t>
+      </w:r>
+      <w:r>
+        <w:t xml:space="preserve"> </w:t>
+      </w:r>
+      <w:r>
+        <w:t xml:space="preserve">analysis below). Adding an indicator for the mother’s generation to the</w:t>
+      </w:r>
+      <w:r>
+        <w:t xml:space="preserve"> </w:t>
+      </w:r>
+      <w:r>
+        <w:t xml:space="preserve">pooled model (robustness checks below, panel B) turns the</w:t>
+      </w:r>
+      <w:r>
+        <w:t xml:space="preserve"> </w:t>
+      </w:r>
+      <w:r>
+        <w:t xml:space="preserve">employment-minutes estimate into 10.5 minutes (CI 5.5 to 15.5) and the</w:t>
+      </w:r>
+      <w:r>
+        <w:t xml:space="preserve"> </w:t>
+      </w:r>
+      <w:r>
+        <w:t xml:space="preserve">employment-rate estimate into 2.2 percentage points higher (CI 0.8 to</w:t>
+      </w:r>
+      <w:r>
+        <w:t xml:space="preserve"> </w:t>
+      </w:r>
+      <w:r>
+        <w:t xml:space="preserve">3.5); adding household size as well gives 9.2 minutes (CI 3.6 to 14.7)</w:t>
+      </w:r>
+      <w:r>
+        <w:t xml:space="preserve"> </w:t>
+      </w:r>
+      <w:r>
+        <w:t xml:space="preserve">and 2.2 percentage points higher (CI 0.7 to 3.7). The negative pooled</w:t>
+      </w:r>
+      <w:r>
+        <w:t xml:space="preserve"> </w:t>
+      </w:r>
+      <w:r>
+        <w:t xml:space="preserve">estimates are therefore consistent with composition: grandmothers live</w:t>
+      </w:r>
+      <w:r>
+        <w:t xml:space="preserve"> </w:t>
+      </w:r>
+      <w:r>
+        <w:t xml:space="preserve">mainly in junior-level households, where mothers’ employment is low. The</w:t>
+      </w:r>
+      <w:r>
+        <w:t xml:space="preserve"> </w:t>
+      </w:r>
+      <w:r>
+        <w:t xml:space="preserve">within-generation estimates also vary across other subgroups (subgroup</w:t>
+      </w:r>
+      <w:r>
+        <w:t xml:space="preserve"> </w:t>
+      </w:r>
+      <w:r>
+        <w:t xml:space="preserve">analysis below), so they do not establish a positive association for all</w:t>
+      </w:r>
+      <w:r>
+        <w:t xml:space="preserve"> </w:t>
+      </w:r>
+      <w:r>
+        <w:t xml:space="preserve">mothers. Generation is itself part of how a grandmother comes to be</w:t>
+      </w:r>
+      <w:r>
+        <w:t xml:space="preserve"> </w:t>
+      </w:r>
+      <w:r>
+        <w:t xml:space="preserve">present, so neither the pooled nor the within-generation estimate is</w:t>
+      </w:r>
+      <w:r>
+        <w:t xml:space="preserve"> </w:t>
+      </w:r>
+      <w:r>
+        <w:t xml:space="preserve">causal, and the within-generation estimates give no sign that</w:t>
+      </w:r>
+      <w:r>
+        <w:t xml:space="preserve"> </w:t>
+      </w:r>
+      <w:r>
+        <w:t xml:space="preserve">grandmothers’ presence goes with less paid work by mothers of the same</w:t>
+      </w:r>
+      <w:r>
+        <w:t xml:space="preserve"> </w:t>
+      </w:r>
+      <w:r>
+        <w:t xml:space="preserve">generation.</w:t>
       </w:r>
     </w:p>
     <w:p>
@@ -5198,13 +5210,13 @@
         <w:t xml:space="preserve"> </w:t>
       </w:r>
       <w:r>
-        <w:t xml:space="preserve">to -12.6). Grandmothers’ care is therefore associated with less care by</w:t>
-      </w:r>
-      <w:r>
-        <w:t xml:space="preserve"> </w:t>
-      </w:r>
-      <w:r>
-        <w:t xml:space="preserve">fathers as well as with more care in the household as a whole.</w:t>
+        <w:t xml:space="preserve">to -12.6). A coresident grandmother is therefore associated with less</w:t>
+      </w:r>
+      <w:r>
+        <w:t xml:space="preserve"> </w:t>
+      </w:r>
+      <w:r>
+        <w:t xml:space="preserve">care by fathers as well as with more care in the household as a whole.</w:t>
       </w:r>
     </w:p>
     <w:bookmarkStart w:id="27" w:name="_be3d5bb4bcb5dc58eff7bb083b7ad594321de31"/>
@@ -8701,7 +8713,7 @@
         <w:t xml:space="preserve"> </w:t>
       </w:r>
       <w:r>
-        <w:t xml:space="preserve">Main specification, estimated separately by subsample. Estimate [95 percent confidence interval] for the grandmother indicator. Not estimable: fewer than 30 mothers with or without a coresident grandmother in the subsample. No subsample falls below it.</w:t>
+        <w:t xml:space="preserve">Main specification, estimated separately by subsample. Estimate [95 percent confidence interval] for the grandmother indicator. Not estimable: fewer than 30 mothers with or without a coresident grandmother in the subsample. No subsample falls below it. Intervals are not adjusted for multiple comparisons across subgroups; individual subgroup estimates should be read as exploratory.</w:t>
       </w:r>
     </w:p>
     <w:p>
@@ -9628,13 +9640,25 @@
         <w:t xml:space="preserve"> </w:t>
       </w:r>
       <w:r>
-        <w:t xml:space="preserve">zero, and for employment the required degree is below one, so the</w:t>
-      </w:r>
-      <w:r>
-        <w:t xml:space="preserve"> </w:t>
-      </w:r>
-      <w:r>
-        <w:t xml:space="preserve">employment estimate is not robust in this sense. Defining the</w:t>
+        <w:t xml:space="preserve">zero, and for employment the required degree is below one in absolute</w:t>
+      </w:r>
+      <w:r>
+        <w:t xml:space="preserve"> </w:t>
+      </w:r>
+      <w:r>
+        <w:t xml:space="preserve">value, so the employment estimate is not robust in this sense. Because</w:t>
+      </w:r>
+      <w:r>
+        <w:t xml:space="preserve"> </w:t>
+      </w:r>
+      <w:r>
+        <w:t xml:space="preserve">both baseline estimates are close to zero with intervals that include</w:t>
+      </w:r>
+      <w:r>
+        <w:t xml:space="preserve"> </w:t>
+      </w:r>
+      <w:r>
+        <w:t xml:space="preserve">it, these delta values are of limited informativeness. Defining the</w:t>
       </w:r>
       <w:r>
         <w:t xml:space="preserve"> </w:t>
@@ -11709,109 +11733,115 @@
         <w:t xml:space="preserve"> </w:t>
       </w:r>
       <w:r>
-        <w:t xml:space="preserve">grandparents raise maternal employment (Sasaki 2002; Dimova and Wolff</w:t>
-      </w:r>
-      <w:r>
-        <w:t xml:space="preserve"> </w:t>
-      </w:r>
-      <w:r>
-        <w:t xml:space="preserve">2011; Maurer-Fazio et al. 2011; Compton and Pollak 2014; Bratti et al.</w:t>
-      </w:r>
-      <w:r>
-        <w:t xml:space="preserve"> </w:t>
-      </w:r>
-      <w:r>
-        <w:t xml:space="preserve">2018). The pooled estimates here show no such association in India</w:t>
-      </w:r>
-      <w:r>
-        <w:t xml:space="preserve"> </w:t>
-      </w:r>
-      <w:r>
-        <w:t xml:space="preserve">(mothers’ paid-work minutes differ little, and their employment rate is</w:t>
-      </w:r>
-      <w:r>
-        <w:t xml:space="preserve"> </w:t>
-      </w:r>
-      <w:r>
-        <w:t xml:space="preserve">1.4 percentage points lower), even though grandmothers provide 37% of</w:t>
-      </w:r>
-      <w:r>
-        <w:t xml:space="preserve"> </w:t>
-      </w:r>
-      <w:r>
-        <w:t xml:space="preserve">the combined childcare of the two women. Within the mother’s household</w:t>
-      </w:r>
-      <w:r>
-        <w:t xml:space="preserve"> </w:t>
-      </w:r>
-      <w:r>
-        <w:t xml:space="preserve">generation, however, the employment rate is 2.2 percentage points higher</w:t>
-      </w:r>
-      <w:r>
-        <w:t xml:space="preserve"> </w:t>
-      </w:r>
-      <w:r>
-        <w:t xml:space="preserve">(CI 0.8 to 3.5), so the Indian estimates are not clearly at odds with</w:t>
-      </w:r>
-      <w:r>
-        <w:t xml:space="preserve"> </w:t>
-      </w:r>
-      <w:r>
-        <w:t xml:space="preserve">those studies: one difference is that grandmothers here live mainly in</w:t>
-      </w:r>
-      <w:r>
-        <w:t xml:space="preserve"> </w:t>
-      </w:r>
-      <w:r>
-        <w:t xml:space="preserve">junior-level households, where mothers’ employment is low, although the</w:t>
-      </w:r>
-      <w:r>
-        <w:t xml:space="preserve"> </w:t>
-      </w:r>
-      <w:r>
-        <w:t xml:space="preserve">within-generation estimate varies across subgroups and the Oster bounds</w:t>
-      </w:r>
-      <w:r>
-        <w:t xml:space="preserve"> </w:t>
-      </w:r>
-      <w:r>
-        <w:t xml:space="preserve">for employment are weak. Whether household norms in such households</w:t>
-      </w:r>
-      <w:r>
-        <w:t xml:space="preserve"> </w:t>
-      </w:r>
-      <w:r>
-        <w:t xml:space="preserve">restrict married women’s work (Dhanaraj and Mahambare 2019; Anukriti et</w:t>
-      </w:r>
-      <w:r>
-        <w:t xml:space="preserve"> </w:t>
-      </w:r>
-      <w:r>
-        <w:t xml:space="preserve">al. 2020; Jayachandran 2021) cannot be established with these data. The</w:t>
-      </w:r>
-      <w:r>
-        <w:t xml:space="preserve"> </w:t>
-      </w:r>
-      <w:r>
-        <w:t xml:space="preserve">Norwegian finding that formal childcare mainly crowded out informal care</w:t>
-      </w:r>
-      <w:r>
-        <w:t xml:space="preserve"> </w:t>
-      </w:r>
-      <w:r>
-        <w:t xml:space="preserve">(Havnes and Mogstad 2011) is a useful parallel: when one form of care</w:t>
-      </w:r>
-      <w:r>
-        <w:t xml:space="preserve"> </w:t>
-      </w:r>
-      <w:r>
-        <w:t xml:space="preserve">replaces another, the effect on mothers’ work depends on what else</w:t>
-      </w:r>
-      <w:r>
-        <w:t xml:space="preserve"> </w:t>
-      </w:r>
-      <w:r>
-        <w:t xml:space="preserve">constrains it.</w:t>
+        <w:t xml:space="preserve">grandparents are associated with, and in several quasi-experimental</w:t>
+      </w:r>
+      <w:r>
+        <w:t xml:space="preserve"> </w:t>
+      </w:r>
+      <w:r>
+        <w:t xml:space="preserve">designs raise, maternal employment (Sasaki 2002; Dimova and Wolff 2011;</w:t>
+      </w:r>
+      <w:r>
+        <w:t xml:space="preserve"> </w:t>
+      </w:r>
+      <w:r>
+        <w:t xml:space="preserve">Maurer-Fazio et al. 2011; Compton and Pollak 2014; Bratti et al. 2018).</w:t>
+      </w:r>
+      <w:r>
+        <w:t xml:space="preserve"> </w:t>
+      </w:r>
+      <w:r>
+        <w:t xml:space="preserve">The pooled estimates here show no such association in India (mothers’</w:t>
+      </w:r>
+      <w:r>
+        <w:t xml:space="preserve"> </w:t>
+      </w:r>
+      <w:r>
+        <w:t xml:space="preserve">paid-work minutes differ little, and their employment rate is 1.4</w:t>
+      </w:r>
+      <w:r>
+        <w:t xml:space="preserve"> </w:t>
+      </w:r>
+      <w:r>
+        <w:t xml:space="preserve">percentage points lower), even though grandmothers provide 37% of the</w:t>
+      </w:r>
+      <w:r>
+        <w:t xml:space="preserve"> </w:t>
+      </w:r>
+      <w:r>
+        <w:t xml:space="preserve">combined raw (unadjusted) childcare minutes of the two women. Within the</w:t>
+      </w:r>
+      <w:r>
+        <w:t xml:space="preserve"> </w:t>
+      </w:r>
+      <w:r>
+        <w:t xml:space="preserve">mother’s household generation, however, the employment rate is 2.2</w:t>
+      </w:r>
+      <w:r>
+        <w:t xml:space="preserve"> </w:t>
+      </w:r>
+      <w:r>
+        <w:t xml:space="preserve">percentage points higher (CI 0.8 to 3.5), so the Indian estimates are</w:t>
+      </w:r>
+      <w:r>
+        <w:t xml:space="preserve"> </w:t>
+      </w:r>
+      <w:r>
+        <w:t xml:space="preserve">not clearly at odds with those studies: one difference is that</w:t>
+      </w:r>
+      <w:r>
+        <w:t xml:space="preserve"> </w:t>
+      </w:r>
+      <w:r>
+        <w:t xml:space="preserve">grandmothers here live mainly in junior-level households, where mothers’</w:t>
+      </w:r>
+      <w:r>
+        <w:t xml:space="preserve"> </w:t>
+      </w:r>
+      <w:r>
+        <w:t xml:space="preserve">employment is low, although the within-generation estimate varies across</w:t>
+      </w:r>
+      <w:r>
+        <w:t xml:space="preserve"> </w:t>
+      </w:r>
+      <w:r>
+        <w:t xml:space="preserve">subgroups and the Oster bounds for employment are weak. Whether</w:t>
+      </w:r>
+      <w:r>
+        <w:t xml:space="preserve"> </w:t>
+      </w:r>
+      <w:r>
+        <w:t xml:space="preserve">household norms in such households restrict married women’s work</w:t>
+      </w:r>
+      <w:r>
+        <w:t xml:space="preserve"> </w:t>
+      </w:r>
+      <w:r>
+        <w:t xml:space="preserve">(Dhanaraj and Mahambare 2019; Anukriti et al. 2020; Jayachandran 2021)</w:t>
+      </w:r>
+      <w:r>
+        <w:t xml:space="preserve"> </w:t>
+      </w:r>
+      <w:r>
+        <w:t xml:space="preserve">cannot be established with these data. The Norwegian finding that formal</w:t>
+      </w:r>
+      <w:r>
+        <w:t xml:space="preserve"> </w:t>
+      </w:r>
+      <w:r>
+        <w:t xml:space="preserve">childcare mainly crowded out informal care (Havnes and Mogstad 2011) is</w:t>
+      </w:r>
+      <w:r>
+        <w:t xml:space="preserve"> </w:t>
+      </w:r>
+      <w:r>
+        <w:t xml:space="preserve">a useful parallel: when one form of care replaces another, the effect on</w:t>
+      </w:r>
+      <w:r>
+        <w:t xml:space="preserve"> </w:t>
+      </w:r>
+      <w:r>
+        <w:t xml:space="preserve">mothers’ work depends on what else constrains it.</w:t>
       </w:r>
     </w:p>
     <w:p>
@@ -12057,37 +12087,61 @@
         <w:t xml:space="preserve"> </w:t>
       </w:r>
       <w:r>
-        <w:t xml:space="preserve">separated. Grandmother age proxies for health only imperfectly. Finally,</w:t>
-      </w:r>
-      <w:r>
-        <w:t xml:space="preserve"> </w:t>
-      </w:r>
-      <w:r>
-        <w:t xml:space="preserve">the survey does not record which child a care episode is for, so in</w:t>
-      </w:r>
-      <w:r>
-        <w:t xml:space="preserve"> </w:t>
-      </w:r>
-      <w:r>
-        <w:t xml:space="preserve">households with several young children the grandmother’s recorded care</w:t>
-      </w:r>
-      <w:r>
-        <w:t xml:space="preserve"> </w:t>
-      </w:r>
-      <w:r>
-        <w:t xml:space="preserve">may serve children other than the mother’s. Future rounds that record</w:t>
-      </w:r>
-      <w:r>
-        <w:t xml:space="preserve"> </w:t>
-      </w:r>
-      <w:r>
-        <w:t xml:space="preserve">the recipient of care, and surveys that follow the same families over</w:t>
-      </w:r>
-      <w:r>
-        <w:t xml:space="preserve"> </w:t>
-      </w:r>
-      <w:r>
-        <w:t xml:space="preserve">the birth of a grandchild, would allow sharper tests.</w:t>
+        <w:t xml:space="preserve">separated. Grandmother age proxies for health only imperfectly. The</w:t>
+      </w:r>
+      <w:r>
+        <w:t xml:space="preserve"> </w:t>
+      </w:r>
+      <w:r>
+        <w:t xml:space="preserve">treatment is coresidence with a grandmother, not care she is observed to</w:t>
+      </w:r>
+      <w:r>
+        <w:t xml:space="preserve"> </w:t>
+      </w:r>
+      <w:r>
+        <w:t xml:space="preserve">give to the mother’s own child. Intervals are not adjusted for multiple</w:t>
+      </w:r>
+      <w:r>
+        <w:t xml:space="preserve"> </w:t>
+      </w:r>
+      <w:r>
+        <w:t xml:space="preserve">comparisons across subgroups; individual subgroup estimates should be</w:t>
+      </w:r>
+      <w:r>
+        <w:t xml:space="preserve"> </w:t>
+      </w:r>
+      <w:r>
+        <w:t xml:space="preserve">read as exploratory. Finally, the survey does not record which child a</w:t>
+      </w:r>
+      <w:r>
+        <w:t xml:space="preserve"> </w:t>
+      </w:r>
+      <w:r>
+        <w:t xml:space="preserve">care episode is for, so in households with several young children the</w:t>
+      </w:r>
+      <w:r>
+        <w:t xml:space="preserve"> </w:t>
+      </w:r>
+      <w:r>
+        <w:t xml:space="preserve">grandmother’s recorded care may serve children other than the mother’s.</w:t>
+      </w:r>
+      <w:r>
+        <w:t xml:space="preserve"> </w:t>
+      </w:r>
+      <w:r>
+        <w:t xml:space="preserve">Future rounds that record the recipient of care, and surveys that follow</w:t>
+      </w:r>
+      <w:r>
+        <w:t xml:space="preserve"> </w:t>
+      </w:r>
+      <w:r>
+        <w:t xml:space="preserve">the same families over the birth of a grandchild, would allow sharper</w:t>
+      </w:r>
+      <w:r>
+        <w:t xml:space="preserve"> </w:t>
+      </w:r>
+      <w:r>
+        <w:t xml:space="preserve">tests.</w:t>
       </w:r>
     </w:p>
     <w:p>

</xml_diff>